<commit_message>
Sync reproduction package with the v0600 submission text
Gate step 6: the packaged manuscript copy now matches v0600, which labels
the 42.7 pp language effect as measured on the BF16 build (three inline
insertions; abstract held at the 250-word limit). No change under data/.
</commit_message>
<xml_diff>
--- a/manuscript/PaperB_manuscript_PR_layout.docx
+++ b/manuscript/PaperB_manuscript_PR_layout.docx
@@ -124,7 +124,7 @@
           <w:i w:val="0"/>
           <w:sz w:val="20"/>
         </w:rPr>
-        <w:t xml:space="preserve"> that make under-counts readable. For the open-weight models studied here (§5.7, §8.2), the dominant dense-scene failure is </w:t>
+        <w:t xml:space="preserve"> that make under-counts readable. For the open-weight models here (§5.7, §8.2), the dominant dense-scene failure is </w:t>
       </w:r>
       <w:r>
         <w:rPr>
@@ -160,7 +160,7 @@
           <w:i w:val="0"/>
           <w:sz w:val="20"/>
         </w:rPr>
-        <w:t xml:space="preserve"> of the total under-count under the ground-truth-weighted share (</w:t>
+        <w:t xml:space="preserve"> of the total under-count under ground-truth-weighted share (</w:t>
       </w:r>
       <w:r>
         <w:rPr>
@@ -241,7 +241,7 @@
           <w:i w:val="0"/>
           <w:sz w:val="20"/>
         </w:rPr>
-        <w:t>42.7 pp under English prompts</w:t>
+        <w:t>42.7 pp on the BF16 build under English</w:t>
       </w:r>
       <w:r>
         <w:rPr>
@@ -484,7 +484,7 @@
           <w:i w:val="0"/>
           <w:sz w:val="20"/>
         </w:rPr>
-        <w:t xml:space="preserve"> of these spans, not their magnitudes, and then only under the </w:t>
+        <w:t xml:space="preserve"> of these spans, not their magnitudes, and only under the </w:t>
       </w:r>
       <w:r>
         <w:rPr>
@@ -781,7 +781,7 @@
           <w:i w:val="0"/>
           <w:sz w:val="20"/>
         </w:rPr>
-        <w:t>42.7 pp under English prompts</w:t>
+        <w:t>42.7 pp on the BF16 build under English prompts</w:t>
       </w:r>
       <w:r>
         <w:rPr>
@@ -15287,25 +15287,7 @@
           <w:i w:val="0"/>
           <w:sz w:val="20"/>
         </w:rPr>
-        <w:t xml:space="preserve">: the same instrument on seven families removes the answered zero in </w:t>
-      </w:r>
-      <w:r>
-        <w:rPr>
-          <w:rFonts w:ascii="Times New Roman" w:hAnsi="Times New Roman"/>
-          <w:b/>
-          <w:i w:val="0"/>
-          <w:sz w:val="20"/>
-        </w:rPr>
-        <w:t>7 of 7</w:t>
-      </w:r>
-      <w:r>
-        <w:rPr>
-          <w:rFonts w:ascii="Times New Roman" w:hAnsi="Times New Roman"/>
-          <w:b w:val="0"/>
-          <w:i w:val="0"/>
-          <w:sz w:val="20"/>
-        </w:rPr>
-        <w:t xml:space="preserve"> on the corpus domains (§5.7) and in </w:t>
+        <w:t xml:space="preserve">: on the public benchmark FSC-147 it holds in </w:t>
       </w:r>
       <w:r>
         <w:rPr>
@@ -15323,7 +15305,7 @@
           <w:i w:val="0"/>
           <w:sz w:val="20"/>
         </w:rPr>
-        <w:t xml:space="preserve"> on the public benchmark FSC-147 (§5.13) — with the Qwen3-VL-32B build as the reported counterexample there. The abstention </w:t>
+        <w:t xml:space="preserve"> (§5.13) — with the Qwen3-VL-32B build as the reported counterexample there. The abstention </w:t>
       </w:r>
       <w:r>
         <w:rPr>
@@ -15467,7 +15449,25 @@
           <w:i w:val="0"/>
           <w:sz w:val="20"/>
         </w:rPr>
-        <w:t xml:space="preserve"> drop (Appendix M.39). The shares of §5.5 are therefore scoped to the prompt language and to the </w:t>
+        <w:t xml:space="preserve"> drop </w:t>
+      </w:r>
+      <w:r>
+        <w:rPr>
+          <w:rFonts w:ascii="Times New Roman" w:hAnsi="Times New Roman"/>
+          <w:b/>
+          <w:i w:val="0"/>
+          <w:sz w:val="20"/>
+        </w:rPr>
+        <w:t>on the BF16 build</w:t>
+      </w:r>
+      <w:r>
+        <w:rPr>
+          <w:rFonts w:ascii="Times New Roman" w:hAnsi="Times New Roman"/>
+          <w:b w:val="0"/>
+          <w:i w:val="0"/>
+          <w:sz w:val="20"/>
+        </w:rPr>
+        <w:t xml:space="preserve"> (Appendix M.39). The shares of §5.5 are therefore scoped to the prompt language and to the </w:t>
       </w:r>
       <w:r>
         <w:rPr>

</xml_diff>

<commit_message>
Sync reproduction package with the v0603 submission text (round-2 revisions)
</commit_message>
<xml_diff>
--- a/manuscript/PaperB_manuscript_PR_layout.docx
+++ b/manuscript/PaperB_manuscript_PR_layout.docx
@@ -1142,7 +1142,7 @@
           <w:i w:val="0"/>
           <w:sz w:val="20"/>
         </w:rPr>
-        <w:t>up to 43%</w:t>
+        <w:t>up to 42.5%</w:t>
       </w:r>
       <w:r>
         <w:rPr>
@@ -4225,7 +4225,43 @@
           <w:i w:val="0"/>
           <w:sz w:val="20"/>
         </w:rPr>
-        <w:t xml:space="preserve"> [39] on a self-hosted 4-bit AWQ [40] and GPTQ-W4 [41] stacks cross-checked against a BF16 hosted API, with an 8B scale control, a Qwen2.5-VL-7B [42] generation control and InternVL2.5-8B [4] as a second lineage; three directional arms use </w:t>
+        <w:t xml:space="preserve"> [39] on a self-hosted 4-bit AWQ [40] </w:t>
+      </w:r>
+      <w:r>
+        <w:rPr>
+          <w:rFonts w:ascii="Times New Roman" w:hAnsi="Times New Roman"/>
+          <w:b/>
+          <w:i w:val="0"/>
+          <w:sz w:val="20"/>
+        </w:rPr>
+        <w:t>community requantisation</w:t>
+      </w:r>
+      <w:r>
+        <w:rPr>
+          <w:rFonts w:ascii="Times New Roman" w:hAnsi="Times New Roman"/>
+          <w:b w:val="0"/>
+          <w:i w:val="0"/>
+          <w:sz w:val="20"/>
+        </w:rPr>
+        <w:t xml:space="preserve"> (</w:t>
+      </w:r>
+      <w:r>
+        <w:rPr>
+          <w:rFonts w:ascii="Times New Roman" w:hAnsi="Times New Roman"/>
+          <w:b w:val="0"/>
+          <w:i/>
+          <w:sz w:val="20"/>
+        </w:rPr>
+        <w:t>cyankiwi/Qwen3-VL-32B-Instruct-AWQ-4bit</w:t>
+      </w:r>
+      <w:r>
+        <w:rPr>
+          <w:rFonts w:ascii="Times New Roman" w:hAnsi="Times New Roman"/>
+          <w:b w:val="0"/>
+          <w:i w:val="0"/>
+          <w:sz w:val="20"/>
+        </w:rPr>
+        <w:t xml:space="preserve">; Appendix M.46) and GPTQ-W4 [41] stacks cross-checked against a BF16 hosted API, with an 8B scale control, a Qwen2.5-VL-7B [42] generation control and InternVL2.5-8B [4] as a second lineage; three directional arms use </w:t>
       </w:r>
       <w:r>
         <w:rPr>
@@ -8207,16 +8243,16 @@
           <w:i w:val="0"/>
           <w:sz w:val="20"/>
         </w:rPr>
-        <w:t>up to 43%</w:t>
-      </w:r>
-      <w:r>
-        <w:rPr>
-          <w:rFonts w:ascii="Times New Roman" w:hAnsi="Times New Roman"/>
-          <w:b w:val="0"/>
-          <w:i w:val="0"/>
-          <w:sz w:val="20"/>
-        </w:rPr>
-        <w:t xml:space="preserve"> in relative deviation (not an abstention share; Appendix C.3) — a floor set by the reporting stage, not by perception. </w:t>
+        <w:t>up to 42.5%</w:t>
+      </w:r>
+      <w:r>
+        <w:rPr>
+          <w:rFonts w:ascii="Times New Roman" w:hAnsi="Times New Roman"/>
+          <w:b w:val="0"/>
+          <w:i w:val="0"/>
+          <w:sz w:val="20"/>
+        </w:rPr>
+        <w:t xml:space="preserve"> in relative deviation (not an abstention share; Appendix J.8) — a floor set by the reporting stage, not by perception. </w:t>
       </w:r>
       <w:r>
         <w:rPr>
@@ -9416,7 +9452,7 @@
           <w:i w:val="0"/>
           <w:sz w:val="20"/>
         </w:rPr>
-        <w:t>up to 43%</w:t>
+        <w:t>up to 42.5%</w:t>
       </w:r>
       <w:r>
         <w:rPr>
@@ -13740,7 +13776,7 @@
           <w:i w:val="0"/>
           <w:sz w:val="20"/>
         </w:rPr>
-        <w:t xml:space="preserve"> (Appendix F.2 reconciles the three unit sets; M.37), . </w:t>
+        <w:t xml:space="preserve"> (Appendix F.2 reconciles the three unit sets; M.37). </w:t>
       </w:r>
       <w:r>
         <w:rPr>
@@ -14561,7 +14597,7 @@
           <w:i w:val="0"/>
           <w:sz w:val="20"/>
         </w:rPr>
-        <w:t xml:space="preserve">Seven counts of measurement fragility are disclosed with item-level impact in </w:t>
+        <w:t xml:space="preserve">Six counts of measurement fragility are disclosed with item-level impact in </w:t>
       </w:r>
       <w:r>
         <w:rPr>
@@ -15584,7 +15620,7 @@
           <w:i w:val="0"/>
           <w:sz w:val="20"/>
         </w:rPr>
-        <w:t>4-bit</w:t>
+        <w:t>third-party 4-bit</w:t>
       </w:r>
       <w:r>
         <w:rPr>

</xml_diff>

<commit_message>
Sync reproduction package with the v0605 submission text (round-2 close-out)
</commit_message>
<xml_diff>
--- a/manuscript/PaperB_manuscript_PR_layout.docx
+++ b/manuscript/PaperB_manuscript_PR_layout.docx
@@ -13380,7 +13380,43 @@
           <w:i w:val="0"/>
           <w:sz w:val="20"/>
         </w:rPr>
-        <w:t xml:space="preserve"> (36 units, k=3); a label-permutation test gives p&lt;5×10^-5; leaving out any single knob keeps it at </w:t>
+        <w:t xml:space="preserve"> (36 units, k=3), and </w:t>
+      </w:r>
+      <w:r>
+        <w:rPr>
+          <w:rFonts w:ascii="Times New Roman" w:hAnsi="Times New Roman"/>
+          <w:b/>
+          <w:i w:val="0"/>
+          <w:sz w:val="20"/>
+        </w:rPr>
+        <w:t>clustering by knob gives 0.913–0.994</w:t>
+      </w:r>
+      <w:r>
+        <w:rPr>
+          <w:rFonts w:ascii="Times New Roman" w:hAnsi="Times New Roman"/>
+          <w:b w:val="0"/>
+          <w:i w:val="0"/>
+          <w:sz w:val="20"/>
+        </w:rPr>
+        <w:t>; a label-permutation test gives p&lt;5×10^-5; leaving out any single knob (</w:t>
+      </w:r>
+      <w:r>
+        <w:rPr>
+          <w:rFonts w:ascii="Times New Roman" w:hAnsi="Times New Roman"/>
+          <w:b/>
+          <w:i w:val="0"/>
+          <w:sz w:val="20"/>
+        </w:rPr>
+        <w:t>36</w:t>
+      </w:r>
+      <w:r>
+        <w:rPr>
+          <w:rFonts w:ascii="Times New Roman" w:hAnsi="Times New Roman"/>
+          <w:b w:val="0"/>
+          <w:i w:val="0"/>
+          <w:sz w:val="20"/>
+        </w:rPr>
+        <w:t xml:space="preserve"> units) keeps it at </w:t>
       </w:r>
       <w:r>
         <w:rPr>
@@ -13642,42 +13678,6 @@
           <w:sz w:val="20"/>
         </w:rPr>
         <w:t>0.732</w:t>
-      </w:r>
-      <w:r>
-        <w:rPr>
-          <w:rFonts w:ascii="Times New Roman" w:hAnsi="Times New Roman"/>
-          <w:b w:val="0"/>
-          <w:i w:val="0"/>
-          <w:sz w:val="20"/>
-        </w:rPr>
-        <w:t xml:space="preserve">, per-knob </w:t>
-      </w:r>
-      <w:r>
-        <w:rPr>
-          <w:rFonts w:ascii="Times New Roman" w:hAnsi="Times New Roman"/>
-          <w:b/>
-          <w:i w:val="0"/>
-          <w:sz w:val="20"/>
-        </w:rPr>
-        <w:t>0.790</w:t>
-      </w:r>
-      <w:r>
-        <w:rPr>
-          <w:rFonts w:ascii="Times New Roman" w:hAnsi="Times New Roman"/>
-          <w:b w:val="0"/>
-          <w:i w:val="0"/>
-          <w:sz w:val="20"/>
-        </w:rPr>
-        <w:t xml:space="preserve">, per-unit </w:t>
-      </w:r>
-      <w:r>
-        <w:rPr>
-          <w:rFonts w:ascii="Times New Roman" w:hAnsi="Times New Roman"/>
-          <w:b/>
-          <w:i w:val="0"/>
-          <w:sz w:val="20"/>
-        </w:rPr>
-        <w:t>0.536</w:t>
       </w:r>
       <w:r>
         <w:rPr>
@@ -15521,7 +15521,25 @@
           <w:i w:val="0"/>
           <w:sz w:val="20"/>
         </w:rPr>
-        <w:t xml:space="preserve"> measured here, not to the lineage (six of seven further families fall short; M.19.15). The true-zero pools differ by </w:t>
+        <w:t xml:space="preserve"> measured here (</w:t>
+      </w:r>
+      <w:r>
+        <w:rPr>
+          <w:rFonts w:ascii="Times New Roman" w:hAnsi="Times New Roman"/>
+          <w:b/>
+          <w:i w:val="0"/>
+          <w:sz w:val="20"/>
+        </w:rPr>
+        <w:t>the share holds at BF16; the rate does not</w:t>
+      </w:r>
+      <w:r>
+        <w:rPr>
+          <w:rFonts w:ascii="Times New Roman" w:hAnsi="Times New Roman"/>
+          <w:b w:val="0"/>
+          <w:i w:val="0"/>
+          <w:sz w:val="20"/>
+        </w:rPr>
+        <w:t xml:space="preserve">; six of seven further families fall short; M.19.15). The true-zero pools differ by </w:t>
       </w:r>
       <w:r>
         <w:rPr>

</xml_diff>

<commit_message>
Sync reproduction package with the v0607 submission text (round-3 fixes)
</commit_message>
<xml_diff>
--- a/manuscript/PaperB_manuscript_PR_layout.docx
+++ b/manuscript/PaperB_manuscript_PR_layout.docx
@@ -106,7 +106,7 @@
           <w:i w:val="0"/>
           <w:sz w:val="20"/>
         </w:rPr>
-        <w:t xml:space="preserve"> of abstention for counting that separates a suppressed abstention from a true zero, and the </w:t>
+        <w:t xml:space="preserve"> of abstention that separates a suppressed abstention from a true zero, and the </w:t>
       </w:r>
       <w:r>
         <w:rPr>
@@ -178,25 +178,25 @@
           <w:i w:val="0"/>
           <w:sz w:val="20"/>
         </w:rPr>
-        <w:t xml:space="preserve">; the </w:t>
-      </w:r>
-      <w:r>
-        <w:rPr>
-          <w:rFonts w:ascii="Times New Roman" w:hAnsi="Times New Roman"/>
-          <w:b/>
-          <w:i w:val="0"/>
-          <w:sz w:val="20"/>
-        </w:rPr>
-        <w:t>unweighted</w:t>
-      </w:r>
-      <w:r>
-        <w:rPr>
-          <w:rFonts w:ascii="Times New Roman" w:hAnsi="Times New Roman"/>
-          <w:b w:val="0"/>
-          <w:i w:val="0"/>
-          <w:sz w:val="20"/>
-        </w:rPr>
-        <w:t xml:space="preserve"> convention gives </w:t>
+        <w:t xml:space="preserve">; the same abstention term under the </w:t>
+      </w:r>
+      <w:r>
+        <w:rPr>
+          <w:rFonts w:ascii="Times New Roman" w:hAnsi="Times New Roman"/>
+          <w:b/>
+          <w:i w:val="0"/>
+          <w:sz w:val="20"/>
+        </w:rPr>
+        <w:t>item-count</w:t>
+      </w:r>
+      <w:r>
+        <w:rPr>
+          <w:rFonts w:ascii="Times New Roman" w:hAnsi="Times New Roman"/>
+          <w:b w:val="0"/>
+          <w:i w:val="0"/>
+          <w:sz w:val="20"/>
+        </w:rPr>
+        <w:t xml:space="preserve"> convention is </w:t>
       </w:r>
       <w:r>
         <w:rPr>
@@ -304,7 +304,7 @@
           <w:i w:val="0"/>
           <w:sz w:val="20"/>
         </w:rPr>
-        <w:t xml:space="preserve"> (§5.7, Appendix M). The gate is the </w:t>
+        <w:t xml:space="preserve"> (§5.7, M). The gate is the </w:t>
       </w:r>
       <w:r>
         <w:rPr>
@@ -322,7 +322,7 @@
           <w:i w:val="0"/>
           <w:sz w:val="20"/>
         </w:rPr>
-        <w:t>, not enumeration demand (Appendix M.18). Abstention is a behaviour, not a capability ceiling: gated by legibility rather than count, removable by tiling (</w:t>
+        <w:t>, not enumeration demand (M.18). Abstention is a behaviour, not a capability ceiling: gated by legibility, removable by tiling (</w:t>
       </w:r>
       <w:r>
         <w:rPr>
@@ -412,7 +412,7 @@
           <w:i w:val="0"/>
           <w:sz w:val="20"/>
         </w:rPr>
-        <w:t xml:space="preserve">, same protocol and items), </w:t>
+        <w:t xml:space="preserve">, same protocol), </w:t>
       </w:r>
       <w:r>
         <w:rPr>
@@ -430,7 +430,7 @@
           <w:i w:val="0"/>
           <w:sz w:val="20"/>
         </w:rPr>
-        <w:t xml:space="preserve"> under a training-domain swap, and a defective reproduction as an </w:t>
+        <w:t xml:space="preserve"> under a domain swap, and a defective reproduction as an </w:t>
       </w:r>
       <w:r>
         <w:rPr>
@@ -448,7 +448,7 @@
           <w:i w:val="0"/>
           <w:sz w:val="20"/>
         </w:rPr>
-        <w:t xml:space="preserve"> (§6.1, Appendix K). What replicates under </w:t>
+        <w:t xml:space="preserve"> (§6.1, K). What replicates under </w:t>
       </w:r>
       <w:r>
         <w:rPr>
@@ -536,7 +536,7 @@
           <w:i w:val="0"/>
           <w:sz w:val="20"/>
         </w:rPr>
-        <w:t xml:space="preserve"> Object counting is used in surveillance and resource scheduling, where the costs of the two error directions are </w:t>
+        <w:t xml:space="preserve"> In surveillance and resource scheduling the two error directions are </w:t>
       </w:r>
       <w:r>
         <w:rPr>
@@ -554,7 +554,7 @@
           <w:i w:val="0"/>
           <w:sz w:val="20"/>
         </w:rPr>
-        <w:t xml:space="preserve">: missing objects and double-counting are not equivalent, and most safety and inventory settings prefer over- to under-counting. The </w:t>
+        <w:t xml:space="preserve">: missing objects and double-counting are not equivalent, and most safety and inventory settings prefer over- to under-counting. The error's </w:t>
       </w:r>
       <w:r>
         <w:rPr>
@@ -572,7 +572,7 @@
           <w:i w:val="0"/>
           <w:sz w:val="20"/>
         </w:rPr>
-        <w:t xml:space="preserve"> of the error has therefore remained implicit. Our first question is: </w:t>
+        <w:t xml:space="preserve"> has therefore remained implicit. Our first question is: </w:t>
       </w:r>
       <w:r>
         <w:rPr>
@@ -581,7 +581,7 @@
           <w:i/>
           <w:sz w:val="20"/>
         </w:rPr>
-        <w:t>can the error direction of a counting system be manipulated systematically, and what determines the range over which it can be moved?</w:t>
+        <w:t>can a counting system's error direction be manipulated systematically, and what sets the range over which it can be moved?</w:t>
       </w:r>
       <w:r>
         <w:rPr>
@@ -610,7 +610,7 @@
           <w:i w:val="0"/>
           <w:sz w:val="20"/>
         </w:rPr>
-        <w:t xml:space="preserve"> Before answering that, we examined a widely accepted premise: that vision-language models (VLMs) systematically underestimate dense scenes, which prior work treats as a </w:t>
+        <w:t xml:space="preserve"> Before that, we examined a widely accepted premise: that vision-language models (VLMs) systematically underestimate dense scenes, which prior work treats as a </w:t>
       </w:r>
       <w:r>
         <w:rPr>
@@ -718,7 +718,7 @@
           <w:i w:val="0"/>
           <w:sz w:val="20"/>
         </w:rPr>
-        <w:t xml:space="preserve">; over all arms and domains the share spans </w:t>
+        <w:t xml:space="preserve">; over all arms and domains it spans </w:t>
       </w:r>
       <w:r>
         <w:rPr>
@@ -736,7 +736,25 @@
           <w:i w:val="0"/>
           <w:sz w:val="20"/>
         </w:rPr>
-        <w:t xml:space="preserve"> — the </w:t>
+        <w:t xml:space="preserve"> — </w:t>
+      </w:r>
+      <w:r>
+        <w:rPr>
+          <w:rFonts w:ascii="Times New Roman" w:hAnsi="Times New Roman"/>
+          <w:b/>
+          <w:i w:val="0"/>
+          <w:sz w:val="20"/>
+        </w:rPr>
+        <w:t>0%</w:t>
+      </w:r>
+      <w:r>
+        <w:rPr>
+          <w:rFonts w:ascii="Times New Roman" w:hAnsi="Times New Roman"/>
+          <w:b w:val="0"/>
+          <w:i w:val="0"/>
+          <w:sz w:val="20"/>
+        </w:rPr>
+        <w:t xml:space="preserve"> on the </w:t>
       </w:r>
       <w:r>
         <w:rPr>
@@ -754,7 +772,43 @@
           <w:i w:val="0"/>
           <w:sz w:val="20"/>
         </w:rPr>
-        <w:t xml:space="preserve"> arm never abstains (Appendix J.1); the </w:t>
+        <w:t xml:space="preserve"> arm and </w:t>
+      </w:r>
+      <w:r>
+        <w:rPr>
+          <w:rFonts w:ascii="Times New Roman" w:hAnsi="Times New Roman"/>
+          <w:b/>
+          <w:i w:val="0"/>
+          <w:sz w:val="20"/>
+        </w:rPr>
+        <w:t>99.4%</w:t>
+      </w:r>
+      <w:r>
+        <w:rPr>
+          <w:rFonts w:ascii="Times New Roman" w:hAnsi="Times New Roman"/>
+          <w:b w:val="0"/>
+          <w:i w:val="0"/>
+          <w:sz w:val="20"/>
+        </w:rPr>
+        <w:t xml:space="preserve"> on ShanghaiTech-A under the </w:t>
+      </w:r>
+      <w:r>
+        <w:rPr>
+          <w:rFonts w:ascii="Times New Roman" w:hAnsi="Times New Roman"/>
+          <w:b w:val="0"/>
+          <w:i/>
+          <w:sz w:val="20"/>
+        </w:rPr>
+        <w:t>under</w:t>
+      </w:r>
+      <w:r>
+        <w:rPr>
+          <w:rFonts w:ascii="Times New Roman" w:hAnsi="Times New Roman"/>
+          <w:b w:val="0"/>
+          <w:i w:val="0"/>
+          <w:sz w:val="20"/>
+        </w:rPr>
+        <w:t xml:space="preserve"> arm (Appendix J.1); the </w:t>
       </w:r>
       <w:r>
         <w:rPr>
@@ -797,11 +851,92 @@
       <w:r>
         <w:rPr>
           <w:rFonts w:ascii="Times New Roman" w:hAnsi="Times New Roman"/>
-          <w:b w:val="0"/>
-          <w:i w:val="0"/>
-          <w:sz w:val="20"/>
-        </w:rPr>
-        <w:t>The distinction changes three things.</w:t>
+          <w:b/>
+          <w:i w:val="0"/>
+          <w:sz w:val="20"/>
+        </w:rPr>
+        <w:t>Why separating the two is not a matter of terminology.</w:t>
+      </w:r>
+      <w:r>
+        <w:rPr>
+          <w:rFonts w:ascii="Times New Roman" w:hAnsi="Times New Roman"/>
+          <w:b w:val="0"/>
+          <w:i w:val="0"/>
+          <w:sz w:val="20"/>
+        </w:rPr>
+        <w:t xml:space="preserve"> A model answering a literal 0 on 60% of dense images and underestimating by 20% on the rest reads, conventionally, as </w:t>
+      </w:r>
+      <w:r>
+        <w:rPr>
+          <w:rFonts w:ascii="Times New Roman" w:hAnsi="Times New Roman"/>
+          <w:b w:val="0"/>
+          <w:i/>
+          <w:sz w:val="20"/>
+        </w:rPr>
+        <w:t>mild underestimation</w:t>
+      </w:r>
+      <w:r>
+        <w:rPr>
+          <w:rFonts w:ascii="Times New Roman" w:hAnsi="Times New Roman"/>
+          <w:b w:val="0"/>
+          <w:i w:val="0"/>
+          <w:sz w:val="20"/>
+        </w:rPr>
+        <w:t xml:space="preserve"> — whereas on six images in ten it </w:t>
+      </w:r>
+      <w:r>
+        <w:rPr>
+          <w:rFonts w:ascii="Times New Roman" w:hAnsi="Times New Roman"/>
+          <w:b/>
+          <w:i w:val="0"/>
+          <w:sz w:val="20"/>
+        </w:rPr>
+        <w:t>answers nothing at all</w:t>
+      </w:r>
+      <w:r>
+        <w:rPr>
+          <w:rFonts w:ascii="Times New Roman" w:hAnsi="Times New Roman"/>
+          <w:b w:val="0"/>
+          <w:i w:val="0"/>
+          <w:sz w:val="20"/>
+        </w:rPr>
+        <w:t xml:space="preserve">. The remedies are opposite: retraining or calibration versus changing the </w:t>
+      </w:r>
+      <w:r>
+        <w:rPr>
+          <w:rFonts w:ascii="Times New Roman" w:hAnsi="Times New Roman"/>
+          <w:b/>
+          <w:i w:val="0"/>
+          <w:sz w:val="20"/>
+        </w:rPr>
+        <w:t>input protocol</w:t>
+      </w:r>
+      <w:r>
+        <w:rPr>
+          <w:rFonts w:ascii="Times New Roman" w:hAnsi="Times New Roman"/>
+          <w:b w:val="0"/>
+          <w:i w:val="0"/>
+          <w:sz w:val="20"/>
+        </w:rPr>
+        <w:t xml:space="preserve">. Worse, recording a refusal as "predicted 0" makes it </w:t>
+      </w:r>
+      <w:r>
+        <w:rPr>
+          <w:rFonts w:ascii="Times New Roman" w:hAnsi="Times New Roman"/>
+          <w:b/>
+          <w:i w:val="0"/>
+          <w:sz w:val="20"/>
+        </w:rPr>
+        <w:t>masquerade as conservative</w:t>
+      </w:r>
+      <w:r>
+        <w:rPr>
+          <w:rFonts w:ascii="Times New Roman" w:hAnsi="Times New Roman"/>
+          <w:b w:val="0"/>
+          <w:i w:val="0"/>
+          <w:sz w:val="20"/>
+        </w:rPr>
+        <w:t>, which a safety deployment least wants.</w:t>
       </w:r>
     </w:p>
     <w:p>
@@ -812,88 +947,124 @@
           <w:i w:val="0"/>
           <w:sz w:val="20"/>
         </w:rPr>
-        <w:t>Why separating the two is not a matter of terminology.</w:t>
-      </w:r>
-      <w:r>
-        <w:rPr>
-          <w:rFonts w:ascii="Times New Roman" w:hAnsi="Times New Roman"/>
-          <w:b w:val="0"/>
-          <w:i w:val="0"/>
-          <w:sz w:val="20"/>
-        </w:rPr>
-        <w:t xml:space="preserve"> A model answering a literal 0 on 60% of dense images and underestimating by 20% on the rest reads, under conventional aggregation, as </w:t>
-      </w:r>
-      <w:r>
-        <w:rPr>
-          <w:rFonts w:ascii="Times New Roman" w:hAnsi="Times New Roman"/>
-          <w:b w:val="0"/>
-          <w:i/>
-          <w:sz w:val="20"/>
-        </w:rPr>
-        <w:t>mild underestimation</w:t>
-      </w:r>
-      <w:r>
-        <w:rPr>
-          <w:rFonts w:ascii="Times New Roman" w:hAnsi="Times New Roman"/>
-          <w:b w:val="0"/>
-          <w:i w:val="0"/>
-          <w:sz w:val="20"/>
-        </w:rPr>
-        <w:t xml:space="preserve"> — whereas on six images in ten it produces </w:t>
-      </w:r>
-      <w:r>
-        <w:rPr>
-          <w:rFonts w:ascii="Times New Roman" w:hAnsi="Times New Roman"/>
-          <w:b/>
-          <w:i w:val="0"/>
-          <w:sz w:val="20"/>
-        </w:rPr>
-        <w:t>no estimate at all</w:t>
-      </w:r>
-      <w:r>
-        <w:rPr>
-          <w:rFonts w:ascii="Times New Roman" w:hAnsi="Times New Roman"/>
-          <w:b w:val="0"/>
-          <w:i w:val="0"/>
-          <w:sz w:val="20"/>
-        </w:rPr>
-        <w:t xml:space="preserve">. The remedies are opposite: retraining or calibration versus changing the </w:t>
-      </w:r>
-      <w:r>
-        <w:rPr>
-          <w:rFonts w:ascii="Times New Roman" w:hAnsi="Times New Roman"/>
-          <w:b/>
-          <w:i w:val="0"/>
-          <w:sz w:val="20"/>
-        </w:rPr>
-        <w:t>input protocol</w:t>
-      </w:r>
-      <w:r>
-        <w:rPr>
-          <w:rFonts w:ascii="Times New Roman" w:hAnsi="Times New Roman"/>
-          <w:b w:val="0"/>
-          <w:i w:val="0"/>
-          <w:sz w:val="20"/>
-        </w:rPr>
-        <w:t xml:space="preserve">. Worse, recording a refusal as "predicted 0" makes it </w:t>
-      </w:r>
-      <w:r>
-        <w:rPr>
-          <w:rFonts w:ascii="Times New Roman" w:hAnsi="Times New Roman"/>
-          <w:b/>
-          <w:i w:val="0"/>
-          <w:sz w:val="20"/>
-        </w:rPr>
-        <w:t>masquerade as conservative</w:t>
-      </w:r>
-      <w:r>
-        <w:rPr>
-          <w:rFonts w:ascii="Times New Roman" w:hAnsi="Times New Roman"/>
-          <w:b w:val="0"/>
-          <w:i w:val="0"/>
-          <w:sz w:val="20"/>
-        </w:rPr>
-        <w:t>, which a safety deployment least wants to correct.</w:t>
+        <w:t>The second half of the gap.</w:t>
+      </w:r>
+      <w:r>
+        <w:rPr>
+          <w:rFonts w:ascii="Times New Roman" w:hAnsi="Times New Roman"/>
+          <w:b w:val="0"/>
+          <w:i w:val="0"/>
+          <w:sz w:val="20"/>
+        </w:rPr>
+        <w:t xml:space="preserve"> Selective prediction and abstention-aware classification have well-developed criteria [2], but sit in </w:t>
+      </w:r>
+      <w:r>
+        <w:rPr>
+          <w:rFonts w:ascii="Times New Roman" w:hAnsi="Times New Roman"/>
+          <w:b/>
+          <w:i w:val="0"/>
+          <w:sz w:val="20"/>
+        </w:rPr>
+        <w:t>classification, question answering and reasoning</w:t>
+      </w:r>
+      <w:r>
+        <w:rPr>
+          <w:rFonts w:ascii="Times New Roman" w:hAnsi="Times New Roman"/>
+          <w:b w:val="0"/>
+          <w:i w:val="0"/>
+          <w:sz w:val="20"/>
+        </w:rPr>
+        <w:t xml:space="preserve">, where abstention is </w:t>
+      </w:r>
+      <w:r>
+        <w:rPr>
+          <w:rFonts w:ascii="Times New Roman" w:hAnsi="Times New Roman"/>
+          <w:b/>
+          <w:i w:val="0"/>
+          <w:sz w:val="20"/>
+        </w:rPr>
+        <w:t>explicitly declared</w:t>
+      </w:r>
+      <w:r>
+        <w:rPr>
+          <w:rFonts w:ascii="Times New Roman" w:hAnsi="Times New Roman"/>
+          <w:b w:val="0"/>
+          <w:i w:val="0"/>
+          <w:sz w:val="20"/>
+        </w:rPr>
+        <w:t xml:space="preserve">. Counting differs in three ways: abstention is </w:t>
+      </w:r>
+      <w:r>
+        <w:rPr>
+          <w:rFonts w:ascii="Times New Roman" w:hAnsi="Times New Roman"/>
+          <w:b/>
+          <w:i w:val="0"/>
+          <w:sz w:val="20"/>
+        </w:rPr>
+        <w:t>implicit</w:t>
+      </w:r>
+      <w:r>
+        <w:rPr>
+          <w:rFonts w:ascii="Times New Roman" w:hAnsi="Times New Roman"/>
+          <w:b w:val="0"/>
+          <w:i w:val="0"/>
+          <w:sz w:val="20"/>
+        </w:rPr>
+        <w:t xml:space="preserve"> (a literal 0, indistinguishable at the output level from an estimate of zero); costs are </w:t>
+      </w:r>
+      <w:r>
+        <w:rPr>
+          <w:rFonts w:ascii="Times New Roman" w:hAnsi="Times New Roman"/>
+          <w:b/>
+          <w:i w:val="0"/>
+          <w:sz w:val="20"/>
+        </w:rPr>
+        <w:t>asymmetric</w:t>
+      </w:r>
+      <w:r>
+        <w:rPr>
+          <w:rFonts w:ascii="Times New Roman" w:hAnsi="Times New Roman"/>
+          <w:b w:val="0"/>
+          <w:i w:val="0"/>
+          <w:sz w:val="20"/>
+        </w:rPr>
+        <w:t xml:space="preserve">, so its acceptability is a deployment question; and there is </w:t>
+      </w:r>
+      <w:r>
+        <w:rPr>
+          <w:rFonts w:ascii="Times New Roman" w:hAnsi="Times New Roman"/>
+          <w:b/>
+          <w:i w:val="0"/>
+          <w:sz w:val="20"/>
+        </w:rPr>
+        <w:t>no dependable confidence</w:t>
+      </w:r>
+      <w:r>
+        <w:rPr>
+          <w:rFonts w:ascii="Times New Roman" w:hAnsi="Times New Roman"/>
+          <w:b w:val="0"/>
+          <w:i w:val="0"/>
+          <w:sz w:val="20"/>
+        </w:rPr>
+        <w:t xml:space="preserve"> for a rejection rule. The framework cannot be transplanted directly — abstention must first be </w:t>
+      </w:r>
+      <w:r>
+        <w:rPr>
+          <w:rFonts w:ascii="Times New Roman" w:hAnsi="Times New Roman"/>
+          <w:b/>
+          <w:i w:val="0"/>
+          <w:sz w:val="20"/>
+        </w:rPr>
+        <w:t>operationalised and validated</w:t>
+      </w:r>
+      <w:r>
+        <w:rPr>
+          <w:rFonts w:ascii="Times New Roman" w:hAnsi="Times New Roman"/>
+          <w:b w:val="0"/>
+          <w:i w:val="0"/>
+          <w:sz w:val="20"/>
+        </w:rPr>
+        <w:t xml:space="preserve"> in the counting domain (§3.6, Proposition 1) — and that step exposed the received reading's problem.</w:t>
       </w:r>
     </w:p>
     <w:p>
@@ -904,124 +1075,70 @@
           <w:i w:val="0"/>
           <w:sz w:val="20"/>
         </w:rPr>
-        <w:t>The second half of the gap.</w:t>
-      </w:r>
-      <w:r>
-        <w:rPr>
-          <w:rFonts w:ascii="Times New Roman" w:hAnsi="Times New Roman"/>
-          <w:b w:val="0"/>
-          <w:i w:val="0"/>
-          <w:sz w:val="20"/>
-        </w:rPr>
-        <w:t xml:space="preserve"> Selective prediction and abstention-aware classification have well-developed criteria [2], but they sit in </w:t>
-      </w:r>
-      <w:r>
-        <w:rPr>
-          <w:rFonts w:ascii="Times New Roman" w:hAnsi="Times New Roman"/>
-          <w:b/>
-          <w:i w:val="0"/>
-          <w:sz w:val="20"/>
-        </w:rPr>
-        <w:t>classification, question answering and reasoning</w:t>
-      </w:r>
-      <w:r>
-        <w:rPr>
-          <w:rFonts w:ascii="Times New Roman" w:hAnsi="Times New Roman"/>
-          <w:b w:val="0"/>
-          <w:i w:val="0"/>
-          <w:sz w:val="20"/>
-        </w:rPr>
-        <w:t xml:space="preserve">, where abstention is </w:t>
-      </w:r>
-      <w:r>
-        <w:rPr>
-          <w:rFonts w:ascii="Times New Roman" w:hAnsi="Times New Roman"/>
-          <w:b/>
-          <w:i w:val="0"/>
-          <w:sz w:val="20"/>
-        </w:rPr>
-        <w:t>explicitly declared</w:t>
-      </w:r>
-      <w:r>
-        <w:rPr>
-          <w:rFonts w:ascii="Times New Roman" w:hAnsi="Times New Roman"/>
-          <w:b w:val="0"/>
-          <w:i w:val="0"/>
-          <w:sz w:val="20"/>
-        </w:rPr>
-        <w:t xml:space="preserve">. Counting differs in three ways: abstention is </w:t>
-      </w:r>
-      <w:r>
-        <w:rPr>
-          <w:rFonts w:ascii="Times New Roman" w:hAnsi="Times New Roman"/>
-          <w:b/>
-          <w:i w:val="0"/>
-          <w:sz w:val="20"/>
-        </w:rPr>
-        <w:t>implicit</w:t>
-      </w:r>
-      <w:r>
-        <w:rPr>
-          <w:rFonts w:ascii="Times New Roman" w:hAnsi="Times New Roman"/>
-          <w:b w:val="0"/>
-          <w:i w:val="0"/>
-          <w:sz w:val="20"/>
-        </w:rPr>
-        <w:t xml:space="preserve"> (a literal 0, indistinguishable at the output level from an estimate of zero); costs are </w:t>
-      </w:r>
-      <w:r>
-        <w:rPr>
-          <w:rFonts w:ascii="Times New Roman" w:hAnsi="Times New Roman"/>
-          <w:b/>
-          <w:i w:val="0"/>
-          <w:sz w:val="20"/>
-        </w:rPr>
-        <w:t>asymmetric</w:t>
-      </w:r>
-      <w:r>
-        <w:rPr>
-          <w:rFonts w:ascii="Times New Roman" w:hAnsi="Times New Roman"/>
-          <w:b w:val="0"/>
-          <w:i w:val="0"/>
-          <w:sz w:val="20"/>
-        </w:rPr>
-        <w:t xml:space="preserve">, so its acceptability is a deployment question; and there is </w:t>
-      </w:r>
-      <w:r>
-        <w:rPr>
-          <w:rFonts w:ascii="Times New Roman" w:hAnsi="Times New Roman"/>
-          <w:b/>
-          <w:i w:val="0"/>
-          <w:sz w:val="20"/>
-        </w:rPr>
-        <w:t>no dependable confidence</w:t>
-      </w:r>
-      <w:r>
-        <w:rPr>
-          <w:rFonts w:ascii="Times New Roman" w:hAnsi="Times New Roman"/>
-          <w:b w:val="0"/>
-          <w:i w:val="0"/>
-          <w:sz w:val="20"/>
-        </w:rPr>
-        <w:t xml:space="preserve"> on which to build a rejection rule. The framework cannot be transplanted directly — abstention must first be </w:t>
-      </w:r>
-      <w:r>
-        <w:rPr>
-          <w:rFonts w:ascii="Times New Roman" w:hAnsi="Times New Roman"/>
-          <w:b/>
-          <w:i w:val="0"/>
-          <w:sz w:val="20"/>
-        </w:rPr>
-        <w:t>operationalised and that operationalisation validated</w:t>
-      </w:r>
-      <w:r>
-        <w:rPr>
-          <w:rFonts w:ascii="Times New Roman" w:hAnsi="Times New Roman"/>
-          <w:b w:val="0"/>
-          <w:i w:val="0"/>
-          <w:sz w:val="20"/>
-        </w:rPr>
-        <w:t xml:space="preserve"> in the counting domain (§3.6, Proposition 1) — and it was this step that exposed the problem with the received reading.</w:t>
+        <w:t>Four properties of abstention.</w:t>
+      </w:r>
+      <w:r>
+        <w:rPr>
+          <w:rFonts w:ascii="Times New Roman" w:hAnsi="Times New Roman"/>
+          <w:b w:val="0"/>
+          <w:i w:val="0"/>
+          <w:sz w:val="20"/>
+        </w:rPr>
+        <w:t xml:space="preserve"> </w:t>
+      </w:r>
+      <w:r>
+        <w:rPr>
+          <w:rFonts w:ascii="Times New Roman" w:hAnsi="Times New Roman"/>
+          <w:b/>
+          <w:i w:val="0"/>
+          <w:sz w:val="20"/>
+        </w:rPr>
+        <w:t>① Measurable, with a lineage-specific channel.</w:t>
+      </w:r>
+      <w:r>
+        <w:rPr>
+          <w:rFonts w:ascii="Times New Roman" w:hAnsi="Times New Roman"/>
+          <w:b w:val="0"/>
+          <w:i w:val="0"/>
+          <w:sz w:val="20"/>
+        </w:rPr>
+        <w:t xml:space="preserve"> Rather than stipulate that </w:t>
+      </w:r>
+      <w:r>
+        <w:rPr>
+          <w:rFonts w:ascii="Times New Roman" w:hAnsi="Times New Roman"/>
+          <w:b w:val="0"/>
+          <w:i/>
+          <w:sz w:val="20"/>
+        </w:rPr>
+        <w:t>pred = 0</w:t>
+      </w:r>
+      <w:r>
+        <w:rPr>
+          <w:rFonts w:ascii="Times New Roman" w:hAnsi="Times New Roman"/>
+          <w:b w:val="0"/>
+          <w:i w:val="0"/>
+          <w:sz w:val="20"/>
+        </w:rPr>
+        <w:t xml:space="preserve"> means abstention, we give an </w:t>
+      </w:r>
+      <w:r>
+        <w:rPr>
+          <w:rFonts w:ascii="Times New Roman" w:hAnsi="Times New Roman"/>
+          <w:b/>
+          <w:i w:val="0"/>
+          <w:sz w:val="20"/>
+        </w:rPr>
+        <w:t>empirical criterion</w:t>
+      </w:r>
+      <w:r>
+        <w:rPr>
+          <w:rFonts w:ascii="Times New Roman" w:hAnsi="Times New Roman"/>
+          <w:b w:val="0"/>
+          <w:i w:val="0"/>
+          <w:sz w:val="20"/>
+        </w:rPr>
+        <w:t>: a lineage abstaining mainly in language would show an answered-zero-to-refusal ratio approaching 0.</w:t>
       </w:r>
     </w:p>
     <w:p>
@@ -1032,70 +1149,88 @@
           <w:i w:val="0"/>
           <w:sz w:val="20"/>
         </w:rPr>
-        <w:t>Four properties of abstention (main results).</w:t>
-      </w:r>
-      <w:r>
-        <w:rPr>
-          <w:rFonts w:ascii="Times New Roman" w:hAnsi="Times New Roman"/>
-          <w:b w:val="0"/>
-          <w:i w:val="0"/>
-          <w:sz w:val="20"/>
-        </w:rPr>
-        <w:t xml:space="preserve"> </w:t>
-      </w:r>
-      <w:r>
-        <w:rPr>
-          <w:rFonts w:ascii="Times New Roman" w:hAnsi="Times New Roman"/>
-          <w:b/>
-          <w:i w:val="0"/>
-          <w:sz w:val="20"/>
-        </w:rPr>
-        <w:t>① Measurable, with a lineage-specific expression channel.</w:t>
-      </w:r>
-      <w:r>
-        <w:rPr>
-          <w:rFonts w:ascii="Times New Roman" w:hAnsi="Times New Roman"/>
-          <w:b w:val="0"/>
-          <w:i w:val="0"/>
-          <w:sz w:val="20"/>
-        </w:rPr>
-        <w:t xml:space="preserve"> Rather than stipulate that </w:t>
-      </w:r>
-      <w:r>
-        <w:rPr>
-          <w:rFonts w:ascii="Times New Roman" w:hAnsi="Times New Roman"/>
-          <w:b w:val="0"/>
-          <w:i/>
-          <w:sz w:val="20"/>
-        </w:rPr>
-        <w:t>pred = 0</w:t>
-      </w:r>
-      <w:r>
-        <w:rPr>
-          <w:rFonts w:ascii="Times New Roman" w:hAnsi="Times New Roman"/>
-          <w:b w:val="0"/>
-          <w:i w:val="0"/>
-          <w:sz w:val="20"/>
-        </w:rPr>
-        <w:t xml:space="preserve"> means abstention, we give an </w:t>
-      </w:r>
-      <w:r>
-        <w:rPr>
-          <w:rFonts w:ascii="Times New Roman" w:hAnsi="Times New Roman"/>
-          <w:b/>
-          <w:i w:val="0"/>
-          <w:sz w:val="20"/>
-        </w:rPr>
-        <w:t>empirical criterion</w:t>
-      </w:r>
-      <w:r>
-        <w:rPr>
-          <w:rFonts w:ascii="Times New Roman" w:hAnsi="Times New Roman"/>
-          <w:b w:val="0"/>
-          <w:i w:val="0"/>
-          <w:sz w:val="20"/>
-        </w:rPr>
-        <w:t>: if a lineage abstained mainly in natural language, its ratio of answered-zero to textual refusal would approach 0.</w:t>
+        <w:t>② Gated by per-instance legibility, not by target count</w:t>
+      </w:r>
+      <w:r>
+        <w:rPr>
+          <w:rFonts w:ascii="Times New Roman" w:hAnsi="Times New Roman"/>
+          <w:b w:val="0"/>
+          <w:i w:val="0"/>
+          <w:sz w:val="20"/>
+        </w:rPr>
+        <w:t xml:space="preserve">, and </w:t>
+      </w:r>
+      <w:r>
+        <w:rPr>
+          <w:rFonts w:ascii="Times New Roman" w:hAnsi="Times New Roman"/>
+          <w:b/>
+          <w:i w:val="0"/>
+          <w:sz w:val="20"/>
+        </w:rPr>
+        <w:t>decoupled from directional bias</w:t>
+      </w:r>
+      <w:r>
+        <w:rPr>
+          <w:rFonts w:ascii="Times New Roman" w:hAnsi="Times New Roman"/>
+          <w:b w:val="0"/>
+          <w:i w:val="0"/>
+          <w:sz w:val="20"/>
+        </w:rPr>
+        <w:t xml:space="preserve">: on count-controlled grids, arrangement and blur alone drive abstention from 0% to 90%, while on clean synthetic dots the base arm never abstains yet still underestimates by </w:t>
+      </w:r>
+      <w:r>
+        <w:rPr>
+          <w:rFonts w:ascii="Times New Roman" w:hAnsi="Times New Roman"/>
+          <w:b/>
+          <w:i w:val="0"/>
+          <w:sz w:val="20"/>
+        </w:rPr>
+        <w:t>up to 42.5%</w:t>
+      </w:r>
+      <w:r>
+        <w:rPr>
+          <w:rFonts w:ascii="Times New Roman" w:hAnsi="Times New Roman"/>
+          <w:b w:val="0"/>
+          <w:i w:val="0"/>
+          <w:sz w:val="20"/>
+        </w:rPr>
+        <w:t xml:space="preserve">, and in microscopy it is </w:t>
+      </w:r>
+      <w:r>
+        <w:rPr>
+          <w:rFonts w:ascii="Times New Roman" w:hAnsi="Times New Roman"/>
+          <w:b/>
+          <w:i w:val="0"/>
+          <w:sz w:val="20"/>
+        </w:rPr>
+        <w:t>0.0%</w:t>
+      </w:r>
+      <w:r>
+        <w:rPr>
+          <w:rFonts w:ascii="Times New Roman" w:hAnsi="Times New Roman"/>
+          <w:b w:val="0"/>
+          <w:i w:val="0"/>
+          <w:sz w:val="20"/>
+        </w:rPr>
+        <w:t xml:space="preserve"> with a bias of </w:t>
+      </w:r>
+      <w:r>
+        <w:rPr>
+          <w:rFonts w:ascii="Times New Roman" w:hAnsi="Times New Roman"/>
+          <w:b/>
+          <w:i w:val="0"/>
+          <w:sz w:val="20"/>
+        </w:rPr>
+        <w:t>−50.1%</w:t>
+      </w:r>
+      <w:r>
+        <w:rPr>
+          <w:rFonts w:ascii="Times New Roman" w:hAnsi="Times New Roman"/>
+          <w:b w:val="0"/>
+          <w:i w:val="0"/>
+          <w:sz w:val="20"/>
+        </w:rPr>
+        <w:t xml:space="preserve"> (§5.6, §5.7).</w:t>
       </w:r>
     </w:p>
     <w:p>
@@ -1106,98 +1241,6 @@
           <w:i w:val="0"/>
           <w:sz w:val="20"/>
         </w:rPr>
-        <w:t>② Gated by per-instance legibility, not by target count</w:t>
-      </w:r>
-      <w:r>
-        <w:rPr>
-          <w:rFonts w:ascii="Times New Roman" w:hAnsi="Times New Roman"/>
-          <w:b w:val="0"/>
-          <w:i w:val="0"/>
-          <w:sz w:val="20"/>
-        </w:rPr>
-        <w:t xml:space="preserve">, and </w:t>
-      </w:r>
-      <w:r>
-        <w:rPr>
-          <w:rFonts w:ascii="Times New Roman" w:hAnsi="Times New Roman"/>
-          <w:b/>
-          <w:i w:val="0"/>
-          <w:sz w:val="20"/>
-        </w:rPr>
-        <w:t>decoupled from directional bias</w:t>
-      </w:r>
-      <w:r>
-        <w:rPr>
-          <w:rFonts w:ascii="Times New Roman" w:hAnsi="Times New Roman"/>
-          <w:b w:val="0"/>
-          <w:i w:val="0"/>
-          <w:sz w:val="20"/>
-        </w:rPr>
-        <w:t xml:space="preserve">: on count-controlled grids, arrangement and blur alone drive abstention from 0% to 90%, while on clean synthetic dots the base arm never abstains yet still underestimates by </w:t>
-      </w:r>
-      <w:r>
-        <w:rPr>
-          <w:rFonts w:ascii="Times New Roman" w:hAnsi="Times New Roman"/>
-          <w:b/>
-          <w:i w:val="0"/>
-          <w:sz w:val="20"/>
-        </w:rPr>
-        <w:t>up to 42.5%</w:t>
-      </w:r>
-      <w:r>
-        <w:rPr>
-          <w:rFonts w:ascii="Times New Roman" w:hAnsi="Times New Roman"/>
-          <w:b w:val="0"/>
-          <w:i w:val="0"/>
-          <w:sz w:val="20"/>
-        </w:rPr>
-        <w:t xml:space="preserve">, and in microscopy abstention is </w:t>
-      </w:r>
-      <w:r>
-        <w:rPr>
-          <w:rFonts w:ascii="Times New Roman" w:hAnsi="Times New Roman"/>
-          <w:b/>
-          <w:i w:val="0"/>
-          <w:sz w:val="20"/>
-        </w:rPr>
-        <w:t>0.0%</w:t>
-      </w:r>
-      <w:r>
-        <w:rPr>
-          <w:rFonts w:ascii="Times New Roman" w:hAnsi="Times New Roman"/>
-          <w:b w:val="0"/>
-          <w:i w:val="0"/>
-          <w:sz w:val="20"/>
-        </w:rPr>
-        <w:t xml:space="preserve"> with a bias of </w:t>
-      </w:r>
-      <w:r>
-        <w:rPr>
-          <w:rFonts w:ascii="Times New Roman" w:hAnsi="Times New Roman"/>
-          <w:b/>
-          <w:i w:val="0"/>
-          <w:sz w:val="20"/>
-        </w:rPr>
-        <w:t>−50.1%</w:t>
-      </w:r>
-      <w:r>
-        <w:rPr>
-          <w:rFonts w:ascii="Times New Roman" w:hAnsi="Times New Roman"/>
-          <w:b w:val="0"/>
-          <w:i w:val="0"/>
-          <w:sz w:val="20"/>
-        </w:rPr>
-        <w:t xml:space="preserve"> (§5.6, §5.7).</w:t>
-      </w:r>
-    </w:p>
-    <w:p>
-      <w:r>
-        <w:rPr>
-          <w:rFonts w:ascii="Times New Roman" w:hAnsi="Times New Roman"/>
-          <w:b/>
-          <w:i w:val="0"/>
-          <w:sz w:val="20"/>
-        </w:rPr>
         <w:t>③ Switchable from both ends</w:t>
       </w:r>
       <w:r>
@@ -1207,7 +1250,7 @@
           <w:i w:val="0"/>
           <w:sz w:val="20"/>
         </w:rPr>
-        <w:t>, because it is a behaviour: tiling (</w:t>
+        <w:t>, being a behaviour: tiling (</w:t>
       </w:r>
       <w:r>
         <w:rPr>
@@ -1644,25 +1687,7 @@
           <w:i w:val="0"/>
           <w:sz w:val="20"/>
         </w:rPr>
-        <w:t xml:space="preserve"> Two empirical findings, plus the apparatus that makes them checkable. We present the identities of §3.8 and the appendices as </w:t>
-      </w:r>
-      <w:r>
-        <w:rPr>
-          <w:rFonts w:ascii="Times New Roman" w:hAnsi="Times New Roman"/>
-          <w:b/>
-          <w:i w:val="0"/>
-          <w:sz w:val="20"/>
-        </w:rPr>
-        <w:t>that apparatus</w:t>
-      </w:r>
-      <w:r>
-        <w:rPr>
-          <w:rFonts w:ascii="Times New Roman" w:hAnsi="Times New Roman"/>
-          <w:b w:val="0"/>
-          <w:i w:val="0"/>
-          <w:sz w:val="20"/>
-        </w:rPr>
-        <w:t xml:space="preserve">, not as findings: they are arithmetic, and their role is that every headline number is either recomputed from the released records or labelled a transcription (Appendix F.9). 1. </w:t>
+        <w:t xml:space="preserve"> Two empirical findings, plus the apparatus that makes them checkable: the identities of §3.8 and the appendices, which are arithmetic rather than findings, and whose role is that every headline number is recomputed from the released records or labelled a transcription (Appendix F.9). 1. </w:t>
       </w:r>
       <w:r>
         <w:rPr>
@@ -1788,25 +1813,61 @@
           <w:i w:val="0"/>
           <w:sz w:val="20"/>
         </w:rPr>
-        <w:t xml:space="preserve"> (§5.7, M.19), one of the seven having offered only </w:t>
-      </w:r>
-      <w:r>
-        <w:rPr>
-          <w:rFonts w:ascii="Times New Roman" w:hAnsi="Times New Roman"/>
-          <w:b/>
-          <w:i w:val="0"/>
-          <w:sz w:val="20"/>
-        </w:rPr>
-        <w:t>9 zeros</w:t>
-      </w:r>
-      <w:r>
-        <w:rPr>
-          <w:rFonts w:ascii="Times New Roman" w:hAnsi="Times New Roman"/>
-          <w:b w:val="0"/>
-          <w:i w:val="0"/>
-          <w:sz w:val="20"/>
-        </w:rPr>
-        <w:t xml:space="preserve"> to remove. The </w:t>
+        <w:t xml:space="preserve"> (§5.7, M.19), two of the seven having offered only </w:t>
+      </w:r>
+      <w:r>
+        <w:rPr>
+          <w:rFonts w:ascii="Times New Roman" w:hAnsi="Times New Roman"/>
+          <w:b/>
+          <w:i w:val="0"/>
+          <w:sz w:val="20"/>
+        </w:rPr>
+        <w:t>9</w:t>
+      </w:r>
+      <w:r>
+        <w:rPr>
+          <w:rFonts w:ascii="Times New Roman" w:hAnsi="Times New Roman"/>
+          <w:b w:val="0"/>
+          <w:i w:val="0"/>
+          <w:sz w:val="20"/>
+        </w:rPr>
+        <w:t xml:space="preserve"> and </w:t>
+      </w:r>
+      <w:r>
+        <w:rPr>
+          <w:rFonts w:ascii="Times New Roman" w:hAnsi="Times New Roman"/>
+          <w:b/>
+          <w:i w:val="0"/>
+          <w:sz w:val="20"/>
+        </w:rPr>
+        <w:t>156 zeros</w:t>
+      </w:r>
+      <w:r>
+        <w:rPr>
+          <w:rFonts w:ascii="Times New Roman" w:hAnsi="Times New Roman"/>
+          <w:b w:val="0"/>
+          <w:i w:val="0"/>
+          <w:sz w:val="20"/>
+        </w:rPr>
+        <w:t xml:space="preserve"> to remove (</w:t>
+      </w:r>
+      <w:r>
+        <w:rPr>
+          <w:rFonts w:ascii="Times New Roman" w:hAnsi="Times New Roman"/>
+          <w:b/>
+          <w:i w:val="0"/>
+          <w:sz w:val="20"/>
+        </w:rPr>
+        <w:t>2</w:t>
+      </w:r>
+      <w:r>
+        <w:rPr>
+          <w:rFonts w:ascii="Times New Roman" w:hAnsi="Times New Roman"/>
+          <w:b w:val="0"/>
+          <w:i w:val="0"/>
+          <w:sz w:val="20"/>
+        </w:rPr>
+        <w:t xml:space="preserve"> of the latter from the dense domains). The </w:t>
       </w:r>
       <w:r>
         <w:rPr>
@@ -1860,25 +1921,7 @@
           <w:i w:val="0"/>
           <w:sz w:val="20"/>
         </w:rPr>
-        <w:t xml:space="preserve">, and on the cross-family grid the share exceeds 50% on </w:t>
-      </w:r>
-      <w:r>
-        <w:rPr>
-          <w:rFonts w:ascii="Times New Roman" w:hAnsi="Times New Roman"/>
-          <w:b/>
-          <w:i w:val="0"/>
-          <w:sz w:val="20"/>
-        </w:rPr>
-        <w:t>one</w:t>
-      </w:r>
-      <w:r>
-        <w:rPr>
-          <w:rFonts w:ascii="Times New Roman" w:hAnsi="Times New Roman"/>
-          <w:b w:val="0"/>
-          <w:i w:val="0"/>
-          <w:sz w:val="20"/>
-        </w:rPr>
-        <w:t xml:space="preserve"> build — the one that defined the pool; M.19.15) and the aerial-scene one </w:t>
+        <w:t xml:space="preserve">, and on the cross-family grid the share exceeds 50% only at the two precisions of the defining checkpoint; M.19.15) and the aerial-scene one </w:t>
       </w:r>
       <w:r>
         <w:rPr>
@@ -2266,7 +2309,7 @@
           <w:i w:val="0"/>
           <w:sz w:val="20"/>
         </w:rPr>
-        <w:t>. What each does not cover is in §8.</w:t>
+        <w:t>.</w:t>
       </w:r>
     </w:p>
     <w:p>
@@ -3001,7 +3044,7 @@
           <w:i w:val="0"/>
           <w:sz w:val="20"/>
         </w:rPr>
-        <w:t xml:space="preserve">Our VLM indicators initially came from single samples. Repeat sampling shows that item-level reproducibility for a hosted API is only about </w:t>
+        <w:t xml:space="preserve">Our VLM indicators initially came from single samples. Repeat sampling shows item-level reproducibility for a hosted API to be only about </w:t>
       </w:r>
       <w:r>
         <w:rPr>
@@ -3019,18 +3062,7 @@
           <w:i w:val="0"/>
           <w:sz w:val="20"/>
         </w:rPr>
-        <w:t>, while a locally controlled stack agrees at essentially 100%, and that aggregate quantities are far more stable.</w:t>
-      </w:r>
-    </w:p>
-    <w:p>
-      <w:r>
-        <w:rPr>
-          <w:rFonts w:ascii="Times New Roman" w:hAnsi="Times New Roman"/>
-          <w:b w:val="0"/>
-          <w:i w:val="0"/>
-          <w:sz w:val="20"/>
-        </w:rPr>
-        <w:t>(Appendix A)</w:t>
+        <w:t>, while a locally controlled stack agrees at essentially 100%, and that aggregate quantities are far more stable (Appendix A).</w:t>
       </w:r>
     </w:p>
     <w:p>
@@ -6136,7 +6168,7 @@
           <w:i w:val="0"/>
           <w:sz w:val="20"/>
         </w:rPr>
-        <w:t xml:space="preserve">: under the </w:t>
+        <w:t xml:space="preserve">: under </w:t>
       </w:r>
       <w:r>
         <w:rPr>
@@ -6154,7 +6186,7 @@
           <w:i w:val="0"/>
           <w:sz w:val="20"/>
         </w:rPr>
-        <w:t xml:space="preserve"> contract three of four builds answer zero on </w:t>
+        <w:t xml:space="preserve"> three of four builds answer zero on </w:t>
       </w:r>
       <w:r>
         <w:rPr>
@@ -6172,7 +6204,7 @@
           <w:i w:val="0"/>
           <w:sz w:val="20"/>
         </w:rPr>
-        <w:t xml:space="preserve"> of the aerial pool S-1, and only one </w:t>
+        <w:t xml:space="preserve"> of aerial pool S-1, and only one </w:t>
       </w:r>
       <w:r>
         <w:rPr>
@@ -6208,7 +6240,7 @@
           <w:i w:val="0"/>
           <w:sz w:val="20"/>
         </w:rPr>
-        <w:t xml:space="preserve"> of the second pool's items (Appendix M.21). Third-channel sensitivity is in Appendix J.5.</w:t>
+        <w:t xml:space="preserve"> of the second pool (Appendix M.21). Third-channel sensitivity is in Appendix J.5.</w:t>
       </w:r>
     </w:p>
     <w:p>
@@ -6289,7 +6321,7 @@
           <w:i w:val="0"/>
           <w:sz w:val="20"/>
         </w:rPr>
-        <w:t xml:space="preserve"> appear where their claim is stated; the list is in </w:t>
+        <w:t xml:space="preserve"> appear where their claim is stated (</w:t>
       </w:r>
       <w:r>
         <w:rPr>
@@ -6307,7 +6339,7 @@
           <w:i w:val="0"/>
           <w:sz w:val="20"/>
         </w:rPr>
-        <w:t>.</w:t>
+        <w:t>).</w:t>
       </w:r>
     </w:p>
     <w:p>
@@ -7070,21 +7102,28 @@
         <w:rPr>
           <w:rFonts w:ascii="Times New Roman" w:hAnsi="Times New Roman"/>
           <w:b w:val="0"/>
-          <w:i w:val="0"/>
-          <w:sz w:val="20"/>
-        </w:rPr>
-        <w:t>* for YOLO (UCF 0.121 → 0.176 → 0.173; ShanghaiTech-A unreachable → 0.260 → 0.183).</w:t>
-      </w:r>
-    </w:p>
-    <w:p>
-      <w:r>
-        <w:rPr>
-          <w:rFonts w:ascii="Times New Roman" w:hAnsi="Times New Roman"/>
-          <w:b w:val="0"/>
-          <w:i w:val="0"/>
-          <w:sz w:val="20"/>
-        </w:rPr>
-        <w:t>(Appendix E)</w:t>
+          <w:i/>
+          <w:sz w:val="20"/>
+        </w:rPr>
+        <w:t xml:space="preserve"> for YOLO (UCF 0.121 → 0.176 → 0.173; ShanghaiTech-A unreachable → 0.260 → 0.183). Full ladders in </w:t>
+      </w:r>
+      <w:r>
+        <w:rPr>
+          <w:rFonts w:ascii="Times New Roman" w:hAnsi="Times New Roman"/>
+          <w:b w:val="0"/>
+          <w:i/>
+          <w:sz w:val="20"/>
+        </w:rPr>
+        <w:t>Appendix E</w:t>
+      </w:r>
+      <w:r>
+        <w:rPr>
+          <w:rFonts w:ascii="Times New Roman" w:hAnsi="Times New Roman"/>
+          <w:b w:val="0"/>
+          <w:i w:val="0"/>
+          <w:sz w:val="20"/>
+        </w:rPr>
+        <w:t>*.</w:t>
       </w:r>
     </w:p>
     <w:p>
@@ -7635,7 +7674,7 @@
                 <w:i w:val="0"/>
                 <w:sz w:val="20"/>
               </w:rPr>
-              <w:t>abstention rate (unweighted)</w:t>
+              <w:t>abstention term, item-count convention</w:t>
             </w:r>
           </w:p>
         </w:tc>
@@ -8038,7 +8077,7 @@
           <w:i/>
           <w:sz w:val="20"/>
         </w:rPr>
-        <w:t>(Terms are pp of the pooled relative deviation and sum to it exactly; S is the ground-truth-weighted share and the last column the same abstention term under the item-count convention. Appendix J.1.)</w:t>
+        <w:t>(Terms are pp of the pooled relative deviation and sum to it exactly; S is the ground-truth-weighted share and the last column the same term under the item-count convention. Appendix J.1.)</w:t>
       </w:r>
     </w:p>
     <w:p>
@@ -13263,7 +13302,7 @@
           <w:i w:val="0"/>
           <w:sz w:val="20"/>
         </w:rPr>
-        <w:t>The ordering is stable under the two obvious deflations, and we report it with intervals.</w:t>
+        <w:t>The ordering is stable under the two obvious deflations, with intervals.</w:t>
       </w:r>
       <w:r>
         <w:rPr>
@@ -13434,7 +13473,7 @@
           <w:i w:val="0"/>
           <w:sz w:val="20"/>
         </w:rPr>
-        <w:t xml:space="preserve">; per-unit spans with their own caliber intervals are plotted in </w:t>
+        <w:t xml:space="preserve">; per-unit spans with caliber intervals are plotted in </w:t>
       </w:r>
       <w:r>
         <w:rPr>
@@ -13542,25 +13581,7 @@
           <w:i w:val="0"/>
           <w:sz w:val="20"/>
         </w:rPr>
-        <w:t xml:space="preserve"> splits — but </w:t>
-      </w:r>
-      <w:r>
-        <w:rPr>
-          <w:rFonts w:ascii="Times New Roman" w:hAnsi="Times New Roman"/>
-          <w:b/>
-          <w:i w:val="0"/>
-          <w:sz w:val="20"/>
-        </w:rPr>
-        <w:t>not</w:t>
-      </w:r>
-      <w:r>
-        <w:rPr>
-          <w:rFonts w:ascii="Times New Roman" w:hAnsi="Times New Roman"/>
-          <w:b w:val="0"/>
-          <w:i w:val="0"/>
-          <w:sz w:val="20"/>
-        </w:rPr>
-        <w:t xml:space="preserve"> when each unit is re-fitted independently: </w:t>
+        <w:t xml:space="preserve"> splits — but not when each unit is re-fitted independently: </w:t>
       </w:r>
       <w:r>
         <w:rPr>
@@ -13605,7 +13626,7 @@
           <w:i w:val="0"/>
           <w:sz w:val="20"/>
         </w:rPr>
-        <w:t>0.571 / 0.548</w:t>
+        <w:t>0.571 / 0.521</w:t>
       </w:r>
       <w:r>
         <w:rPr>
@@ -14597,7 +14618,7 @@
           <w:i w:val="0"/>
           <w:sz w:val="20"/>
         </w:rPr>
-        <w:t xml:space="preserve">Six counts of measurement fragility are disclosed with item-level impact in </w:t>
+        <w:t xml:space="preserve">Six counts of measurement fragility are itemised with item-level impact in </w:t>
       </w:r>
       <w:r>
         <w:rPr>
@@ -14615,7 +14636,7 @@
           <w:i w:val="0"/>
           <w:sz w:val="20"/>
         </w:rPr>
-        <w:t xml:space="preserve">. </w:t>
+        <w:t xml:space="preserve">: </w:t>
       </w:r>
       <w:r>
         <w:rPr>
@@ -14633,7 +14654,25 @@
           <w:i w:val="0"/>
           <w:sz w:val="20"/>
         </w:rPr>
-        <w:t xml:space="preserve"> are itemised there, one of them a dead parse branch; </w:t>
+        <w:t xml:space="preserve">, one of them a dead parse branch recorded as a </w:t>
+      </w:r>
+      <w:r>
+        <w:rPr>
+          <w:rFonts w:ascii="Times New Roman" w:hAnsi="Times New Roman"/>
+          <w:b/>
+          <w:i w:val="0"/>
+          <w:sz w:val="20"/>
+        </w:rPr>
+        <w:t>third instrument finding</w:t>
+      </w:r>
+      <w:r>
+        <w:rPr>
+          <w:rFonts w:ascii="Times New Roman" w:hAnsi="Times New Roman"/>
+          <w:b w:val="0"/>
+          <w:i w:val="0"/>
+          <w:sz w:val="20"/>
+        </w:rPr>
+        <w:t xml:space="preserve">; </w:t>
       </w:r>
       <w:r>
         <w:rPr>
@@ -14651,7 +14690,7 @@
           <w:i w:val="0"/>
           <w:sz w:val="20"/>
         </w:rPr>
-        <w:t xml:space="preserve"> is characterised below; </w:t>
+        <w:t xml:space="preserve">, characterised below; </w:t>
       </w:r>
       <w:r>
         <w:rPr>
@@ -14669,7 +14708,7 @@
           <w:i w:val="0"/>
           <w:sz w:val="20"/>
         </w:rPr>
-        <w:t xml:space="preserve"> carries a residue ledger; </w:t>
+        <w:t xml:space="preserve">, with a residue ledger; </w:t>
       </w:r>
       <w:r>
         <w:rPr>
@@ -14687,7 +14726,7 @@
           <w:i w:val="0"/>
           <w:sz w:val="20"/>
         </w:rPr>
-        <w:t xml:space="preserve"> records what the graded tiers hold; </w:t>
+        <w:t xml:space="preserve">; </w:t>
       </w:r>
       <w:r>
         <w:rPr>
@@ -14705,7 +14744,7 @@
           <w:i w:val="0"/>
           <w:sz w:val="20"/>
         </w:rPr>
-        <w:t xml:space="preserve"> is available to us; and </w:t>
+        <w:t xml:space="preserve">; and </w:t>
       </w:r>
       <w:r>
         <w:rPr>
@@ -14723,25 +14762,7 @@
           <w:i w:val="0"/>
           <w:sz w:val="20"/>
         </w:rPr>
-        <w:t xml:space="preserve">, because where a cell has few levels the across-repeat term can </w:t>
-      </w:r>
-      <w:r>
-        <w:rPr>
-          <w:rFonts w:ascii="Times New Roman" w:hAnsi="Times New Roman"/>
-          <w:b/>
-          <w:i w:val="0"/>
-          <w:sz w:val="20"/>
-        </w:rPr>
-        <w:t>exceed the interval width itself</w:t>
-      </w:r>
-      <w:r>
-        <w:rPr>
-          <w:rFonts w:ascii="Times New Roman" w:hAnsi="Times New Roman"/>
-          <w:b w:val="0"/>
-          <w:i w:val="0"/>
-          <w:sz w:val="20"/>
-        </w:rPr>
-        <w:t xml:space="preserve"> — by roughly a factor of two (§A.2). None of the aggregates above depends on the affected runs (§3.7, §5.1). The two numbers: the aggregate change in ME is within </w:t>
+        <w:t xml:space="preserve">, the across-repeat term exceeding the interval width by roughly a factor of two where levels are few (§A.2). No aggregate above depends on the affected runs (§3.7, §5.1). The two numbers: the aggregate change in ME is within </w:t>
       </w:r>
       <w:r>
         <w:rPr>
@@ -15539,7 +15560,7 @@
           <w:i w:val="0"/>
           <w:sz w:val="20"/>
         </w:rPr>
-        <w:t xml:space="preserve">; six of seven further families fall short; M.19.15). The true-zero pools differ by </w:t>
+        <w:t xml:space="preserve">; seven of eight further families and builds fall short; M.19.15). The true-zero pools differ by </w:t>
       </w:r>
       <w:r>
         <w:rPr>
@@ -15557,7 +15578,7 @@
           <w:i w:val="0"/>
           <w:sz w:val="20"/>
         </w:rPr>
-        <w:t xml:space="preserve">, so p≈1 is not transferable (Appendix M.21.9). Two further limits from the same experiment: the abstention </w:t>
+        <w:t xml:space="preserve">, so p≈1 is not transferable (Appendix M.21.9). Two further limits: the abstention </w:t>
       </w:r>
       <w:r>
         <w:rPr>
@@ -15575,7 +15596,7 @@
           <w:i w:val="0"/>
           <w:sz w:val="20"/>
         </w:rPr>
-        <w:t xml:space="preserve"> leaves its unit interval when the net deviation is near zero — three of twenty cells, reported as unmeasured rather than clipped — and the </w:t>
+        <w:t xml:space="preserve"> leaves its unit interval when the net deviation is near zero — three of twenty cells, unmeasured rather than clipped — and the </w:t>
       </w:r>
       <w:r>
         <w:rPr>
@@ -15667,7 +15688,7 @@
           <w:i w:val="0"/>
           <w:sz w:val="20"/>
         </w:rPr>
-        <w:t>: the nine datasets were assembled to span a legibility range rather than sampled from a stated population, so domain-level statements describe these domains and are not estimates over a distribution.</w:t>
+        <w:t>: the nine datasets span a legibility range rather than a stated population, so domain-level statements describe these domains, not a distribution.</w:t>
       </w:r>
     </w:p>
     <w:p>
@@ -16306,7 +16327,7 @@
           <w:i w:val="0"/>
           <w:sz w:val="20"/>
         </w:rPr>
-        <w:t>15. Zhang, H., Feng, Y., Zheng, S., et al. The Uncontrolled Variable: Vision-Language Model Refusal Responds to Image Presence in Ways Risk Cannot Explain. preprint arXiv:2609.26174, 2026.</w:t>
+        <w:t>15. Zhang, H., Feng, Y., Liu, H., et al. The Uncontrolled Variable: Vision-Language Refusal Is Conditioned on the Image-Attachment Interface, and Not Robust to Irrelevant Image Properties. preprint arXiv:2609.26174, 2026.</w:t>
       </w:r>
     </w:p>
     <w:p>

</xml_diff>

<commit_message>
v0612: round-4 (10 blind reviews) class-1 corrections; main text 5 edits, supplement 7, repro README 1; 35 pages unchanged
</commit_message>
<xml_diff>
--- a/manuscript/PaperB_manuscript_PR_layout.docx
+++ b/manuscript/PaperB_manuscript_PR_layout.docx
@@ -12079,7 +12079,7 @@
           <w:i w:val="0"/>
           <w:sz w:val="20"/>
         </w:rPr>
-        <w:t>(iii) On this benchmark the convention moves magnitudes, not the ranking</w:t>
+        <w:t>(iii) On this benchmark the convention moves magnitudes, not the ρ ordering</w:t>
       </w:r>
       <w:r>
         <w:rPr>
@@ -12733,7 +12733,7 @@
           <w:i w:val="0"/>
           <w:sz w:val="20"/>
         </w:rPr>
-        <w:t>). Reporting one convention without the abstention mass therefore publishes an ordering of abstention propensity; the correction needs no re-run, since MAE_A=(1-w) MAE_B+w GT_abstained recovers it from any stored output (Appendix M.35).</w:t>
+        <w:t xml:space="preserve"> on the MAE ordering). Reporting one convention without the abstention mass therefore publishes an ordering of abstention propensity; the correction needs no re-run, since MAE_A=(1-w) MAE_B+w GT_abstained recovers it from any stored output (Appendix M.35).</w:t>
       </w:r>
     </w:p>
     <w:p>
@@ -14654,7 +14654,7 @@
           <w:i w:val="0"/>
           <w:sz w:val="20"/>
         </w:rPr>
-        <w:t xml:space="preserve">, one of them a dead parse branch recorded as a </w:t>
+        <w:t xml:space="preserve"> and, separately, a dead parse branch recorded as a </w:t>
       </w:r>
       <w:r>
         <w:rPr>
@@ -15560,7 +15560,7 @@
           <w:i w:val="0"/>
           <w:sz w:val="20"/>
         </w:rPr>
-        <w:t xml:space="preserve">; seven of eight further families and builds fall short; M.19.15). The true-zero pools differ by </w:t>
+        <w:t xml:space="preserve">; eight of nine further families and builds fall short; M.19.15). The true-zero pools differ by </w:t>
       </w:r>
       <w:r>
         <w:rPr>
@@ -16349,7 +16349,7 @@
           <w:i w:val="0"/>
           <w:sz w:val="20"/>
         </w:rPr>
-        <w:t>17. Fu, Y., Li, F., Liu, X., et al. NumerosityVLM: A Cognitively Inspired Benchmark for Interpreting Numerosity Representations in VLMs. preprint arXiv:2608.15425, 2026.</w:t>
+        <w:t>17. Fu, Y., Li, F., Liu, X., et al. NumerosityVLM: A Cognitively Inspired Benchmark for Interpreting Numerosity Representations in Vision-Language Models. preprint arXiv:2608.15425, 2026.</w:t>
       </w:r>
     </w:p>
     <w:p>

</xml_diff>

<commit_message>
v0616: round-5 review fixes (M.35 denominators, two CIs, Table 3 naming, bound direction, metric labels, FSC-147 caliber, M.19.15.1 denominator) + eight zero-call theoretical criteria; supplement heading order restored
</commit_message>
<xml_diff>
--- a/manuscript/PaperB_manuscript_PR_layout.docx
+++ b/manuscript/PaperB_manuscript_PR_layout.docx
@@ -124,7 +124,25 @@
           <w:i w:val="0"/>
           <w:sz w:val="20"/>
         </w:rPr>
-        <w:t xml:space="preserve"> that make under-counts readable. For the open-weight models here (§5.7, §8.2), the dominant dense-scene failure is </w:t>
+        <w:t xml:space="preserve"> that make under-counts readable. For </w:t>
+      </w:r>
+      <w:r>
+        <w:rPr>
+          <w:rFonts w:ascii="Times New Roman" w:hAnsi="Times New Roman"/>
+          <w:b/>
+          <w:i w:val="0"/>
+          <w:sz w:val="20"/>
+        </w:rPr>
+        <w:t>one anchor build under Chinese prompts</w:t>
+      </w:r>
+      <w:r>
+        <w:rPr>
+          <w:rFonts w:ascii="Times New Roman" w:hAnsi="Times New Roman"/>
+          <w:b w:val="0"/>
+          <w:i w:val="0"/>
+          <w:sz w:val="20"/>
+        </w:rPr>
+        <w:t xml:space="preserve"> (§5.7, §8.2), the dominant dense-scene failure is </w:t>
       </w:r>
       <w:r>
         <w:rPr>
@@ -169,16 +187,34 @@
           <w:i w:val="0"/>
           <w:sz w:val="20"/>
         </w:rPr>
-        <w:t>base arm, Chinese prompts, one anchor build</w:t>
-      </w:r>
-      <w:r>
-        <w:rPr>
-          <w:rFonts w:ascii="Times New Roman" w:hAnsi="Times New Roman"/>
-          <w:b w:val="0"/>
-          <w:i w:val="0"/>
-          <w:sz w:val="20"/>
-        </w:rPr>
-        <w:t xml:space="preserve">; the same abstention term under the </w:t>
+        <w:t>base arm</w:t>
+      </w:r>
+      <w:r>
+        <w:rPr>
+          <w:rFonts w:ascii="Times New Roman" w:hAnsi="Times New Roman"/>
+          <w:b w:val="0"/>
+          <w:i w:val="0"/>
+          <w:sz w:val="20"/>
+        </w:rPr>
+        <w:t xml:space="preserve">; the same abstention </w:t>
+      </w:r>
+      <w:r>
+        <w:rPr>
+          <w:rFonts w:ascii="Times New Roman" w:hAnsi="Times New Roman"/>
+          <w:b/>
+          <w:i w:val="0"/>
+          <w:sz w:val="20"/>
+        </w:rPr>
+        <w:t>rate</w:t>
+      </w:r>
+      <w:r>
+        <w:rPr>
+          <w:rFonts w:ascii="Times New Roman" w:hAnsi="Times New Roman"/>
+          <w:b w:val="0"/>
+          <w:i w:val="0"/>
+          <w:sz w:val="20"/>
+        </w:rPr>
+        <w:t xml:space="preserve"> under the </w:t>
       </w:r>
       <w:r>
         <w:rPr>
@@ -682,7 +718,7 @@
           <w:i w:val="0"/>
           <w:sz w:val="20"/>
         </w:rPr>
-        <w:t xml:space="preserve">. Under a ground-truth-weighted convention, answering 0 accounts for </w:t>
+        <w:t xml:space="preserve">. Under a ground-truth-weighted convention on one anchor build, answering 0 accounts for </w:t>
       </w:r>
       <w:r>
         <w:rPr>
@@ -709,7 +745,7 @@
           <w:i w:val="0"/>
           <w:sz w:val="20"/>
         </w:rPr>
-        <w:t>base contract arm, Chinese prompts, one anchor build</w:t>
+        <w:t>base contract arm, Chinese prompts</w:t>
       </w:r>
       <w:r>
         <w:rPr>
@@ -5247,16 +5283,34 @@
           <w:i w:val="0"/>
           <w:sz w:val="20"/>
         </w:rPr>
-        <w:t>bounded rather than merely disclosed</w:t>
-      </w:r>
-      <w:r>
-        <w:rPr>
-          <w:rFonts w:ascii="Times New Roman" w:hAnsi="Times New Roman"/>
-          <w:b w:val="0"/>
-          <w:i w:val="0"/>
-          <w:sz w:val="20"/>
-        </w:rPr>
-        <w:t xml:space="preserve">: by Proposition 7, a lineage with ratio κ identifies the abstention rate only to within the missed-refusal share 1/(κ+1) — </w:t>
+        <w:t>lower-bounded, not disclosed</w:t>
+      </w:r>
+      <w:r>
+        <w:rPr>
+          <w:rFonts w:ascii="Times New Roman" w:hAnsi="Times New Roman"/>
+          <w:b w:val="0"/>
+          <w:i w:val="0"/>
+          <w:sz w:val="20"/>
+        </w:rPr>
+        <w:t xml:space="preserve">: by Proposition 7, a lineage with ratio κ identifies the abstention rate only to within </w:t>
+      </w:r>
+      <w:r>
+        <w:rPr>
+          <w:rFonts w:ascii="Times New Roman" w:hAnsi="Times New Roman"/>
+          <w:b/>
+          <w:i w:val="0"/>
+          <w:sz w:val="20"/>
+        </w:rPr>
+        <w:t>at least</w:t>
+      </w:r>
+      <w:r>
+        <w:rPr>
+          <w:rFonts w:ascii="Times New Roman" w:hAnsi="Times New Roman"/>
+          <w:b w:val="0"/>
+          <w:i w:val="0"/>
+          <w:sz w:val="20"/>
+        </w:rPr>
+        <w:t xml:space="preserve"> the missed-refusal share 1/(κ+1) — </w:t>
       </w:r>
       <w:r>
         <w:rPr>
@@ -7674,7 +7728,7 @@
                 <w:i w:val="0"/>
                 <w:sz w:val="20"/>
               </w:rPr>
-              <w:t>abstention term, item-count convention</w:t>
+              <w:t>abstention rate, item-count convention</w:t>
             </w:r>
           </w:p>
         </w:tc>
@@ -8077,7 +8131,25 @@
           <w:i/>
           <w:sz w:val="20"/>
         </w:rPr>
-        <w:t>(Terms are pp of the pooled relative deviation and sum to it exactly; S is the ground-truth-weighted share and the last column the same term under the item-count convention. Appendix J.1.)</w:t>
+        <w:t xml:space="preserve">(Terms are pp of the pooled relative deviation and sum to it exactly; S is the ground-truth-weighted share and the last column the same </w:t>
+      </w:r>
+      <w:r>
+        <w:rPr>
+          <w:rFonts w:ascii="Times New Roman" w:hAnsi="Times New Roman"/>
+          <w:b w:val="0"/>
+          <w:i/>
+          <w:sz w:val="20"/>
+        </w:rPr>
+        <w:t>rate</w:t>
+      </w:r>
+      <w:r>
+        <w:rPr>
+          <w:rFonts w:ascii="Times New Roman" w:hAnsi="Times New Roman"/>
+          <w:b w:val="0"/>
+          <w:i/>
+          <w:sz w:val="20"/>
+        </w:rPr>
+        <w:t xml:space="preserve"> under the item-count convention. Appendix J.1.)</w:t>
       </w:r>
     </w:p>
     <w:p>
@@ -12079,7 +12151,7 @@
           <w:i w:val="0"/>
           <w:sz w:val="20"/>
         </w:rPr>
-        <w:t>(iii) On this benchmark the convention moves magnitudes, not the ρ ordering</w:t>
+        <w:t>(iii) Here the convention moves magnitudes, not the ρ ordering</w:t>
       </w:r>
       <w:r>
         <w:rPr>
@@ -12115,16 +12187,16 @@
           <w:i w:val="0"/>
           <w:sz w:val="20"/>
         </w:rPr>
-        <w:t>0.983</w:t>
-      </w:r>
-      <w:r>
-        <w:rPr>
-          <w:rFonts w:ascii="Times New Roman" w:hAnsi="Times New Roman"/>
-          <w:b w:val="0"/>
-          <w:i w:val="0"/>
-          <w:sz w:val="20"/>
-        </w:rPr>
-        <w:t>, 1 inversion of 36) — the same asymmetry §5.12 reports for the decision forms. Its sensitivity to the input scale is bounded in Appendix M.41.</w:t>
+        <w:t>0.983 on the ρ ordering</w:t>
+      </w:r>
+      <w:r>
+        <w:rPr>
+          <w:rFonts w:ascii="Times New Roman" w:hAnsi="Times New Roman"/>
+          <w:b w:val="0"/>
+          <w:i w:val="0"/>
+          <w:sz w:val="20"/>
+        </w:rPr>
+        <w:t>, 1 inversion of 36) — the asymmetry §5.12 reports for the decision forms. Its sensitivity to the input scale is bounded in Appendix M.41.</w:t>
       </w:r>
     </w:p>
     <w:p>
@@ -13102,7 +13174,7 @@
           <w:i w:val="0"/>
           <w:sz w:val="20"/>
         </w:rPr>
-        <w:t>0.075</w:t>
+        <w:t>≥0.075</w:t>
       </w:r>
       <w:r>
         <w:rPr>
@@ -16123,7 +16195,7 @@
           <w:i w:val="0"/>
           <w:sz w:val="20"/>
         </w:rPr>
-        <w:t>The image corpora are public datasets, cited above. The derived per-image prediction records, analysis scripts and run logs that reproduce every reported number are released at https://github.com/YBP2005/P3 (CC BY 4.0), with a per-file MD5 manifest.</w:t>
+        <w:t>The image corpora are public datasets, cited above. The derived per-image prediction records, analysis scripts and run logs that reproduce every reported number are released or flagged at https://github.com/YBP2005/P3 (CC BY 4.0), with per-file MD5s.</w:t>
       </w:r>
     </w:p>
     <w:p>

</xml_diff>

<commit_message>
v0617: (a) M.46(a) interval-family declaration (Jeffreys vs Clopper-Pearson under one 95% upper-bound label); (b) land the fidelity note v0614 promised for the main text - the 8-bit rows were served weight-only, not W8A8 (capability 8.0 vs 8.9), so they bound the build and not that numeric path
</commit_message>
<xml_diff>
--- a/manuscript/PaperB_manuscript_PR_layout.docx
+++ b/manuscript/PaperB_manuscript_PR_layout.docx
@@ -15740,7 +15740,25 @@
           <w:i w:val="0"/>
           <w:sz w:val="20"/>
         </w:rPr>
-        <w:t xml:space="preserve"> build, where two of the twenty cells stay outside the unit interval (Appendices M.19.16, M.46(c)).</w:t>
+        <w:t xml:space="preserve"> build, where two of the twenty cells stay outside the unit interval (Appendices M.19.16, M.46(c)). </w:t>
+      </w:r>
+      <w:r>
+        <w:rPr>
+          <w:rFonts w:ascii="Times New Roman" w:hAnsi="Times New Roman"/>
+          <w:b/>
+          <w:i w:val="0"/>
+          <w:sz w:val="20"/>
+        </w:rPr>
+        <w:t>The 8-bit rows were served weight-only, not weight-and-activation 8-bit</w:t>
+      </w:r>
+      <w:r>
+        <w:rPr>
+          <w:rFonts w:ascii="Times New Roman" w:hAnsi="Times New Roman"/>
+          <w:b w:val="0"/>
+          <w:i w:val="0"/>
+          <w:sz w:val="20"/>
+        </w:rPr>
+        <w:t xml:space="preserve"> — the hardware cannot select the latter — so they bound the build, not that path (M.46(c)).</w:t>
       </w:r>
     </w:p>
     <w:p>

</xml_diff>

<commit_message>
v0618: correct recomputable errors from round 6 - M.46(a) interval family is Wilson not Jeffreys, M.23 probability 0.1635 and the spurious 1/4 removed, F.7 pre-registration premise direction fixed, M.37 quantifier narrowed, M.19.15.1 denominator sentence (17 of 244), FSC-133 attribution, M.19.15 sign, J.1/M.9 terminology; main text one object-of-identification clause, net 0 words
</commit_message>
<xml_diff>
--- a/manuscript/PaperB_manuscript_PR_layout.docx
+++ b/manuscript/PaperB_manuscript_PR_layout.docx
@@ -5292,7 +5292,25 @@
           <w:i w:val="0"/>
           <w:sz w:val="20"/>
         </w:rPr>
-        <w:t xml:space="preserve">: by Proposition 7, a lineage with ratio κ identifies the abstention rate only to within </w:t>
+        <w:t xml:space="preserve">: by Proposition 7, a lineage with ratio κ identifies its </w:t>
+      </w:r>
+      <w:r>
+        <w:rPr>
+          <w:rFonts w:ascii="Times New Roman" w:hAnsi="Times New Roman"/>
+          <w:b/>
+          <w:i w:val="0"/>
+          <w:sz w:val="20"/>
+        </w:rPr>
+        <w:t>answered-zero rate</w:t>
+      </w:r>
+      <w:r>
+        <w:rPr>
+          <w:rFonts w:ascii="Times New Roman" w:hAnsi="Times New Roman"/>
+          <w:b w:val="0"/>
+          <w:i w:val="0"/>
+          <w:sz w:val="20"/>
+        </w:rPr>
+        <w:t xml:space="preserve"> only to within </w:t>
       </w:r>
       <w:r>
         <w:rPr>
@@ -5346,7 +5364,25 @@
           <w:i w:val="0"/>
           <w:sz w:val="20"/>
         </w:rPr>
-        <w:t xml:space="preserve"> for InternVL2.5-8B — so any abstention rate quoted for a partially covered lineage carries that error bar, and the two lineages are never pooled (§3.8, §8.2).</w:t>
+        <w:t xml:space="preserve"> for InternVL2.5-8B — so any </w:t>
+      </w:r>
+      <w:r>
+        <w:rPr>
+          <w:rFonts w:ascii="Times New Roman" w:hAnsi="Times New Roman"/>
+          <w:b/>
+          <w:i w:val="0"/>
+          <w:sz w:val="20"/>
+        </w:rPr>
+        <w:t>answered-zero rate</w:t>
+      </w:r>
+      <w:r>
+        <w:rPr>
+          <w:rFonts w:ascii="Times New Roman" w:hAnsi="Times New Roman"/>
+          <w:b w:val="0"/>
+          <w:i w:val="0"/>
+          <w:sz w:val="20"/>
+        </w:rPr>
+        <w:t xml:space="preserve"> quoted for a partially covered lineage carries that error bar, and the two lineages are never pooled (§3.8, §8.2).</w:t>
       </w:r>
     </w:p>
     <w:p>

</xml_diff>

<commit_message>
v0619: apply all remaining round-6 fixable items (52 fixes across main/supplement/question-set) plus three zero-call analyses (FSC-147 answered-only subset sizes and bootstrap intervals, exact binomial 0.019, M.44 n back-solve) and a redundancy-only trim back to the 35-page limit
</commit_message>
<xml_diff>
--- a/manuscript/PaperB_manuscript_PR_layout.docx
+++ b/manuscript/PaperB_manuscript_PR_layout.docx
@@ -142,7 +142,25 @@
           <w:i w:val="0"/>
           <w:sz w:val="20"/>
         </w:rPr>
-        <w:t xml:space="preserve"> (§5.7, §8.2), the dominant dense-scene failure is </w:t>
+        <w:t xml:space="preserve"> (§5.7, §8.2), the dominant dense-scene failure </w:t>
+      </w:r>
+      <w:r>
+        <w:rPr>
+          <w:rFonts w:ascii="Times New Roman" w:hAnsi="Times New Roman"/>
+          <w:b/>
+          <w:i w:val="0"/>
+          <w:sz w:val="20"/>
+        </w:rPr>
+        <w:t>in these cells</w:t>
+      </w:r>
+      <w:r>
+        <w:rPr>
+          <w:rFonts w:ascii="Times New Roman" w:hAnsi="Times New Roman"/>
+          <w:b w:val="0"/>
+          <w:i w:val="0"/>
+          <w:sz w:val="20"/>
+        </w:rPr>
+        <w:t xml:space="preserve"> is </w:t>
       </w:r>
       <w:r>
         <w:rPr>
@@ -376,7 +394,7 @@
           <w:i w:val="0"/>
           <w:sz w:val="20"/>
         </w:rPr>
-        <w:t xml:space="preserve">) or, at a directional cost, by prompt relaxation (ρ: </w:t>
+        <w:t xml:space="preserve"> on the anchor build) or, at a directional cost, by prompt relaxation (ρ: </w:t>
       </w:r>
       <w:r>
         <w:rPr>
@@ -1667,7 +1685,7 @@
           <w:i w:val="0"/>
           <w:sz w:val="20"/>
         </w:rPr>
-        <w:t xml:space="preserve"> established is a partition: the separating split is </w:t>
+        <w:t xml:space="preserve"> established is a partition: the observed separating split is </w:t>
       </w:r>
       <w:r>
         <w:rPr>
@@ -1685,7 +1703,7 @@
           <w:i w:val="0"/>
           <w:sz w:val="20"/>
         </w:rPr>
-        <w:t xml:space="preserve">, below our own noise floor (2.15–6.46 pp), so we report a </w:t>
+        <w:t xml:space="preserve">, below our own noise floor (2.15–6.46 pp) and below the smallest attainable corrected p of that test, so we report a </w:t>
       </w:r>
       <w:r>
         <w:rPr>
@@ -1723,7 +1741,7 @@
           <w:i w:val="0"/>
           <w:sz w:val="20"/>
         </w:rPr>
-        <w:t xml:space="preserve"> Two empirical findings, plus the apparatus that makes them checkable: the identities of §3.8 and the appendices, which are arithmetic rather than findings, and whose role is that every headline number is recomputed from the released records or labelled a transcription (Appendix F.9). 1. </w:t>
+        <w:t xml:space="preserve"> Two empirical findings, plus the apparatus that makes them checkable: the identities of §3.8 and the appendices, which are arithmetic rather than findings, and whose role is that every headline number is recomputed from the released records, or labelled a transcription or an author-side computation (Appendix F.9). 1. </w:t>
       </w:r>
       <w:r>
         <w:rPr>
@@ -1993,43 +2011,7 @@
           <w:i w:val="0"/>
           <w:sz w:val="20"/>
         </w:rPr>
-        <w:t xml:space="preserve"> across the same five; M.18.4, M.18.8). §5.12 then shows what a single convention costs: the two conventions reorder the configurations (Spearman </w:t>
-      </w:r>
-      <w:r>
-        <w:rPr>
-          <w:rFonts w:ascii="Times New Roman" w:hAnsi="Times New Roman"/>
-          <w:b/>
-          <w:i w:val="0"/>
-          <w:sz w:val="20"/>
-        </w:rPr>
-        <w:t>0.476–1.000</w:t>
-      </w:r>
-      <w:r>
-        <w:rPr>
-          <w:rFonts w:ascii="Times New Roman" w:hAnsi="Times New Roman"/>
-          <w:b w:val="0"/>
-          <w:i w:val="0"/>
-          <w:sz w:val="20"/>
-        </w:rPr>
-        <w:t xml:space="preserve">) and move one configuration's bias by up to </w:t>
-      </w:r>
-      <w:r>
-        <w:rPr>
-          <w:rFonts w:ascii="Times New Roman" w:hAnsi="Times New Roman"/>
-          <w:b/>
-          <w:i w:val="0"/>
-          <w:sz w:val="20"/>
-        </w:rPr>
-        <w:t>48.2 pp</w:t>
-      </w:r>
-      <w:r>
-        <w:rPr>
-          <w:rFonts w:ascii="Times New Roman" w:hAnsi="Times New Roman"/>
-          <w:b w:val="0"/>
-          <w:i w:val="0"/>
-          <w:sz w:val="20"/>
-        </w:rPr>
-        <w:t>.</w:t>
+        <w:t xml:space="preserve"> across the same five; M.18.4, M.18.8).</w:t>
       </w:r>
     </w:p>
     <w:p>
@@ -2384,25 +2366,7 @@
           <w:i w:val="0"/>
           <w:sz w:val="20"/>
         </w:rPr>
-        <w:t xml:space="preserve">Two families dominate counting: detection-based methods localise instances and count them, while density regression predicts a density map whose integral is the count — the definitional formulation of the field [6]. Comparative work treats them as paradigms with characteristic trade-offs, and magnitude error is the axis on which they are compared; one controlled benchmark organises its probes by complexity [7]. §7.3 adds </w:t>
-      </w:r>
-      <w:r>
-        <w:rPr>
-          <w:rFonts w:ascii="Times New Roman" w:hAnsi="Times New Roman"/>
-          <w:b/>
-          <w:i w:val="0"/>
-          <w:sz w:val="20"/>
-        </w:rPr>
-        <w:t>signed direction</w:t>
-      </w:r>
-      <w:r>
-        <w:rPr>
-          <w:rFonts w:ascii="Times New Roman" w:hAnsi="Times New Roman"/>
-          <w:b w:val="0"/>
-          <w:i w:val="0"/>
-          <w:sz w:val="20"/>
-        </w:rPr>
-        <w:t xml:space="preserve"> to that comparison: a method that systematically over-counts and one that systematically under-counts can otherwise be reported as equivalent, and the paradigm label predicts span far more weakly than the implementation does.</w:t>
+        <w:t>Two families dominate counting: detection-based methods localise instances and count them, while density regression predicts a density map whose integral is the count — the definitional formulation of the field [6]. Comparative work treats them as paradigms with characteristic trade-offs, and magnitude error is the axis on which they are compared; one controlled benchmark organises its probes by complexity [7].</w:t>
       </w:r>
     </w:p>
     <w:p>
@@ -2542,7 +2506,7 @@
           <w:i w:val="0"/>
           <w:sz w:val="20"/>
         </w:rPr>
-        <w:t xml:space="preserve"> the legibility gating — abstention is gated by per-instance legibility, not by object count, and is demonstrable in the aerial domains where the dense domains saturate under an explicit abstention contract (Appendix M.18) — and for the dominant lineage it appears as that literal zero (§3.6, §5.6).</w:t>
+        <w:t xml:space="preserve"> the legibility gating — it is gated by per-instance legibility, not by object count — and for the dominant lineage it appears as that literal zero (§3.6, §5.6).</w:t>
       </w:r>
     </w:p>
     <w:p>
@@ -3055,7 +3019,7 @@
           <w:i w:val="0"/>
           <w:sz w:val="20"/>
         </w:rPr>
-        <w:t>, with the machinery that separates them on a fixed serving stack in §3.8 and §5.7. Three boundaries delimit the comparison: dependent variable (accuracy versus signed direction and abstention), data (everyday versus aerial, microscopy and dense-crowd scenes), and contrast design (in-domain versus zero-shot weights, input protocol controlled).</w:t>
+        <w:t>, with the machinery that separates them on a fixed serving stack in §3.8 and §5.7.</w:t>
       </w:r>
     </w:p>
     <w:p>
@@ -3411,7 +3375,7 @@
           <w:i w:val="0"/>
           <w:sz w:val="20"/>
         </w:rPr>
-        <w:t>: the rate, ρ on answered items only, and the abstention share of the total under-count. Density is summarised by OPM, whose applicability boundary is §7.1. The statistical protocol and the non-determinism declaration are in Appendix A.</w:t>
+        <w:t>: the rate, ρ on answered items only, and the abstention share of the total under-count. Density is summarised by OPM, whose applicability boundary is §7.1.</w:t>
       </w:r>
     </w:p>
     <w:p>
@@ -3472,7 +3436,7 @@
           <w:i w:val="0"/>
           <w:sz w:val="20"/>
         </w:rPr>
-        <w:t xml:space="preserve">, and recent work notes that granularity is usually left implicit ([22]; [23]). Running both conventions on SFCHD shows that </w:t>
+        <w:t xml:space="preserve">. Running both conventions on SFCHD shows that </w:t>
       </w:r>
       <w:r>
         <w:rPr>
@@ -3697,25 +3661,7 @@
           <w:i w:val="0"/>
           <w:sz w:val="20"/>
         </w:rPr>
-        <w:t xml:space="preserve"> (blur 9.1% vs. downsampling 0.6%, </w:t>
-      </w:r>
-      <w:r>
-        <w:rPr>
-          <w:rFonts w:ascii="Times New Roman" w:hAnsi="Times New Roman"/>
-          <w:b/>
-          <w:i w:val="0"/>
-          <w:sz w:val="20"/>
-        </w:rPr>
-        <w:t>+8.6 pp</w:t>
-      </w:r>
-      <w:r>
-        <w:rPr>
-          <w:rFonts w:ascii="Times New Roman" w:hAnsi="Times New Roman"/>
-          <w:b w:val="0"/>
-          <w:i w:val="0"/>
-          <w:sz w:val="20"/>
-        </w:rPr>
-        <w:t xml:space="preserve">), while the </w:t>
+        <w:t xml:space="preserve">, while the </w:t>
       </w:r>
       <w:r>
         <w:rPr>
@@ -3899,7 +3845,79 @@
           <w:i w:val="0"/>
           <w:sz w:val="20"/>
         </w:rPr>
-        <w:t xml:space="preserve"> in this paper, not its headline: it tells a downstream user </w:t>
+        <w:t xml:space="preserve"> in this paper, and its use is bounded accordingly. It supports </w:t>
+      </w:r>
+      <w:r>
+        <w:rPr>
+          <w:rFonts w:ascii="Times New Roman" w:hAnsi="Times New Roman"/>
+          <w:b/>
+          <w:i w:val="0"/>
+          <w:sz w:val="20"/>
+        </w:rPr>
+        <w:t>stratification, ranking and selective prediction</w:t>
+      </w:r>
+      <w:r>
+        <w:rPr>
+          <w:rFonts w:ascii="Times New Roman" w:hAnsi="Times New Roman"/>
+          <w:b w:val="0"/>
+          <w:i w:val="0"/>
+          <w:sz w:val="20"/>
+        </w:rPr>
+        <w:t xml:space="preserve">; it is </w:t>
+      </w:r>
+      <w:r>
+        <w:rPr>
+          <w:rFonts w:ascii="Times New Roman" w:hAnsi="Times New Roman"/>
+          <w:b/>
+          <w:i w:val="0"/>
+          <w:sz w:val="20"/>
+        </w:rPr>
+        <w:t>not</w:t>
+      </w:r>
+      <w:r>
+        <w:rPr>
+          <w:rFonts w:ascii="Times New Roman" w:hAnsi="Times New Roman"/>
+          <w:b w:val="0"/>
+          <w:i w:val="0"/>
+          <w:sz w:val="20"/>
+        </w:rPr>
+        <w:t xml:space="preserve"> a sufficient statistic, must </w:t>
+      </w:r>
+      <w:r>
+        <w:rPr>
+          <w:rFonts w:ascii="Times New Roman" w:hAnsi="Times New Roman"/>
+          <w:b/>
+          <w:i w:val="0"/>
+          <w:sz w:val="20"/>
+        </w:rPr>
+        <w:t>not</w:t>
+      </w:r>
+      <w:r>
+        <w:rPr>
+          <w:rFonts w:ascii="Times New Roman" w:hAnsi="Times New Roman"/>
+          <w:b w:val="0"/>
+          <w:i w:val="0"/>
+          <w:sz w:val="20"/>
+        </w:rPr>
+        <w:t xml:space="preserve"> be compared across scales directly, and must not be read as "more pixels is always better". Because it is defined on annotation boxes it is </w:t>
+      </w:r>
+      <w:r>
+        <w:rPr>
+          <w:rFonts w:ascii="Times New Roman" w:hAnsi="Times New Roman"/>
+          <w:b/>
+          <w:i w:val="0"/>
+          <w:sz w:val="20"/>
+        </w:rPr>
+        <w:t>not</w:t>
+      </w:r>
+      <w:r>
+        <w:rPr>
+          <w:rFonts w:ascii="Times New Roman" w:hAnsi="Times New Roman"/>
+          <w:b w:val="0"/>
+          <w:i w:val="0"/>
+          <w:sz w:val="20"/>
+        </w:rPr>
+        <w:t xml:space="preserve"> a deployment-time decision rule, and the obvious annotation-free substitute — the </w:t>
       </w:r>
       <w:r>
         <w:rPr>
@@ -3908,34 +3926,52 @@
           <w:i/>
           <w:sz w:val="20"/>
         </w:rPr>
-        <w:t>which images to trust the number on</w:t>
-      </w:r>
-      <w:r>
-        <w:rPr>
-          <w:rFonts w:ascii="Times New Roman" w:hAnsi="Times New Roman"/>
-          <w:b w:val="0"/>
-          <w:i w:val="0"/>
-          <w:sz w:val="20"/>
-        </w:rPr>
-        <w:t xml:space="preserve">, and its use is bounded accordingly. It supports </w:t>
-      </w:r>
-      <w:r>
-        <w:rPr>
-          <w:rFonts w:ascii="Times New Roman" w:hAnsi="Times New Roman"/>
-          <w:b/>
-          <w:i w:val="0"/>
-          <w:sz w:val="20"/>
-        </w:rPr>
-        <w:t>stratification, ranking and selective prediction</w:t>
-      </w:r>
-      <w:r>
-        <w:rPr>
-          <w:rFonts w:ascii="Times New Roman" w:hAnsi="Times New Roman"/>
-          <w:b w:val="0"/>
-          <w:i w:val="0"/>
-          <w:sz w:val="20"/>
-        </w:rPr>
-        <w:t xml:space="preserve">; it is </w:t>
+        <w:t>same</w:t>
+      </w:r>
+      <w:r>
+        <w:rPr>
+          <w:rFonts w:ascii="Times New Roman" w:hAnsi="Times New Roman"/>
+          <w:b w:val="0"/>
+          <w:i w:val="0"/>
+          <w:sz w:val="20"/>
+        </w:rPr>
+        <w:t xml:space="preserve"> functional form on </w:t>
+      </w:r>
+      <w:r>
+        <w:rPr>
+          <w:rFonts w:ascii="Times New Roman" w:hAnsi="Times New Roman"/>
+          <w:b/>
+          <w:i w:val="0"/>
+          <w:sz w:val="20"/>
+        </w:rPr>
+        <w:t>detector</w:t>
+      </w:r>
+      <w:r>
+        <w:rPr>
+          <w:rFonts w:ascii="Times New Roman" w:hAnsi="Times New Roman"/>
+          <w:b w:val="0"/>
+          <w:i w:val="0"/>
+          <w:sz w:val="20"/>
+        </w:rPr>
+        <w:t xml:space="preserve"> boxes — does not inherit its power (AUC </w:t>
+      </w:r>
+      <w:r>
+        <w:rPr>
+          <w:rFonts w:ascii="Times New Roman" w:hAnsi="Times New Roman"/>
+          <w:b/>
+          <w:i w:val="0"/>
+          <w:sz w:val="20"/>
+        </w:rPr>
+        <w:t>0.49–0.63</w:t>
+      </w:r>
+      <w:r>
+        <w:rPr>
+          <w:rFonts w:ascii="Times New Roman" w:hAnsi="Times New Roman"/>
+          <w:b w:val="0"/>
+          <w:i w:val="0"/>
+          <w:sz w:val="20"/>
+        </w:rPr>
+        <w:t xml:space="preserve">; Appendix M.20 records the measurement and why we report it as a boundary rather than a promise). It is also </w:t>
       </w:r>
       <w:r>
         <w:rPr>
@@ -3953,7 +3989,7 @@
           <w:i w:val="0"/>
           <w:sz w:val="20"/>
         </w:rPr>
-        <w:t xml:space="preserve"> a sufficient statistic, must </w:t>
+        <w:t xml:space="preserve"> an attention map or a confidence, and </w:t>
       </w:r>
       <w:r>
         <w:rPr>
@@ -3971,114 +4007,6 @@
           <w:i w:val="0"/>
           <w:sz w:val="20"/>
         </w:rPr>
-        <w:t xml:space="preserve"> be compared across scales directly, and must not be read as "more pixels is always better". Because it is defined on annotation boxes it is </w:t>
-      </w:r>
-      <w:r>
-        <w:rPr>
-          <w:rFonts w:ascii="Times New Roman" w:hAnsi="Times New Roman"/>
-          <w:b/>
-          <w:i w:val="0"/>
-          <w:sz w:val="20"/>
-        </w:rPr>
-        <w:t>not</w:t>
-      </w:r>
-      <w:r>
-        <w:rPr>
-          <w:rFonts w:ascii="Times New Roman" w:hAnsi="Times New Roman"/>
-          <w:b w:val="0"/>
-          <w:i w:val="0"/>
-          <w:sz w:val="20"/>
-        </w:rPr>
-        <w:t xml:space="preserve"> a deployment-time decision rule, and the obvious annotation-free substitute — the </w:t>
-      </w:r>
-      <w:r>
-        <w:rPr>
-          <w:rFonts w:ascii="Times New Roman" w:hAnsi="Times New Roman"/>
-          <w:b w:val="0"/>
-          <w:i/>
-          <w:sz w:val="20"/>
-        </w:rPr>
-        <w:t>same</w:t>
-      </w:r>
-      <w:r>
-        <w:rPr>
-          <w:rFonts w:ascii="Times New Roman" w:hAnsi="Times New Roman"/>
-          <w:b w:val="0"/>
-          <w:i w:val="0"/>
-          <w:sz w:val="20"/>
-        </w:rPr>
-        <w:t xml:space="preserve"> functional form on </w:t>
-      </w:r>
-      <w:r>
-        <w:rPr>
-          <w:rFonts w:ascii="Times New Roman" w:hAnsi="Times New Roman"/>
-          <w:b/>
-          <w:i w:val="0"/>
-          <w:sz w:val="20"/>
-        </w:rPr>
-        <w:t>detector</w:t>
-      </w:r>
-      <w:r>
-        <w:rPr>
-          <w:rFonts w:ascii="Times New Roman" w:hAnsi="Times New Roman"/>
-          <w:b w:val="0"/>
-          <w:i w:val="0"/>
-          <w:sz w:val="20"/>
-        </w:rPr>
-        <w:t xml:space="preserve"> boxes — does not inherit its power (AUC </w:t>
-      </w:r>
-      <w:r>
-        <w:rPr>
-          <w:rFonts w:ascii="Times New Roman" w:hAnsi="Times New Roman"/>
-          <w:b/>
-          <w:i w:val="0"/>
-          <w:sz w:val="20"/>
-        </w:rPr>
-        <w:t>0.49–0.63</w:t>
-      </w:r>
-      <w:r>
-        <w:rPr>
-          <w:rFonts w:ascii="Times New Roman" w:hAnsi="Times New Roman"/>
-          <w:b w:val="0"/>
-          <w:i w:val="0"/>
-          <w:sz w:val="20"/>
-        </w:rPr>
-        <w:t xml:space="preserve">; Appendix M.20 records the measurement and why we report it as a boundary rather than a promise). It is also </w:t>
-      </w:r>
-      <w:r>
-        <w:rPr>
-          <w:rFonts w:ascii="Times New Roman" w:hAnsi="Times New Roman"/>
-          <w:b/>
-          <w:i w:val="0"/>
-          <w:sz w:val="20"/>
-        </w:rPr>
-        <w:t>not</w:t>
-      </w:r>
-      <w:r>
-        <w:rPr>
-          <w:rFonts w:ascii="Times New Roman" w:hAnsi="Times New Roman"/>
-          <w:b w:val="0"/>
-          <w:i w:val="0"/>
-          <w:sz w:val="20"/>
-        </w:rPr>
-        <w:t xml:space="preserve"> an attention map or a confidence, and </w:t>
-      </w:r>
-      <w:r>
-        <w:rPr>
-          <w:rFonts w:ascii="Times New Roman" w:hAnsi="Times New Roman"/>
-          <w:b/>
-          <w:i w:val="0"/>
-          <w:sz w:val="20"/>
-        </w:rPr>
-        <w:t>not</w:t>
-      </w:r>
-      <w:r>
-        <w:rPr>
-          <w:rFonts w:ascii="Times New Roman" w:hAnsi="Times New Roman"/>
-          <w:b w:val="0"/>
-          <w:i w:val="0"/>
-          <w:sz w:val="20"/>
-        </w:rPr>
         <w:t xml:space="preserve"> OPM, whose cross-domain Spearman correlation is only </w:t>
       </w:r>
       <w:r>
@@ -4097,7 +4025,7 @@
           <w:i w:val="0"/>
           <w:sz w:val="20"/>
         </w:rPr>
-        <w:t xml:space="preserve"> (§7.1). §7.7 states what a deployable rule would have to satisfy; §5.12 shows that the paper's own conclusions do not depend on this variable.</w:t>
+        <w:t xml:space="preserve"> (§7.1).</w:t>
       </w:r>
     </w:p>
     <w:p>
@@ -4223,7 +4151,25 @@
           <w:i w:val="0"/>
           <w:sz w:val="20"/>
         </w:rPr>
-        <w:t xml:space="preserve"> ShanghaiTech-A (433 targets per image), 68% vs. 57%.</w:t>
+        <w:t xml:space="preserve"> ShanghaiTech-A (433 targets per image), 68% vs. 57% (</w:t>
+      </w:r>
+      <w:r>
+        <w:rPr>
+          <w:rFonts w:ascii="Times New Roman" w:hAnsi="Times New Roman"/>
+          <w:b/>
+          <w:i w:val="0"/>
+          <w:sz w:val="20"/>
+        </w:rPr>
+        <w:t>Proposition 6</w:t>
+      </w:r>
+      <w:r>
+        <w:rPr>
+          <w:rFonts w:ascii="Times New Roman" w:hAnsi="Times New Roman"/>
+          <w:b w:val="0"/>
+          <w:i w:val="0"/>
+          <w:sz w:val="20"/>
+        </w:rPr>
+        <w:t>).</w:t>
       </w:r>
     </w:p>
     <w:p>
@@ -4408,25 +4354,7 @@
           <w:i w:val="0"/>
           <w:sz w:val="20"/>
         </w:rPr>
-        <w:t xml:space="preserve">Abstention is our leading indicator, so its operationalisation is stated item by item rather than left as "the predicted total is zero". </w:t>
-      </w:r>
-      <w:r>
-        <w:rPr>
-          <w:rFonts w:ascii="Times New Roman" w:hAnsi="Times New Roman"/>
-          <w:b/>
-          <w:i w:val="0"/>
-          <w:sz w:val="20"/>
-        </w:rPr>
-        <w:t>Appendix B</w:t>
-      </w:r>
-      <w:r>
-        <w:rPr>
-          <w:rFonts w:ascii="Times New Roman" w:hAnsi="Times New Roman"/>
-          <w:b w:val="0"/>
-          <w:i w:val="0"/>
-          <w:sz w:val="20"/>
-        </w:rPr>
-        <w:t xml:space="preserve"> carries the full protocol; three points matter here.</w:t>
+        <w:t>Abstention is our leading indicator, so its operationalisation is stated item by item rather than left as "the predicted total is zero". Three points matter here.</w:t>
       </w:r>
     </w:p>
     <w:p>
@@ -4637,7 +4565,7 @@
           <w:i w:val="0"/>
           <w:sz w:val="20"/>
         </w:rPr>
-        <w:t>(c) Is `pred = 0` a sufficient operationalisation? A lineage-stratified answer.</w:t>
+        <w:t>(c) Is `pred = 0` a sufficient operationalisation? A two-lineage answer (the two lineages for which the ratio is measured).</w:t>
       </w:r>
       <w:r>
         <w:rPr>
@@ -5769,24 +5697,6 @@
           <w:i w:val="0"/>
           <w:sz w:val="20"/>
         </w:rPr>
-        <w:t xml:space="preserve">; the figure and table plan of §3.9 is </w:t>
-      </w:r>
-      <w:r>
-        <w:rPr>
-          <w:rFonts w:ascii="Times New Roman" w:hAnsi="Times New Roman"/>
-          <w:b/>
-          <w:i w:val="0"/>
-          <w:sz w:val="20"/>
-        </w:rPr>
-        <w:t>Appendix D.4</w:t>
-      </w:r>
-      <w:r>
-        <w:rPr>
-          <w:rFonts w:ascii="Times New Roman" w:hAnsi="Times New Roman"/>
-          <w:b w:val="0"/>
-          <w:i w:val="0"/>
-          <w:sz w:val="20"/>
-        </w:rPr>
         <w:t>.</w:t>
       </w:r>
     </w:p>
@@ -6054,43 +5964,7 @@
           <w:i w:val="0"/>
           <w:sz w:val="20"/>
         </w:rPr>
-        <w:t xml:space="preserve"> ρ_total=-(1-w)+w ρ_answered with w=G_N/G, and the abstention share of the under-count has the closed form S=(1-w)/[1-w(1+ρ_answered)]. This is a reporting identity of the same form as the answer-propensity / conditional-composition decomposition we use elsewhere [46]; what is in question is where the movement goes on this corpus, and it is the one behind the </w:t>
-      </w:r>
-      <w:r>
-        <w:rPr>
-          <w:rFonts w:ascii="Times New Roman" w:hAnsi="Times New Roman"/>
-          <w:b/>
-          <w:i w:val="0"/>
-          <w:sz w:val="20"/>
-        </w:rPr>
-        <w:t>82–94%</w:t>
-      </w:r>
-      <w:r>
-        <w:rPr>
-          <w:rFonts w:ascii="Times New Roman" w:hAnsi="Times New Roman"/>
-          <w:b w:val="0"/>
-          <w:i w:val="0"/>
-          <w:sz w:val="20"/>
-        </w:rPr>
-        <w:t xml:space="preserve"> of §5.5 for the </w:t>
-      </w:r>
-      <w:r>
-        <w:rPr>
-          <w:rFonts w:ascii="Times New Roman" w:hAnsi="Times New Roman"/>
-          <w:b/>
-          <w:i w:val="0"/>
-          <w:sz w:val="20"/>
-        </w:rPr>
-        <w:t>base contract arm</w:t>
-      </w:r>
-      <w:r>
-        <w:rPr>
-          <w:rFonts w:ascii="Times New Roman" w:hAnsi="Times New Roman"/>
-          <w:b w:val="0"/>
-          <w:i w:val="0"/>
-          <w:sz w:val="20"/>
-        </w:rPr>
-        <w:t>.</w:t>
+        <w:t xml:space="preserve"> ρ_total=-(1-w)+w ρ_answered with w=G_N/G, and the abstention share of the under-count has the closed form S=(1-w)/[1-w(1+ρ_answered)], which is a share inside [0,1] only when the net deviation is an under-count; where it is not, the two pp terms of Table 3 are the reported quantities (§8.2). This is a reporting identity of the same form as the answer-propensity / conditional-composition decomposition we use elsewhere [46]; what is in question is where the movement goes on this corpus.</w:t>
       </w:r>
     </w:p>
     <w:p>
@@ -6312,7 +6186,7 @@
           <w:i w:val="0"/>
           <w:sz w:val="20"/>
         </w:rPr>
-        <w:t xml:space="preserve"> has headroom in both pools — </w:t>
+        <w:t xml:space="preserve"> — gemma-3-12b — has headroom in both pools, so only that build's two-source comparison is licensed (the other three builds' two-source agreement there is largely a saturation product, Appendix M.32(c)), and  remains unknown (Appendix M.21) — </w:t>
       </w:r>
       <w:r>
         <w:rPr>
@@ -6411,6 +6285,24 @@
           <w:i w:val="0"/>
           <w:sz w:val="20"/>
         </w:rPr>
+        <w:t xml:space="preserve"> and Tables </w:t>
+      </w:r>
+      <w:r>
+        <w:rPr>
+          <w:rFonts w:ascii="Times New Roman" w:hAnsi="Times New Roman"/>
+          <w:b/>
+          <w:i w:val="0"/>
+          <w:sz w:val="20"/>
+        </w:rPr>
+        <w:t>1–6</w:t>
+      </w:r>
+      <w:r>
+        <w:rPr>
+          <w:rFonts w:ascii="Times New Roman" w:hAnsi="Times New Roman"/>
+          <w:b w:val="0"/>
+          <w:i w:val="0"/>
+          <w:sz w:val="20"/>
+        </w:rPr>
         <w:t xml:space="preserve"> appear where their claim is stated (</w:t>
       </w:r>
       <w:r>
@@ -6587,7 +6479,7 @@
           <w:i w:val="0"/>
           <w:sz w:val="20"/>
         </w:rPr>
-        <w:t xml:space="preserve"> — and never crosses (all-detections, same eight-level grid: </w:t>
+        <w:t xml:space="preserve"> (three levels) — and never crosses (all-detections, same eight-level grid: </w:t>
       </w:r>
       <w:r>
         <w:rPr>
@@ -6623,25 +6515,7 @@
           <w:i w:val="0"/>
           <w:sz w:val="20"/>
         </w:rPr>
-        <w:t xml:space="preserve"> for the in-domain one; Appendix F.10). It is a usable availability test, </w:t>
-      </w:r>
-      <w:r>
-        <w:rPr>
-          <w:rFonts w:ascii="Times New Roman" w:hAnsi="Times New Roman"/>
-          <w:b/>
-          <w:i w:val="0"/>
-          <w:sz w:val="20"/>
-        </w:rPr>
-        <w:t>not</w:t>
-      </w:r>
-      <w:r>
-        <w:rPr>
-          <w:rFonts w:ascii="Times New Roman" w:hAnsi="Times New Roman"/>
-          <w:b w:val="0"/>
-          <w:i w:val="0"/>
-          <w:sz w:val="20"/>
-        </w:rPr>
-        <w:t xml:space="preserve"> a predictor of how large the span will be (§7.3). (Appendix M.37)</w:t>
+        <w:t xml:space="preserve"> for the in-domain one; Appendix F.10). (Appendix M.37)</w:t>
       </w:r>
     </w:p>
     <w:p>
@@ -6684,7 +6558,7 @@
           <w:i w:val="0"/>
           <w:sz w:val="20"/>
         </w:rPr>
-        <w:t>: the last reachable bin is reached by tiling, and what fails beyond it is the per-tile instance budget. This converts an unexplained ceiling into a design rule.</w:t>
+        <w:t>: the last reachable bin is reached by tiling, and what fails beyond it is the per-tile instance budget.</w:t>
       </w:r>
     </w:p>
     <w:p>
@@ -7192,28 +7066,10 @@
         <w:rPr>
           <w:rFonts w:ascii="Times New Roman" w:hAnsi="Times New Roman"/>
           <w:b w:val="0"/>
-          <w:i/>
-          <w:sz w:val="20"/>
-        </w:rPr>
-        <w:t xml:space="preserve"> for YOLO (UCF 0.121 → 0.176 → 0.173; ShanghaiTech-A unreachable → 0.260 → 0.183). Full ladders in </w:t>
-      </w:r>
-      <w:r>
-        <w:rPr>
-          <w:rFonts w:ascii="Times New Roman" w:hAnsi="Times New Roman"/>
-          <w:b w:val="0"/>
-          <w:i/>
-          <w:sz w:val="20"/>
-        </w:rPr>
-        <w:t>Appendix E</w:t>
-      </w:r>
-      <w:r>
-        <w:rPr>
-          <w:rFonts w:ascii="Times New Roman" w:hAnsi="Times New Roman"/>
-          <w:b w:val="0"/>
-          <w:i w:val="0"/>
-          <w:sz w:val="20"/>
-        </w:rPr>
-        <w:t>*.</w:t>
+          <w:i w:val="0"/>
+          <w:sz w:val="20"/>
+        </w:rPr>
+        <w:t>* for YOLO (UCF 0.121 → 0.176 → 0.173; ShanghaiTech-A unreachable → 0.260 → 0.183).</w:t>
       </w:r>
     </w:p>
     <w:p>
@@ -7331,7 +7187,7 @@
           <w:i w:val="0"/>
           <w:sz w:val="20"/>
         </w:rPr>
-        <w:t>Screening on the sparse end (SFCHD, 12,066 images) across three arms and two stacks establishes the baseline for the rest of the section: on sparse, clearly visible targets, the three-arm prompts move the direction as expected but at small amplitudes, and abstention is negligible. The dense and aerial domains, where the effects of interest live, are the subject of the remaining subsections.</w:t>
+        <w:t>Screening on the sparse end (SFCHD, 12,066 images) across three arms and two stacks establishes the baseline for the rest of the section: on sparse, clearly visible targets, the three-arm prompts move the direction as expected but at small amplitudes, and abstention is negligible.</w:t>
       </w:r>
     </w:p>
     <w:p>
@@ -7374,7 +7230,7 @@
           <w:i w:val="0"/>
           <w:sz w:val="20"/>
         </w:rPr>
-        <w:t xml:space="preserve"> between conventions. The consequence is the one stated in §3.2: numbers are not comparable across studies unless the target granularity is declared.</w:t>
+        <w:t xml:space="preserve"> between conventions.</w:t>
       </w:r>
     </w:p>
     <w:p>
@@ -7620,7 +7476,7 @@
           <w:i w:val="0"/>
           <w:sz w:val="20"/>
         </w:rPr>
-        <w:t>This is the quantitative core of the paper's central claim: the received description "VLMs underestimate dense scenes" is mostly a description of refusals.</w:t>
+        <w:t>This is the quantitative core of the paper's central claim (a coverage of the abstention channel, not a precision; Proposition 7): the received description "VLMs underestimate dense scenes" is mostly a description of refusals.</w:t>
       </w:r>
       <w:r>
         <w:rPr>
@@ -8361,7 +8217,7 @@
           <w:i w:val="0"/>
           <w:sz w:val="20"/>
         </w:rPr>
-        <w:t xml:space="preserve"> band (§8.1).</w:t>
+        <w:t xml:space="preserve"> band (§A.3 — the across-repeat band of ρ, which is neither the 3.92 pp batch bound of Appendix M.21.9 nor a band for zero rates).</w:t>
       </w:r>
     </w:p>
     <w:p>
@@ -8745,7 +8601,25 @@
           <w:i w:val="0"/>
           <w:sz w:val="20"/>
         </w:rPr>
-        <w:t xml:space="preserve"> The cross-family contract gate.</w:t>
+        <w:t xml:space="preserve"> The cross-family contract gate. The three rows tagged </w:t>
+      </w:r>
+      <w:r>
+        <w:rPr>
+          <w:rFonts w:ascii="Times New Roman" w:hAnsi="Times New Roman"/>
+          <w:b w:val="0"/>
+          <w:i/>
+          <w:sz w:val="20"/>
+        </w:rPr>
+        <w:t>(anchor)</w:t>
+      </w:r>
+      <w:r>
+        <w:rPr>
+          <w:rFonts w:ascii="Times New Roman" w:hAnsi="Times New Roman"/>
+          <w:b w:val="0"/>
+          <w:i w:val="0"/>
+          <w:sz w:val="20"/>
+        </w:rPr>
+        <w:t xml:space="preserve"> use the community AWQ-4bit requantisation of §3.5.</w:t>
       </w:r>
     </w:p>
     <w:tbl>
@@ -9787,25 +9661,7 @@
           <w:i w:val="0"/>
           <w:sz w:val="20"/>
         </w:rPr>
-        <w:t xml:space="preserve">). </w:t>
-      </w:r>
-      <w:r>
-        <w:rPr>
-          <w:rFonts w:ascii="Times New Roman" w:hAnsi="Times New Roman"/>
-          <w:b/>
-          <w:i w:val="0"/>
-          <w:sz w:val="20"/>
-        </w:rPr>
-        <w:t>Legibility decides *whether* to answer, not *which way* to be wrong.</w:t>
-      </w:r>
-      <w:r>
-        <w:rPr>
-          <w:rFonts w:ascii="Times New Roman" w:hAnsi="Times New Roman"/>
-          <w:b w:val="0"/>
-          <w:i w:val="0"/>
-          <w:sz w:val="20"/>
-        </w:rPr>
-        <w:t xml:space="preserve"> What gates abstention is </w:t>
+        <w:t xml:space="preserve">). What gates abstention is </w:t>
       </w:r>
       <w:r>
         <w:rPr>
@@ -11255,7 +11111,7 @@
           <w:i w:val="0"/>
           <w:sz w:val="20"/>
         </w:rPr>
-        <w:t xml:space="preserve">: it cannot make a user deploy the wrong model, but it can make the numbers incomparable. The decision-relevant quantity is the abstention </w:t>
+        <w:t xml:space="preserve"> for the three decision forms tested here: across those forms it cannot make a user deploy the wrong model, but it can make the numbers incomparable. The decision-relevant quantity is the abstention </w:t>
       </w:r>
       <w:r>
         <w:rPr>
@@ -11372,7 +11228,7 @@
           <w:i w:val="0"/>
           <w:sz w:val="20"/>
         </w:rPr>
-        <w:t xml:space="preserve"> The contract gate on FSC-147.</w:t>
+        <w:t xml:space="preserve"> The contract gate on FSC-147 (five of the nine configurations in the panel; the full panel is Appendix M.24.1).</w:t>
       </w:r>
     </w:p>
     <w:tbl>
@@ -12232,7 +12088,7 @@
           <w:i w:val="0"/>
           <w:sz w:val="20"/>
         </w:rPr>
-        <w:t>, 1 inversion of 36) — the asymmetry §5.12 reports for the decision forms. Its sensitivity to the input scale is bounded in Appendix M.41.</w:t>
+        <w:t>, 1 inversion of 36) — the asymmetry §5.12 reports for the decision forms. Its sensitivity to the input scale is bounded in Appendix M.41. The two rank correlations behind this paragraph rest on the answered subset of the 300 sampled images, which is 17–52 images per configuration (Appendix M.24.2); those two figures carry no interval.</w:t>
       </w:r>
     </w:p>
     <w:p>
@@ -12439,7 +12295,7 @@
           <w:i w:val="0"/>
           <w:sz w:val="20"/>
         </w:rPr>
-        <w:t xml:space="preserve"> qualifying cells (83%), while the resolution knob alone never moves it by more than </w:t>
+        <w:t xml:space="preserve"> qualifying cells (83%; exact binomial P(X≥10| n=12, p=1/2)=0.019), while the resolution knob alone never moves it by more than </w:t>
       </w:r>
       <w:r>
         <w:rPr>
@@ -12511,7 +12367,25 @@
           <w:i w:val="0"/>
           <w:sz w:val="20"/>
         </w:rPr>
-        <w:t xml:space="preserve"> — with a bootstrap interval that excludes zero. That is the population-level statement the earlier corpora could not make.</w:t>
+        <w:t xml:space="preserve"> — with a bootstrap interval that excludes zero — the frozen record value </w:t>
+      </w:r>
+      <w:r>
+        <w:rPr>
+          <w:rFonts w:ascii="Times New Roman" w:hAnsi="Times New Roman"/>
+          <w:b/>
+          <w:i w:val="0"/>
+          <w:sz w:val="20"/>
+        </w:rPr>
+        <w:t>`[0.0831, 0.1002]`</w:t>
+      </w:r>
+      <w:r>
+        <w:rPr>
+          <w:rFonts w:ascii="Times New Roman" w:hAnsi="Times New Roman"/>
+          <w:b w:val="0"/>
+          <w:i w:val="0"/>
+          <w:sz w:val="20"/>
+        </w:rPr>
+        <w:t>, item level, as printed in Appendix M.31.2. That is the population-level statement the earlier corpora could not make.</w:t>
       </w:r>
     </w:p>
     <w:p>
@@ -13165,7 +13039,7 @@
           <w:i w:val="0"/>
           <w:sz w:val="20"/>
         </w:rPr>
-        <w:t xml:space="preserve"> Ten unit values on four sides resolve to the design's own noise floor, </w:t>
+        <w:t xml:space="preserve"> Ten unit values on four sides — six knobs map onto four sides, and Appendix F.2 reconciles the three unit sets — resolve to the design's own noise floor, </w:t>
       </w:r>
       <w:r>
         <w:rPr>
@@ -13381,25 +13255,7 @@
           <w:i w:val="0"/>
           <w:sz w:val="20"/>
         </w:rPr>
-        <w:t xml:space="preserve"> (Appendix F.7, M.37). F.9 is an illustration only; the load-bearing ordering evidence is the </w:t>
-      </w:r>
-      <w:r>
-        <w:rPr>
-          <w:rFonts w:ascii="Times New Roman" w:hAnsi="Times New Roman"/>
-          <w:b/>
-          <w:i w:val="0"/>
-          <w:sz w:val="20"/>
-        </w:rPr>
-        <w:t>recomputable</w:t>
-      </w:r>
-      <w:r>
-        <w:rPr>
-          <w:rFonts w:ascii="Times New Roman" w:hAnsi="Times New Roman"/>
-          <w:b w:val="0"/>
-          <w:i w:val="0"/>
-          <w:sz w:val="20"/>
-        </w:rPr>
-        <w:t xml:space="preserve"> set of Appendix M.37.</w:t>
+        <w:t xml:space="preserve"> (Appendix F.7, M.37).</w:t>
       </w:r>
     </w:p>
     <w:p>
@@ -13545,7 +13401,7 @@
           <w:i w:val="0"/>
           <w:sz w:val="20"/>
         </w:rPr>
-        <w:t>; a label-permutation test gives p&lt;5×10^-5; leaving out any single knob (</w:t>
+        <w:t xml:space="preserve"> (author-side: not independently recomputable from the released package, Appendix F.7); a label-permutation test gives p&lt;5×10^-5; leaving out any single knob (</w:t>
       </w:r>
       <w:r>
         <w:rPr>
@@ -13914,7 +13770,7 @@
           <w:i w:val="0"/>
           <w:sz w:val="20"/>
         </w:rPr>
-        <w:t>No scale-free form of the span — equal-count gridding, endpoint removal, or the three M.37 calibration families — makes cross-knob magnitudes invariant, and the ordering also survives normalising each span by its knob's relative travel (Appendix F.10; M.42–M.45).</w:t>
+        <w:t>No scale-free form of the span — equal-count gridding, endpoint removal, or the three M.37 calibration families — makes cross-knob magnitudes invariant, and the ordering also survives normalising each span by its knob's relative travel (Appendix F.10; M.42–M.45), and the 0.85 criterion set for that objection is not met by the re-normalised ladders (0.629 on log ratios, 0.595 on ranks, 0.580–0.754 over the four subsets; Appendix M.37).</w:t>
       </w:r>
       <w:r>
         <w:rPr>
@@ -14051,7 +13907,7 @@
           <w:i w:val="0"/>
           <w:sz w:val="20"/>
         </w:rPr>
-        <w:t>rank knobs by this ordering, and quote a magnitude only with the grid density and the calibration caliber that produced it.</w:t>
+        <w:t>rank knobs by this ordering, and quote a magnitude only with the grid density and the calibration caliber that produced it, and only within the level sets compared.</w:t>
       </w:r>
       <w:r>
         <w:rPr>
@@ -14687,7 +14543,7 @@
           <w:i w:val="0"/>
           <w:sz w:val="20"/>
         </w:rPr>
-        <w:t xml:space="preserve"> (residual ≤5% ⇒ contract-set; &gt;30% ⇒ record a counterexample and retry with the three-option wording; a convention gap below the 7 pp noise floor ⇒ immaterial for that cell). Adoption costs one serving session and yields the two quantities §5.3–§5.13 turn on, which is what makes these comparisons reproducible elsewhere (M.22). In a first independent use it was run, unchanged, on two corpora whose recipe residual had never been reported — including a large unconstrained dense-crowd release (JHU-CROWD++ [51]) — with the criteria fixed before the runs (Appendix M.46).</w:t>
+        <w:t xml:space="preserve"> (residual ≤5% read from the point estimate — several cells rest on 2–25 items, so their upper bounds are wide and they are direction readings, Appendix M.46(a) ⇒ contract-set; &gt;30% ⇒ record a counterexample and retry with the three-option wording; a convention gap below the 7 pp noise floor ⇒ immaterial for that cell). Adoption costs one serving session and yields the two quantities §5.3–§5.13 turn on, which is what makes these comparisons reproducible elsewhere (M.22). In a first independent use it was run, unchanged, on two corpora whose recipe residual had never been reported — including a large unconstrained dense-crowd release (JHU-CROWD++ [51]) — with the criteria fixed before the runs (Appendix M.46).</w:t>
       </w:r>
     </w:p>
     <w:p>
@@ -15632,7 +15488,25 @@
           <w:i w:val="0"/>
           <w:sz w:val="20"/>
         </w:rPr>
-        <w:t xml:space="preserve"> (Appendix M.39). The shares of §5.5 are therefore scoped to the prompt language and to the </w:t>
+        <w:t xml:space="preserve"> — a pooled dense-pool figure; the per-domain drops on the same build are </w:t>
+      </w:r>
+      <w:r>
+        <w:rPr>
+          <w:rFonts w:ascii="Times New Roman" w:hAnsi="Times New Roman"/>
+          <w:b/>
+          <w:i w:val="0"/>
+          <w:sz w:val="20"/>
+        </w:rPr>
+        <w:t>18–22 pp</w:t>
+      </w:r>
+      <w:r>
+        <w:rPr>
+          <w:rFonts w:ascii="Times New Roman" w:hAnsi="Times New Roman"/>
+          <w:b w:val="0"/>
+          <w:i w:val="0"/>
+          <w:sz w:val="20"/>
+        </w:rPr>
+        <w:t xml:space="preserve"> and come from a different item set (Appendix M.39). The shares of §5.5 are therefore scoped to the prompt language and to the </w:t>
       </w:r>
       <w:r>
         <w:rPr>
@@ -15704,7 +15578,7 @@
           <w:i w:val="0"/>
           <w:sz w:val="20"/>
         </w:rPr>
-        <w:t xml:space="preserve"> leaves its unit interval when the net deviation is near zero — three of twenty cells, unmeasured rather than clipped — and the </w:t>
+        <w:t xml:space="preserve"> leaves its unit interval when the net deviation is near zero — three of twenty cells, unmeasured rather than clipped, the two pp terms of Table 3 being the fallback there — and the </w:t>
       </w:r>
       <w:r>
         <w:rPr>
@@ -15722,25 +15596,7 @@
           <w:i w:val="0"/>
           <w:sz w:val="20"/>
         </w:rPr>
-        <w:t xml:space="preserve"> prompt lowers the answered-zero rate on the dense domains only, by 18–22 pp on the </w:t>
-      </w:r>
-      <w:r>
-        <w:rPr>
-          <w:rFonts w:ascii="Times New Roman" w:hAnsi="Times New Roman"/>
-          <w:b/>
-          <w:i w:val="0"/>
-          <w:sz w:val="20"/>
-        </w:rPr>
-        <w:t>BF16</w:t>
-      </w:r>
-      <w:r>
-        <w:rPr>
-          <w:rFonts w:ascii="Times New Roman" w:hAnsi="Times New Roman"/>
-          <w:b w:val="0"/>
-          <w:i w:val="0"/>
-          <w:sz w:val="20"/>
-        </w:rPr>
-        <w:t xml:space="preserve"> build, against </w:t>
+        <w:t xml:space="preserve"> prompt lowers the answered-zero rate on the dense domains only, by </w:t>
       </w:r>
       <w:r>
         <w:rPr>
@@ -15776,7 +15632,25 @@
           <w:i w:val="0"/>
           <w:sz w:val="20"/>
         </w:rPr>
-        <w:t xml:space="preserve"> build, where two of the twenty cells stay outside the unit interval (Appendices M.19.16, M.46(c)). </w:t>
+        <w:t xml:space="preserve"> build, where two of the twenty cells stay outside the unit interval and every absolute rate on that build carries a </w:t>
+      </w:r>
+      <w:r>
+        <w:rPr>
+          <w:rFonts w:ascii="Times New Roman" w:hAnsi="Times New Roman"/>
+          <w:b/>
+          <w:i w:val="0"/>
+          <w:sz w:val="20"/>
+        </w:rPr>
+        <w:t>~1.3% item-level stack band</w:t>
+      </w:r>
+      <w:r>
+        <w:rPr>
+          <w:rFonts w:ascii="Times New Roman" w:hAnsi="Times New Roman"/>
+          <w:b w:val="0"/>
+          <w:i w:val="0"/>
+          <w:sz w:val="20"/>
+        </w:rPr>
+        <w:t xml:space="preserve"> (Appendices M.19.16, M.46(c)). </w:t>
       </w:r>
       <w:r>
         <w:rPr>
@@ -15794,7 +15668,43 @@
           <w:i w:val="0"/>
           <w:sz w:val="20"/>
         </w:rPr>
-        <w:t xml:space="preserve"> — the hardware cannot select the latter — so they bound the build, not that path (M.46(c)).</w:t>
+        <w:t xml:space="preserve"> — the host's compute capability is </w:t>
+      </w:r>
+      <w:r>
+        <w:rPr>
+          <w:rFonts w:ascii="Times New Roman" w:hAnsi="Times New Roman"/>
+          <w:b/>
+          <w:i w:val="0"/>
+          <w:sz w:val="20"/>
+        </w:rPr>
+        <w:t>8.0</w:t>
+      </w:r>
+      <w:r>
+        <w:rPr>
+          <w:rFonts w:ascii="Times New Roman" w:hAnsi="Times New Roman"/>
+          <w:b w:val="0"/>
+          <w:i w:val="0"/>
+          <w:sz w:val="20"/>
+        </w:rPr>
+        <w:t xml:space="preserve"> and W8A16 needs </w:t>
+      </w:r>
+      <w:r>
+        <w:rPr>
+          <w:rFonts w:ascii="Times New Roman" w:hAnsi="Times New Roman"/>
+          <w:b/>
+          <w:i w:val="0"/>
+          <w:sz w:val="20"/>
+        </w:rPr>
+        <w:t>8.9</w:t>
+      </w:r>
+      <w:r>
+        <w:rPr>
+          <w:rFonts w:ascii="Times New Roman" w:hAnsi="Times New Roman"/>
+          <w:b w:val="0"/>
+          <w:i w:val="0"/>
+          <w:sz w:val="20"/>
+        </w:rPr>
+        <w:t>, so the loader takes the weight-only path — and they therefore bound the build, not that path (M.46(c)).</w:t>
       </w:r>
     </w:p>
     <w:p>
@@ -15852,7 +15762,7 @@
           <w:i w:val="0"/>
           <w:sz w:val="20"/>
         </w:rPr>
-        <w:t xml:space="preserve"> (four knob sides, ten units); the separated-cluster claim rests on a permutation test over single split points plus bootstrap intervals, not on a modality test.</w:t>
+        <w:t xml:space="preserve"> (four knob sides, ten units), and the candidate claim rests on a permutation test over single split points plus bootstrap intervals, not on a modality test.</w:t>
       </w:r>
     </w:p>
     <w:p>

</xml_diff>

<commit_message>
v0623: 理论补强10项 + T6两轮跨池复制 + E3多渲染 + §M.45(b)放行 + 42.5%->50%
</commit_message>
<xml_diff>
--- a/manuscript/PaperB_manuscript_PR_layout.docx
+++ b/manuscript/PaperB_manuscript_PR_layout.docx
@@ -1239,7 +1239,7 @@
           <w:i w:val="0"/>
           <w:sz w:val="20"/>
         </w:rPr>
-        <w:t>up to 42.5%</w:t>
+        <w:t>up to 50%</w:t>
       </w:r>
       <w:r>
         <w:rPr>
@@ -8246,7 +8246,7 @@
           <w:i w:val="0"/>
           <w:sz w:val="20"/>
         </w:rPr>
-        <w:t>up to 42.5%</w:t>
+        <w:t>up to 50%</w:t>
       </w:r>
       <w:r>
         <w:rPr>
@@ -9473,7 +9473,7 @@
           <w:i w:val="0"/>
           <w:sz w:val="20"/>
         </w:rPr>
-        <w:t>up to 42.5%</w:t>
+        <w:t>up to 50%</w:t>
       </w:r>
       <w:r>
         <w:rPr>

</xml_diff>

<commit_message>
v0634: 五处口径错误(no more accurate/M.19.16(ii)指针/过冲下界/loss指针/口径绑定)+放行 a39_disp4.py；主稿净0词
</commit_message>
<xml_diff>
--- a/manuscript/PaperB_manuscript_PR_layout.docx
+++ b/manuscript/PaperB_manuscript_PR_layout.docx
@@ -7467,7 +7467,7 @@
           <w:i w:val="0"/>
           <w:sz w:val="20"/>
         </w:rPr>
-        <w:t xml:space="preserve"> (three of twenty (language × build) cells leave the unit interval; M.18.9, M.39, M.46(c)). </w:t>
+        <w:t xml:space="preserve"> (three of twenty (language × build) cells leave the unit interval; M.18.9, M.19.16(ii), M.39, M.46(c)). </w:t>
       </w:r>
       <w:r>
         <w:rPr>
@@ -12551,7 +12551,7 @@
           <w:i w:val="0"/>
           <w:sz w:val="20"/>
         </w:rPr>
-        <w:t xml:space="preserve"> of those items (residual 0.00%); and their numbers are no more accurate than the open families' (</w:t>
+        <w:t xml:space="preserve"> of those items (residual 0.00%); and their numbers are more accurate than the open families' (</w:t>
       </w:r>
       <w:r>
         <w:rPr>

</xml_diff>

<commit_message>
v0647: trace neutralization (two release scripts), failure semantics in adopt_report.py, novelty narrowing, F.7 clustered-p print value, M.11.1 caliber
</commit_message>
<xml_diff>
--- a/manuscript/PaperB_manuscript_PR_layout.docx
+++ b/manuscript/PaperB_manuscript_PR_layout.docx
@@ -1445,7 +1445,7 @@
           <w:i w:val="0"/>
           <w:sz w:val="20"/>
         </w:rPr>
-        <w:t>④ Removing abstention costs direction.</w:t>
+        <w:t>④ Removing abstention costs direction among the tested interventions.</w:t>
       </w:r>
       <w:r>
         <w:rPr>
@@ -1508,25 +1508,25 @@
           <w:i w:val="0"/>
           <w:sz w:val="20"/>
         </w:rPr>
-        <w:t xml:space="preserve">, so </w:t>
-      </w:r>
-      <w:r>
-        <w:rPr>
-          <w:rFonts w:ascii="Times New Roman" w:hAnsi="Times New Roman"/>
-          <w:b/>
-          <w:i w:val="0"/>
-          <w:sz w:val="20"/>
-        </w:rPr>
-        <w:t>accuracy and directional controllability cannot both be obtained</w:t>
-      </w:r>
-      <w:r>
-        <w:rPr>
-          <w:rFonts w:ascii="Times New Roman" w:hAnsi="Times New Roman"/>
-          <w:b w:val="0"/>
-          <w:i w:val="0"/>
-          <w:sz w:val="20"/>
-        </w:rPr>
-        <w:t xml:space="preserve">; tiling is the only mechanism that improves both. </w:t>
+        <w:t xml:space="preserve">; </w:t>
+      </w:r>
+      <w:r>
+        <w:rPr>
+          <w:rFonts w:ascii="Times New Roman" w:hAnsi="Times New Roman"/>
+          <w:b/>
+          <w:i w:val="0"/>
+          <w:sz w:val="20"/>
+        </w:rPr>
+        <w:t>among the tested interventions, tiling is the only one that improves both.</w:t>
+      </w:r>
+      <w:r>
+        <w:rPr>
+          <w:rFonts w:ascii="Times New Roman" w:hAnsi="Times New Roman"/>
+          <w:b w:val="0"/>
+          <w:i w:val="0"/>
+          <w:sz w:val="20"/>
+        </w:rPr>
+        <w:t xml:space="preserve"> </w:t>
       </w:r>
       <w:r>
         <w:rPr>
@@ -14511,16 +14511,16 @@
           <w:i w:val="0"/>
           <w:sz w:val="20"/>
         </w:rPr>
-        <w:t>not identifiable from these output-level signals</w:t>
-      </w:r>
-      <w:r>
-        <w:rPr>
-          <w:rFonts w:ascii="Times New Roman" w:hAnsi="Times New Roman"/>
-          <w:b w:val="0"/>
-          <w:i w:val="0"/>
-          <w:sz w:val="20"/>
-        </w:rPr>
-        <w:t xml:space="preserve"> — it has to come from outside the answers (Appendices M.23, M.14).</w:t>
+        <w:t>not identified by the three tested output-level signals</w:t>
+      </w:r>
+      <w:r>
+        <w:rPr>
+          <w:rFonts w:ascii="Times New Roman" w:hAnsi="Times New Roman"/>
+          <w:b w:val="0"/>
+          <w:i w:val="0"/>
+          <w:sz w:val="20"/>
+        </w:rPr>
+        <w:t xml:space="preserve"> — it must come from outside the answers (Appendices M.23, M.14).</w:t>
       </w:r>
     </w:p>
     <w:p>

</xml_diff>

<commit_message>
v0649: M.27 aligned to main text (three calibers 3/78/75), M.46(a) entry condition fixed (prints 49 1), M.31.8 four failed predictions, M.21.10(e) coverage point not bracket, 5.14 panel wording, M.31.1 35GB protocol deviation, M.19.15 denominator wording, probe position/tensor-count corrections, .BUGGY placeholder neutralization
</commit_message>
<xml_diff>
--- a/manuscript/PaperB_manuscript_PR_layout.docx
+++ b/manuscript/PaperB_manuscript_PR_layout.docx
@@ -11219,7 +11219,7 @@
           <w:i w:val="0"/>
           <w:sz w:val="20"/>
         </w:rPr>
-        <w:t>one verdict flips</w:t>
+        <w:t>three verdicts flip</w:t>
       </w:r>
       <w:r>
         <w:rPr>
@@ -12592,7 +12592,7 @@
           <w:i w:val="0"/>
           <w:sz w:val="20"/>
         </w:rPr>
-        <w:t>, item level, as printed in Appendix M.31.2. That is the population-level statement the earlier corpora could not make.</w:t>
+        <w:t>, item level (Appendix M.31.2). That is a fixed, partially protocol-deviating panel statement, not a population interval over families.</w:t>
       </w:r>
     </w:p>
     <w:p>

</xml_diff>

<commit_message>
v0657: four figure captions (Fig. 1-4), reviewer-process metadata neutralised in the release tree, task-book hardening
</commit_message>
<xml_diff>
--- a/manuscript/PaperB_manuscript_PR_layout.docx
+++ b/manuscript/PaperB_manuscript_PR_layout.docx
@@ -1443,6 +1443,26 @@
           <w:rFonts w:ascii="Times New Roman" w:hAnsi="Times New Roman"/>
           <w:b/>
           <w:i w:val="0"/>
+          <w:sz w:val="16"/>
+        </w:rPr>
+        <w:t>Fig. 1.</w:t>
+      </w:r>
+      <w:r>
+        <w:rPr>
+          <w:rFonts w:ascii="Times New Roman" w:hAnsi="Times New Roman"/>
+          <w:b w:val="0"/>
+          <w:i w:val="0"/>
+          <w:sz w:val="16"/>
+        </w:rPr>
+        <w:t xml:space="preserve"> Tiling removes the ShanghaiTech-A abstention without harming direction.</w:t>
+      </w:r>
+    </w:p>
+    <w:p>
+      <w:r>
+        <w:rPr>
+          <w:rFonts w:ascii="Times New Roman" w:hAnsi="Times New Roman"/>
+          <w:b/>
+          <w:i w:val="0"/>
           <w:sz w:val="20"/>
         </w:rPr>
         <w:t>④ Removing abstention costs direction among the tested interventions.</w:t>
@@ -1517,7 +1537,7 @@
           <w:i w:val="0"/>
           <w:sz w:val="20"/>
         </w:rPr>
-        <w:t>among the tested interventions, tiling is the only one that improves both.</w:t>
+        <w:t>tiling is the only one that improves both.</w:t>
       </w:r>
       <w:r>
         <w:rPr>
@@ -1584,180 +1604,18 @@
           <w:rFonts w:ascii="Times New Roman" w:hAnsi="Times New Roman"/>
           <w:b/>
           <w:i w:val="0"/>
-          <w:sz w:val="20"/>
-        </w:rPr>
-        <w:t>Supporting result: the response spectrum of direction.</w:t>
-      </w:r>
-      <w:r>
-        <w:rPr>
-          <w:rFonts w:ascii="Times New Roman" w:hAnsi="Times New Roman"/>
-          <w:b w:val="0"/>
-          <w:i w:val="0"/>
-          <w:sz w:val="20"/>
-        </w:rPr>
-        <w:t xml:space="preserve"> The signed direction can be moved continuously, but its </w:t>
-      </w:r>
-      <w:r>
-        <w:rPr>
-          <w:rFonts w:ascii="Times New Roman" w:hAnsi="Times New Roman"/>
-          <w:b/>
-          <w:i w:val="0"/>
-          <w:sz w:val="20"/>
-        </w:rPr>
-        <w:t>achievable span is an empirical property of implementation × training domain × data domain × protocol, not of a paradigm</w:t>
-      </w:r>
-      <w:r>
-        <w:rPr>
-          <w:rFonts w:ascii="Times New Roman" w:hAnsi="Times New Roman"/>
-          <w:b w:val="0"/>
-          <w:i w:val="0"/>
-          <w:sz w:val="20"/>
-        </w:rPr>
-        <w:t xml:space="preserve">. What is established is the </w:t>
-      </w:r>
-      <w:r>
-        <w:rPr>
-          <w:rFonts w:ascii="Times New Roman" w:hAnsi="Times New Roman"/>
-          <w:b/>
-          <w:i w:val="0"/>
-          <w:sz w:val="20"/>
-        </w:rPr>
-        <w:t>ordering</w:t>
-      </w:r>
-      <w:r>
-        <w:rPr>
-          <w:rFonts w:ascii="Times New Roman" w:hAnsi="Times New Roman"/>
-          <w:b w:val="0"/>
-          <w:i w:val="0"/>
-          <w:sz w:val="20"/>
-        </w:rPr>
-        <w:t xml:space="preserve">, preserved at </w:t>
-      </w:r>
-      <w:r>
-        <w:rPr>
-          <w:rFonts w:ascii="Times New Roman" w:hAnsi="Times New Roman"/>
-          <w:b/>
-          <w:i w:val="0"/>
-          <w:sz w:val="20"/>
-        </w:rPr>
-        <w:t>Spearman 0.981–0.999</w:t>
-      </w:r>
-      <w:r>
-        <w:rPr>
-          <w:rFonts w:ascii="Times New Roman" w:hAnsi="Times New Roman"/>
-          <w:b w:val="0"/>
-          <w:i w:val="0"/>
-          <w:sz w:val="20"/>
-        </w:rPr>
-        <w:t xml:space="preserve"> when every ladder is re-estimated on a common level count with its extreme level removed (Appendix F.10): the </w:t>
-      </w:r>
-      <w:r>
-        <w:rPr>
-          <w:rFonts w:ascii="Times New Roman" w:hAnsi="Times New Roman"/>
-          <w:b/>
-          <w:i w:val="0"/>
-          <w:sz w:val="20"/>
-        </w:rPr>
-        <w:t>ordering</w:t>
-      </w:r>
-      <w:r>
-        <w:rPr>
-          <w:rFonts w:ascii="Times New Roman" w:hAnsi="Times New Roman"/>
-          <w:b w:val="0"/>
-          <w:i w:val="0"/>
-          <w:sz w:val="20"/>
-        </w:rPr>
-        <w:t xml:space="preserve"> is not a function of the scanning grid, the </w:t>
-      </w:r>
-      <w:r>
-        <w:rPr>
-          <w:rFonts w:ascii="Times New Roman" w:hAnsi="Times New Roman"/>
-          <w:b/>
-          <w:i w:val="0"/>
-          <w:sz w:val="20"/>
-        </w:rPr>
-        <w:t>magnitudes</w:t>
-      </w:r>
-      <w:r>
-        <w:rPr>
-          <w:rFonts w:ascii="Times New Roman" w:hAnsi="Times New Roman"/>
-          <w:b w:val="0"/>
-          <w:i w:val="0"/>
-          <w:sz w:val="20"/>
-        </w:rPr>
-        <w:t xml:space="preserve"> are (median retention </w:t>
-      </w:r>
-      <w:r>
-        <w:rPr>
-          <w:rFonts w:ascii="Times New Roman" w:hAnsi="Times New Roman"/>
-          <w:b/>
-          <w:i w:val="0"/>
-          <w:sz w:val="20"/>
-        </w:rPr>
-        <w:t>0.51–0.67</w:t>
-      </w:r>
-      <w:r>
-        <w:rPr>
-          <w:rFonts w:ascii="Times New Roman" w:hAnsi="Times New Roman"/>
-          <w:b w:val="0"/>
-          <w:i w:val="0"/>
-          <w:sz w:val="20"/>
-        </w:rPr>
-        <w:t xml:space="preserve"> under random thinning; F.10). What is </w:t>
-      </w:r>
-      <w:r>
-        <w:rPr>
-          <w:rFonts w:ascii="Times New Roman" w:hAnsi="Times New Roman"/>
-          <w:b/>
-          <w:i w:val="0"/>
-          <w:sz w:val="20"/>
-        </w:rPr>
-        <w:t>not</w:t>
-      </w:r>
-      <w:r>
-        <w:rPr>
-          <w:rFonts w:ascii="Times New Roman" w:hAnsi="Times New Roman"/>
-          <w:b w:val="0"/>
-          <w:i w:val="0"/>
-          <w:sz w:val="20"/>
-        </w:rPr>
-        <w:t xml:space="preserve"> established is a partition: the observed separating split is </w:t>
-      </w:r>
-      <w:r>
-        <w:rPr>
-          <w:rFonts w:ascii="Times New Roman" w:hAnsi="Times New Roman"/>
-          <w:b/>
-          <w:i w:val="0"/>
-          <w:sz w:val="20"/>
-        </w:rPr>
-        <w:t>1.6 pp</w:t>
-      </w:r>
-      <w:r>
-        <w:rPr>
-          <w:rFonts w:ascii="Times New Roman" w:hAnsi="Times New Roman"/>
-          <w:b w:val="0"/>
-          <w:i w:val="0"/>
-          <w:sz w:val="20"/>
-        </w:rPr>
-        <w:t xml:space="preserve">, below our own noise floor (2.15–6.46 pp) and below the smallest attainable corrected p of that test, so we report a </w:t>
-      </w:r>
-      <w:r>
-        <w:rPr>
-          <w:rFonts w:ascii="Times New Roman" w:hAnsi="Times New Roman"/>
-          <w:b/>
-          <w:i w:val="0"/>
-          <w:sz w:val="20"/>
-        </w:rPr>
-        <w:t>candidate</w:t>
-      </w:r>
-      <w:r>
-        <w:rPr>
-          <w:rFonts w:ascii="Times New Roman" w:hAnsi="Times New Roman"/>
-          <w:b w:val="0"/>
-          <w:i w:val="0"/>
-          <w:sz w:val="20"/>
-        </w:rPr>
-        <w:t xml:space="preserve"> only, and claim neither two anchor zones nor bimodality (Appendices F.3, M.37, M.17).</w:t>
+          <w:sz w:val="16"/>
+        </w:rPr>
+        <w:t>Fig. 2.</w:t>
+      </w:r>
+      <w:r>
+        <w:rPr>
+          <w:rFonts w:ascii="Times New Roman" w:hAnsi="Times New Roman"/>
+          <w:b w:val="0"/>
+          <w:i w:val="0"/>
+          <w:sz w:val="16"/>
+        </w:rPr>
+        <w:t xml:space="preserve"> The prompt-strength dose–response: relaxation also drives abstention to zero, but flips ρ from −82% to +234%…+345%.</w:t>
       </w:r>
     </w:p>
     <w:p>
@@ -1768,297 +1626,468 @@
           <w:i w:val="0"/>
           <w:sz w:val="20"/>
         </w:rPr>
-        <w:t>Contributions.</w:t>
-      </w:r>
-      <w:r>
-        <w:rPr>
-          <w:rFonts w:ascii="Times New Roman" w:hAnsi="Times New Roman"/>
-          <w:b w:val="0"/>
-          <w:i w:val="0"/>
-          <w:sz w:val="20"/>
-        </w:rPr>
-        <w:t xml:space="preserve"> Two empirical findings, plus the apparatus that makes them checkable: the identities of §3.8 and the appendices, which are arithmetic rather than findings, and whose role is that every headline number is recomputed from the released records, or labelled a transcription or an author-side computation (Appendix F.9). 1. </w:t>
-      </w:r>
-      <w:r>
-        <w:rPr>
-          <w:rFonts w:ascii="Times New Roman" w:hAnsi="Times New Roman"/>
-          <w:b/>
-          <w:i w:val="0"/>
-          <w:sz w:val="20"/>
-        </w:rPr>
-        <w:t>Finding 1 — on dense scenes the aggregate under-count is mostly a suppressed abstention, and the suppression is set by the output contract.</w:t>
-      </w:r>
-      <w:r>
-        <w:rPr>
-          <w:rFonts w:ascii="Times New Roman" w:hAnsi="Times New Roman"/>
-          <w:b w:val="0"/>
-          <w:i w:val="0"/>
-          <w:sz w:val="20"/>
-        </w:rPr>
-        <w:t xml:space="preserve"> Within the cells studied here, literal-zero outputs dominate the pooled under-count (§5.5); for InternVL2.5-8B [6] the answered-zero channel covers only 69.69% of abstentions (§3.6, Proposition 7); and </w:t>
-      </w:r>
-      <w:r>
-        <w:rPr>
-          <w:rFonts w:ascii="Times New Roman" w:hAnsi="Times New Roman"/>
-          <w:b/>
-          <w:i w:val="0"/>
-          <w:sz w:val="20"/>
-        </w:rPr>
-        <w:t>the outlet</w:t>
-      </w:r>
-      <w:r>
-        <w:rPr>
-          <w:rFonts w:ascii="Times New Roman" w:hAnsi="Times New Roman"/>
-          <w:b w:val="0"/>
-          <w:i w:val="0"/>
-          <w:sz w:val="20"/>
-        </w:rPr>
-        <w:t xml:space="preserve"> is a property of the serving configuration rather than of the lineage (the </w:t>
-      </w:r>
-      <w:r>
-        <w:rPr>
-          <w:rFonts w:ascii="Times New Roman" w:hAnsi="Times New Roman"/>
-          <w:b/>
-          <w:i w:val="0"/>
-          <w:sz w:val="20"/>
-        </w:rPr>
-        <w:t>rate</w:t>
-      </w:r>
-      <w:r>
-        <w:rPr>
-          <w:rFonts w:ascii="Times New Roman" w:hAnsi="Times New Roman"/>
-          <w:b w:val="0"/>
-          <w:i w:val="0"/>
-          <w:sz w:val="20"/>
-        </w:rPr>
-        <w:t xml:space="preserve"> is not; Appendix M.47) — given an abstention token </w:t>
-      </w:r>
-      <w:r>
-        <w:rPr>
-          <w:rFonts w:ascii="Times New Roman" w:hAnsi="Times New Roman"/>
-          <w:b/>
-          <w:i w:val="0"/>
-          <w:sz w:val="20"/>
-        </w:rPr>
-        <w:t>1591/1591</w:t>
-      </w:r>
-      <w:r>
-        <w:rPr>
-          <w:rFonts w:ascii="Times New Roman" w:hAnsi="Times New Roman"/>
-          <w:b w:val="0"/>
-          <w:i w:val="0"/>
-          <w:sz w:val="20"/>
-        </w:rPr>
-        <w:t xml:space="preserve"> calls abstain, and in a census fixing the stack and varying only the contract, item-level pairing removes the answered zero in </w:t>
-      </w:r>
-      <w:r>
-        <w:rPr>
-          <w:rFonts w:ascii="Times New Roman" w:hAnsi="Times New Roman"/>
-          <w:b/>
-          <w:i w:val="0"/>
-          <w:sz w:val="20"/>
-        </w:rPr>
-        <w:t>46 of 52</w:t>
-      </w:r>
-      <w:r>
-        <w:rPr>
-          <w:rFonts w:ascii="Times New Roman" w:hAnsi="Times New Roman"/>
-          <w:b w:val="0"/>
-          <w:i w:val="0"/>
-          <w:sz w:val="20"/>
-        </w:rPr>
-        <w:t xml:space="preserve"> (model × domain) cells (</w:t>
-      </w:r>
-      <w:r>
-        <w:rPr>
-          <w:rFonts w:ascii="Times New Roman" w:hAnsi="Times New Roman"/>
-          <w:b/>
-          <w:i w:val="0"/>
-          <w:sz w:val="20"/>
-        </w:rPr>
-        <w:t>52 of 52</w:t>
-      </w:r>
-      <w:r>
-        <w:rPr>
-          <w:rFonts w:ascii="Times New Roman" w:hAnsi="Times New Roman"/>
-          <w:b w:val="0"/>
-          <w:i w:val="0"/>
-          <w:sz w:val="20"/>
-        </w:rPr>
-        <w:t xml:space="preserve"> under the three-option contract; M.18.2–M.18.3), while the same grid on </w:t>
-      </w:r>
-      <w:r>
-        <w:rPr>
-          <w:rFonts w:ascii="Times New Roman" w:hAnsi="Times New Roman"/>
-          <w:b/>
-          <w:i w:val="0"/>
-          <w:sz w:val="20"/>
-        </w:rPr>
-        <w:t>seven families — four of them beyond the corpus's own, all unquantised — removes it in 7 of 7</w:t>
-      </w:r>
-      <w:r>
-        <w:rPr>
-          <w:rFonts w:ascii="Times New Roman" w:hAnsi="Times New Roman"/>
-          <w:b w:val="0"/>
-          <w:i w:val="0"/>
-          <w:sz w:val="20"/>
-        </w:rPr>
-        <w:t xml:space="preserve"> (§5.7, M.19), two of the seven having offered only </w:t>
-      </w:r>
-      <w:r>
-        <w:rPr>
-          <w:rFonts w:ascii="Times New Roman" w:hAnsi="Times New Roman"/>
-          <w:b/>
-          <w:i w:val="0"/>
-          <w:sz w:val="20"/>
-        </w:rPr>
-        <w:t>9</w:t>
-      </w:r>
-      <w:r>
-        <w:rPr>
-          <w:rFonts w:ascii="Times New Roman" w:hAnsi="Times New Roman"/>
-          <w:b w:val="0"/>
-          <w:i w:val="0"/>
-          <w:sz w:val="20"/>
-        </w:rPr>
-        <w:t xml:space="preserve"> and </w:t>
-      </w:r>
-      <w:r>
-        <w:rPr>
-          <w:rFonts w:ascii="Times New Roman" w:hAnsi="Times New Roman"/>
-          <w:b/>
-          <w:i w:val="0"/>
-          <w:sz w:val="20"/>
-        </w:rPr>
-        <w:t>156 zeros</w:t>
-      </w:r>
-      <w:r>
-        <w:rPr>
-          <w:rFonts w:ascii="Times New Roman" w:hAnsi="Times New Roman"/>
-          <w:b w:val="0"/>
-          <w:i w:val="0"/>
-          <w:sz w:val="20"/>
-        </w:rPr>
-        <w:t xml:space="preserve"> to remove (</w:t>
-      </w:r>
-      <w:r>
-        <w:rPr>
-          <w:rFonts w:ascii="Times New Roman" w:hAnsi="Times New Roman"/>
-          <w:b/>
-          <w:i w:val="0"/>
-          <w:sz w:val="20"/>
-        </w:rPr>
-        <w:t>2</w:t>
-      </w:r>
-      <w:r>
-        <w:rPr>
-          <w:rFonts w:ascii="Times New Roman" w:hAnsi="Times New Roman"/>
-          <w:b w:val="0"/>
-          <w:i w:val="0"/>
-          <w:sz w:val="20"/>
-        </w:rPr>
-        <w:t xml:space="preserve"> of the latter from the dense domains). The </w:t>
-      </w:r>
-      <w:r>
-        <w:rPr>
-          <w:rFonts w:ascii="Times New Roman" w:hAnsi="Times New Roman"/>
-          <w:b/>
-          <w:i w:val="0"/>
-          <w:sz w:val="20"/>
-        </w:rPr>
-        <w:t>frequency</w:t>
-      </w:r>
-      <w:r>
-        <w:rPr>
-          <w:rFonts w:ascii="Times New Roman" w:hAnsi="Times New Roman"/>
-          <w:b w:val="0"/>
-          <w:i w:val="0"/>
-          <w:sz w:val="20"/>
-        </w:rPr>
-        <w:t xml:space="preserve"> claim stays bounded: the corpus is dominated by one lineage (§8.2), the dense-scene headline is </w:t>
-      </w:r>
-      <w:r>
-        <w:rPr>
-          <w:rFonts w:ascii="Times New Roman" w:hAnsi="Times New Roman"/>
-          <w:b/>
-          <w:i w:val="0"/>
-          <w:sz w:val="20"/>
-        </w:rPr>
-        <w:t>build-specific</w:t>
-      </w:r>
-      <w:r>
-        <w:rPr>
-          <w:rFonts w:ascii="Times New Roman" w:hAnsi="Times New Roman"/>
-          <w:b w:val="0"/>
-          <w:i w:val="0"/>
-          <w:sz w:val="20"/>
-        </w:rPr>
-        <w:t xml:space="preserve"> (five deployments of one 32B checkpoint differ by up to </w:t>
-      </w:r>
-      <w:r>
-        <w:rPr>
-          <w:rFonts w:ascii="Times New Roman" w:hAnsi="Times New Roman"/>
-          <w:b/>
-          <w:i w:val="0"/>
-          <w:sz w:val="20"/>
-        </w:rPr>
-        <w:t>90.3 pp</w:t>
-      </w:r>
-      <w:r>
-        <w:rPr>
-          <w:rFonts w:ascii="Times New Roman" w:hAnsi="Times New Roman"/>
-          <w:b w:val="0"/>
-          <w:i w:val="0"/>
-          <w:sz w:val="20"/>
-        </w:rPr>
-        <w:t xml:space="preserve">, and on the cross-family grid the share exceeds 50% only at the two precisions of the defining checkpoint; M.19.15) and the aerial-scene one </w:t>
-      </w:r>
-      <w:r>
-        <w:rPr>
-          <w:rFonts w:ascii="Times New Roman" w:hAnsi="Times New Roman"/>
-          <w:b/>
-          <w:i w:val="0"/>
-          <w:sz w:val="20"/>
-        </w:rPr>
-        <w:t>domain-specific</w:t>
-      </w:r>
-      <w:r>
-        <w:rPr>
-          <w:rFonts w:ascii="Times New Roman" w:hAnsi="Times New Roman"/>
-          <w:b w:val="0"/>
-          <w:i w:val="0"/>
-          <w:sz w:val="20"/>
-        </w:rPr>
-        <w:t xml:space="preserve"> (</w:t>
-      </w:r>
-      <w:r>
-        <w:rPr>
-          <w:rFonts w:ascii="Times New Roman" w:hAnsi="Times New Roman"/>
-          <w:b/>
-          <w:i w:val="0"/>
-          <w:sz w:val="20"/>
-        </w:rPr>
-        <w:t>2.7–8.7 pp</w:t>
-      </w:r>
-      <w:r>
-        <w:rPr>
-          <w:rFonts w:ascii="Times New Roman" w:hAnsi="Times New Roman"/>
-          <w:b w:val="0"/>
-          <w:i w:val="0"/>
-          <w:sz w:val="20"/>
-        </w:rPr>
-        <w:t xml:space="preserve"> across the same five; M.18.4, M.18.8).</w:t>
+        <w:t>Supporting result: the response spectrum of direction.</w:t>
+      </w:r>
+      <w:r>
+        <w:rPr>
+          <w:rFonts w:ascii="Times New Roman" w:hAnsi="Times New Roman"/>
+          <w:b w:val="0"/>
+          <w:i w:val="0"/>
+          <w:sz w:val="20"/>
+        </w:rPr>
+        <w:t xml:space="preserve"> The signed direction can be moved continuously, but its </w:t>
+      </w:r>
+      <w:r>
+        <w:rPr>
+          <w:rFonts w:ascii="Times New Roman" w:hAnsi="Times New Roman"/>
+          <w:b/>
+          <w:i w:val="0"/>
+          <w:sz w:val="20"/>
+        </w:rPr>
+        <w:t>achievable span is an empirical property of implementation × training domain × data domain × protocol, not of a paradigm</w:t>
+      </w:r>
+      <w:r>
+        <w:rPr>
+          <w:rFonts w:ascii="Times New Roman" w:hAnsi="Times New Roman"/>
+          <w:b w:val="0"/>
+          <w:i w:val="0"/>
+          <w:sz w:val="20"/>
+        </w:rPr>
+        <w:t xml:space="preserve">. What is established is the </w:t>
+      </w:r>
+      <w:r>
+        <w:rPr>
+          <w:rFonts w:ascii="Times New Roman" w:hAnsi="Times New Roman"/>
+          <w:b/>
+          <w:i w:val="0"/>
+          <w:sz w:val="20"/>
+        </w:rPr>
+        <w:t>ordering</w:t>
+      </w:r>
+      <w:r>
+        <w:rPr>
+          <w:rFonts w:ascii="Times New Roman" w:hAnsi="Times New Roman"/>
+          <w:b w:val="0"/>
+          <w:i w:val="0"/>
+          <w:sz w:val="20"/>
+        </w:rPr>
+        <w:t xml:space="preserve">, preserved at </w:t>
+      </w:r>
+      <w:r>
+        <w:rPr>
+          <w:rFonts w:ascii="Times New Roman" w:hAnsi="Times New Roman"/>
+          <w:b/>
+          <w:i w:val="0"/>
+          <w:sz w:val="20"/>
+        </w:rPr>
+        <w:t>Spearman 0.981–0.999</w:t>
+      </w:r>
+      <w:r>
+        <w:rPr>
+          <w:rFonts w:ascii="Times New Roman" w:hAnsi="Times New Roman"/>
+          <w:b w:val="0"/>
+          <w:i w:val="0"/>
+          <w:sz w:val="20"/>
+        </w:rPr>
+        <w:t xml:space="preserve"> when every ladder is re-estimated on a common level count with its extreme level removed (Appendix F.10): the </w:t>
+      </w:r>
+      <w:r>
+        <w:rPr>
+          <w:rFonts w:ascii="Times New Roman" w:hAnsi="Times New Roman"/>
+          <w:b/>
+          <w:i w:val="0"/>
+          <w:sz w:val="20"/>
+        </w:rPr>
+        <w:t>ordering</w:t>
+      </w:r>
+      <w:r>
+        <w:rPr>
+          <w:rFonts w:ascii="Times New Roman" w:hAnsi="Times New Roman"/>
+          <w:b w:val="0"/>
+          <w:i w:val="0"/>
+          <w:sz w:val="20"/>
+        </w:rPr>
+        <w:t xml:space="preserve"> is not a function of the scanning grid, the </w:t>
+      </w:r>
+      <w:r>
+        <w:rPr>
+          <w:rFonts w:ascii="Times New Roman" w:hAnsi="Times New Roman"/>
+          <w:b/>
+          <w:i w:val="0"/>
+          <w:sz w:val="20"/>
+        </w:rPr>
+        <w:t>magnitudes</w:t>
+      </w:r>
+      <w:r>
+        <w:rPr>
+          <w:rFonts w:ascii="Times New Roman" w:hAnsi="Times New Roman"/>
+          <w:b w:val="0"/>
+          <w:i w:val="0"/>
+          <w:sz w:val="20"/>
+        </w:rPr>
+        <w:t xml:space="preserve"> are (median retention </w:t>
+      </w:r>
+      <w:r>
+        <w:rPr>
+          <w:rFonts w:ascii="Times New Roman" w:hAnsi="Times New Roman"/>
+          <w:b/>
+          <w:i w:val="0"/>
+          <w:sz w:val="20"/>
+        </w:rPr>
+        <w:t>0.51–0.67</w:t>
+      </w:r>
+      <w:r>
+        <w:rPr>
+          <w:rFonts w:ascii="Times New Roman" w:hAnsi="Times New Roman"/>
+          <w:b w:val="0"/>
+          <w:i w:val="0"/>
+          <w:sz w:val="20"/>
+        </w:rPr>
+        <w:t xml:space="preserve"> under random thinning; F.10). What is </w:t>
+      </w:r>
+      <w:r>
+        <w:rPr>
+          <w:rFonts w:ascii="Times New Roman" w:hAnsi="Times New Roman"/>
+          <w:b/>
+          <w:i w:val="0"/>
+          <w:sz w:val="20"/>
+        </w:rPr>
+        <w:t>not</w:t>
+      </w:r>
+      <w:r>
+        <w:rPr>
+          <w:rFonts w:ascii="Times New Roman" w:hAnsi="Times New Roman"/>
+          <w:b w:val="0"/>
+          <w:i w:val="0"/>
+          <w:sz w:val="20"/>
+        </w:rPr>
+        <w:t xml:space="preserve"> established is a partition: the observed separating split is </w:t>
+      </w:r>
+      <w:r>
+        <w:rPr>
+          <w:rFonts w:ascii="Times New Roman" w:hAnsi="Times New Roman"/>
+          <w:b/>
+          <w:i w:val="0"/>
+          <w:sz w:val="20"/>
+        </w:rPr>
+        <w:t>1.6 pp</w:t>
+      </w:r>
+      <w:r>
+        <w:rPr>
+          <w:rFonts w:ascii="Times New Roman" w:hAnsi="Times New Roman"/>
+          <w:b w:val="0"/>
+          <w:i w:val="0"/>
+          <w:sz w:val="20"/>
+        </w:rPr>
+        <w:t xml:space="preserve">, below our own noise floor (2.15–6.46 pp) and below the smallest attainable corrected p of that test, so we report a </w:t>
+      </w:r>
+      <w:r>
+        <w:rPr>
+          <w:rFonts w:ascii="Times New Roman" w:hAnsi="Times New Roman"/>
+          <w:b/>
+          <w:i w:val="0"/>
+          <w:sz w:val="20"/>
+        </w:rPr>
+        <w:t>candidate</w:t>
+      </w:r>
+      <w:r>
+        <w:rPr>
+          <w:rFonts w:ascii="Times New Roman" w:hAnsi="Times New Roman"/>
+          <w:b w:val="0"/>
+          <w:i w:val="0"/>
+          <w:sz w:val="20"/>
+        </w:rPr>
+        <w:t xml:space="preserve"> only, and claim neither two anchor zones nor bimodality (Appendices F.3, M.37, M.17).</w:t>
       </w:r>
     </w:p>
     <w:p>
       <w:r>
         <w:rPr>
           <w:rFonts w:ascii="Times New Roman" w:hAnsi="Times New Roman"/>
-          <w:b w:val="0"/>
-          <w:i w:val="0"/>
-          <w:sz w:val="20"/>
-        </w:rPr>
-        <w:t>2. **Finding 2 — per-instance legibility gates whether a model answers, and it is a diagnostic rather than a</w:t>
+          <w:b/>
+          <w:i w:val="0"/>
+          <w:sz w:val="20"/>
+        </w:rPr>
+        <w:t>Contributions.</w:t>
+      </w:r>
+      <w:r>
+        <w:rPr>
+          <w:rFonts w:ascii="Times New Roman" w:hAnsi="Times New Roman"/>
+          <w:b w:val="0"/>
+          <w:i w:val="0"/>
+          <w:sz w:val="20"/>
+        </w:rPr>
+        <w:t xml:space="preserve"> Two empirical findings, plus the apparatus that makes them checkable: the identities of §3.8 and the appendices, which are arithmetic, not findings, and whose role is that every headline number is recomputed from the released records, or labelled a transcription or an author-side computation (Appendix F.9). 1. </w:t>
+      </w:r>
+      <w:r>
+        <w:rPr>
+          <w:rFonts w:ascii="Times New Roman" w:hAnsi="Times New Roman"/>
+          <w:b/>
+          <w:i w:val="0"/>
+          <w:sz w:val="20"/>
+        </w:rPr>
+        <w:t>Finding 1 — on dense scenes the aggregate under-count is mostly a suppressed abstention, and the suppression is set by the output contract.</w:t>
+      </w:r>
+      <w:r>
+        <w:rPr>
+          <w:rFonts w:ascii="Times New Roman" w:hAnsi="Times New Roman"/>
+          <w:b w:val="0"/>
+          <w:i w:val="0"/>
+          <w:sz w:val="20"/>
+        </w:rPr>
+        <w:t xml:space="preserve"> Within the cells studied here, literal-zero outputs dominate the pooled under-count (§5.5); for InternVL2.5-8B [6] the answered-zero channel covers only 69.69% of abstentions (§3.6, Proposition 7); and </w:t>
+      </w:r>
+      <w:r>
+        <w:rPr>
+          <w:rFonts w:ascii="Times New Roman" w:hAnsi="Times New Roman"/>
+          <w:b/>
+          <w:i w:val="0"/>
+          <w:sz w:val="20"/>
+        </w:rPr>
+        <w:t>the outlet</w:t>
+      </w:r>
+      <w:r>
+        <w:rPr>
+          <w:rFonts w:ascii="Times New Roman" w:hAnsi="Times New Roman"/>
+          <w:b w:val="0"/>
+          <w:i w:val="0"/>
+          <w:sz w:val="20"/>
+        </w:rPr>
+        <w:t xml:space="preserve"> is a property of the serving configuration, not of the lineage (the </w:t>
+      </w:r>
+      <w:r>
+        <w:rPr>
+          <w:rFonts w:ascii="Times New Roman" w:hAnsi="Times New Roman"/>
+          <w:b/>
+          <w:i w:val="0"/>
+          <w:sz w:val="20"/>
+        </w:rPr>
+        <w:t>rate</w:t>
+      </w:r>
+      <w:r>
+        <w:rPr>
+          <w:rFonts w:ascii="Times New Roman" w:hAnsi="Times New Roman"/>
+          <w:b w:val="0"/>
+          <w:i w:val="0"/>
+          <w:sz w:val="20"/>
+        </w:rPr>
+        <w:t xml:space="preserve"> is not; Appendix M.47) — given an abstention token </w:t>
+      </w:r>
+      <w:r>
+        <w:rPr>
+          <w:rFonts w:ascii="Times New Roman" w:hAnsi="Times New Roman"/>
+          <w:b/>
+          <w:i w:val="0"/>
+          <w:sz w:val="20"/>
+        </w:rPr>
+        <w:t>1591/1591</w:t>
+      </w:r>
+      <w:r>
+        <w:rPr>
+          <w:rFonts w:ascii="Times New Roman" w:hAnsi="Times New Roman"/>
+          <w:b w:val="0"/>
+          <w:i w:val="0"/>
+          <w:sz w:val="20"/>
+        </w:rPr>
+        <w:t xml:space="preserve"> calls abstain, and in a census fixing the stack and varying only the contract, item-level pairing removes the answered zero in </w:t>
+      </w:r>
+      <w:r>
+        <w:rPr>
+          <w:rFonts w:ascii="Times New Roman" w:hAnsi="Times New Roman"/>
+          <w:b/>
+          <w:i w:val="0"/>
+          <w:sz w:val="20"/>
+        </w:rPr>
+        <w:t>46 of 52</w:t>
+      </w:r>
+      <w:r>
+        <w:rPr>
+          <w:rFonts w:ascii="Times New Roman" w:hAnsi="Times New Roman"/>
+          <w:b w:val="0"/>
+          <w:i w:val="0"/>
+          <w:sz w:val="20"/>
+        </w:rPr>
+        <w:t xml:space="preserve"> (model × domain) cells (</w:t>
+      </w:r>
+      <w:r>
+        <w:rPr>
+          <w:rFonts w:ascii="Times New Roman" w:hAnsi="Times New Roman"/>
+          <w:b/>
+          <w:i w:val="0"/>
+          <w:sz w:val="20"/>
+        </w:rPr>
+        <w:t>52 of 52</w:t>
+      </w:r>
+      <w:r>
+        <w:rPr>
+          <w:rFonts w:ascii="Times New Roman" w:hAnsi="Times New Roman"/>
+          <w:b w:val="0"/>
+          <w:i w:val="0"/>
+          <w:sz w:val="20"/>
+        </w:rPr>
+        <w:t xml:space="preserve"> under the three-option contract; M.18.2–M.18.3), while the same grid on </w:t>
+      </w:r>
+      <w:r>
+        <w:rPr>
+          <w:rFonts w:ascii="Times New Roman" w:hAnsi="Times New Roman"/>
+          <w:b/>
+          <w:i w:val="0"/>
+          <w:sz w:val="20"/>
+        </w:rPr>
+        <w:t>seven families — four of them beyond the corpus's own, all unquantised — removes it in 7 of 7</w:t>
+      </w:r>
+      <w:r>
+        <w:rPr>
+          <w:rFonts w:ascii="Times New Roman" w:hAnsi="Times New Roman"/>
+          <w:b w:val="0"/>
+          <w:i w:val="0"/>
+          <w:sz w:val="20"/>
+        </w:rPr>
+        <w:t xml:space="preserve"> (§5.7, M.19), two of the seven having offered only </w:t>
+      </w:r>
+      <w:r>
+        <w:rPr>
+          <w:rFonts w:ascii="Times New Roman" w:hAnsi="Times New Roman"/>
+          <w:b/>
+          <w:i w:val="0"/>
+          <w:sz w:val="20"/>
+        </w:rPr>
+        <w:t>9</w:t>
+      </w:r>
+      <w:r>
+        <w:rPr>
+          <w:rFonts w:ascii="Times New Roman" w:hAnsi="Times New Roman"/>
+          <w:b w:val="0"/>
+          <w:i w:val="0"/>
+          <w:sz w:val="20"/>
+        </w:rPr>
+        <w:t xml:space="preserve"> and </w:t>
+      </w:r>
+      <w:r>
+        <w:rPr>
+          <w:rFonts w:ascii="Times New Roman" w:hAnsi="Times New Roman"/>
+          <w:b/>
+          <w:i w:val="0"/>
+          <w:sz w:val="20"/>
+        </w:rPr>
+        <w:t>156 zeros</w:t>
+      </w:r>
+      <w:r>
+        <w:rPr>
+          <w:rFonts w:ascii="Times New Roman" w:hAnsi="Times New Roman"/>
+          <w:b w:val="0"/>
+          <w:i w:val="0"/>
+          <w:sz w:val="20"/>
+        </w:rPr>
+        <w:t xml:space="preserve"> to remove (</w:t>
+      </w:r>
+      <w:r>
+        <w:rPr>
+          <w:rFonts w:ascii="Times New Roman" w:hAnsi="Times New Roman"/>
+          <w:b/>
+          <w:i w:val="0"/>
+          <w:sz w:val="20"/>
+        </w:rPr>
+        <w:t>2</w:t>
+      </w:r>
+      <w:r>
+        <w:rPr>
+          <w:rFonts w:ascii="Times New Roman" w:hAnsi="Times New Roman"/>
+          <w:b w:val="0"/>
+          <w:i w:val="0"/>
+          <w:sz w:val="20"/>
+        </w:rPr>
+        <w:t xml:space="preserve"> of the latter from the dense domains). The </w:t>
+      </w:r>
+      <w:r>
+        <w:rPr>
+          <w:rFonts w:ascii="Times New Roman" w:hAnsi="Times New Roman"/>
+          <w:b/>
+          <w:i w:val="0"/>
+          <w:sz w:val="20"/>
+        </w:rPr>
+        <w:t>frequency</w:t>
+      </w:r>
+      <w:r>
+        <w:rPr>
+          <w:rFonts w:ascii="Times New Roman" w:hAnsi="Times New Roman"/>
+          <w:b w:val="0"/>
+          <w:i w:val="0"/>
+          <w:sz w:val="20"/>
+        </w:rPr>
+        <w:t xml:space="preserve"> claim stays bounded: the corpus is dominated by one lineage (§8.2), the dense-scene headline is </w:t>
+      </w:r>
+      <w:r>
+        <w:rPr>
+          <w:rFonts w:ascii="Times New Roman" w:hAnsi="Times New Roman"/>
+          <w:b/>
+          <w:i w:val="0"/>
+          <w:sz w:val="20"/>
+        </w:rPr>
+        <w:t>build-specific</w:t>
+      </w:r>
+      <w:r>
+        <w:rPr>
+          <w:rFonts w:ascii="Times New Roman" w:hAnsi="Times New Roman"/>
+          <w:b w:val="0"/>
+          <w:i w:val="0"/>
+          <w:sz w:val="20"/>
+        </w:rPr>
+        <w:t xml:space="preserve"> (five deployments of one 32B checkpoint differ by up to </w:t>
+      </w:r>
+      <w:r>
+        <w:rPr>
+          <w:rFonts w:ascii="Times New Roman" w:hAnsi="Times New Roman"/>
+          <w:b/>
+          <w:i w:val="0"/>
+          <w:sz w:val="20"/>
+        </w:rPr>
+        <w:t>90.3 pp</w:t>
+      </w:r>
+      <w:r>
+        <w:rPr>
+          <w:rFonts w:ascii="Times New Roman" w:hAnsi="Times New Roman"/>
+          <w:b w:val="0"/>
+          <w:i w:val="0"/>
+          <w:sz w:val="20"/>
+        </w:rPr>
+        <w:t xml:space="preserve">, and on the cross-family grid the share exceeds 50% only at the two precisions of the defining checkpoint; M.19.15) and the aerial-scene one </w:t>
+      </w:r>
+      <w:r>
+        <w:rPr>
+          <w:rFonts w:ascii="Times New Roman" w:hAnsi="Times New Roman"/>
+          <w:b/>
+          <w:i w:val="0"/>
+          <w:sz w:val="20"/>
+        </w:rPr>
+        <w:t>domain-specific</w:t>
+      </w:r>
+      <w:r>
+        <w:rPr>
+          <w:rFonts w:ascii="Times New Roman" w:hAnsi="Times New Roman"/>
+          <w:b w:val="0"/>
+          <w:i w:val="0"/>
+          <w:sz w:val="20"/>
+        </w:rPr>
+        <w:t xml:space="preserve"> (</w:t>
+      </w:r>
+      <w:r>
+        <w:rPr>
+          <w:rFonts w:ascii="Times New Roman" w:hAnsi="Times New Roman"/>
+          <w:b/>
+          <w:i w:val="0"/>
+          <w:sz w:val="20"/>
+        </w:rPr>
+        <w:t>2.7–8.7 pp</w:t>
+      </w:r>
+      <w:r>
+        <w:rPr>
+          <w:rFonts w:ascii="Times New Roman" w:hAnsi="Times New Roman"/>
+          <w:b w:val="0"/>
+          <w:i w:val="0"/>
+          <w:sz w:val="20"/>
+        </w:rPr>
+        <w:t xml:space="preserve"> across the same five; M.18.4, M.18.8).</w:t>
       </w:r>
     </w:p>
     <w:p>
@@ -2069,133 +2098,7 @@
           <w:i w:val="0"/>
           <w:sz w:val="20"/>
         </w:rPr>
-        <w:t>repair.</w:t>
-      </w:r>
-      <w:r>
-        <w:rPr>
-          <w:rFonts w:ascii="Times New Roman" w:hAnsi="Times New Roman"/>
-          <w:b/>
-          <w:i w:val="0"/>
-          <w:sz w:val="20"/>
-        </w:rPr>
-        <w:t xml:space="preserve"> We give the proxy, the effect structure under three controlled manipulations, and what it </w:t>
-      </w:r>
-      <w:r>
-        <w:rPr>
-          <w:rFonts w:ascii="Times New Roman" w:hAnsi="Times New Roman"/>
-          <w:b w:val="0"/>
-          <w:i w:val="0"/>
-          <w:sz w:val="20"/>
-        </w:rPr>
-        <w:t>cannot</w:t>
-      </w:r>
-      <w:r>
-        <w:rPr>
-          <w:rFonts w:ascii="Times New Roman" w:hAnsi="Times New Roman"/>
-          <w:b/>
-          <w:i w:val="0"/>
-          <w:sz w:val="20"/>
-        </w:rPr>
-        <w:t xml:space="preserve"> do: it supports selective prediction (the most legible 20% of images reduce MAE by </w:t>
-      </w:r>
-      <w:r>
-        <w:rPr>
-          <w:rFonts w:ascii="Times New Roman" w:hAnsi="Times New Roman"/>
-          <w:b w:val="0"/>
-          <w:i w:val="0"/>
-          <w:sz w:val="20"/>
-        </w:rPr>
-        <w:t>31–66%</w:t>
-      </w:r>
-      <w:r>
-        <w:rPr>
-          <w:rFonts w:ascii="Times New Roman" w:hAnsi="Times New Roman"/>
-          <w:b/>
-          <w:i w:val="0"/>
-          <w:sz w:val="20"/>
-        </w:rPr>
-        <w:t xml:space="preserve">, selector AUC </w:t>
-      </w:r>
-      <w:r>
-        <w:rPr>
-          <w:rFonts w:ascii="Times New Roman" w:hAnsi="Times New Roman"/>
-          <w:b w:val="0"/>
-          <w:i w:val="0"/>
-          <w:sz w:val="20"/>
-        </w:rPr>
-        <w:t>0.753–0.786</w:t>
-      </w:r>
-      <w:r>
-        <w:rPr>
-          <w:rFonts w:ascii="Times New Roman" w:hAnsi="Times New Roman"/>
-          <w:b/>
-          <w:i w:val="0"/>
-          <w:sz w:val="20"/>
-        </w:rPr>
-        <w:t xml:space="preserve">) but </w:t>
-      </w:r>
-      <w:r>
-        <w:rPr>
-          <w:rFonts w:ascii="Times New Roman" w:hAnsi="Times New Roman"/>
-          <w:b w:val="0"/>
-          <w:i w:val="0"/>
-          <w:sz w:val="20"/>
-        </w:rPr>
-        <w:t>cannot repair direction</w:t>
-      </w:r>
-      <w:r>
-        <w:rPr>
-          <w:rFonts w:ascii="Times New Roman" w:hAnsi="Times New Roman"/>
-          <w:b/>
-          <w:i w:val="0"/>
-          <w:sz w:val="20"/>
-        </w:rPr>
-        <w:t xml:space="preserve"> (ρ attenuating only from </w:t>
-      </w:r>
-      <w:r>
-        <w:rPr>
-          <w:rFonts w:ascii="Times New Roman" w:hAnsi="Times New Roman"/>
-          <w:b w:val="0"/>
-          <w:i w:val="0"/>
-          <w:sz w:val="20"/>
-        </w:rPr>
-        <w:t>−85.0%</w:t>
-      </w:r>
-      <w:r>
-        <w:rPr>
-          <w:rFonts w:ascii="Times New Roman" w:hAnsi="Times New Roman"/>
-          <w:b/>
-          <w:i w:val="0"/>
-          <w:sz w:val="20"/>
-        </w:rPr>
-        <w:t xml:space="preserve"> to </w:t>
-      </w:r>
-      <w:r>
-        <w:rPr>
-          <w:rFonts w:ascii="Times New Roman" w:hAnsi="Times New Roman"/>
-          <w:b w:val="0"/>
-          <w:i w:val="0"/>
-          <w:sz w:val="20"/>
-        </w:rPr>
-        <w:t>−53.4%</w:t>
-      </w:r>
-      <w:r>
-        <w:rPr>
-          <w:rFonts w:ascii="Times New Roman" w:hAnsi="Times New Roman"/>
-          <w:b/>
-          <w:i w:val="0"/>
-          <w:sz w:val="20"/>
-        </w:rPr>
-        <w:t xml:space="preserve">), and because it requires instance-level boxes it is a </w:t>
-      </w:r>
-      <w:r>
-        <w:rPr>
-          <w:rFonts w:ascii="Times New Roman" w:hAnsi="Times New Roman"/>
-          <w:b w:val="0"/>
-          <w:i w:val="0"/>
-          <w:sz w:val="20"/>
-        </w:rPr>
-        <w:t>diagnostic, not a deployment-time criterion** (§3.3, §7.1).</w:t>
+        <w:t>2. **Finding 2 — per-instance legibility gates whether a model answers, and it is a diagnostic, not a</w:t>
       </w:r>
     </w:p>
     <w:p>
@@ -2206,25 +2109,133 @@
           <w:i w:val="0"/>
           <w:sz w:val="20"/>
         </w:rPr>
-        <w:t xml:space="preserve">3. </w:t>
-      </w:r>
-      <w:r>
-        <w:rPr>
-          <w:rFonts w:ascii="Times New Roman" w:hAnsi="Times New Roman"/>
-          <w:b/>
-          <w:i w:val="0"/>
-          <w:sz w:val="20"/>
-        </w:rPr>
-        <w:t>The apparatus: a re-checkable measurement discipline.</w:t>
-      </w:r>
-      <w:r>
-        <w:rPr>
-          <w:rFonts w:ascii="Times New Roman" w:hAnsi="Times New Roman"/>
-          <w:b w:val="0"/>
-          <w:i w:val="0"/>
-          <w:sz w:val="20"/>
-        </w:rPr>
-        <w:t xml:space="preserve"> The dual convention and its divergence</w:t>
+        <w:t>repair.</w:t>
+      </w:r>
+      <w:r>
+        <w:rPr>
+          <w:rFonts w:ascii="Times New Roman" w:hAnsi="Times New Roman"/>
+          <w:b/>
+          <w:i w:val="0"/>
+          <w:sz w:val="20"/>
+        </w:rPr>
+        <w:t xml:space="preserve"> We give the proxy, the effect structure under three controlled manipulations, and what it </w:t>
+      </w:r>
+      <w:r>
+        <w:rPr>
+          <w:rFonts w:ascii="Times New Roman" w:hAnsi="Times New Roman"/>
+          <w:b w:val="0"/>
+          <w:i w:val="0"/>
+          <w:sz w:val="20"/>
+        </w:rPr>
+        <w:t>cannot</w:t>
+      </w:r>
+      <w:r>
+        <w:rPr>
+          <w:rFonts w:ascii="Times New Roman" w:hAnsi="Times New Roman"/>
+          <w:b/>
+          <w:i w:val="0"/>
+          <w:sz w:val="20"/>
+        </w:rPr>
+        <w:t xml:space="preserve"> do: it supports selective prediction (the most legible 20% of images reduce MAE by </w:t>
+      </w:r>
+      <w:r>
+        <w:rPr>
+          <w:rFonts w:ascii="Times New Roman" w:hAnsi="Times New Roman"/>
+          <w:b w:val="0"/>
+          <w:i w:val="0"/>
+          <w:sz w:val="20"/>
+        </w:rPr>
+        <w:t>31–66%</w:t>
+      </w:r>
+      <w:r>
+        <w:rPr>
+          <w:rFonts w:ascii="Times New Roman" w:hAnsi="Times New Roman"/>
+          <w:b/>
+          <w:i w:val="0"/>
+          <w:sz w:val="20"/>
+        </w:rPr>
+        <w:t xml:space="preserve">, selector AUC </w:t>
+      </w:r>
+      <w:r>
+        <w:rPr>
+          <w:rFonts w:ascii="Times New Roman" w:hAnsi="Times New Roman"/>
+          <w:b w:val="0"/>
+          <w:i w:val="0"/>
+          <w:sz w:val="20"/>
+        </w:rPr>
+        <w:t>0.753–0.786</w:t>
+      </w:r>
+      <w:r>
+        <w:rPr>
+          <w:rFonts w:ascii="Times New Roman" w:hAnsi="Times New Roman"/>
+          <w:b/>
+          <w:i w:val="0"/>
+          <w:sz w:val="20"/>
+        </w:rPr>
+        <w:t xml:space="preserve">) but </w:t>
+      </w:r>
+      <w:r>
+        <w:rPr>
+          <w:rFonts w:ascii="Times New Roman" w:hAnsi="Times New Roman"/>
+          <w:b w:val="0"/>
+          <w:i w:val="0"/>
+          <w:sz w:val="20"/>
+        </w:rPr>
+        <w:t>cannot repair direction</w:t>
+      </w:r>
+      <w:r>
+        <w:rPr>
+          <w:rFonts w:ascii="Times New Roman" w:hAnsi="Times New Roman"/>
+          <w:b/>
+          <w:i w:val="0"/>
+          <w:sz w:val="20"/>
+        </w:rPr>
+        <w:t xml:space="preserve"> (ρ attenuating only from </w:t>
+      </w:r>
+      <w:r>
+        <w:rPr>
+          <w:rFonts w:ascii="Times New Roman" w:hAnsi="Times New Roman"/>
+          <w:b w:val="0"/>
+          <w:i w:val="0"/>
+          <w:sz w:val="20"/>
+        </w:rPr>
+        <w:t>−85.0%</w:t>
+      </w:r>
+      <w:r>
+        <w:rPr>
+          <w:rFonts w:ascii="Times New Roman" w:hAnsi="Times New Roman"/>
+          <w:b/>
+          <w:i w:val="0"/>
+          <w:sz w:val="20"/>
+        </w:rPr>
+        <w:t xml:space="preserve"> to </w:t>
+      </w:r>
+      <w:r>
+        <w:rPr>
+          <w:rFonts w:ascii="Times New Roman" w:hAnsi="Times New Roman"/>
+          <w:b w:val="0"/>
+          <w:i w:val="0"/>
+          <w:sz w:val="20"/>
+        </w:rPr>
+        <w:t>−53.4%</w:t>
+      </w:r>
+      <w:r>
+        <w:rPr>
+          <w:rFonts w:ascii="Times New Roman" w:hAnsi="Times New Roman"/>
+          <w:b/>
+          <w:i w:val="0"/>
+          <w:sz w:val="20"/>
+        </w:rPr>
+        <w:t xml:space="preserve">), and because it requires instance-level boxes it is a </w:t>
+      </w:r>
+      <w:r>
+        <w:rPr>
+          <w:rFonts w:ascii="Times New Roman" w:hAnsi="Times New Roman"/>
+          <w:b w:val="0"/>
+          <w:i w:val="0"/>
+          <w:sz w:val="20"/>
+        </w:rPr>
+        <w:t>diagnostic, not a deployment-time criterion** (§3.3, §7.1).</w:t>
       </w:r>
     </w:p>
     <w:p>
@@ -2235,6 +2246,35 @@
           <w:i w:val="0"/>
           <w:sz w:val="20"/>
         </w:rPr>
+        <w:t xml:space="preserve">3. </w:t>
+      </w:r>
+      <w:r>
+        <w:rPr>
+          <w:rFonts w:ascii="Times New Roman" w:hAnsi="Times New Roman"/>
+          <w:b/>
+          <w:i w:val="0"/>
+          <w:sz w:val="20"/>
+        </w:rPr>
+        <w:t>The apparatus: a re-checkable measurement discipline.</w:t>
+      </w:r>
+      <w:r>
+        <w:rPr>
+          <w:rFonts w:ascii="Times New Roman" w:hAnsi="Times New Roman"/>
+          <w:b w:val="0"/>
+          <w:i w:val="0"/>
+          <w:sz w:val="20"/>
+        </w:rPr>
+        <w:t xml:space="preserve"> The dual convention and its divergence</w:t>
+      </w:r>
+    </w:p>
+    <w:p>
+      <w:r>
+        <w:rPr>
+          <w:rFonts w:ascii="Times New Roman" w:hAnsi="Times New Roman"/>
+          <w:b w:val="0"/>
+          <w:i w:val="0"/>
+          <w:sz w:val="20"/>
+        </w:rPr>
         <w:t>condition (Proposition 2), the anomaly-exclusion rule, span variants against the noise floor (</w:t>
       </w:r>
       <w:r>
@@ -2253,7 +2293,7 @@
           <w:i w:val="0"/>
           <w:sz w:val="20"/>
         </w:rPr>
-        <w:t xml:space="preserve">), and every split point enumerated rather than searched (Appendix F.3). It yields one positive rule where a magnitude law is absent: the span </w:t>
+        <w:t xml:space="preserve">), and every split point enumerated, not searched (Appendix F.3). It yields one positive rule where a magnitude law is absent: the span </w:t>
       </w:r>
       <w:r>
         <w:rPr>
@@ -2533,7 +2573,7 @@
           <w:i w:val="0"/>
           <w:sz w:val="20"/>
         </w:rPr>
-        <w:t>reproduce rather than claim</w:t>
+        <w:t>reproduce, not claim</w:t>
       </w:r>
       <w:r>
         <w:rPr>
@@ -3019,7 +3059,7 @@
           <w:i w:val="0"/>
           <w:sz w:val="20"/>
         </w:rPr>
-        <w:t>we cite that locus rather than claim it</w:t>
+        <w:t>we cite that locus, not claim it</w:t>
       </w:r>
       <w:r>
         <w:rPr>
@@ -3553,7 +3593,7 @@
           <w:i w:val="0"/>
           <w:sz w:val="20"/>
         </w:rPr>
-        <w:t>; part of the spread across published counting numbers is a granularity artefact rather than a modelling difference.</w:t>
+        <w:t>; part of the spread across published counting numbers is a granularity artefact, not a modelling difference.</w:t>
       </w:r>
     </w:p>
     <w:p>
@@ -3751,7 +3791,7 @@
           <w:i w:val="0"/>
           <w:sz w:val="20"/>
         </w:rPr>
-        <w:t>per-instance pixel budget is a covariate rather than the gate</w:t>
+        <w:t>per-instance pixel budget is a covariate, not the gate</w:t>
       </w:r>
       <w:r>
         <w:rPr>
@@ -4052,7 +4092,7 @@
           <w:i w:val="0"/>
           <w:sz w:val="20"/>
         </w:rPr>
-        <w:t xml:space="preserve">; Appendix M.20 records the measurement and why we report it as a boundary rather than a promise). It is also </w:t>
+        <w:t xml:space="preserve">; Appendix M.20 records the measurement and why we report it as a boundary, not a promise). It is also </w:t>
       </w:r>
       <w:r>
         <w:rPr>
@@ -4435,7 +4475,7 @@
           <w:i w:val="0"/>
           <w:sz w:val="20"/>
         </w:rPr>
-        <w:t>Abstention is our leading indicator, so its operationalisation is stated item by item rather than left as "the predicted total is zero". Three points matter here.</w:t>
+        <w:t>Abstention is our leading indicator, so its operationalisation is stated item by item, not left as "the predicted total is zero". Three points matter here.</w:t>
       </w:r>
     </w:p>
     <w:p>
@@ -4655,7 +4695,7 @@
           <w:i w:val="0"/>
           <w:sz w:val="20"/>
         </w:rPr>
-        <w:t xml:space="preserve"> We give an empirical criterion rather than a stipulation: a lineage that abstained mainly in natural language would show a low ratio of answered-zero to textual refusal, approaching 0, and </w:t>
+        <w:t xml:space="preserve"> We give an empirical criterion, not a stipulation: a lineage that abstained mainly in natural language would show a low ratio of answered-zero to textual refusal, approaching 0, and </w:t>
       </w:r>
       <w:r>
         <w:rPr>
@@ -5760,7 +5800,7 @@
           <w:i w:val="0"/>
           <w:sz w:val="20"/>
         </w:rPr>
-        <w:t xml:space="preserve">Anomalous-record removal, quarantine of unreadable key data, and the person-matched recomputation are preconditions here rather than refinements; the rules and the corpus-wide scan behind them are in </w:t>
+        <w:t xml:space="preserve">Anomalous-record removal, quarantine of unreadable key data, and the person-matched recomputation are preconditions here, not refinements; the rules and the corpus-wide scan behind them are in </w:t>
       </w:r>
       <w:r>
         <w:rPr>
@@ -5931,7 +5971,7 @@
           <w:i w:val="0"/>
           <w:sz w:val="20"/>
         </w:rPr>
-        <w:t xml:space="preserve"> for InternVL2.5-8B (κ = 2.3) — which is the arithmetic reason §3.6 reports the two lineages separately rather than pooled.</w:t>
+        <w:t xml:space="preserve"> for InternVL2.5-8B (κ = 2.3) — the arithmetic reason §3.6 reports the two lineages separately, not pooled.</w:t>
       </w:r>
     </w:p>
     <w:p>
@@ -6103,7 +6143,7 @@
           <w:i w:val="0"/>
           <w:sz w:val="20"/>
         </w:rPr>
-        <w:t xml:space="preserve"> VisDrone and AI-TOD have the fewest targets (17–22) yet abstain as often as ShanghaiTech-A (433), which is what licenses stratifying by legibility rather than by density.</w:t>
+        <w:t xml:space="preserve"> VisDrone and AI-TOD have the fewest targets (17–22) yet abstain as often as ShanghaiTech-A (433), which licenses stratifying by legibility, not by density.</w:t>
       </w:r>
     </w:p>
     <w:p>
@@ -6648,7 +6688,7 @@
           <w:i w:val="0"/>
           <w:sz w:val="20"/>
         </w:rPr>
-        <w:t>belongs to each effective tile rather than to the image</w:t>
+        <w:t>belongs to each effective tile, not to the image</w:t>
       </w:r>
       <w:r>
         <w:rPr>
@@ -6700,25 +6740,25 @@
           <w:i w:val="0"/>
           <w:sz w:val="20"/>
         </w:rPr>
-        <w:t xml:space="preserve"> (per-level tables in Appendix F.8). The curve separating reachable from unreachable levels is </w:t>
-      </w:r>
-      <w:r>
-        <w:rPr>
-          <w:rFonts w:ascii="Times New Roman" w:hAnsi="Times New Roman"/>
-          <w:b/>
-          <w:i w:val="0"/>
-          <w:sz w:val="20"/>
-        </w:rPr>
-        <w:t>the threshold-cleaning curve of Fig. 3</w:t>
-      </w:r>
-      <w:r>
-        <w:rPr>
-          <w:rFonts w:ascii="Times New Roman" w:hAnsi="Times New Roman"/>
-          <w:b w:val="0"/>
-          <w:i w:val="0"/>
-          <w:sz w:val="20"/>
-        </w:rPr>
-        <w:t>; the fine-grid magnitudes are read with their grid density (§7.3).</w:t>
+        <w:t xml:space="preserve"> (per-level tables in Appendix F.8). </w:t>
+      </w:r>
+      <w:r>
+        <w:rPr>
+          <w:rFonts w:ascii="Times New Roman" w:hAnsi="Times New Roman"/>
+          <w:b/>
+          <w:i w:val="0"/>
+          <w:sz w:val="20"/>
+        </w:rPr>
+        <w:t>The threshold-cleaning curve of Fig. 3</w:t>
+      </w:r>
+      <w:r>
+        <w:rPr>
+          <w:rFonts w:ascii="Times New Roman" w:hAnsi="Times New Roman"/>
+          <w:b w:val="0"/>
+          <w:i w:val="0"/>
+          <w:sz w:val="20"/>
+        </w:rPr>
+        <w:t xml:space="preserve"> separates reachable from unreachable levels; the fine-grid magnitudes are read with their grid density (§7.3).</w:t>
       </w:r>
     </w:p>
     <w:p>
@@ -6759,6 +6799,26 @@
             </a:graphic>
           </wp:inline>
         </w:drawing>
+      </w:r>
+    </w:p>
+    <w:p>
+      <w:r>
+        <w:rPr>
+          <w:rFonts w:ascii="Times New Roman" w:hAnsi="Times New Roman"/>
+          <w:b/>
+          <w:i w:val="0"/>
+          <w:sz w:val="16"/>
+        </w:rPr>
+        <w:t>Fig. 3.</w:t>
+      </w:r>
+      <w:r>
+        <w:rPr>
+          <w:rFonts w:ascii="Times New Roman" w:hAnsi="Times New Roman"/>
+          <w:b w:val="0"/>
+          <w:i w:val="0"/>
+          <w:sz w:val="16"/>
+        </w:rPr>
+        <w:t xml:space="preserve"> The threshold-cleaning curve separating reachable from unreachable levels.</w:t>
       </w:r>
     </w:p>
     <w:p>
@@ -8165,7 +8225,25 @@
           <w:i w:val="0"/>
           <w:sz w:val="20"/>
         </w:rPr>
-        <w:t>A new synthetic-dot experiment holds rendering fixed: count predicts correctness, not abstention. β = −4.2059, CI [−4.6465, −3.7653], 49.9% → 2.1% → 0.5% (11,232 = main-batch primary; contrast in M.11.1).</w:t>
+        <w:t xml:space="preserve">A new synthetic-dot experiment holds rendering fixed: count predicts correctness, not abstention. β = −4.2059, CI [−4.6465, −3.7653], 49.9% → 2.1% → 0.5% (11,232 = main-batch primary; </w:t>
+      </w:r>
+      <w:r>
+        <w:rPr>
+          <w:rFonts w:ascii="Times New Roman" w:hAnsi="Times New Roman"/>
+          <w:b/>
+          <w:i w:val="0"/>
+          <w:sz w:val="20"/>
+        </w:rPr>
+        <w:t>Appendix M.11.1</w:t>
+      </w:r>
+      <w:r>
+        <w:rPr>
+          <w:rFonts w:ascii="Times New Roman" w:hAnsi="Times New Roman"/>
+          <w:b w:val="0"/>
+          <w:i w:val="0"/>
+          <w:sz w:val="20"/>
+        </w:rPr>
+        <w:t>).</w:t>
       </w:r>
     </w:p>
     <w:p>
@@ -9518,7 +9596,7 @@
           <w:i w:val="0"/>
           <w:sz w:val="20"/>
         </w:rPr>
-        <w:t>The two modes decouple completely (Fig. 4).</w:t>
+        <w:t>The two modes decouple (Fig. 4).</w:t>
       </w:r>
       <w:r>
         <w:rPr>
@@ -9646,6 +9724,26 @@
       <w:r>
         <w:rPr>
           <w:rFonts w:ascii="Times New Roman" w:hAnsi="Times New Roman"/>
+          <w:b/>
+          <w:i w:val="0"/>
+          <w:sz w:val="16"/>
+        </w:rPr>
+        <w:t>Fig. 4.</w:t>
+      </w:r>
+      <w:r>
+        <w:rPr>
+          <w:rFonts w:ascii="Times New Roman" w:hAnsi="Times New Roman"/>
+          <w:b w:val="0"/>
+          <w:i w:val="0"/>
+          <w:sz w:val="16"/>
+        </w:rPr>
+        <w:t xml:space="preserve"> The four-panel separation of the two failure modes: abstention and under-count decouple.</w:t>
+      </w:r>
+    </w:p>
+    <w:p>
+      <w:r>
+        <w:rPr>
+          <w:rFonts w:ascii="Times New Roman" w:hAnsi="Times New Roman"/>
           <w:b w:val="0"/>
           <w:i w:val="0"/>
           <w:sz w:val="20"/>
@@ -10159,7 +10257,7 @@
           <w:i w:val="0"/>
           <w:sz w:val="20"/>
         </w:rPr>
-        <w:t xml:space="preserve"> rather than an independent empirical prediction.</w:t>
+        <w:t>, not an independent empirical prediction.</w:t>
       </w:r>
     </w:p>
     <w:p>
@@ -11989,7 +12087,7 @@
           <w:i w:val="0"/>
           <w:sz w:val="20"/>
         </w:rPr>
-        <w:t xml:space="preserve">Three readings, one of which is a counterexample and is reported as one. </w:t>
+        <w:t xml:space="preserve">Three readings, one of which is a counterexample, reported as one. </w:t>
       </w:r>
       <w:r>
         <w:rPr>
@@ -12205,7 +12303,7 @@
           <w:i w:val="0"/>
           <w:sz w:val="20"/>
         </w:rPr>
-        <w:t xml:space="preserve"> rather than </w:t>
+        <w:t xml:space="preserve">, not </w:t>
       </w:r>
       <w:r>
         <w:rPr>
@@ -12241,7 +12339,7 @@
           <w:i w:val="0"/>
           <w:sz w:val="20"/>
         </w:rPr>
-        <w:t xml:space="preserve">, and we state that explicitly rather than as a dense-only caveat. </w:t>
+        <w:t xml:space="preserve">, and we state that explicitly, not as a dense-only caveat. </w:t>
       </w:r>
       <w:r>
         <w:rPr>
@@ -12295,7 +12393,7 @@
           <w:i w:val="0"/>
           <w:sz w:val="20"/>
         </w:rPr>
-        <w:t>, 1 inversion of 36) — the asymmetry §5.12 reports for the decision forms. Its sensitivity to the input scale is bounded in Appendix M.41. The two rank correlations behind this paragraph rest on the answered subset of the 300 sampled images, which is 17–52 images per configuration (Appendix M.24.2); those two figures carry no interval.</w:t>
+        <w:t>, 1 inversion of 36) — the asymmetry §5.12 reports for the decision forms. Its sensitivity to the input scale is bounded in Appendix M.41. The two rank correlations behind this paragraph rest on the answered subset of the 300 sampled images, 17–52 images per configuration (Appendix M.24.2); those two figures carry no interval.</w:t>
       </w:r>
     </w:p>
     <w:p>
@@ -12448,7 +12546,7 @@
           <w:i w:val="0"/>
           <w:sz w:val="20"/>
         </w:rPr>
-        <w:t xml:space="preserve"> families reach ≤2% (0.00%, 0.00%, 0.00%, 0.18%). The two exceptions are diagnostic rather than fatal. Idefics3-8B leaves </w:t>
+        <w:t xml:space="preserve"> families reach ≤2% (0.00%, 0.00%, 0.00%, 0.18%). The two exceptions are diagnostic, not fatal. Idefics3-8B leaves </w:t>
       </w:r>
       <w:r>
         <w:rPr>
@@ -12612,7 +12710,7 @@
           <w:i w:val="0"/>
           <w:sz w:val="20"/>
         </w:rPr>
-        <w:t xml:space="preserve"> (a prediction fails unless every conjunct passes; P2's second is not evaluable), and they bear on scope rather than on the measurement: the convention can change the top-ranked family in </w:t>
+        <w:t xml:space="preserve"> (a prediction fails unless every conjunct passes; P2's second is not evaluable), and they bear on scope, not on the measurement: the convention can change the top-ranked family in </w:t>
       </w:r>
       <w:r>
         <w:rPr>
@@ -12677,7 +12775,7 @@
           <w:i w:val="0"/>
           <w:sz w:val="20"/>
         </w:rPr>
-        <w:t>On hosted endpoints the abstention is latent rather than absent.</w:t>
+        <w:t>On hosted endpoints the abstention is latent, not absent.</w:t>
       </w:r>
       <w:r>
         <w:rPr>
@@ -12961,7 +13059,7 @@
           <w:i w:val="0"/>
           <w:sz w:val="20"/>
         </w:rPr>
-        <w:t xml:space="preserve">On the dense end, density regression is the most accurate family under a fixed protocol but the least directionally controllable: its predicted totals scale multiplicatively with inference input size, so ρ is a function of the scale protocol rather than of the model alone, and the family carries a </w:t>
+        <w:t xml:space="preserve">On the dense end, density regression is the most accurate family under a fixed protocol but the least directionally controllable: its predicted totals scale multiplicatively with inference input size, so ρ is a function of the scale protocol, not of the model alone, and the family carries a </w:t>
       </w:r>
       <w:r>
         <w:rPr>
@@ -13130,7 +13228,7 @@
           <w:i w:val="0"/>
           <w:sz w:val="20"/>
         </w:rPr>
-        <w:t>, since under sampling it co-varies with temperature and sample count, which is why our VLM protocol fixes temperature at 0 (H.2); and the collapse of the VLM contract arm's output under overlap occurs for both 8B and 32B models at comparable overlap levels, making it a property of the task structure rather than of model capacity (H.3).</w:t>
+        <w:t>, since under sampling it co-varies with temperature and sample count, so our VLM protocol fixes temperature at 0 (H.2); and the collapse of the VLM contract arm's output under overlap occurs for both 8B and 32B models at comparable overlap levels, making it a property of the task structure, not of model capacity (H.3).</w:t>
       </w:r>
     </w:p>
     <w:p>
@@ -13187,7 +13285,7 @@
           <w:i w:val="0"/>
           <w:sz w:val="20"/>
         </w:rPr>
-        <w:t>, not as the paper's primary claim: the contract result (§5.7) and the convention result (§5.12) hold without it. A downstream user who wants a rule rather than a stratifier should read §7.7 and Appendix M.20 first.</w:t>
+        <w:t>, not as the paper's primary claim: the contract result (§5.7) and the convention result (§5.12) hold without it. A downstream user who wants a rule, not a stratifier should read §7.7 and Appendix M.20 first.</w:t>
       </w:r>
     </w:p>
     <w:p>
@@ -14396,7 +14494,7 @@
           <w:i w:val="0"/>
           <w:sz w:val="20"/>
         </w:rPr>
-        <w:t>unresolved rather than explained</w:t>
+        <w:t>unresolved, not explained</w:t>
       </w:r>
       <w:r>
         <w:rPr>
@@ -15205,7 +15303,7 @@
           <w:i w:val="0"/>
           <w:sz w:val="20"/>
         </w:rPr>
-        <w:t xml:space="preserve"> in one step). The three hosted endpoints are deployments we cannot pin to a build, so their numbers are dated rather than frozen.</w:t>
+        <w:t xml:space="preserve"> in one step). The three hosted endpoints are deployments we cannot pin to a build, so their numbers are dated, not frozen.</w:t>
       </w:r>
     </w:p>
     <w:p>
@@ -15459,7 +15557,7 @@
           <w:i w:val="0"/>
           <w:sz w:val="20"/>
         </w:rPr>
-        <w:t xml:space="preserve">, which is </w:t>
+        <w:t xml:space="preserve">, </w:t>
       </w:r>
       <w:r>
         <w:rPr>
@@ -15803,7 +15901,7 @@
           <w:i w:val="0"/>
           <w:sz w:val="20"/>
         </w:rPr>
-        <w:t xml:space="preserve"> leaves its unit interval when the net deviation is not an under-count (§3.8) — three of twenty cells, unmeasured rather than clipped, the two pp terms of Table 3 being the fallback there — and the </w:t>
+        <w:t xml:space="preserve"> leaves its unit interval when the net deviation is not an under-count (§3.8) — three of twenty cells, unmeasured, not clipped, the two pp terms of Table 3 being the fallback there — and the </w:t>
       </w:r>
       <w:r>
         <w:rPr>
@@ -15949,7 +16047,7 @@
           <w:i w:val="0"/>
           <w:sz w:val="20"/>
         </w:rPr>
-        <w:t>: the nine datasets span a legibility range rather than a stated population, so domain-level statements describe these domains, not a distribution.</w:t>
+        <w:t>: the nine datasets span a legibility range, not a stated population, so domain-level statements describe these domains, not a distribution.</w:t>
       </w:r>
     </w:p>
     <w:p>
@@ -15969,7 +16067,7 @@
           <w:i w:val="0"/>
           <w:sz w:val="20"/>
         </w:rPr>
-        <w:t xml:space="preserve"> Only the sub-experiments explicitly marked as pre-registered had their criteria written before the data were examined — Appendix G.1 and G.2 list them with each criterion quoted as frozen. The rest are post hoc (including the choice of tiling level, weight set and aggregation convention), which is why both conventions and the weight-set range are reported wherever they diverge. </w:t>
+        <w:t xml:space="preserve"> Only the sub-experiments explicitly marked as pre-registered had their criteria written before the data were examined — Appendix G.1 and G.2 list them with each criterion quoted as frozen. The rest are post hoc (including the choice of tiling level, weight set and aggregation convention), so both conventions and the weight-set range are reported wherever they diverge. </w:t>
       </w:r>
       <w:r>
         <w:rPr>
@@ -16084,7 +16182,7 @@
           <w:i w:val="0"/>
           <w:sz w:val="20"/>
         </w:rPr>
-        <w:t xml:space="preserve">: the channel through which a model declines to answer is set by the output contract rather than by the lineage, so the outlet is a property of the serving configuration (§5.7). The spectrum replicates in its </w:t>
+        <w:t xml:space="preserve">: the channel through which a model declines to answer is set by the output contract, not by the lineage, so the outlet is a property of the serving configuration (§5.7). The spectrum replicates in its </w:t>
       </w:r>
       <w:r>
         <w:rPr>
@@ -16192,7 +16290,7 @@
           <w:i w:val="0"/>
           <w:sz w:val="20"/>
         </w:rPr>
-        <w:t xml:space="preserve"> (§8.1). The weakest parts are stated as such in §8; the most consequential open question is whether the abstention channel can be given a statistical guarantee rather than a measured rate (§7.7).</w:t>
+        <w:t xml:space="preserve"> (§8.1). The weakest parts are stated as such in §8; the most consequential open question is whether the abstention channel can be given a statistical guarantee, not a measured rate (§7.7).</w:t>
       </w:r>
     </w:p>
     <w:p>

</xml_diff>

<commit_message>
v0662: r17 distillation Top-3 (M.11.2 analyzer md5 -> shipped copy, 42-cell api_error caliber, 6-of-6 -> 5-of-6 with glm-4.6v named) + main-text MUST-FIX (net 0 words, 35 pp) + release the M.11.2 analysis tables and manifest (MANIFEST 4,763 rows)
</commit_message>
<xml_diff>
--- a/manuscript/PaperB_manuscript_PR_layout.docx
+++ b/manuscript/PaperB_manuscript_PR_layout.docx
@@ -106,7 +106,7 @@
           <w:i w:val="0"/>
           <w:sz w:val="20"/>
         </w:rPr>
-        <w:t xml:space="preserve"> of abstention that separates a suppressed abstention from a true zero, and the </w:t>
+        <w:t xml:space="preserve"> of abstention that separates suppressed abstention from a true zero, and the </w:t>
       </w:r>
       <w:r>
         <w:rPr>
@@ -142,25 +142,7 @@
           <w:i w:val="0"/>
           <w:sz w:val="20"/>
         </w:rPr>
-        <w:t xml:space="preserve"> (§5.7, §8.2), the dominant dense-scene failure </w:t>
-      </w:r>
-      <w:r>
-        <w:rPr>
-          <w:rFonts w:ascii="Times New Roman" w:hAnsi="Times New Roman"/>
-          <w:b/>
-          <w:i w:val="0"/>
-          <w:sz w:val="20"/>
-        </w:rPr>
-        <w:t>in these cells</w:t>
-      </w:r>
-      <w:r>
-        <w:rPr>
-          <w:rFonts w:ascii="Times New Roman" w:hAnsi="Times New Roman"/>
-          <w:b w:val="0"/>
-          <w:i w:val="0"/>
-          <w:sz w:val="20"/>
-        </w:rPr>
-        <w:t xml:space="preserve"> is </w:t>
+        <w:t xml:space="preserve"> (§5.7, §8.2), the dominant dense-scene failure is </w:t>
       </w:r>
       <w:r>
         <w:rPr>
@@ -196,7 +178,7 @@
           <w:i w:val="0"/>
           <w:sz w:val="20"/>
         </w:rPr>
-        <w:t xml:space="preserve"> of the total under-count under ground-truth-weighted share (</w:t>
+        <w:t xml:space="preserve"> of the total under-count under ground-truth-weighted share on matched-annotation corpora (</w:t>
       </w:r>
       <w:r>
         <w:rPr>
@@ -2442,7 +2424,7 @@
           <w:i w:val="0"/>
           <w:sz w:val="20"/>
         </w:rPr>
-        <w:t>Two families dominate counting: detection-based methods localise instances and count them, while density regression predicts a density map whose integral is the count — the definitional formulation of the field [8]. Comparative work treats them as paradigms with characteristic trade-offs, and magnitude error is the axis on which they are compared.</w:t>
+        <w:t>Two families dominate counting: detection-based methods localise instances and count them, while density regression predicts a density map whose integral is the count — the definitional formulation of the field [8]; comparative work treats them as paradigms whose trade-offs are read on magnitude error.</w:t>
       </w:r>
     </w:p>
     <w:p>
@@ -2485,7 +2467,7 @@
           <w:i w:val="0"/>
           <w:sz w:val="20"/>
         </w:rPr>
-        <w:t xml:space="preserve">, with NMS IoU as a second such knob, and with "crossing zero" shown to be </w:t>
+        <w:t xml:space="preserve">, NMS IoU being a second such knob, and "crossing zero" shown to be </w:t>
       </w:r>
       <w:r>
         <w:rPr>
@@ -2503,7 +2485,7 @@
           <w:i w:val="0"/>
           <w:sz w:val="20"/>
         </w:rPr>
-        <w:t xml:space="preserve"> — the zero of the user-side error and that of the total error differ by a factor of about 2.1–2.3 (§4.4, §4.7).</w:t>
+        <w:t xml:space="preserve"> — the zero of the user-side error and that of the total error differ by about 2.1–2.3 (§4.4, §4.7).</w:t>
       </w:r>
     </w:p>
     <w:p>
@@ -2537,7 +2519,7 @@
           <w:i w:val="0"/>
           <w:sz w:val="20"/>
         </w:rPr>
-        <w:t>The gap is that abstention rates have never been measured on counting tasks</w:t>
+        <w:t>The gap is that abstention rates are rarely measured on counting tasks</w:t>
       </w:r>
       <w:r>
         <w:rPr>
@@ -3140,7 +3122,7 @@
           <w:i w:val="0"/>
           <w:sz w:val="20"/>
         </w:rPr>
-        <w:t>, with the machinery that separates them on a fixed serving stack in §3.8 and §5.7.</w:t>
+        <w:t>, separated on a fixed serving stack in §3.8 and §5.7.</w:t>
       </w:r>
     </w:p>
     <w:p>
@@ -3165,7 +3147,7 @@
           <w:i w:val="0"/>
           <w:sz w:val="20"/>
         </w:rPr>
-        <w:t xml:space="preserve">Our VLM indicators came from single samples. Repeat sampling shows item-level reproducibility for a hosted API to be only about </w:t>
+        <w:t xml:space="preserve">Our VLM indicators came from single samples. Repeat sampling shows item-level reproducibility for a hosted API to be about </w:t>
       </w:r>
       <w:r>
         <w:rPr>
@@ -3183,7 +3165,7 @@
           <w:i w:val="0"/>
           <w:sz w:val="20"/>
         </w:rPr>
-        <w:t>, while a locally controlled stack agrees at essentially 100% (batch ≤ 2), and aggregates are far more stable (Appendix A).</w:t>
+        <w:t>, while a locally controlled stack agrees at essentially 100% (batch ≤ 2); aggregates are far more stable (Appendix A).</w:t>
       </w:r>
     </w:p>
     <w:p>
@@ -3301,7 +3283,7 @@
           <w:i w:val="0"/>
           <w:sz w:val="20"/>
         </w:rPr>
-        <w:t>Calibration conventions and their failure modes follow the standard taxonomy of Guo et al. [29].</w:t>
+        <w:t>Calibration conventions and their failure modes follow the standard taxonomy of Guo et al. [29]; stated for classification, it is a naming convention for the counting map, not a validated calibration result.</w:t>
       </w:r>
     </w:p>
     <w:p>
@@ -3496,7 +3478,7 @@
           <w:i w:val="0"/>
           <w:sz w:val="20"/>
         </w:rPr>
-        <w:t>: the rate, ρ on answered items only, and the abstention share of the total under-count. Density is summarised by OPM, whose applicability boundary is §7.1.</w:t>
+        <w:t>: the rate, ρ on answered items only, and the ground-truth-weighted under-count share S (Proposition 4), whose conditioning event and denominator are not those of the Proposition 7 channel coverage. Density is summarised by OPM, whose applicability boundary is §7.1.</w:t>
       </w:r>
     </w:p>
     <w:p>
@@ -3575,25 +3557,25 @@
           <w:i w:val="0"/>
           <w:sz w:val="20"/>
         </w:rPr>
-        <w:t xml:space="preserve"> (§5.2). </w:t>
-      </w:r>
-      <w:r>
-        <w:rPr>
-          <w:rFonts w:ascii="Times New Roman" w:hAnsi="Times New Roman"/>
-          <w:b/>
-          <w:i w:val="0"/>
-          <w:sz w:val="20"/>
-        </w:rPr>
-        <w:t>Any counting evaluation must therefore declare its target granularity explicitly</w:t>
-      </w:r>
-      <w:r>
-        <w:rPr>
-          <w:rFonts w:ascii="Times New Roman" w:hAnsi="Times New Roman"/>
-          <w:b w:val="0"/>
-          <w:i w:val="0"/>
-          <w:sz w:val="20"/>
-        </w:rPr>
-        <w:t>; part of the spread across published counting numbers is a granularity artefact, not a modelling difference.</w:t>
+        <w:t xml:space="preserve"> (§5.2). part of the spread across published counting numbers is a granularity artefact, not a modelling difference, so </w:t>
+      </w:r>
+      <w:r>
+        <w:rPr>
+          <w:rFonts w:ascii="Times New Roman" w:hAnsi="Times New Roman"/>
+          <w:b/>
+          <w:i w:val="0"/>
+          <w:sz w:val="20"/>
+        </w:rPr>
+        <w:t>any counting evaluation must declare its target granularity explicitly</w:t>
+      </w:r>
+      <w:r>
+        <w:rPr>
+          <w:rFonts w:ascii="Times New Roman" w:hAnsi="Times New Roman"/>
+          <w:b w:val="0"/>
+          <w:i w:val="0"/>
+          <w:sz w:val="20"/>
+        </w:rPr>
+        <w:t>.</w:t>
       </w:r>
     </w:p>
     <w:p>
@@ -3966,7 +3948,7 @@
           <w:i w:val="0"/>
           <w:sz w:val="20"/>
         </w:rPr>
-        <w:t xml:space="preserve"> in this paper, and its use is bounded accordingly. It supports </w:t>
+        <w:t xml:space="preserve"> here, and its use is bounded accordingly. It supports </w:t>
       </w:r>
       <w:r>
         <w:rPr>
@@ -4092,7 +4074,7 @@
           <w:i w:val="0"/>
           <w:sz w:val="20"/>
         </w:rPr>
-        <w:t xml:space="preserve">; Appendix M.20 records the measurement and why we report it as a boundary, not a promise). It is also </w:t>
+        <w:t xml:space="preserve">; M.20). It is also </w:t>
       </w:r>
       <w:r>
         <w:rPr>
@@ -4272,7 +4254,7 @@
           <w:i w:val="0"/>
           <w:sz w:val="20"/>
         </w:rPr>
-        <w:t xml:space="preserve"> ShanghaiTech-A (433 targets per image), 68% vs. 57% (</w:t>
+        <w:t xml:space="preserve"> ShanghaiTech-A (433), 68% vs. 57% (</w:t>
       </w:r>
       <w:r>
         <w:rPr>
@@ -4324,7 +4306,7 @@
           <w:i w:val="0"/>
           <w:sz w:val="20"/>
         </w:rPr>
-        <w:t xml:space="preserve"> YOLOv12n [34] (tiling follows SAHI [35]) with nine variants plus budget × source-domain combinations, zero-shot COCO [36] person detectors under a tiling protocol for the dense end, and two label conventions; Faster R-CNN [37] and RetinaNet [38] supply a second and third family (fairness parameters in Appendix D.2; Appendix M.11). </w:t>
+        <w:t xml:space="preserve"> YOLOv12n [34] (tiling follows SAHI [35]) with nine variants plus budget × source-domain combinations, zero-shot COCO [36] person detectors under a tiling protocol for the dense end, and two label conventions; Faster R-CNN [37] and RetinaNet [38] supply a second and third family (fairness parameters in D.2; M.11). </w:t>
       </w:r>
       <w:r>
         <w:rPr>
@@ -5341,7 +5323,7 @@
           <w:i w:val="0"/>
           <w:sz w:val="20"/>
         </w:rPr>
-        <w:t xml:space="preserve">: by Proposition 7, a lineage with ratio κ identifies its </w:t>
+        <w:t xml:space="preserve">: by Proposition 7, write f=R/A and R/N for relative missed detection and absolute omission; a lineage with ratio κ identifies its </w:t>
       </w:r>
       <w:r>
         <w:rPr>
@@ -5359,7 +5341,7 @@
           <w:i w:val="0"/>
           <w:sz w:val="20"/>
         </w:rPr>
-        <w:t xml:space="preserve"> only to within </w:t>
+        <w:t xml:space="preserve"> only conditionally, the equality failing under an unverbalised true zero, within </w:t>
       </w:r>
       <w:r>
         <w:rPr>
@@ -5505,7 +5487,7 @@
           <w:i w:val="0"/>
           <w:sz w:val="20"/>
         </w:rPr>
-        <w:t xml:space="preserve"> per-instance enumeration ("count every person one by one") or localisation ("locate every person") but expose only a numeric field produced </w:t>
+        <w:t xml:space="preserve"> per-instance enumeration or localisation but expose only a numeric field produced </w:t>
       </w:r>
       <w:r>
         <w:rPr>
@@ -5649,7 +5631,7 @@
           <w:i w:val="0"/>
           <w:sz w:val="20"/>
         </w:rPr>
-        <w:t xml:space="preserve"> of those items into explicit abstention, whereas relaxing the demand while still exposing only a number ("give your best estimate even if you cannot count precisely") left the answered-zero count unchanged (</w:t>
+        <w:t xml:space="preserve"> of those items into explicit abstention, whereas relaxing the demand while still exposing only a number left the answered-zero count unchanged (</w:t>
       </w:r>
       <w:r>
         <w:rPr>
@@ -5703,7 +5685,7 @@
           <w:i w:val="0"/>
           <w:sz w:val="20"/>
         </w:rPr>
-        <w:t xml:space="preserve">. The legibility attribution consequently rests on the direct manipulations of §5.6–5.7, with one boundary that the same census imposes: under an abstention contract the </w:t>
+        <w:t xml:space="preserve">. The legibility attribution consequently rests on the direct manipulations of §5.6–5.7, with one boundary the same census imposes: under an abstention contract the </w:t>
       </w:r>
       <w:r>
         <w:rPr>
@@ -5757,7 +5739,7 @@
           <w:i w:val="0"/>
           <w:sz w:val="20"/>
         </w:rPr>
-        <w:t xml:space="preserve"> domains, where it is exercised on </w:t>
+        <w:t xml:space="preserve"> domains, on </w:t>
       </w:r>
       <w:r>
         <w:rPr>
@@ -6009,7 +5991,7 @@
           <w:i w:val="0"/>
           <w:sz w:val="20"/>
         </w:rPr>
-        <w:t>. §5.12 reports those values. Both conventions are therefore</w:t>
+        <w:t>. §5.12 reports those values. Both conventions are therefore reported side by side, their divergence fixed by that covariance.</w:t>
       </w:r>
     </w:p>
     <w:p>
@@ -6262,7 +6244,7 @@
           <w:i w:val="0"/>
           <w:sz w:val="20"/>
         </w:rPr>
-        <w:t>sensitivity</w:t>
+        <w:t>sensitivity, not a precision</w:t>
       </w:r>
       <w:r>
         <w:rPr>
@@ -6600,7 +6582,7 @@
           <w:i w:val="0"/>
           <w:sz w:val="20"/>
         </w:rPr>
-        <w:t xml:space="preserve"> — the three input sizes 640 / 1024 / 1536 px, i.e. the same ladder giving the in-domain weights </w:t>
+        <w:t xml:space="preserve"> at the same three input sizes 640 / 1024 / 1536 px, against </w:t>
       </w:r>
       <w:r>
         <w:rPr>
@@ -6618,7 +6600,7 @@
           <w:i w:val="0"/>
           <w:sz w:val="20"/>
         </w:rPr>
-        <w:t xml:space="preserve"> (three levels) — and never crosses (all-detections, same eight-level grid: </w:t>
+        <w:t xml:space="preserve"> for the in-domain weights (three levels), and never crosses (all-detections, same eight-level grid: </w:t>
       </w:r>
       <w:r>
         <w:rPr>
@@ -6679,7 +6661,7 @@
           <w:i w:val="0"/>
           <w:sz w:val="20"/>
         </w:rPr>
-        <w:t xml:space="preserve">An earlier reading of these results placed the boundary of reachability at a fixed image-level density. Refining by ground-truth density bin, on a fine grid (threshold step 0.005, bootstrap 10,000×), shows the bound is real but </w:t>
+        <w:t xml:space="preserve">An earlier reading placed the boundary of reachability at a fixed image-level density. Refining by ground-truth density bin on a fine grid (threshold step 0.005, bootstrap 10,000×) shows the bound is real but </w:t>
       </w:r>
       <w:r>
         <w:rPr>
@@ -6910,16 +6892,16 @@
           <w:i/>
           <w:sz w:val="20"/>
         </w:rPr>
-        <w:t>), so configuration attribution does not rest on file naming. Tiling moves UCF from unreachable to reachable (τ^\</w:t>
-      </w:r>
-      <w:r>
-        <w:rPr>
-          <w:rFonts w:ascii="Times New Roman" w:hAnsi="Times New Roman"/>
-          <w:b w:val="0"/>
-          <w:i w:val="0"/>
-          <w:sz w:val="20"/>
-        </w:rPr>
-        <w:t xml:space="preserve"> 0.121–0.152): protocol and threshold jointly determine reachability. (Appendix M.9)</w:t>
+        <w:t>). Tiling moves UCF from unreachable to reachable (τ^\</w:t>
+      </w:r>
+      <w:r>
+        <w:rPr>
+          <w:rFonts w:ascii="Times New Roman" w:hAnsi="Times New Roman"/>
+          <w:b w:val="0"/>
+          <w:i w:val="0"/>
+          <w:sz w:val="20"/>
+        </w:rPr>
+        <w:t xml:space="preserve"> 0.121–0.152): protocol and threshold jointly determine reachability. (M.9)</w:t>
       </w:r>
     </w:p>
     <w:p>
@@ -7043,7 +7025,7 @@
           <w:i/>
           <w:sz w:val="20"/>
         </w:rPr>
-        <w:t xml:space="preserve"> (Appendix E.2). Controllability is therefore a property of the </w:t>
+        <w:t xml:space="preserve"> (E.2). Controllability is therefore a property of the </w:t>
       </w:r>
       <w:r>
         <w:rPr>
@@ -7122,7 +7104,7 @@
           <w:i w:val="0"/>
           <w:sz w:val="20"/>
         </w:rPr>
-        <w:t xml:space="preserve"> under the identical protocol (Appendix E.3, M.16) gives two readings: </w:t>
+        <w:t xml:space="preserve"> under the identical protocol (E.3, M.16) gives two readings: </w:t>
       </w:r>
       <w:r>
         <w:rPr>
@@ -7158,25 +7140,7 @@
           <w:i w:val="0"/>
           <w:sz w:val="20"/>
         </w:rPr>
-        <w:t xml:space="preserve">; and </w:t>
-      </w:r>
-      <w:r>
-        <w:rPr>
-          <w:rFonts w:ascii="Times New Roman" w:hAnsi="Times New Roman"/>
-          <w:b/>
-          <w:i w:val="0"/>
-          <w:sz w:val="20"/>
-        </w:rPr>
-        <w:t>the two families unseal at different granularities</w:t>
-      </w:r>
-      <w:r>
-        <w:rPr>
-          <w:rFonts w:ascii="Times New Roman" w:hAnsi="Times New Roman"/>
-          <w:b w:val="0"/>
-          <w:i w:val="0"/>
-          <w:sz w:val="20"/>
-        </w:rPr>
-        <w:t>, the pre-FPN architecture needing finer tiling for the same domain.</w:t>
+        <w:t>; and the pre-FPN architecture needs finer tiling to unseal the same domain.</w:t>
       </w:r>
     </w:p>
     <w:p>
@@ -7414,7 +7378,7 @@
           <w:i w:val="0"/>
           <w:sz w:val="20"/>
         </w:rPr>
-        <w:t xml:space="preserve">On the full sparse set (12,066 items × 3 arms × 2 stacks) the prompts move the direction monotonically and reproducibly, with the </w:t>
+        <w:t xml:space="preserve">On the full sparse set (12,066 items × 3 arms × 2 stacks) the prompts move the direction monotonically and reproducibly, the </w:t>
       </w:r>
       <w:r>
         <w:rPr>
@@ -7486,7 +7450,7 @@
           <w:i w:val="0"/>
           <w:sz w:val="20"/>
         </w:rPr>
-        <w:t xml:space="preserve"> control — a separation that proves useful in §5.7.</w:t>
+        <w:t xml:space="preserve"> control — a separation useful in §5.7.</w:t>
       </w:r>
     </w:p>
     <w:p>
@@ -7547,7 +7511,7 @@
           <w:i w:val="0"/>
           <w:sz w:val="20"/>
         </w:rPr>
-        <w:t xml:space="preserve"> targets per image (§5.6 identifies the ordering variable). (Appendix M.29)</w:t>
+        <w:t xml:space="preserve"> targets per image (§5.6 identifies the ordering variable). (M.29)</w:t>
       </w:r>
     </w:p>
     <w:p>
@@ -7590,7 +7554,25 @@
           <w:i w:val="0"/>
           <w:sz w:val="20"/>
         </w:rPr>
-        <w:t xml:space="preserve"> the total under-count is an abstention term plus a scaled answering term, and the abstention share has the closed form S=(1-w)/[1-w(1+ρ_answered)]; evaluated here it gives </w:t>
+        <w:t xml:space="preserve"> the total under-count is an abstention term plus a scaled answering term, and the </w:t>
+      </w:r>
+      <w:r>
+        <w:rPr>
+          <w:rFonts w:ascii="Times New Roman" w:hAnsi="Times New Roman"/>
+          <w:b/>
+          <w:i w:val="0"/>
+          <w:sz w:val="20"/>
+        </w:rPr>
+        <w:t>GT-weighted under-count share of zero-output items</w:t>
+      </w:r>
+      <w:r>
+        <w:rPr>
+          <w:rFonts w:ascii="Times New Roman" w:hAnsi="Times New Roman"/>
+          <w:b w:val="0"/>
+          <w:i w:val="0"/>
+          <w:sz w:val="20"/>
+        </w:rPr>
+        <w:t xml:space="preserve"> has the closed form S=(1-w)/[1-w(1+ρ_answered)]; evaluated here it gives </w:t>
       </w:r>
       <w:r>
         <w:rPr>
@@ -7626,16 +7608,16 @@
           <w:i w:val="0"/>
           <w:sz w:val="20"/>
         </w:rPr>
-        <w:t xml:space="preserve"> (three of twenty (language × build) cells leave the unit interval; M.18.9, M.19.16(ii), M.39, M.46(c)). </w:t>
-      </w:r>
-      <w:r>
-        <w:rPr>
-          <w:rFonts w:ascii="Times New Roman" w:hAnsi="Times New Roman"/>
-          <w:b/>
-          <w:i w:val="0"/>
-          <w:sz w:val="20"/>
-        </w:rPr>
-        <w:t>This is the quantitative core of the paper's central claim (a coverage of the abstention channel, not a precision; Proposition 7): the received description "VLMs underestimate dense scenes" is mostly a description of refusals.</w:t>
+        <w:t xml:space="preserve"> (M.19.15: only the defining checkpoint's two precisions clear 50%) (three of twenty (language × build) cells leave the unit interval; M.18.9, M.19.16(ii), M.39, M.46(c)). </w:t>
+      </w:r>
+      <w:r>
+        <w:rPr>
+          <w:rFonts w:ascii="Times New Roman" w:hAnsi="Times New Roman"/>
+          <w:b/>
+          <w:i w:val="0"/>
+          <w:sz w:val="20"/>
+        </w:rPr>
+        <w:t>This is the quantitative core of the paper's central claim (a share of the under-count, not a precision; Proposition 7): the received description "VLMs underestimate dense scenes" is mostly a description of refusals.</w:t>
       </w:r>
       <w:r>
         <w:rPr>
@@ -8234,7 +8216,7 @@
           <w:i w:val="0"/>
           <w:sz w:val="20"/>
         </w:rPr>
-        <w:t>Appendix M.11.1</w:t>
+        <w:t>M.11.1</w:t>
       </w:r>
       <w:r>
         <w:rPr>
@@ -8450,7 +8432,7 @@
           <w:i w:val="0"/>
           <w:sz w:val="20"/>
         </w:rPr>
-        <w:t xml:space="preserve"> on the items that the corpus configuration answered exactly 0, five configurations given an explicit abstention option abstained explicitly in </w:t>
+        <w:t xml:space="preserve"> on the items that the corpus configuration answered exactly 0, five configurations given an explicit abstention option abstained in </w:t>
       </w:r>
       <w:r>
         <w:rPr>
@@ -8486,7 +8468,7 @@
           <w:i w:val="0"/>
           <w:sz w:val="20"/>
         </w:rPr>
-        <w:t xml:space="preserve"> answered 0, while forbidding abstention produced a </w:t>
+        <w:t xml:space="preserve"> answered 0, while forbidding abstention gave a </w:t>
       </w:r>
       <w:r>
         <w:rPr>
@@ -9930,25 +9912,7 @@
           <w:i w:val="0"/>
           <w:sz w:val="20"/>
         </w:rPr>
-        <w:t xml:space="preserve">, paired, n = 900). </w:t>
-      </w:r>
-      <w:r>
-        <w:rPr>
-          <w:rFonts w:ascii="Times New Roman" w:hAnsi="Times New Roman"/>
-          <w:b/>
-          <w:i w:val="0"/>
-          <w:sz w:val="20"/>
-        </w:rPr>
-        <w:t>Not lineage-specific</w:t>
-      </w:r>
-      <w:r>
-        <w:rPr>
-          <w:rFonts w:ascii="Times New Roman" w:hAnsi="Times New Roman"/>
-          <w:b w:val="0"/>
-          <w:i w:val="0"/>
-          <w:sz w:val="20"/>
-        </w:rPr>
-        <w:t>: on a controlled disc grid the same gate reproduces in three further lineages, where the permitted contract leaves no zeros (Appendix M.19.10).</w:t>
+        <w:t>, paired, n = 900); the gate reproduces in three further lineages on a controlled disc grid, where the permitted contract leaves no zeros (M.19.10).</w:t>
       </w:r>
     </w:p>
     <w:p>
@@ -10045,16 +10009,16 @@
           <w:i w:val="0"/>
           <w:sz w:val="20"/>
         </w:rPr>
-        <w:t>Route B — relaxing the prompt</w:t>
-      </w:r>
-      <w:r>
-        <w:rPr>
-          <w:rFonts w:ascii="Times New Roman" w:hAnsi="Times New Roman"/>
-          <w:b w:val="0"/>
-          <w:i w:val="0"/>
-          <w:sz w:val="20"/>
-        </w:rPr>
-        <w:t xml:space="preserve"> cannot obtain both. (Appendices M.8, M.11)</w:t>
+        <w:t>Route B</w:t>
+      </w:r>
+      <w:r>
+        <w:rPr>
+          <w:rFonts w:ascii="Times New Roman" w:hAnsi="Times New Roman"/>
+          <w:b w:val="0"/>
+          <w:i w:val="0"/>
+          <w:sz w:val="20"/>
+        </w:rPr>
+        <w:t xml:space="preserve"> cannot obtain both. (M.8, M.11)</w:t>
       </w:r>
     </w:p>
     <w:p>
@@ -10228,18 +10192,7 @@
           <w:i w:val="0"/>
           <w:sz w:val="20"/>
         </w:rPr>
-        <w:t xml:space="preserve"> (AI-TOD and VisDrone) (Appendix M.8).</w:t>
-      </w:r>
-    </w:p>
-    <w:p>
-      <w:r>
-        <w:rPr>
-          <w:rFonts w:ascii="Times New Roman" w:hAnsi="Times New Roman"/>
-          <w:b w:val="0"/>
-          <w:i w:val="0"/>
-          <w:sz w:val="20"/>
-        </w:rPr>
-        <w:t xml:space="preserve">Proposition 4 expresses this gap as -(1-w)(1+ρ_answered), so the four reported values are a </w:t>
+        <w:t xml:space="preserve"> (AI-TOD and VisDrone) (M.8). Proposition 4 expresses this gap as -(1-w)(1+ρ_answered), so these four values are a </w:t>
       </w:r>
       <w:r>
         <w:rPr>
@@ -10336,7 +10289,7 @@
           <w:i w:val="0"/>
           <w:sz w:val="20"/>
         </w:rPr>
-        <w:t xml:space="preserve"> domains that admit a common item intersection, zero and non-zero pools pooled within a domain, so that no rank difference can come from different denominators (the quantities and the denominator are defined in Appendix M.21) — the convention changes how large a configuration's measured bias appears, and in the dense domains changes the order:</w:t>
+        <w:t xml:space="preserve"> domains that admit a common item intersection, zero and non-zero pools pooled within a domain, so that no rank difference can come from different denominators (the quantities and denominators are defined in M.21) — the convention changes how large a configuration's measured bias appears, and in the dense domains changes the order:</w:t>
       </w:r>
     </w:p>
     <w:p>
@@ -11207,7 +11160,7 @@
           <w:i w:val="0"/>
           <w:sz w:val="20"/>
         </w:rPr>
-        <w:t xml:space="preserve">). A number quoted under one convention is thus not comparable with a number quoted under the other — the operational reading of Proposition 8, and what the released protocol of §7.9 reports as a matter of course. </w:t>
+        <w:t xml:space="preserve">). A number quoted under one convention is thus not comparable with one quoted under the other — the operational reading of Proposition 8, and what the released protocol of §7.9 reports as a matter of course. </w:t>
       </w:r>
       <w:r>
         <w:rPr>
@@ -11290,7 +11243,7 @@
           <w:i w:val="0"/>
           <w:sz w:val="20"/>
         </w:rPr>
-        <w:t xml:space="preserve"> (the three best configurations per dataset) — over five datasets and a 3 × 3 grid of θ × tol are evaluated under both readings of "answered". Read as </w:t>
+        <w:t xml:space="preserve"> (the three best configurations per dataset) — over five datasets and a 3 × 3 grid of θ × tol are evaluated under both readings of "answered": as </w:t>
       </w:r>
       <w:r>
         <w:rPr>
@@ -11344,7 +11297,7 @@
           <w:i w:val="0"/>
           <w:sz w:val="20"/>
         </w:rPr>
-        <w:t xml:space="preserve">; read as §M.27 defines them — a numerical </w:t>
+        <w:t xml:space="preserve">; as §M.27 defines them — a numerical </w:t>
       </w:r>
       <w:r>
         <w:rPr>
@@ -11513,7 +11466,25 @@
           <w:i w:val="0"/>
           <w:sz w:val="20"/>
         </w:rPr>
-        <w:t>:</w:t>
+        <w:t xml:space="preserve">, read </w:t>
+      </w:r>
+      <w:r>
+        <w:rPr>
+          <w:rFonts w:ascii="Times New Roman" w:hAnsi="Times New Roman"/>
+          <w:b w:val="0"/>
+          <w:i/>
+          <w:sz w:val="20"/>
+        </w:rPr>
+        <w:t>instrument-as-is</w:t>
+      </w:r>
+      <w:r>
+        <w:rPr>
+          <w:rFonts w:ascii="Times New Roman" w:hAnsi="Times New Roman"/>
+          <w:b w:val="0"/>
+          <w:i w:val="0"/>
+          <w:sz w:val="20"/>
+        </w:rPr>
+        <w:t>: its queried class need not match our prompt's phrasing, so the readings below bound rather than estimate the contract effect:</w:t>
       </w:r>
     </w:p>
     <w:p>
@@ -11533,7 +11504,25 @@
           <w:i w:val="0"/>
           <w:sz w:val="20"/>
         </w:rPr>
-        <w:t xml:space="preserve"> The contract gate on FSC-147 (five of the nine configurations in the panel; the full panel is Appendix M.24.1).</w:t>
+        <w:t xml:space="preserve"> The contract gate on FSC-147 (</w:t>
+      </w:r>
+      <w:r>
+        <w:rPr>
+          <w:rFonts w:ascii="Times New Roman" w:hAnsi="Times New Roman"/>
+          <w:b w:val="0"/>
+          <w:i/>
+          <w:sz w:val="20"/>
+        </w:rPr>
+        <w:t>instrument-as-is</w:t>
+      </w:r>
+      <w:r>
+        <w:rPr>
+          <w:rFonts w:ascii="Times New Roman" w:hAnsi="Times New Roman"/>
+          <w:b w:val="0"/>
+          <w:i w:val="0"/>
+          <w:sz w:val="20"/>
+        </w:rPr>
+        <w:t>; five of the nine configurations in the panel; the full panel is Appendix M.24.1).</w:t>
       </w:r>
     </w:p>
     <w:tbl>
@@ -12454,7 +12443,7 @@
           <w:i w:val="0"/>
           <w:sz w:val="20"/>
         </w:rPr>
-        <w:t xml:space="preserve">, re-issued, traces removed; values unchanged; rule and full frame in Appendix M.31). The rule takes one open-weight family per lineage, excludes every family used above, and yielded </w:t>
+        <w:t xml:space="preserve">, re-issued, traces removed; values unchanged; rule and frame in Appendix M.31). The rule takes one open-weight family per lineage, excludes every family used above, and yielded </w:t>
       </w:r>
       <w:r>
         <w:rPr>
@@ -12472,7 +12461,7 @@
           <w:i w:val="0"/>
           <w:sz w:val="20"/>
         </w:rPr>
-        <w:t xml:space="preserve"> — five of those lineages appear nowhere in §3–§5. The pools are the census-defined ones, which do not depend on the new models, and the instrument is the frozen probe, byte-identical in prompts and parser to the census probe.</w:t>
+        <w:t>, five of those lineages appearing nowhere in §3–§5. The pools are the census-defined ones, which do not depend on the new models, and the instrument is the frozen probe, byte-identical in prompts and parser to the census probe.</w:t>
       </w:r>
     </w:p>
     <w:p>
@@ -12546,7 +12535,7 @@
           <w:i w:val="0"/>
           <w:sz w:val="20"/>
         </w:rPr>
-        <w:t xml:space="preserve"> families reach ≤2% (0.00%, 0.00%, 0.00%, 0.18%). The two exceptions are diagnostic, not fatal. Idefics3-8B leaves </w:t>
+        <w:t xml:space="preserve"> families reach ≤2% (0.00%, 0.00%, 0.00%, 0.18%). The two exceptions are diagnostic, not fatal: Idefics3-8B leaves </w:t>
       </w:r>
       <w:r>
         <w:rPr>
@@ -12564,7 +12553,7 @@
           <w:i w:val="0"/>
           <w:sz w:val="20"/>
         </w:rPr>
-        <w:t xml:space="preserve">, but its residual sits on sparse aerial items whose ground truth is one to three objects — a missed tiny target, not a refused outlet. deepseek-vl2-tiny leaves </w:t>
+        <w:t xml:space="preserve"> on sparse aerial items whose ground truth is one to three objects — a missed tiny target, not a refused outlet — and deepseek-vl2-tiny leaves </w:t>
       </w:r>
       <w:r>
         <w:rPr>
@@ -12582,7 +12571,7 @@
           <w:i w:val="0"/>
           <w:sz w:val="20"/>
         </w:rPr>
-        <w:t xml:space="preserve">: it never abstains in the aerial domains and its dense-domain output is 99% unparsable, so its numbers are a format failure and a genuine family × domain outlet failure at once. The contract knob moves the zero rate by at least 10 pp more than the resolution knob in </w:t>
+        <w:t xml:space="preserve">, never abstaining in the aerial domains while its dense-domain output is 99% unparsable, a format failure and a genuine family × domain outlet failure at once. The contract knob moves the zero rate by at least 10 pp more than the resolution knob in </w:t>
       </w:r>
       <w:r>
         <w:rPr>
@@ -13210,7 +13199,7 @@
           <w:i w:val="0"/>
           <w:sz w:val="20"/>
         </w:rPr>
-        <w:t xml:space="preserve">, not a new architecture (H.1); the abstention rate is a stable property </w:t>
+        <w:t xml:space="preserve">, not a new architecture (H.1); the abstention rate is stable </w:t>
       </w:r>
       <w:r>
         <w:rPr>
@@ -13228,7 +13217,7 @@
           <w:i w:val="0"/>
           <w:sz w:val="20"/>
         </w:rPr>
-        <w:t>, since under sampling it co-varies with temperature and sample count, so our VLM protocol fixes temperature at 0 (H.2); and the collapse of the VLM contract arm's output under overlap occurs for both 8B and 32B models at comparable overlap levels, making it a property of the task structure, not of model capacity (H.3).</w:t>
+        <w:t>, since under sampling it co-varies with temperature and sample count, so our protocol fixes temperature at 0 (H.2); and the collapse of the VLM contract arm's output under overlap occurs for both 8B and 32B models at comparable overlap levels, making it a property of the task structure, not of model capacity (H.3).</w:t>
       </w:r>
     </w:p>
     <w:p>
@@ -13706,7 +13695,25 @@
           <w:i w:val="0"/>
           <w:sz w:val="20"/>
         </w:rPr>
-        <w:t xml:space="preserve"> (recomputed from the released package, Appendix F.7); a label-permutation test gives p&lt;5×10^-5; leaving out any single knob (</w:t>
+        <w:t xml:space="preserve"> (recomputed from the released package, Appendix F.7); the wider 36-unit resampling gives </w:t>
+      </w:r>
+      <w:r>
+        <w:rPr>
+          <w:rFonts w:ascii="Times New Roman" w:hAnsi="Times New Roman"/>
+          <w:b/>
+          <w:i w:val="0"/>
+          <w:sz w:val="20"/>
+        </w:rPr>
+        <w:t>0.711–0.998</w:t>
+      </w:r>
+      <w:r>
+        <w:rPr>
+          <w:rFonts w:ascii="Times New Roman" w:hAnsi="Times New Roman"/>
+          <w:b w:val="0"/>
+          <w:i w:val="0"/>
+          <w:sz w:val="20"/>
+        </w:rPr>
+        <w:t>, below the 0.80 bar F.7 records as not clearing; a label-permutation test gives p&lt;5×10^-5; leaving out any single knob (</w:t>
       </w:r>
       <w:r>
         <w:rPr>
@@ -13949,7 +13956,7 @@
           <w:i w:val="0"/>
           <w:sz w:val="20"/>
         </w:rPr>
-        <w:t>no deployment-usable granularity does so while preserving the ordering</w:t>
+        <w:t>no granularity validated here does so while preserving the ordering, so transfer is unverified rather than excluded</w:t>
       </w:r>
       <w:r>
         <w:rPr>
@@ -13976,7 +13983,7 @@
           <w:i w:val="0"/>
           <w:sz w:val="20"/>
         </w:rPr>
-        <w:t xml:space="preserve">; Appendix M.37). The claim is scoped to the first two calibers, and the VLM unit's own build-sensitivity is bounded in </w:t>
+        <w:t xml:space="preserve">; Appendix M.37). The claim is scoped to the first two calibers, and the VLM unit's build-sensitivity is bounded in </w:t>
       </w:r>
       <w:r>
         <w:rPr>
@@ -14066,7 +14073,7 @@
           <w:i w:val="0"/>
           <w:sz w:val="20"/>
         </w:rPr>
-        <w:t xml:space="preserve"> (Appendix F.2 reconciles the three unit sets; M.37). </w:t>
+        <w:t xml:space="preserve"> (Appendix F.2; M.37). </w:t>
       </w:r>
       <w:r>
         <w:rPr>
@@ -14239,7 +14246,7 @@
           <w:i w:val="0"/>
           <w:sz w:val="20"/>
         </w:rPr>
-        <w:t>: the ordering we report is descriptive. Our own candidate for the magnitude (Proposition 3) is a component of the definition and is withdrawn, so a magnitude law remains open; the ordering itself is measured, not assumed.</w:t>
+        <w:t>: the ordering is descriptive, and our own candidate for the magnitude (Proposition 3) is a component of the definition and is withdrawn; the ordering itself is measured, not assumed.</w:t>
       </w:r>
     </w:p>
     <w:p>
@@ -14397,7 +14404,7 @@
           <w:i w:val="0"/>
           <w:sz w:val="20"/>
         </w:rPr>
-        <w:t>. (Appendix M.11)</w:t>
+        <w:t>. (M.11)</w:t>
       </w:r>
     </w:p>
     <w:p>
@@ -14582,7 +14589,7 @@
           <w:i w:val="0"/>
           <w:sz w:val="20"/>
         </w:rPr>
-        <w:t xml:space="preserve">, not a reporting or gating rule: it needs annotation boxes, so the </w:t>
+        <w:t xml:space="preserve">, not a reporting or gating rule — it needs annotation boxes, so the </w:t>
       </w:r>
       <w:r>
         <w:rPr>
@@ -14600,25 +14607,7 @@
           <w:i w:val="0"/>
           <w:sz w:val="20"/>
         </w:rPr>
-        <w:t xml:space="preserve"> for a third party with none is in Appendix M.22. </w:t>
-      </w:r>
-      <w:r>
-        <w:rPr>
-          <w:rFonts w:ascii="Times New Roman" w:hAnsi="Times New Roman"/>
-          <w:b/>
-          <w:i w:val="0"/>
-          <w:sz w:val="20"/>
-        </w:rPr>
-        <w:t>The three annotation-free signals tested do not form the rule defined above</w:t>
-      </w:r>
-      <w:r>
-        <w:rPr>
-          <w:rFonts w:ascii="Times New Roman" w:hAnsi="Times New Roman"/>
-          <w:b w:val="0"/>
-          <w:i w:val="0"/>
-          <w:sz w:val="20"/>
-        </w:rPr>
-        <w:t xml:space="preserve"> — cross-scale, cross-phrasing and cross-family agreement — were tested on </w:t>
+        <w:t xml:space="preserve"> for a third party with none is in Appendix M.22. The three annotation-free signals (cross-scale, cross-phrasing, cross-family agreement) were tested on </w:t>
       </w:r>
       <w:r>
         <w:rPr>
@@ -14708,7 +14697,7 @@
           <w:i w:val="0"/>
           <w:sz w:val="20"/>
         </w:rPr>
-        <w:t xml:space="preserve"> — it must come from outside the answers (Appendices M.23, M.14).</w:t>
+        <w:t xml:space="preserve"> (Appendices M.23, M.14).</w:t>
       </w:r>
     </w:p>
     <w:p>
@@ -14848,7 +14837,7 @@
           <w:i w:val="0"/>
           <w:sz w:val="20"/>
         </w:rPr>
-        <w:t xml:space="preserve"> w (not Proposition 4's ground-truth-weighted w); the two deviations need reference counts on the same scored subset, so without them only that diagnosis is licensed. The thresholds are frozen in </w:t>
+        <w:t xml:space="preserve"> w (not Proposition 4's ground-truth-weighted w); the two deviations need reference counts on the same scored subset, so without them only that diagnosis is licensed. Records are kept only for completely paired inputs: the base arm's zero-item set fixes the denominator, and a missing arm is a conservative bound, not a dropped denominator. The thresholds are frozen in </w:t>
       </w:r>
       <w:r>
         <w:rPr>
@@ -14941,16 +14930,52 @@
           <w:i w:val="0"/>
           <w:sz w:val="20"/>
         </w:rPr>
-        <w:t xml:space="preserve"> and, separately, a dead parse branch recorded as a </w:t>
-      </w:r>
-      <w:r>
-        <w:rPr>
-          <w:rFonts w:ascii="Times New Roman" w:hAnsi="Times New Roman"/>
-          <w:b/>
-          <w:i w:val="0"/>
-          <w:sz w:val="20"/>
-        </w:rPr>
-        <w:t>third instrument finding</w:t>
+        <w:t xml:space="preserve"> and, separately, a dead parse branch; </w:t>
+      </w:r>
+      <w:r>
+        <w:rPr>
+          <w:rFonts w:ascii="Times New Roman" w:hAnsi="Times New Roman"/>
+          <w:b/>
+          <w:i w:val="0"/>
+          <w:sz w:val="20"/>
+        </w:rPr>
+        <w:t>Run-to-run non-determinism</w:t>
+      </w:r>
+      <w:r>
+        <w:rPr>
+          <w:rFonts w:ascii="Times New Roman" w:hAnsi="Times New Roman"/>
+          <w:b w:val="0"/>
+          <w:i w:val="0"/>
+          <w:sz w:val="20"/>
+        </w:rPr>
+        <w:t xml:space="preserve">, characterised below; </w:t>
+      </w:r>
+      <w:r>
+        <w:rPr>
+          <w:rFonts w:ascii="Times New Roman" w:hAnsi="Times New Roman"/>
+          <w:b/>
+          <w:i w:val="0"/>
+          <w:sz w:val="20"/>
+        </w:rPr>
+        <w:t>Graded isolation</w:t>
+      </w:r>
+      <w:r>
+        <w:rPr>
+          <w:rFonts w:ascii="Times New Roman" w:hAnsi="Times New Roman"/>
+          <w:b w:val="0"/>
+          <w:i w:val="0"/>
+          <w:sz w:val="20"/>
+        </w:rPr>
+        <w:t xml:space="preserve">, with a residue ledger and </w:t>
+      </w:r>
+      <w:r>
+        <w:rPr>
+          <w:rFonts w:ascii="Times New Roman" w:hAnsi="Times New Roman"/>
+          <w:b/>
+          <w:i w:val="0"/>
+          <w:sz w:val="20"/>
+        </w:rPr>
+        <w:t>a census of anomalous predictions</w:t>
       </w:r>
       <w:r>
         <w:rPr>
@@ -14968,60 +14993,6 @@
           <w:i w:val="0"/>
           <w:sz w:val="20"/>
         </w:rPr>
-        <w:t>Run-to-run non-determinism</w:t>
-      </w:r>
-      <w:r>
-        <w:rPr>
-          <w:rFonts w:ascii="Times New Roman" w:hAnsi="Times New Roman"/>
-          <w:b w:val="0"/>
-          <w:i w:val="0"/>
-          <w:sz w:val="20"/>
-        </w:rPr>
-        <w:t xml:space="preserve">, characterised below; </w:t>
-      </w:r>
-      <w:r>
-        <w:rPr>
-          <w:rFonts w:ascii="Times New Roman" w:hAnsi="Times New Roman"/>
-          <w:b/>
-          <w:i w:val="0"/>
-          <w:sz w:val="20"/>
-        </w:rPr>
-        <w:t>Graded isolation</w:t>
-      </w:r>
-      <w:r>
-        <w:rPr>
-          <w:rFonts w:ascii="Times New Roman" w:hAnsi="Times New Roman"/>
-          <w:b w:val="0"/>
-          <w:i w:val="0"/>
-          <w:sz w:val="20"/>
-        </w:rPr>
-        <w:t xml:space="preserve">, with a residue ledger; </w:t>
-      </w:r>
-      <w:r>
-        <w:rPr>
-          <w:rFonts w:ascii="Times New Roman" w:hAnsi="Times New Roman"/>
-          <w:b/>
-          <w:i w:val="0"/>
-          <w:sz w:val="20"/>
-        </w:rPr>
-        <w:t>a census of anomalous predictions</w:t>
-      </w:r>
-      <w:r>
-        <w:rPr>
-          <w:rFonts w:ascii="Times New Roman" w:hAnsi="Times New Roman"/>
-          <w:b w:val="0"/>
-          <w:i w:val="0"/>
-          <w:sz w:val="20"/>
-        </w:rPr>
-        <w:t xml:space="preserve">; </w:t>
-      </w:r>
-      <w:r>
-        <w:rPr>
-          <w:rFonts w:ascii="Times New Roman" w:hAnsi="Times New Roman"/>
-          <w:b/>
-          <w:i w:val="0"/>
-          <w:sz w:val="20"/>
-        </w:rPr>
         <w:t>No attention-based criterion</w:t>
       </w:r>
       <w:r>
@@ -15049,7 +15020,7 @@
           <w:i w:val="0"/>
           <w:sz w:val="20"/>
         </w:rPr>
-        <w:t xml:space="preserve">, the across-repeat term exceeding the interval width by roughly a factor of two where levels are few (§A.2). No aggregate above depends on the affected runs (§3.7, §5.1). The two numbers: the aggregate change in ME is within </w:t>
+        <w:t xml:space="preserve">, the across-repeat term exceeding the interval width by roughly a factor of two where levels are few (§A.2). No aggregate above depends on the affected runs (§3.7, §5.1). The aggregate change in ME is within </w:t>
       </w:r>
       <w:r>
         <w:rPr>
@@ -15085,7 +15056,7 @@
           <w:i w:val="0"/>
           <w:sz w:val="20"/>
         </w:rPr>
-        <w:t xml:space="preserve"> across the six such pairs; Item-level claims are made only on our own stack: local stacks at batch ≤ 2 reproduce exactly, hosted endpoints do not (§A.3). Non-determinism is documented for LLM inference [52], [53] and for evaluation harnesses [54], [55].</w:t>
+        <w:t xml:space="preserve"> across the six such pairs. Item-level claims are made only on our own stack: local stacks at batch ≤ 2 reproduce exactly, hosted endpoints do not (§A.3). Non-determinism is documented for LLM inference [52], [53] and for evaluation harnesses [54], [55].</w:t>
       </w:r>
     </w:p>
     <w:p>
@@ -15195,7 +15166,7 @@
           <w:i w:val="0"/>
           <w:sz w:val="20"/>
         </w:rPr>
-        <w:t xml:space="preserve">, resting on YOLO with RetinaNet and Faster R-CNN as secondary lineages; a broader sweep would establish whether §4.1's domain conditionality and §4.5's unsealing granularity are family or architecture properties. The exemplar condition is measured on </w:t>
+        <w:t xml:space="preserve">, resting on YOLO with RetinaNet and Faster R-CNN as secondary lineages; a broader sweep would establish whether §4.1's and §4.5's properties are family or architecture properties. The exemplar condition is measured on </w:t>
       </w:r>
       <w:r>
         <w:rPr>
@@ -15649,7 +15620,7 @@
           <w:i w:val="0"/>
           <w:sz w:val="20"/>
         </w:rPr>
-        <w:t xml:space="preserve"> (§5.13) — with the Qwen3-VL-32B build as the reported counterexample there. The abstention </w:t>
+        <w:t xml:space="preserve"> on the same </w:t>
       </w:r>
       <w:r>
         <w:rPr>
@@ -15658,6 +15629,24 @@
           <w:i/>
           <w:sz w:val="20"/>
         </w:rPr>
+        <w:t>instrument-as-is</w:t>
+      </w:r>
+      <w:r>
+        <w:rPr>
+          <w:rFonts w:ascii="Times New Roman" w:hAnsi="Times New Roman"/>
+          <w:b w:val="0"/>
+          <w:i w:val="0"/>
+          <w:sz w:val="20"/>
+        </w:rPr>
+        <w:t xml:space="preserve"> panel (§5.13) — with the Qwen3-VL-32B build as the reported counterexample there. The abstention </w:t>
+      </w:r>
+      <w:r>
+        <w:rPr>
+          <w:rFonts w:ascii="Times New Roman" w:hAnsi="Times New Roman"/>
+          <w:b w:val="0"/>
+          <w:i/>
+          <w:sz w:val="20"/>
+        </w:rPr>
         <w:t>completeness</w:t>
       </w:r>
       <w:r>
@@ -15901,7 +15890,7 @@
           <w:i w:val="0"/>
           <w:sz w:val="20"/>
         </w:rPr>
-        <w:t xml:space="preserve"> leaves its unit interval when the net deviation is not an under-count (§3.8) — three of twenty cells, unmeasured, not clipped, the two pp terms of Table 3 being the fallback there — and the </w:t>
+        <w:t xml:space="preserve"> leaves its unit interval when the net deviation is not an under-count (§3.8) — three of twenty cells, unmeasured, not clipped, the Table 3 pp terms the fallback — and the </w:t>
       </w:r>
       <w:r>
         <w:rPr>
@@ -15955,7 +15944,7 @@
           <w:i w:val="0"/>
           <w:sz w:val="20"/>
         </w:rPr>
-        <w:t xml:space="preserve"> build, where two of the twenty cells stay outside the unit interval and every absolute rate on that build carries a </w:t>
+        <w:t xml:space="preserve"> build, where two of the twenty cells stay outside the unit interval and every absolute rate carries a </w:t>
       </w:r>
       <w:r>
         <w:rPr>
@@ -15973,7 +15962,7 @@
           <w:i w:val="0"/>
           <w:sz w:val="20"/>
         </w:rPr>
-        <w:t xml:space="preserve"> (Appendices M.19.16, M.46(c)). </w:t>
+        <w:t xml:space="preserve"> (M.19.16, M.46(c)). </w:t>
       </w:r>
       <w:r>
         <w:rPr>
@@ -16067,7 +16056,7 @@
           <w:i w:val="0"/>
           <w:sz w:val="20"/>
         </w:rPr>
-        <w:t xml:space="preserve"> Only the sub-experiments explicitly marked as pre-registered had their criteria written before the data were examined — Appendix G.1 and G.2 list them with each criterion quoted as frozen. The rest are post hoc (including the choice of tiling level, weight set and aggregation convention), so both conventions and the weight-set range are reported wherever they diverge. </w:t>
+        <w:t xml:space="preserve"> Only the sub-experiments explicitly marked as pre-registered had their criteria written before the data were examined (Appendix G.1, G.2 quote each as frozen); the rest are post hoc, including the tiling level, weight set and aggregation convention, so both conventions and the weight-set range are reported wherever they diverge. </w:t>
       </w:r>
       <w:r>
         <w:rPr>
@@ -16128,7 +16117,7 @@
           <w:i w:val="0"/>
           <w:sz w:val="20"/>
         </w:rPr>
-        <w:t xml:space="preserve"> of counting error measurable and found that the dominant dense-scene failure is not directional but abstention; the contributions are therefore </w:t>
+        <w:t xml:space="preserve"> of counting error measurable and found that, for one anchor build under Chinese prompts and GT weighting, the dominant dense-scene failure is not directional but abstention; the contributions are therefore </w:t>
       </w:r>
       <w:r>
         <w:rPr>
@@ -16482,7 +16471,25 @@
           <w:i w:val="0"/>
           <w:sz w:val="20"/>
         </w:rPr>
-        <w:t>The image corpora are public datasets, cited above. The derived per-image prediction records, analysis scripts and run logs that reproduce every reported number are released or flagged at https://github.com/YBP2005/P3 (CC BY 4.0), with per-file MD5s.</w:t>
+        <w:t xml:space="preserve">The image corpora are public datasets, cited above. The derived per-image prediction records, analysis scripts and run logs that recompute the released aggregate numbers are released or flagged at https://github.com/YBP2005/P3 (CC BY 4.0), with per-file MD5s; the release-only gate and inputs absent from the package are in </w:t>
+      </w:r>
+      <w:r>
+        <w:rPr>
+          <w:rFonts w:ascii="Times New Roman" w:hAnsi="Times New Roman"/>
+          <w:b w:val="0"/>
+          <w:i/>
+          <w:sz w:val="20"/>
+        </w:rPr>
+        <w:t>README.md</w:t>
+      </w:r>
+      <w:r>
+        <w:rPr>
+          <w:rFonts w:ascii="Times New Roman" w:hAnsi="Times New Roman"/>
+          <w:b w:val="0"/>
+          <w:i w:val="0"/>
+          <w:sz w:val="20"/>
+        </w:rPr>
+        <w:t>.</w:t>
       </w:r>
     </w:p>
     <w:p>

</xml_diff>

<commit_message>
v0666: r18 landed — observable-vs-latent conclusion level (A0-2/V3-1/2/3, M.21.1/M.21.9/M.21.10/M.24/M.33), release-entry closure (n3 36/36 + fail-stop, adopt_report base-set denominator, M.35 unified exclusion set + row identity), per-call API records and driver released (V1-3); main text net 0 words (35 pp / 11,601 w)
</commit_message>
<xml_diff>
--- a/manuscript/PaperB_manuscript_PR_layout.docx
+++ b/manuscript/PaperB_manuscript_PR_layout.docx
@@ -13,7 +13,7 @@
           <w:i w:val="0"/>
           <w:sz w:val="24"/>
         </w:rPr>
-        <w:t>Abstention dominates the aggregate under-count on dense scenes for one anchor build and language: signed error direction in object counting with vision-language models</w:t>
+        <w:t>Answered-zero outputs dominate the aggregate under-count on dense scenes for one anchor build and language: signed error direction in object counting with vision-language models</w:t>
       </w:r>
     </w:p>
     <w:p>
@@ -52,7 +52,7 @@
           <w:i w:val="0"/>
           <w:sz w:val="20"/>
         </w:rPr>
-        <w:t xml:space="preserve">Evaluation reports symmetric magnitudes: 100 and 150 look alike. We treat the </w:t>
+        <w:t xml:space="preserve">Symmetric magnitudes look alike: a count of 100 and one of 150. We treat the </w:t>
       </w:r>
       <w:r>
         <w:rPr>
@@ -79,7 +79,7 @@
           <w:i w:val="0"/>
           <w:sz w:val="20"/>
         </w:rPr>
-        <w:t>two findings, plus the apparatus that makes them checkable</w:t>
+        <w:t>two findings plus the apparatus that makes them checkable</w:t>
       </w:r>
       <w:r>
         <w:rPr>
@@ -106,7 +106,7 @@
           <w:i w:val="0"/>
           <w:sz w:val="20"/>
         </w:rPr>
-        <w:t xml:space="preserve"> of abstention that separates suppressed abstention from a true zero, and the </w:t>
+        <w:t xml:space="preserve"> of abstention that separates a suppressed abstention from a true zero, and the </w:t>
       </w:r>
       <w:r>
         <w:rPr>
@@ -133,34 +133,34 @@
           <w:i w:val="0"/>
           <w:sz w:val="20"/>
         </w:rPr>
-        <w:t>one anchor build under Chinese prompts</w:t>
-      </w:r>
-      <w:r>
-        <w:rPr>
-          <w:rFonts w:ascii="Times New Roman" w:hAnsi="Times New Roman"/>
-          <w:b w:val="0"/>
-          <w:i w:val="0"/>
-          <w:sz w:val="20"/>
-        </w:rPr>
-        <w:t xml:space="preserve"> (§5.7, §8.2), the dominant dense-scene failure is </w:t>
-      </w:r>
-      <w:r>
-        <w:rPr>
-          <w:rFonts w:ascii="Times New Roman" w:hAnsi="Times New Roman"/>
-          <w:b/>
-          <w:i w:val="0"/>
-          <w:sz w:val="20"/>
-        </w:rPr>
-        <w:t>not underestimation but abstention</w:t>
-      </w:r>
-      <w:r>
-        <w:rPr>
-          <w:rFonts w:ascii="Times New Roman" w:hAnsi="Times New Roman"/>
-          <w:b w:val="0"/>
-          <w:i w:val="0"/>
-          <w:sz w:val="20"/>
-        </w:rPr>
-        <w:t xml:space="preserve"> — a literal "0" — accounting for </w:t>
+        <w:t>one anchor build under Chinese base prompts</w:t>
+      </w:r>
+      <w:r>
+        <w:rPr>
+          <w:rFonts w:ascii="Times New Roman" w:hAnsi="Times New Roman"/>
+          <w:b w:val="0"/>
+          <w:i w:val="0"/>
+          <w:sz w:val="20"/>
+        </w:rPr>
+        <w:t xml:space="preserve"> </w:t>
+      </w:r>
+      <w:r>
+        <w:rPr>
+          <w:rFonts w:ascii="Times New Roman" w:hAnsi="Times New Roman"/>
+          <w:b/>
+          <w:i w:val="0"/>
+          <w:sz w:val="20"/>
+        </w:rPr>
+        <w:t>answered-zero outputs</w:t>
+      </w:r>
+      <w:r>
+        <w:rPr>
+          <w:rFonts w:ascii="Times New Roman" w:hAnsi="Times New Roman"/>
+          <w:b w:val="0"/>
+          <w:i w:val="0"/>
+          <w:sz w:val="20"/>
+        </w:rPr>
+        <w:t xml:space="preserve"> account for </w:t>
       </w:r>
       <w:r>
         <w:rPr>
@@ -178,7 +178,7 @@
           <w:i w:val="0"/>
           <w:sz w:val="20"/>
         </w:rPr>
-        <w:t xml:space="preserve"> of the total under-count under ground-truth-weighted share on matched-annotation corpora (</w:t>
+        <w:t xml:space="preserve"> of the net under-count under ground-truth-weighted share (</w:t>
       </w:r>
       <w:r>
         <w:rPr>
@@ -196,25 +196,61 @@
           <w:i w:val="0"/>
           <w:sz w:val="20"/>
         </w:rPr>
-        <w:t xml:space="preserve">; the same abstention </w:t>
-      </w:r>
-      <w:r>
-        <w:rPr>
-          <w:rFonts w:ascii="Times New Roman" w:hAnsi="Times New Roman"/>
-          <w:b/>
-          <w:i w:val="0"/>
-          <w:sz w:val="20"/>
-        </w:rPr>
-        <w:t>rate</w:t>
-      </w:r>
-      <w:r>
-        <w:rPr>
-          <w:rFonts w:ascii="Times New Roman" w:hAnsi="Times New Roman"/>
-          <w:b w:val="0"/>
-          <w:i w:val="0"/>
-          <w:sz w:val="20"/>
-        </w:rPr>
-        <w:t xml:space="preserve"> under the </w:t>
+        <w:t xml:space="preserve">); contract interventions change </w:t>
+      </w:r>
+      <w:r>
+        <w:rPr>
+          <w:rFonts w:ascii="Times New Roman" w:hAnsi="Times New Roman"/>
+          <w:b/>
+          <w:i w:val="0"/>
+          <w:sz w:val="20"/>
+        </w:rPr>
+        <w:t>observable response channels</w:t>
+      </w:r>
+      <w:r>
+        <w:rPr>
+          <w:rFonts w:ascii="Times New Roman" w:hAnsi="Times New Roman"/>
+          <w:b w:val="0"/>
+          <w:i w:val="0"/>
+          <w:sz w:val="20"/>
+        </w:rPr>
+        <w:t xml:space="preserve">, not each base response's </w:t>
+      </w:r>
+      <w:r>
+        <w:rPr>
+          <w:rFonts w:ascii="Times New Roman" w:hAnsi="Times New Roman"/>
+          <w:b/>
+          <w:i w:val="0"/>
+          <w:sz w:val="20"/>
+        </w:rPr>
+        <w:t>latent state</w:t>
+      </w:r>
+      <w:r>
+        <w:rPr>
+          <w:rFonts w:ascii="Times New Roman" w:hAnsi="Times New Roman"/>
+          <w:b w:val="0"/>
+          <w:i w:val="0"/>
+          <w:sz w:val="20"/>
+        </w:rPr>
+        <w:t xml:space="preserve">; reading the zero contribution as abstention </w:t>
+      </w:r>
+      <w:r>
+        <w:rPr>
+          <w:rFonts w:ascii="Times New Roman" w:hAnsi="Times New Roman"/>
+          <w:b/>
+          <w:i w:val="0"/>
+          <w:sz w:val="20"/>
+        </w:rPr>
+        <w:t>requires channel purity and exhaustiveness</w:t>
+      </w:r>
+      <w:r>
+        <w:rPr>
+          <w:rFonts w:ascii="Times New Roman" w:hAnsi="Times New Roman"/>
+          <w:b w:val="0"/>
+          <w:i w:val="0"/>
+          <w:sz w:val="20"/>
+        </w:rPr>
+        <w:t xml:space="preserve">, and the </w:t>
       </w:r>
       <w:r>
         <w:rPr>
@@ -232,7 +268,7 @@
           <w:i w:val="0"/>
           <w:sz w:val="20"/>
         </w:rPr>
-        <w:t xml:space="preserve"> convention is </w:t>
+        <w:t xml:space="preserve"> convention gives </w:t>
       </w:r>
       <w:r>
         <w:rPr>
@@ -250,7 +286,7 @@
           <w:i w:val="0"/>
           <w:sz w:val="20"/>
         </w:rPr>
-        <w:t xml:space="preserve">); </w:t>
+        <w:t xml:space="preserve">. The </w:t>
       </w:r>
       <w:r>
         <w:rPr>
@@ -340,7 +376,7 @@
           <w:i w:val="0"/>
           <w:sz w:val="20"/>
         </w:rPr>
-        <w:t xml:space="preserve"> (§5.7, M.1). The gate is the </w:t>
+        <w:t xml:space="preserve"> (§5.7, M.1). The gate is </w:t>
       </w:r>
       <w:r>
         <w:rPr>
@@ -358,7 +394,7 @@
           <w:i w:val="0"/>
           <w:sz w:val="20"/>
         </w:rPr>
-        <w:t>, not enumeration demand (M.18). Abstention is a behaviour, not a capability ceiling: gated by legibility, removable by tiling (</w:t>
+        <w:t>, not demand. Abstention is a behaviour, not a capability ceiling: gated by legibility, removable by tiling (</w:t>
       </w:r>
       <w:r>
         <w:rPr>
@@ -376,7 +412,7 @@
           <w:i w:val="0"/>
           <w:sz w:val="20"/>
         </w:rPr>
-        <w:t xml:space="preserve"> on the anchor build) or, at a directional cost, by prompt relaxation (ρ: </w:t>
+        <w:t xml:space="preserve"> on the anchor build) or, at a directional cost, by prompt relaxation (</w:t>
       </w:r>
       <w:r>
         <w:rPr>
@@ -394,7 +430,7 @@
           <w:i w:val="0"/>
           <w:sz w:val="20"/>
         </w:rPr>
-        <w:t xml:space="preserve">). Span of the direction is a property of implementation × training domain × data domain × protocol, not of a paradigm — </w:t>
+        <w:t xml:space="preserve">). Direction span is a property of implementation × training domain × data domain × protocol, not a paradigm — </w:t>
       </w:r>
       <w:r>
         <w:rPr>
@@ -412,7 +448,25 @@
           <w:i w:val="0"/>
           <w:sz w:val="20"/>
         </w:rPr>
-        <w:t xml:space="preserve"> across official implementations (DM-Count </w:t>
+        <w:t xml:space="preserve"> across implementations under a </w:t>
+      </w:r>
+      <w:r>
+        <w:rPr>
+          <w:rFonts w:ascii="Times New Roman" w:hAnsi="Times New Roman"/>
+          <w:b/>
+          <w:i w:val="0"/>
+          <w:sz w:val="20"/>
+        </w:rPr>
+        <w:t>shared</w:t>
+      </w:r>
+      <w:r>
+        <w:rPr>
+          <w:rFonts w:ascii="Times New Roman" w:hAnsi="Times New Roman"/>
+          <w:b w:val="0"/>
+          <w:i w:val="0"/>
+          <w:sz w:val="20"/>
+        </w:rPr>
+        <w:t xml:space="preserve"> protocol (DM-Count </w:t>
       </w:r>
       <w:r>
         <w:rPr>
@@ -448,7 +502,7 @@
           <w:i w:val="0"/>
           <w:sz w:val="20"/>
         </w:rPr>
-        <w:t xml:space="preserve">, same protocol), </w:t>
+        <w:t xml:space="preserve">), </w:t>
       </w:r>
       <w:r>
         <w:rPr>
@@ -718,7 +772,7 @@
           <w:i w:val="0"/>
           <w:sz w:val="20"/>
         </w:rPr>
-        <w:t xml:space="preserve">. Under a ground-truth-weighted convention on one anchor build, answering 0 accounts for </w:t>
+        <w:t xml:space="preserve">. Under a ground-truth-weighted convention on one anchor build, answered-zero outputs account for </w:t>
       </w:r>
       <w:r>
         <w:rPr>
@@ -736,7 +790,7 @@
           <w:i w:val="0"/>
           <w:sz w:val="20"/>
         </w:rPr>
-        <w:t xml:space="preserve"> of the total under-count (</w:t>
+        <w:t xml:space="preserve"> of the net under-count (</w:t>
       </w:r>
       <w:r>
         <w:rPr>
@@ -754,97 +808,7 @@
           <w:i w:val="0"/>
           <w:sz w:val="20"/>
         </w:rPr>
-        <w:t xml:space="preserve">; over all arms and domains it spans </w:t>
-      </w:r>
-      <w:r>
-        <w:rPr>
-          <w:rFonts w:ascii="Times New Roman" w:hAnsi="Times New Roman"/>
-          <w:b/>
-          <w:i w:val="0"/>
-          <w:sz w:val="20"/>
-        </w:rPr>
-        <w:t>0–99.4%</w:t>
-      </w:r>
-      <w:r>
-        <w:rPr>
-          <w:rFonts w:ascii="Times New Roman" w:hAnsi="Times New Roman"/>
-          <w:b w:val="0"/>
-          <w:i w:val="0"/>
-          <w:sz w:val="20"/>
-        </w:rPr>
-        <w:t xml:space="preserve"> — </w:t>
-      </w:r>
-      <w:r>
-        <w:rPr>
-          <w:rFonts w:ascii="Times New Roman" w:hAnsi="Times New Roman"/>
-          <w:b/>
-          <w:i w:val="0"/>
-          <w:sz w:val="20"/>
-        </w:rPr>
-        <w:t>0%</w:t>
-      </w:r>
-      <w:r>
-        <w:rPr>
-          <w:rFonts w:ascii="Times New Roman" w:hAnsi="Times New Roman"/>
-          <w:b w:val="0"/>
-          <w:i w:val="0"/>
-          <w:sz w:val="20"/>
-        </w:rPr>
-        <w:t xml:space="preserve"> on the </w:t>
-      </w:r>
-      <w:r>
-        <w:rPr>
-          <w:rFonts w:ascii="Times New Roman" w:hAnsi="Times New Roman"/>
-          <w:b w:val="0"/>
-          <w:i/>
-          <w:sz w:val="20"/>
-        </w:rPr>
-        <w:t>over</w:t>
-      </w:r>
-      <w:r>
-        <w:rPr>
-          <w:rFonts w:ascii="Times New Roman" w:hAnsi="Times New Roman"/>
-          <w:b w:val="0"/>
-          <w:i w:val="0"/>
-          <w:sz w:val="20"/>
-        </w:rPr>
-        <w:t xml:space="preserve"> arm and </w:t>
-      </w:r>
-      <w:r>
-        <w:rPr>
-          <w:rFonts w:ascii="Times New Roman" w:hAnsi="Times New Roman"/>
-          <w:b/>
-          <w:i w:val="0"/>
-          <w:sz w:val="20"/>
-        </w:rPr>
-        <w:t>99.4%</w:t>
-      </w:r>
-      <w:r>
-        <w:rPr>
-          <w:rFonts w:ascii="Times New Roman" w:hAnsi="Times New Roman"/>
-          <w:b w:val="0"/>
-          <w:i w:val="0"/>
-          <w:sz w:val="20"/>
-        </w:rPr>
-        <w:t xml:space="preserve"> on ShanghaiTech-A under the </w:t>
-      </w:r>
-      <w:r>
-        <w:rPr>
-          <w:rFonts w:ascii="Times New Roman" w:hAnsi="Times New Roman"/>
-          <w:b w:val="0"/>
-          <w:i/>
-          <w:sz w:val="20"/>
-        </w:rPr>
-        <w:t>under</w:t>
-      </w:r>
-      <w:r>
-        <w:rPr>
-          <w:rFonts w:ascii="Times New Roman" w:hAnsi="Times New Roman"/>
-          <w:b w:val="0"/>
-          <w:i w:val="0"/>
-          <w:sz w:val="20"/>
-        </w:rPr>
-        <w:t xml:space="preserve"> arm (Appendix J.1); the </w:t>
+        <w:t xml:space="preserve">; the full range over arms and domains is in Appendix J.1); the </w:t>
       </w:r>
       <w:r>
         <w:rPr>
@@ -1248,61 +1212,7 @@
           <w:i w:val="0"/>
           <w:sz w:val="20"/>
         </w:rPr>
-        <w:t xml:space="preserve">: on count-controlled grids, arrangement and blur alone drive abstention from 0% to 90%, while on clean synthetic dots the base arm never abstains yet still underestimates by </w:t>
-      </w:r>
-      <w:r>
-        <w:rPr>
-          <w:rFonts w:ascii="Times New Roman" w:hAnsi="Times New Roman"/>
-          <w:b/>
-          <w:i w:val="0"/>
-          <w:sz w:val="20"/>
-        </w:rPr>
-        <w:t>up to 50%</w:t>
-      </w:r>
-      <w:r>
-        <w:rPr>
-          <w:rFonts w:ascii="Times New Roman" w:hAnsi="Times New Roman"/>
-          <w:b w:val="0"/>
-          <w:i w:val="0"/>
-          <w:sz w:val="20"/>
-        </w:rPr>
-        <w:t xml:space="preserve">, and in microscopy it is </w:t>
-      </w:r>
-      <w:r>
-        <w:rPr>
-          <w:rFonts w:ascii="Times New Roman" w:hAnsi="Times New Roman"/>
-          <w:b/>
-          <w:i w:val="0"/>
-          <w:sz w:val="20"/>
-        </w:rPr>
-        <w:t>0.0%</w:t>
-      </w:r>
-      <w:r>
-        <w:rPr>
-          <w:rFonts w:ascii="Times New Roman" w:hAnsi="Times New Roman"/>
-          <w:b w:val="0"/>
-          <w:i w:val="0"/>
-          <w:sz w:val="20"/>
-        </w:rPr>
-        <w:t xml:space="preserve"> with a bias of </w:t>
-      </w:r>
-      <w:r>
-        <w:rPr>
-          <w:rFonts w:ascii="Times New Roman" w:hAnsi="Times New Roman"/>
-          <w:b/>
-          <w:i w:val="0"/>
-          <w:sz w:val="20"/>
-        </w:rPr>
-        <w:t>−50.1%</w:t>
-      </w:r>
-      <w:r>
-        <w:rPr>
-          <w:rFonts w:ascii="Times New Roman" w:hAnsi="Times New Roman"/>
-          <w:b w:val="0"/>
-          <w:i w:val="0"/>
-          <w:sz w:val="20"/>
-        </w:rPr>
-        <w:t xml:space="preserve"> (§5.6, §5.7).</w:t>
+        <w:t>: on count-controlled grids arrangement and blur alone drive abstention to 90%, while on clean synthetic dots the same base arm neither abstains nor becomes directionally accurate (§5.6, §5.7).</w:t>
       </w:r>
     </w:p>
     <w:p>
@@ -1707,25 +1617,7 @@
           <w:i w:val="0"/>
           <w:sz w:val="20"/>
         </w:rPr>
-        <w:t xml:space="preserve"> are (median retention </w:t>
-      </w:r>
-      <w:r>
-        <w:rPr>
-          <w:rFonts w:ascii="Times New Roman" w:hAnsi="Times New Roman"/>
-          <w:b/>
-          <w:i w:val="0"/>
-          <w:sz w:val="20"/>
-        </w:rPr>
-        <w:t>0.51–0.67</w:t>
-      </w:r>
-      <w:r>
-        <w:rPr>
-          <w:rFonts w:ascii="Times New Roman" w:hAnsi="Times New Roman"/>
-          <w:b w:val="0"/>
-          <w:i w:val="0"/>
-          <w:sz w:val="20"/>
-        </w:rPr>
-        <w:t xml:space="preserve"> under random thinning; F.10). What is </w:t>
+        <w:t xml:space="preserve"> are. What is </w:t>
       </w:r>
       <w:r>
         <w:rPr>
@@ -1761,7 +1653,7 @@
           <w:i w:val="0"/>
           <w:sz w:val="20"/>
         </w:rPr>
-        <w:t xml:space="preserve">, below our own noise floor (2.15–6.46 pp) and below the smallest attainable corrected p of that test, so we report a </w:t>
+        <w:t xml:space="preserve">, below our own noise floor, so we report a </w:t>
       </w:r>
       <w:r>
         <w:rPr>
@@ -1997,79 +1889,7 @@
           <w:i w:val="0"/>
           <w:sz w:val="20"/>
         </w:rPr>
-        <w:t xml:space="preserve"> claim stays bounded: the corpus is dominated by one lineage (§8.2), the dense-scene headline is </w:t>
-      </w:r>
-      <w:r>
-        <w:rPr>
-          <w:rFonts w:ascii="Times New Roman" w:hAnsi="Times New Roman"/>
-          <w:b/>
-          <w:i w:val="0"/>
-          <w:sz w:val="20"/>
-        </w:rPr>
-        <w:t>build-specific</w:t>
-      </w:r>
-      <w:r>
-        <w:rPr>
-          <w:rFonts w:ascii="Times New Roman" w:hAnsi="Times New Roman"/>
-          <w:b w:val="0"/>
-          <w:i w:val="0"/>
-          <w:sz w:val="20"/>
-        </w:rPr>
-        <w:t xml:space="preserve"> (five deployments of one 32B checkpoint differ by up to </w:t>
-      </w:r>
-      <w:r>
-        <w:rPr>
-          <w:rFonts w:ascii="Times New Roman" w:hAnsi="Times New Roman"/>
-          <w:b/>
-          <w:i w:val="0"/>
-          <w:sz w:val="20"/>
-        </w:rPr>
-        <w:t>90.3 pp</w:t>
-      </w:r>
-      <w:r>
-        <w:rPr>
-          <w:rFonts w:ascii="Times New Roman" w:hAnsi="Times New Roman"/>
-          <w:b w:val="0"/>
-          <w:i w:val="0"/>
-          <w:sz w:val="20"/>
-        </w:rPr>
-        <w:t xml:space="preserve">, and on the cross-family grid the share exceeds 50% only at the two precisions of the defining checkpoint; M.19.15) and the aerial-scene one </w:t>
-      </w:r>
-      <w:r>
-        <w:rPr>
-          <w:rFonts w:ascii="Times New Roman" w:hAnsi="Times New Roman"/>
-          <w:b/>
-          <w:i w:val="0"/>
-          <w:sz w:val="20"/>
-        </w:rPr>
-        <w:t>domain-specific</w:t>
-      </w:r>
-      <w:r>
-        <w:rPr>
-          <w:rFonts w:ascii="Times New Roman" w:hAnsi="Times New Roman"/>
-          <w:b w:val="0"/>
-          <w:i w:val="0"/>
-          <w:sz w:val="20"/>
-        </w:rPr>
-        <w:t xml:space="preserve"> (</w:t>
-      </w:r>
-      <w:r>
-        <w:rPr>
-          <w:rFonts w:ascii="Times New Roman" w:hAnsi="Times New Roman"/>
-          <w:b/>
-          <w:i w:val="0"/>
-          <w:sz w:val="20"/>
-        </w:rPr>
-        <w:t>2.7–8.7 pp</w:t>
-      </w:r>
-      <w:r>
-        <w:rPr>
-          <w:rFonts w:ascii="Times New Roman" w:hAnsi="Times New Roman"/>
-          <w:b w:val="0"/>
-          <w:i w:val="0"/>
-          <w:sz w:val="20"/>
-        </w:rPr>
-        <w:t xml:space="preserve"> across the same five; M.18.4, M.18.8).</w:t>
+        <w:t xml:space="preserve"> claim stays bounded by lineage, build and domain; the per-cell bounds are stated in §8.2 and Appendices M.18–M.19.</w:t>
       </w:r>
     </w:p>
     <w:p>
@@ -11466,7 +11286,7 @@
           <w:i w:val="0"/>
           <w:sz w:val="20"/>
         </w:rPr>
-        <w:t xml:space="preserve">, read </w:t>
+        <w:t xml:space="preserve">. This </w:t>
       </w:r>
       <w:r>
         <w:rPr>
@@ -11484,7 +11304,7 @@
           <w:i w:val="0"/>
           <w:sz w:val="20"/>
         </w:rPr>
-        <w:t>: its queried class need not match our prompt's phrasing, so the readings below bound rather than estimate the contract effect:</w:t>
+        <w:t xml:space="preserve"> panel measures responses to a fixed people-counting prompt on FSC-147 images; since that target need not match the annotated category, these results give no standard FSC-147 counting accuracy and no implicit abstention, so the readings we give bound the contract effect and do not estimate it, and target-matched results need separate evaluation on those images:</w:t>
       </w:r>
     </w:p>
     <w:p>
@@ -12753,18 +12573,16 @@
           <w:i w:val="0"/>
           <w:sz w:val="20"/>
         </w:rPr>
-        <w:t xml:space="preserve"> (full verdicts and per-family numbers: Appendix M.31.2–M.31.4).</w:t>
-      </w:r>
-    </w:p>
-    <w:p>
-      <w:r>
-        <w:rPr>
-          <w:rFonts w:ascii="Times New Roman" w:hAnsi="Times New Roman"/>
-          <w:b/>
-          <w:i w:val="0"/>
-          <w:sz w:val="20"/>
-        </w:rPr>
-        <w:t>On hosted endpoints the abstention is latent, not absent.</w:t>
+        <w:t xml:space="preserve"> (full verdicts and per-family numbers: Appendix M.31.2–M.31.4). </w:t>
+      </w:r>
+      <w:r>
+        <w:rPr>
+          <w:rFonts w:ascii="Times New Roman" w:hAnsi="Times New Roman"/>
+          <w:b/>
+          <w:i w:val="0"/>
+          <w:sz w:val="20"/>
+        </w:rPr>
+        <w:t>On hosted endpoints the zero answer is contract-dependent, not absent.</w:t>
       </w:r>
       <w:r>
         <w:rPr>
@@ -12881,7 +12699,25 @@
           <w:i w:val="0"/>
           <w:sz w:val="20"/>
         </w:rPr>
-        <w:t>). The failure that open families express as a zero is present in frontier hosted models too; only its expression differs.</w:t>
+        <w:t xml:space="preserve">). An observable zero answer can therefore be removed by the contract here too; whether the same latent state underlies it is </w:t>
+      </w:r>
+      <w:r>
+        <w:rPr>
+          <w:rFonts w:ascii="Times New Roman" w:hAnsi="Times New Roman"/>
+          <w:b/>
+          <w:i w:val="0"/>
+          <w:sz w:val="20"/>
+        </w:rPr>
+        <w:t>not identified</w:t>
+      </w:r>
+      <w:r>
+        <w:rPr>
+          <w:rFonts w:ascii="Times New Roman" w:hAnsi="Times New Roman"/>
+          <w:b w:val="0"/>
+          <w:i w:val="0"/>
+          <w:sz w:val="20"/>
+        </w:rPr>
+        <w:t>.</w:t>
       </w:r>
     </w:p>
     <w:p>
@@ -13387,7 +13223,331 @@
           <w:i w:val="0"/>
           <w:sz w:val="20"/>
         </w:rPr>
-        <w:t xml:space="preserve">) lies below it. For the split </w:t>
+        <w:t xml:space="preserve">) lies below it, so </w:t>
+      </w:r>
+      <w:r>
+        <w:rPr>
+          <w:rFonts w:ascii="Times New Roman" w:hAnsi="Times New Roman"/>
+          <w:b/>
+          <w:i w:val="0"/>
+          <w:sz w:val="20"/>
+        </w:rPr>
+        <w:t>no gap whatsoever would be certified by this test</w:t>
+      </w:r>
+      <w:r>
+        <w:rPr>
+          <w:rFonts w:ascii="Times New Roman" w:hAnsi="Times New Roman"/>
+          <w:b w:val="0"/>
+          <w:i w:val="0"/>
+          <w:sz w:val="20"/>
+        </w:rPr>
+        <w:t xml:space="preserve">; a 5-vs-5 split would need </w:t>
+      </w:r>
+      <w:r>
+        <w:rPr>
+          <w:rFonts w:ascii="Times New Roman" w:hAnsi="Times New Roman"/>
+          <w:b/>
+          <w:i w:val="0"/>
+          <w:sz w:val="20"/>
+        </w:rPr>
+        <w:t>6.5 pp</w:t>
+      </w:r>
+      <w:r>
+        <w:rPr>
+          <w:rFonts w:ascii="Times New Roman" w:hAnsi="Times New Roman"/>
+          <w:b w:val="0"/>
+          <w:i w:val="0"/>
+          <w:sz w:val="20"/>
+        </w:rPr>
+        <w:t xml:space="preserve"> for 80% power. </w:t>
+      </w:r>
+      <w:r>
+        <w:rPr>
+          <w:rFonts w:ascii="Times New Roman" w:hAnsi="Times New Roman"/>
+          <w:b/>
+          <w:i w:val="0"/>
+          <w:sz w:val="20"/>
+        </w:rPr>
+        <w:t>We therefore do not claim a separable structure</w:t>
+      </w:r>
+      <w:r>
+        <w:rPr>
+          <w:rFonts w:ascii="Times New Roman" w:hAnsi="Times New Roman"/>
+          <w:b w:val="0"/>
+          <w:i w:val="0"/>
+          <w:sz w:val="20"/>
+        </w:rPr>
+        <w:t xml:space="preserve">; what the design supports is the </w:t>
+      </w:r>
+      <w:r>
+        <w:rPr>
+          <w:rFonts w:ascii="Times New Roman" w:hAnsi="Times New Roman"/>
+          <w:b/>
+          <w:i w:val="0"/>
+          <w:sz w:val="20"/>
+        </w:rPr>
+        <w:t>ordering</w:t>
+      </w:r>
+      <w:r>
+        <w:rPr>
+          <w:rFonts w:ascii="Times New Roman" w:hAnsi="Times New Roman"/>
+          <w:b w:val="0"/>
+          <w:i w:val="0"/>
+          <w:sz w:val="20"/>
+        </w:rPr>
+        <w:t xml:space="preserve">, specifically under the </w:t>
+      </w:r>
+      <w:r>
+        <w:rPr>
+          <w:rFonts w:ascii="Times New Roman" w:hAnsi="Times New Roman"/>
+          <w:b/>
+          <w:i w:val="0"/>
+          <w:sz w:val="20"/>
+        </w:rPr>
+        <w:t>pooled relative deviation</w:t>
+      </w:r>
+      <w:r>
+        <w:rPr>
+          <w:rFonts w:ascii="Times New Roman" w:hAnsi="Times New Roman"/>
+          <w:b w:val="0"/>
+          <w:i w:val="0"/>
+          <w:sz w:val="20"/>
+        </w:rPr>
+        <w:t xml:space="preserve"> (Appendix F.7, M.37). </w:t>
+      </w:r>
+      <w:r>
+        <w:rPr>
+          <w:rFonts w:ascii="Times New Roman" w:hAnsi="Times New Roman"/>
+          <w:b/>
+          <w:i w:val="0"/>
+          <w:sz w:val="20"/>
+        </w:rPr>
+        <w:t>The ordering is stable under the two obvious deflations, with intervals.</w:t>
+      </w:r>
+      <w:r>
+        <w:rPr>
+          <w:rFonts w:ascii="Times New Roman" w:hAnsi="Times New Roman"/>
+          <w:b w:val="0"/>
+          <w:i w:val="0"/>
+          <w:sz w:val="20"/>
+        </w:rPr>
+        <w:t xml:space="preserve"> Re-estimated on a </w:t>
+      </w:r>
+      <w:r>
+        <w:rPr>
+          <w:rFonts w:ascii="Times New Roman" w:hAnsi="Times New Roman"/>
+          <w:b/>
+          <w:i w:val="0"/>
+          <w:sz w:val="20"/>
+        </w:rPr>
+        <w:t>common level count</w:t>
+      </w:r>
+      <w:r>
+        <w:rPr>
+          <w:rFonts w:ascii="Times New Roman" w:hAnsi="Times New Roman"/>
+          <w:b w:val="0"/>
+          <w:i w:val="0"/>
+          <w:sz w:val="20"/>
+        </w:rPr>
+        <w:t xml:space="preserve"> with each ladder's extreme level removed, it still comes out at Spearman </w:t>
+      </w:r>
+      <w:r>
+        <w:rPr>
+          <w:rFonts w:ascii="Times New Roman" w:hAnsi="Times New Roman"/>
+          <w:b/>
+          <w:i w:val="0"/>
+          <w:sz w:val="20"/>
+        </w:rPr>
+        <w:t>0.999 / 0.981 / 0.991</w:t>
+      </w:r>
+      <w:r>
+        <w:rPr>
+          <w:rFonts w:ascii="Times New Roman" w:hAnsi="Times New Roman"/>
+          <w:b w:val="0"/>
+          <w:i w:val="0"/>
+          <w:sz w:val="20"/>
+        </w:rPr>
+        <w:t xml:space="preserve"> over 24 (knob × domain) units, and at </w:t>
+      </w:r>
+      <w:r>
+        <w:rPr>
+          <w:rFonts w:ascii="Times New Roman" w:hAnsi="Times New Roman"/>
+          <w:b/>
+          <w:i w:val="0"/>
+          <w:sz w:val="20"/>
+        </w:rPr>
+        <w:t>0.983 / 0.987 / 0.983</w:t>
+      </w:r>
+      <w:r>
+        <w:rPr>
+          <w:rFonts w:ascii="Times New Roman" w:hAnsi="Times New Roman"/>
+          <w:b w:val="0"/>
+          <w:i w:val="0"/>
+          <w:sz w:val="20"/>
+        </w:rPr>
+        <w:t xml:space="preserve"> on a </w:t>
+      </w:r>
+      <w:r>
+        <w:rPr>
+          <w:rFonts w:ascii="Times New Roman" w:hAnsi="Times New Roman"/>
+          <w:b/>
+          <w:i w:val="0"/>
+          <w:sz w:val="20"/>
+        </w:rPr>
+        <w:t>fully recomputable</w:t>
+      </w:r>
+      <w:r>
+        <w:rPr>
+          <w:rFonts w:ascii="Times New Roman" w:hAnsi="Times New Roman"/>
+          <w:b w:val="0"/>
+          <w:i w:val="0"/>
+          <w:sz w:val="20"/>
+        </w:rPr>
+        <w:t xml:space="preserve"> unit set at the same level count (31 units; Appendix M.37). A bootstrap that resamples whole units puts it at </w:t>
+      </w:r>
+      <w:r>
+        <w:rPr>
+          <w:rFonts w:ascii="Times New Roman" w:hAnsi="Times New Roman"/>
+          <w:b/>
+          <w:i w:val="0"/>
+          <w:sz w:val="20"/>
+        </w:rPr>
+        <w:t>0.943–0.996</w:t>
+      </w:r>
+      <w:r>
+        <w:rPr>
+          <w:rFonts w:ascii="Times New Roman" w:hAnsi="Times New Roman"/>
+          <w:b w:val="0"/>
+          <w:i w:val="0"/>
+          <w:sz w:val="20"/>
+        </w:rPr>
+        <w:t xml:space="preserve"> (31 units) and </w:t>
+      </w:r>
+      <w:r>
+        <w:rPr>
+          <w:rFonts w:ascii="Times New Roman" w:hAnsi="Times New Roman"/>
+          <w:b/>
+          <w:i w:val="0"/>
+          <w:sz w:val="20"/>
+        </w:rPr>
+        <w:t>0.834–0.984</w:t>
+      </w:r>
+      <w:r>
+        <w:rPr>
+          <w:rFonts w:ascii="Times New Roman" w:hAnsi="Times New Roman"/>
+          <w:b w:val="0"/>
+          <w:i w:val="0"/>
+          <w:sz w:val="20"/>
+        </w:rPr>
+        <w:t xml:space="preserve"> (36 units, k=3), and </w:t>
+      </w:r>
+      <w:r>
+        <w:rPr>
+          <w:rFonts w:ascii="Times New Roman" w:hAnsi="Times New Roman"/>
+          <w:b/>
+          <w:i w:val="0"/>
+          <w:sz w:val="20"/>
+        </w:rPr>
+        <w:t>clustering by knob gives 0.913–0.994</w:t>
+      </w:r>
+      <w:r>
+        <w:rPr>
+          <w:rFonts w:ascii="Times New Roman" w:hAnsi="Times New Roman"/>
+          <w:b w:val="0"/>
+          <w:i w:val="0"/>
+          <w:sz w:val="20"/>
+        </w:rPr>
+        <w:t xml:space="preserve">, while the wider resampling gives </w:t>
+      </w:r>
+      <w:r>
+        <w:rPr>
+          <w:rFonts w:ascii="Times New Roman" w:hAnsi="Times New Roman"/>
+          <w:b/>
+          <w:i w:val="0"/>
+          <w:sz w:val="20"/>
+        </w:rPr>
+        <w:t>0.711–0.998</w:t>
+      </w:r>
+      <w:r>
+        <w:rPr>
+          <w:rFonts w:ascii="Times New Roman" w:hAnsi="Times New Roman"/>
+          <w:b w:val="0"/>
+          <w:i w:val="0"/>
+          <w:sz w:val="20"/>
+        </w:rPr>
+        <w:t>; a label-permutation test gives p&lt;5×10^-5; leaving out any single knob (</w:t>
+      </w:r>
+      <w:r>
+        <w:rPr>
+          <w:rFonts w:ascii="Times New Roman" w:hAnsi="Times New Roman"/>
+          <w:b/>
+          <w:i w:val="0"/>
+          <w:sz w:val="20"/>
+        </w:rPr>
+        <w:t>36</w:t>
+      </w:r>
+      <w:r>
+        <w:rPr>
+          <w:rFonts w:ascii="Times New Roman" w:hAnsi="Times New Roman"/>
+          <w:b w:val="0"/>
+          <w:i w:val="0"/>
+          <w:sz w:val="20"/>
+        </w:rPr>
+        <w:t xml:space="preserve"> units) keeps it at </w:t>
+      </w:r>
+      <w:r>
+        <w:rPr>
+          <w:rFonts w:ascii="Times New Roman" w:hAnsi="Times New Roman"/>
+          <w:b/>
+          <w:i w:val="0"/>
+          <w:sz w:val="20"/>
+        </w:rPr>
+        <w:t>0.883–0.970</w:t>
+      </w:r>
+      <w:r>
+        <w:rPr>
+          <w:rFonts w:ascii="Times New Roman" w:hAnsi="Times New Roman"/>
+          <w:b w:val="0"/>
+          <w:i w:val="0"/>
+          <w:sz w:val="20"/>
+        </w:rPr>
+        <w:t xml:space="preserve">; per-unit spans with caliber intervals are plotted in </w:t>
+      </w:r>
+      <w:r>
+        <w:rPr>
+          <w:rFonts w:ascii="Times New Roman" w:hAnsi="Times New Roman"/>
+          <w:b/>
+          <w:i w:val="0"/>
+          <w:sz w:val="20"/>
+        </w:rPr>
+        <w:t>Fig. F.17</w:t>
+      </w:r>
+      <w:r>
+        <w:rPr>
+          <w:rFonts w:ascii="Times New Roman" w:hAnsi="Times New Roman"/>
+          <w:b w:val="0"/>
+          <w:i w:val="0"/>
+          <w:sz w:val="20"/>
+        </w:rPr>
+        <w:t xml:space="preserve"> (Appendix F.12). It also comes out </w:t>
+      </w:r>
+      <w:r>
+        <w:rPr>
+          <w:rFonts w:ascii="Times New Roman" w:hAnsi="Times New Roman"/>
+          <w:b/>
+          <w:i w:val="0"/>
+          <w:sz w:val="20"/>
+        </w:rPr>
+        <w:t>exactly</w:t>
+      </w:r>
+      <w:r>
+        <w:rPr>
+          <w:rFonts w:ascii="Times New Roman" w:hAnsi="Times New Roman"/>
+          <w:b w:val="0"/>
+          <w:i w:val="0"/>
+          <w:sz w:val="20"/>
+        </w:rPr>
+        <w:t xml:space="preserve"> the same under shared affine calibration (Proposition 5: </w:t>
       </w:r>
       <w:r>
         <w:rPr>
@@ -13396,396 +13556,214 @@
           <w:i/>
           <w:sz w:val="20"/>
         </w:rPr>
-        <w:t>as observed</w:t>
-      </w:r>
-      <w:r>
-        <w:rPr>
-          <w:rFonts w:ascii="Times New Roman" w:hAnsi="Times New Roman"/>
-          <w:b w:val="0"/>
-          <w:i w:val="0"/>
-          <w:sz w:val="20"/>
-        </w:rPr>
-        <w:t xml:space="preserve"> (</w:t>
-      </w:r>
-      <w:r>
-        <w:rPr>
-          <w:rFonts w:ascii="Times New Roman" w:hAnsi="Times New Roman"/>
-          <w:b/>
-          <w:i w:val="0"/>
-          <w:sz w:val="20"/>
-        </w:rPr>
-        <w:t>3 vs 7</w:t>
-      </w:r>
-      <w:r>
-        <w:rPr>
-          <w:rFonts w:ascii="Times New Roman" w:hAnsi="Times New Roman"/>
-          <w:b w:val="0"/>
-          <w:i w:val="0"/>
-          <w:sz w:val="20"/>
-        </w:rPr>
-        <w:t xml:space="preserve">) the nine enumerated split points span only </w:t>
-      </w:r>
-      <w:r>
-        <w:rPr>
-          <w:rFonts w:ascii="Times New Roman" w:hAnsi="Times New Roman"/>
-          <w:b/>
-          <w:i w:val="0"/>
-          <w:sz w:val="20"/>
-        </w:rPr>
-        <w:t>120</w:t>
-      </w:r>
-      <w:r>
-        <w:rPr>
-          <w:rFonts w:ascii="Times New Roman" w:hAnsi="Times New Roman"/>
-          <w:b w:val="0"/>
-          <w:i w:val="0"/>
-          <w:sz w:val="20"/>
-        </w:rPr>
-        <w:t xml:space="preserve"> assignments, so the </w:t>
-      </w:r>
-      <w:r>
-        <w:rPr>
-          <w:rFonts w:ascii="Times New Roman" w:hAnsi="Times New Roman"/>
-          <w:b/>
-          <w:i w:val="0"/>
-          <w:sz w:val="20"/>
-        </w:rPr>
-        <w:t>smallest attainable corrected p is 0.075</w:t>
-      </w:r>
-      <w:r>
-        <w:rPr>
-          <w:rFonts w:ascii="Times New Roman" w:hAnsi="Times New Roman"/>
-          <w:b w:val="0"/>
-          <w:i w:val="0"/>
-          <w:sz w:val="20"/>
-        </w:rPr>
-        <w:t xml:space="preserve"> — </w:t>
-      </w:r>
-      <w:r>
-        <w:rPr>
-          <w:rFonts w:ascii="Times New Roman" w:hAnsi="Times New Roman"/>
-          <w:b/>
-          <w:i w:val="0"/>
-          <w:sz w:val="20"/>
-        </w:rPr>
-        <w:t>no gap whatsoever would be certified by this test</w:t>
-      </w:r>
-      <w:r>
-        <w:rPr>
-          <w:rFonts w:ascii="Times New Roman" w:hAnsi="Times New Roman"/>
-          <w:b w:val="0"/>
-          <w:i w:val="0"/>
-          <w:sz w:val="20"/>
-        </w:rPr>
-        <w:t xml:space="preserve">; a 5-vs-5 split would need </w:t>
-      </w:r>
-      <w:r>
-        <w:rPr>
-          <w:rFonts w:ascii="Times New Roman" w:hAnsi="Times New Roman"/>
-          <w:b/>
-          <w:i w:val="0"/>
-          <w:sz w:val="20"/>
-        </w:rPr>
-        <w:t>6.5 pp</w:t>
-      </w:r>
-      <w:r>
-        <w:rPr>
-          <w:rFonts w:ascii="Times New Roman" w:hAnsi="Times New Roman"/>
-          <w:b w:val="0"/>
-          <w:i w:val="0"/>
-          <w:sz w:val="20"/>
-        </w:rPr>
-        <w:t xml:space="preserve"> for 80% power. </w:t>
-      </w:r>
-      <w:r>
-        <w:rPr>
-          <w:rFonts w:ascii="Times New Roman" w:hAnsi="Times New Roman"/>
-          <w:b/>
-          <w:i w:val="0"/>
-          <w:sz w:val="20"/>
-        </w:rPr>
-        <w:t>We therefore do not claim a separable structure</w:t>
-      </w:r>
-      <w:r>
-        <w:rPr>
-          <w:rFonts w:ascii="Times New Roman" w:hAnsi="Times New Roman"/>
-          <w:b w:val="0"/>
-          <w:i w:val="0"/>
-          <w:sz w:val="20"/>
-        </w:rPr>
-        <w:t xml:space="preserve"> and report the 1.6 pp gap for completeness only; what the design supports is the </w:t>
-      </w:r>
-      <w:r>
-        <w:rPr>
-          <w:rFonts w:ascii="Times New Roman" w:hAnsi="Times New Roman"/>
-          <w:b/>
-          <w:i w:val="0"/>
-          <w:sz w:val="20"/>
-        </w:rPr>
-        <w:t>ordering</w:t>
-      </w:r>
-      <w:r>
-        <w:rPr>
-          <w:rFonts w:ascii="Times New Roman" w:hAnsi="Times New Roman"/>
-          <w:b w:val="0"/>
-          <w:i w:val="0"/>
-          <w:sz w:val="20"/>
-        </w:rPr>
-        <w:t xml:space="preserve">, specifically under the </w:t>
-      </w:r>
-      <w:r>
-        <w:rPr>
-          <w:rFonts w:ascii="Times New Roman" w:hAnsi="Times New Roman"/>
-          <w:b/>
-          <w:i w:val="0"/>
-          <w:sz w:val="20"/>
-        </w:rPr>
-        <w:t>pooled relative deviation</w:t>
-      </w:r>
-      <w:r>
-        <w:rPr>
-          <w:rFonts w:ascii="Times New Roman" w:hAnsi="Times New Roman"/>
-          <w:b w:val="0"/>
-          <w:i w:val="0"/>
-          <w:sz w:val="20"/>
-        </w:rPr>
-        <w:t xml:space="preserve"> (Appendix F.7, M.37).</w:t>
-      </w:r>
-    </w:p>
-    <w:p>
-      <w:r>
-        <w:rPr>
-          <w:rFonts w:ascii="Times New Roman" w:hAnsi="Times New Roman"/>
-          <w:b/>
-          <w:i w:val="0"/>
-          <w:sz w:val="20"/>
-        </w:rPr>
-        <w:t>The ordering is stable under the two obvious deflations, with intervals.</w:t>
-      </w:r>
-      <w:r>
-        <w:rPr>
-          <w:rFonts w:ascii="Times New Roman" w:hAnsi="Times New Roman"/>
-          <w:b w:val="0"/>
-          <w:i w:val="0"/>
-          <w:sz w:val="20"/>
-        </w:rPr>
-        <w:t xml:space="preserve"> Re-estimated on a </w:t>
-      </w:r>
-      <w:r>
-        <w:rPr>
-          <w:rFonts w:ascii="Times New Roman" w:hAnsi="Times New Roman"/>
-          <w:b/>
-          <w:i w:val="0"/>
-          <w:sz w:val="20"/>
-        </w:rPr>
-        <w:t>common level count</w:t>
-      </w:r>
-      <w:r>
-        <w:rPr>
-          <w:rFonts w:ascii="Times New Roman" w:hAnsi="Times New Roman"/>
-          <w:b w:val="0"/>
-          <w:i w:val="0"/>
-          <w:sz w:val="20"/>
-        </w:rPr>
-        <w:t xml:space="preserve"> with each ladder's extreme level removed, it is preserved at Spearman </w:t>
-      </w:r>
-      <w:r>
-        <w:rPr>
-          <w:rFonts w:ascii="Times New Roman" w:hAnsi="Times New Roman"/>
-          <w:b/>
-          <w:i w:val="0"/>
-          <w:sz w:val="20"/>
-        </w:rPr>
-        <w:t>0.999 / 0.981 / 0.991</w:t>
-      </w:r>
-      <w:r>
-        <w:rPr>
-          <w:rFonts w:ascii="Times New Roman" w:hAnsi="Times New Roman"/>
-          <w:b w:val="0"/>
-          <w:i w:val="0"/>
-          <w:sz w:val="20"/>
-        </w:rPr>
-        <w:t xml:space="preserve"> over 24 (knob × domain) units, and at </w:t>
-      </w:r>
-      <w:r>
-        <w:rPr>
-          <w:rFonts w:ascii="Times New Roman" w:hAnsi="Times New Roman"/>
-          <w:b/>
-          <w:i w:val="0"/>
-          <w:sz w:val="20"/>
-        </w:rPr>
-        <w:t>0.983 / 0.987 / 0.983</w:t>
-      </w:r>
-      <w:r>
-        <w:rPr>
-          <w:rFonts w:ascii="Times New Roman" w:hAnsi="Times New Roman"/>
-          <w:b w:val="0"/>
-          <w:i w:val="0"/>
-          <w:sz w:val="20"/>
-        </w:rPr>
-        <w:t xml:space="preserve"> on a </w:t>
-      </w:r>
-      <w:r>
-        <w:rPr>
-          <w:rFonts w:ascii="Times New Roman" w:hAnsi="Times New Roman"/>
-          <w:b/>
-          <w:i w:val="0"/>
-          <w:sz w:val="20"/>
-        </w:rPr>
-        <w:t>fully recomputable</w:t>
-      </w:r>
-      <w:r>
-        <w:rPr>
-          <w:rFonts w:ascii="Times New Roman" w:hAnsi="Times New Roman"/>
-          <w:b w:val="0"/>
-          <w:i w:val="0"/>
-          <w:sz w:val="20"/>
-        </w:rPr>
-        <w:t xml:space="preserve"> unit set at the same level count (31 units; Appendix M.37). A unit bootstrap puts it at </w:t>
-      </w:r>
-      <w:r>
-        <w:rPr>
-          <w:rFonts w:ascii="Times New Roman" w:hAnsi="Times New Roman"/>
-          <w:b/>
-          <w:i w:val="0"/>
-          <w:sz w:val="20"/>
-        </w:rPr>
-        <w:t>0.943–0.996</w:t>
-      </w:r>
-      <w:r>
-        <w:rPr>
-          <w:rFonts w:ascii="Times New Roman" w:hAnsi="Times New Roman"/>
-          <w:b w:val="0"/>
-          <w:i w:val="0"/>
-          <w:sz w:val="20"/>
-        </w:rPr>
-        <w:t xml:space="preserve"> (31 units) and </w:t>
-      </w:r>
-      <w:r>
-        <w:rPr>
-          <w:rFonts w:ascii="Times New Roman" w:hAnsi="Times New Roman"/>
-          <w:b/>
-          <w:i w:val="0"/>
-          <w:sz w:val="20"/>
-        </w:rPr>
-        <w:t>0.834–0.984</w:t>
-      </w:r>
-      <w:r>
-        <w:rPr>
-          <w:rFonts w:ascii="Times New Roman" w:hAnsi="Times New Roman"/>
-          <w:b w:val="0"/>
-          <w:i w:val="0"/>
-          <w:sz w:val="20"/>
-        </w:rPr>
-        <w:t xml:space="preserve"> (36 units, k=3), and </w:t>
-      </w:r>
-      <w:r>
-        <w:rPr>
-          <w:rFonts w:ascii="Times New Roman" w:hAnsi="Times New Roman"/>
-          <w:b/>
-          <w:i w:val="0"/>
-          <w:sz w:val="20"/>
-        </w:rPr>
-        <w:t>clustering by knob gives 0.913–0.994</w:t>
-      </w:r>
-      <w:r>
-        <w:rPr>
-          <w:rFonts w:ascii="Times New Roman" w:hAnsi="Times New Roman"/>
-          <w:b w:val="0"/>
-          <w:i w:val="0"/>
-          <w:sz w:val="20"/>
-        </w:rPr>
-        <w:t xml:space="preserve"> (recomputed from the released package, Appendix F.7); the wider 36-unit resampling gives </w:t>
-      </w:r>
-      <w:r>
-        <w:rPr>
-          <w:rFonts w:ascii="Times New Roman" w:hAnsi="Times New Roman"/>
-          <w:b/>
-          <w:i w:val="0"/>
-          <w:sz w:val="20"/>
-        </w:rPr>
-        <w:t>0.711–0.998</w:t>
-      </w:r>
-      <w:r>
-        <w:rPr>
-          <w:rFonts w:ascii="Times New Roman" w:hAnsi="Times New Roman"/>
-          <w:b w:val="0"/>
-          <w:i w:val="0"/>
-          <w:sz w:val="20"/>
-        </w:rPr>
-        <w:t>, below the 0.80 bar F.7 records as not clearing; a label-permutation test gives p&lt;5×10^-5; leaving out any single knob (</w:t>
-      </w:r>
-      <w:r>
-        <w:rPr>
-          <w:rFonts w:ascii="Times New Roman" w:hAnsi="Times New Roman"/>
-          <w:b/>
-          <w:i w:val="0"/>
-          <w:sz w:val="20"/>
-        </w:rPr>
-        <w:t>36</w:t>
-      </w:r>
-      <w:r>
-        <w:rPr>
-          <w:rFonts w:ascii="Times New Roman" w:hAnsi="Times New Roman"/>
-          <w:b w:val="0"/>
-          <w:i w:val="0"/>
-          <w:sz w:val="20"/>
-        </w:rPr>
-        <w:t xml:space="preserve"> units) keeps it at </w:t>
-      </w:r>
-      <w:r>
-        <w:rPr>
-          <w:rFonts w:ascii="Times New Roman" w:hAnsi="Times New Roman"/>
-          <w:b/>
-          <w:i w:val="0"/>
-          <w:sz w:val="20"/>
-        </w:rPr>
-        <w:t>0.883–0.970</w:t>
-      </w:r>
-      <w:r>
-        <w:rPr>
-          <w:rFonts w:ascii="Times New Roman" w:hAnsi="Times New Roman"/>
-          <w:b w:val="0"/>
-          <w:i w:val="0"/>
-          <w:sz w:val="20"/>
-        </w:rPr>
-        <w:t xml:space="preserve">; per-unit spans with caliber intervals are plotted in </w:t>
-      </w:r>
-      <w:r>
-        <w:rPr>
-          <w:rFonts w:ascii="Times New Roman" w:hAnsi="Times New Roman"/>
-          <w:b/>
-          <w:i w:val="0"/>
-          <w:sz w:val="20"/>
-        </w:rPr>
-        <w:t>Fig. F.17</w:t>
-      </w:r>
-      <w:r>
-        <w:rPr>
-          <w:rFonts w:ascii="Times New Roman" w:hAnsi="Times New Roman"/>
-          <w:b w:val="0"/>
-          <w:i w:val="0"/>
-          <w:sz w:val="20"/>
-        </w:rPr>
-        <w:t xml:space="preserve"> (Appendix F.12). It is also </w:t>
-      </w:r>
-      <w:r>
-        <w:rPr>
-          <w:rFonts w:ascii="Times New Roman" w:hAnsi="Times New Roman"/>
-          <w:b/>
-          <w:i w:val="0"/>
-          <w:sz w:val="20"/>
-        </w:rPr>
-        <w:t>exactly</w:t>
-      </w:r>
-      <w:r>
-        <w:rPr>
-          <w:rFonts w:ascii="Times New Roman" w:hAnsi="Times New Roman"/>
-          <w:b w:val="0"/>
-          <w:i w:val="0"/>
-          <w:sz w:val="20"/>
-        </w:rPr>
-        <w:t xml:space="preserve"> preserved under shared affine calibration (Proposition 5: </w:t>
+        <w:t>span ↦ s·span</w:t>
+      </w:r>
+      <w:r>
+        <w:rPr>
+          <w:rFonts w:ascii="Times New Roman" w:hAnsi="Times New Roman"/>
+          <w:b w:val="0"/>
+          <w:i w:val="0"/>
+          <w:sz w:val="20"/>
+        </w:rPr>
+        <w:t xml:space="preserve">) and under no calibration — the M.37 held-out third gives median </w:t>
+      </w:r>
+      <w:r>
+        <w:rPr>
+          <w:rFonts w:ascii="Times New Roman" w:hAnsi="Times New Roman"/>
+          <w:b/>
+          <w:i w:val="0"/>
+          <w:sz w:val="20"/>
+        </w:rPr>
+        <w:t>0.995</w:t>
+      </w:r>
+      <w:r>
+        <w:rPr>
+          <w:rFonts w:ascii="Times New Roman" w:hAnsi="Times New Roman"/>
+          <w:b w:val="0"/>
+          <w:i w:val="0"/>
+          <w:sz w:val="20"/>
+        </w:rPr>
+        <w:t xml:space="preserve">, interval </w:t>
+      </w:r>
+      <w:r>
+        <w:rPr>
+          <w:rFonts w:ascii="Times New Roman" w:hAnsi="Times New Roman"/>
+          <w:b/>
+          <w:i w:val="0"/>
+          <w:sz w:val="20"/>
+        </w:rPr>
+        <w:t>0.984–0.998</w:t>
+      </w:r>
+      <w:r>
+        <w:rPr>
+          <w:rFonts w:ascii="Times New Roman" w:hAnsi="Times New Roman"/>
+          <w:b w:val="0"/>
+          <w:i w:val="0"/>
+          <w:sz w:val="20"/>
+        </w:rPr>
+        <w:t xml:space="preserve">, above 0.9 in </w:t>
+      </w:r>
+      <w:r>
+        <w:rPr>
+          <w:rFonts w:ascii="Times New Roman" w:hAnsi="Times New Roman"/>
+          <w:b/>
+          <w:i w:val="0"/>
+          <w:sz w:val="20"/>
+        </w:rPr>
+        <w:t>200 of 200</w:t>
+      </w:r>
+      <w:r>
+        <w:rPr>
+          <w:rFonts w:ascii="Times New Roman" w:hAnsi="Times New Roman"/>
+          <w:b w:val="0"/>
+          <w:i w:val="0"/>
+          <w:sz w:val="20"/>
+        </w:rPr>
+        <w:t xml:space="preserve"> splits — but not when each unit is re-fitted independently: </w:t>
+      </w:r>
+      <w:r>
+        <w:rPr>
+          <w:rFonts w:ascii="Times New Roman" w:hAnsi="Times New Roman"/>
+          <w:b/>
+          <w:i w:val="0"/>
+          <w:sz w:val="20"/>
+        </w:rPr>
+        <w:t>0.810 / 0.536</w:t>
+      </w:r>
+      <w:r>
+        <w:rPr>
+          <w:rFonts w:ascii="Times New Roman" w:hAnsi="Times New Roman"/>
+          <w:b w:val="0"/>
+          <w:i w:val="0"/>
+          <w:sz w:val="20"/>
+        </w:rPr>
+        <w:t xml:space="preserve"> over 8 / 36 units, per-unit family medians </w:t>
+      </w:r>
+      <w:r>
+        <w:rPr>
+          <w:rFonts w:ascii="Times New Roman" w:hAnsi="Times New Roman"/>
+          <w:b/>
+          <w:i w:val="0"/>
+          <w:sz w:val="20"/>
+        </w:rPr>
+        <w:t>0.41–0.54</w:t>
+      </w:r>
+      <w:r>
+        <w:rPr>
+          <w:rFonts w:ascii="Times New Roman" w:hAnsi="Times New Roman"/>
+          <w:b w:val="0"/>
+          <w:i w:val="0"/>
+          <w:sz w:val="20"/>
+        </w:rPr>
+        <w:t xml:space="preserve"> (isotonic </w:t>
+      </w:r>
+      <w:r>
+        <w:rPr>
+          <w:rFonts w:ascii="Times New Roman" w:hAnsi="Times New Roman"/>
+          <w:b/>
+          <w:i w:val="0"/>
+          <w:sz w:val="20"/>
+        </w:rPr>
+        <w:t>0.571 / 0.521</w:t>
+      </w:r>
+      <w:r>
+        <w:rPr>
+          <w:rFonts w:ascii="Times New Roman" w:hAnsi="Times New Roman"/>
+          <w:b w:val="0"/>
+          <w:i w:val="0"/>
+          <w:sz w:val="20"/>
+        </w:rPr>
+        <w:t xml:space="preserve">). Measured s spans </w:t>
+      </w:r>
+      <w:r>
+        <w:rPr>
+          <w:rFonts w:ascii="Times New Roman" w:hAnsi="Times New Roman"/>
+          <w:b/>
+          <w:i w:val="0"/>
+          <w:sz w:val="20"/>
+        </w:rPr>
+        <w:t>0.027–2.352</w:t>
+      </w:r>
+      <w:r>
+        <w:rPr>
+          <w:rFonts w:ascii="Times New Roman" w:hAnsi="Times New Roman"/>
+          <w:b w:val="0"/>
+          <w:i w:val="0"/>
+          <w:sz w:val="20"/>
+        </w:rPr>
+        <w:t xml:space="preserve">, so a compressor must vary its factor </w:t>
+      </w:r>
+      <w:r>
+        <w:rPr>
+          <w:rFonts w:ascii="Times New Roman" w:hAnsi="Times New Roman"/>
+          <w:b/>
+          <w:i w:val="0"/>
+          <w:sz w:val="20"/>
+        </w:rPr>
+        <w:t>across units</w:t>
+      </w:r>
+      <w:r>
+        <w:rPr>
+          <w:rFonts w:ascii="Times New Roman" w:hAnsi="Times New Roman"/>
+          <w:b w:val="0"/>
+          <w:i w:val="0"/>
+          <w:sz w:val="20"/>
+        </w:rPr>
+        <w:t xml:space="preserve">; </w:t>
+      </w:r>
+      <w:r>
+        <w:rPr>
+          <w:rFonts w:ascii="Times New Roman" w:hAnsi="Times New Roman"/>
+          <w:b/>
+          <w:i w:val="0"/>
+          <w:sz w:val="20"/>
+        </w:rPr>
+        <w:t>no granularity validated here does so while preserving the ordering, so transfer is unverified rather than excluded</w:t>
+      </w:r>
+      <w:r>
+        <w:rPr>
+          <w:rFonts w:ascii="Times New Roman" w:hAnsi="Times New Roman"/>
+          <w:b w:val="0"/>
+          <w:i w:val="0"/>
+          <w:sz w:val="20"/>
+        </w:rPr>
+        <w:t xml:space="preserve"> (per-domain </w:t>
+      </w:r>
+      <w:r>
+        <w:rPr>
+          <w:rFonts w:ascii="Times New Roman" w:hAnsi="Times New Roman"/>
+          <w:b/>
+          <w:i w:val="0"/>
+          <w:sz w:val="20"/>
+        </w:rPr>
+        <w:t>0.732</w:t>
+      </w:r>
+      <w:r>
+        <w:rPr>
+          <w:rFonts w:ascii="Times New Roman" w:hAnsi="Times New Roman"/>
+          <w:b w:val="0"/>
+          <w:i w:val="0"/>
+          <w:sz w:val="20"/>
+        </w:rPr>
+        <w:t xml:space="preserve">; Appendix M.37). The claim is scoped to the first two calibers, and the VLM unit's build-sensitivity is bounded in </w:t>
+      </w:r>
+      <w:r>
+        <w:rPr>
+          <w:rFonts w:ascii="Times New Roman" w:hAnsi="Times New Roman"/>
+          <w:b/>
+          <w:i w:val="0"/>
+          <w:sz w:val="20"/>
+        </w:rPr>
+        <w:t>Appendix M.18.8</w:t>
+      </w:r>
+      <w:r>
+        <w:rPr>
+          <w:rFonts w:ascii="Times New Roman" w:hAnsi="Times New Roman"/>
+          <w:b w:val="0"/>
+          <w:i w:val="0"/>
+          <w:sz w:val="20"/>
+        </w:rPr>
+        <w:t xml:space="preserve"> (its level moves 90.3 pp across five builds; its contract effect does not). The </w:t>
       </w:r>
       <w:r>
         <w:rPr>
@@ -13794,222 +13772,6 @@
           <w:i/>
           <w:sz w:val="20"/>
         </w:rPr>
-        <w:t>span ↦ s·span</w:t>
-      </w:r>
-      <w:r>
-        <w:rPr>
-          <w:rFonts w:ascii="Times New Roman" w:hAnsi="Times New Roman"/>
-          <w:b w:val="0"/>
-          <w:i w:val="0"/>
-          <w:sz w:val="20"/>
-        </w:rPr>
-        <w:t xml:space="preserve">) and under no calibration — the M.37 held-out third gives median </w:t>
-      </w:r>
-      <w:r>
-        <w:rPr>
-          <w:rFonts w:ascii="Times New Roman" w:hAnsi="Times New Roman"/>
-          <w:b/>
-          <w:i w:val="0"/>
-          <w:sz w:val="20"/>
-        </w:rPr>
-        <w:t>0.995</w:t>
-      </w:r>
-      <w:r>
-        <w:rPr>
-          <w:rFonts w:ascii="Times New Roman" w:hAnsi="Times New Roman"/>
-          <w:b w:val="0"/>
-          <w:i w:val="0"/>
-          <w:sz w:val="20"/>
-        </w:rPr>
-        <w:t xml:space="preserve">, interval </w:t>
-      </w:r>
-      <w:r>
-        <w:rPr>
-          <w:rFonts w:ascii="Times New Roman" w:hAnsi="Times New Roman"/>
-          <w:b/>
-          <w:i w:val="0"/>
-          <w:sz w:val="20"/>
-        </w:rPr>
-        <w:t>0.984–0.998</w:t>
-      </w:r>
-      <w:r>
-        <w:rPr>
-          <w:rFonts w:ascii="Times New Roman" w:hAnsi="Times New Roman"/>
-          <w:b w:val="0"/>
-          <w:i w:val="0"/>
-          <w:sz w:val="20"/>
-        </w:rPr>
-        <w:t xml:space="preserve">, above 0.9 in </w:t>
-      </w:r>
-      <w:r>
-        <w:rPr>
-          <w:rFonts w:ascii="Times New Roman" w:hAnsi="Times New Roman"/>
-          <w:b/>
-          <w:i w:val="0"/>
-          <w:sz w:val="20"/>
-        </w:rPr>
-        <w:t>200 of 200</w:t>
-      </w:r>
-      <w:r>
-        <w:rPr>
-          <w:rFonts w:ascii="Times New Roman" w:hAnsi="Times New Roman"/>
-          <w:b w:val="0"/>
-          <w:i w:val="0"/>
-          <w:sz w:val="20"/>
-        </w:rPr>
-        <w:t xml:space="preserve"> splits — but not when each unit is re-fitted independently: </w:t>
-      </w:r>
-      <w:r>
-        <w:rPr>
-          <w:rFonts w:ascii="Times New Roman" w:hAnsi="Times New Roman"/>
-          <w:b/>
-          <w:i w:val="0"/>
-          <w:sz w:val="20"/>
-        </w:rPr>
-        <w:t>0.810 / 0.536</w:t>
-      </w:r>
-      <w:r>
-        <w:rPr>
-          <w:rFonts w:ascii="Times New Roman" w:hAnsi="Times New Roman"/>
-          <w:b w:val="0"/>
-          <w:i w:val="0"/>
-          <w:sz w:val="20"/>
-        </w:rPr>
-        <w:t xml:space="preserve"> over 8 / 36 units, per-unit family medians </w:t>
-      </w:r>
-      <w:r>
-        <w:rPr>
-          <w:rFonts w:ascii="Times New Roman" w:hAnsi="Times New Roman"/>
-          <w:b/>
-          <w:i w:val="0"/>
-          <w:sz w:val="20"/>
-        </w:rPr>
-        <w:t>0.41–0.54</w:t>
-      </w:r>
-      <w:r>
-        <w:rPr>
-          <w:rFonts w:ascii="Times New Roman" w:hAnsi="Times New Roman"/>
-          <w:b w:val="0"/>
-          <w:i w:val="0"/>
-          <w:sz w:val="20"/>
-        </w:rPr>
-        <w:t xml:space="preserve"> (isotonic </w:t>
-      </w:r>
-      <w:r>
-        <w:rPr>
-          <w:rFonts w:ascii="Times New Roman" w:hAnsi="Times New Roman"/>
-          <w:b/>
-          <w:i w:val="0"/>
-          <w:sz w:val="20"/>
-        </w:rPr>
-        <w:t>0.571 / 0.521</w:t>
-      </w:r>
-      <w:r>
-        <w:rPr>
-          <w:rFonts w:ascii="Times New Roman" w:hAnsi="Times New Roman"/>
-          <w:b w:val="0"/>
-          <w:i w:val="0"/>
-          <w:sz w:val="20"/>
-        </w:rPr>
-        <w:t xml:space="preserve">). Measured s spans </w:t>
-      </w:r>
-      <w:r>
-        <w:rPr>
-          <w:rFonts w:ascii="Times New Roman" w:hAnsi="Times New Roman"/>
-          <w:b/>
-          <w:i w:val="0"/>
-          <w:sz w:val="20"/>
-        </w:rPr>
-        <w:t>0.027–2.352</w:t>
-      </w:r>
-      <w:r>
-        <w:rPr>
-          <w:rFonts w:ascii="Times New Roman" w:hAnsi="Times New Roman"/>
-          <w:b w:val="0"/>
-          <w:i w:val="0"/>
-          <w:sz w:val="20"/>
-        </w:rPr>
-        <w:t xml:space="preserve">, so a compressor must vary its factor </w:t>
-      </w:r>
-      <w:r>
-        <w:rPr>
-          <w:rFonts w:ascii="Times New Roman" w:hAnsi="Times New Roman"/>
-          <w:b/>
-          <w:i w:val="0"/>
-          <w:sz w:val="20"/>
-        </w:rPr>
-        <w:t>across units</w:t>
-      </w:r>
-      <w:r>
-        <w:rPr>
-          <w:rFonts w:ascii="Times New Roman" w:hAnsi="Times New Roman"/>
-          <w:b w:val="0"/>
-          <w:i w:val="0"/>
-          <w:sz w:val="20"/>
-        </w:rPr>
-        <w:t xml:space="preserve">; </w:t>
-      </w:r>
-      <w:r>
-        <w:rPr>
-          <w:rFonts w:ascii="Times New Roman" w:hAnsi="Times New Roman"/>
-          <w:b/>
-          <w:i w:val="0"/>
-          <w:sz w:val="20"/>
-        </w:rPr>
-        <w:t>no granularity validated here does so while preserving the ordering, so transfer is unverified rather than excluded</w:t>
-      </w:r>
-      <w:r>
-        <w:rPr>
-          <w:rFonts w:ascii="Times New Roman" w:hAnsi="Times New Roman"/>
-          <w:b w:val="0"/>
-          <w:i w:val="0"/>
-          <w:sz w:val="20"/>
-        </w:rPr>
-        <w:t xml:space="preserve"> (per-domain </w:t>
-      </w:r>
-      <w:r>
-        <w:rPr>
-          <w:rFonts w:ascii="Times New Roman" w:hAnsi="Times New Roman"/>
-          <w:b/>
-          <w:i w:val="0"/>
-          <w:sz w:val="20"/>
-        </w:rPr>
-        <w:t>0.732</w:t>
-      </w:r>
-      <w:r>
-        <w:rPr>
-          <w:rFonts w:ascii="Times New Roman" w:hAnsi="Times New Roman"/>
-          <w:b w:val="0"/>
-          <w:i w:val="0"/>
-          <w:sz w:val="20"/>
-        </w:rPr>
-        <w:t xml:space="preserve">; Appendix M.37). The claim is scoped to the first two calibers, and the VLM unit's build-sensitivity is bounded in </w:t>
-      </w:r>
-      <w:r>
-        <w:rPr>
-          <w:rFonts w:ascii="Times New Roman" w:hAnsi="Times New Roman"/>
-          <w:b/>
-          <w:i w:val="0"/>
-          <w:sz w:val="20"/>
-        </w:rPr>
-        <w:t>Appendix M.18.8</w:t>
-      </w:r>
-      <w:r>
-        <w:rPr>
-          <w:rFonts w:ascii="Times New Roman" w:hAnsi="Times New Roman"/>
-          <w:b w:val="0"/>
-          <w:i w:val="0"/>
-          <w:sz w:val="20"/>
-        </w:rPr>
-        <w:t xml:space="preserve"> (its level moves 90.3 pp across five builds; its contract effect does not). The </w:t>
-      </w:r>
-      <w:r>
-        <w:rPr>
-          <w:rFonts w:ascii="Times New Roman" w:hAnsi="Times New Roman"/>
-          <w:b w:val="0"/>
-          <w:i/>
-          <w:sz w:val="20"/>
-        </w:rPr>
         <w:t>magnitudes</w:t>
       </w:r>
       <w:r>
@@ -14082,7 +13844,7 @@
           <w:i w:val="0"/>
           <w:sz w:val="20"/>
         </w:rPr>
-        <w:t>No scale-free form of the span — equal-count gridding, endpoint removal, or the three M.37 calibration families — makes cross-knob magnitudes invariant, and the ordering also survives normalising each span by its knob's relative travel (Appendix F.10; M.42–M.45), and the 0.85 criterion set for that objection is not met by the re-normalised ladders (0.629 on log ratios, 0.595 on ranks, 0.580–0.754 over the four subsets; Appendix M.37).</w:t>
+        <w:t>No scale-free form of the span — equal-count gridding, endpoint removal, or the three M.37 calibration families — makes cross-knob magnitudes invariant, and the ordering also survives normalising each span by its knob travel (Appendix F.10; M.37).</w:t>
       </w:r>
       <w:r>
         <w:rPr>
@@ -14120,8 +13882,15 @@
         </w:rPr>
         <w:t>Under a common error-and-cost budget the ordering is not preserved and half the units admit no admissible pair at all (Appendix M.45).</w:t>
       </w:r>
-    </w:p>
-    <w:p>
+      <w:r>
+        <w:rPr>
+          <w:rFonts w:ascii="Times New Roman" w:hAnsi="Times New Roman"/>
+          <w:b w:val="0"/>
+          <w:i w:val="0"/>
+          <w:sz w:val="20"/>
+        </w:rPr>
+        <w:t xml:space="preserve"> </w:t>
+      </w:r>
       <w:r>
         <w:rPr>
           <w:rFonts w:ascii="Times New Roman" w:hAnsi="Times New Roman"/>
@@ -14837,7 +14606,7 @@
           <w:i w:val="0"/>
           <w:sz w:val="20"/>
         </w:rPr>
-        <w:t xml:space="preserve"> w (not Proposition 4's ground-truth-weighted w); the two deviations need reference counts on the same scored subset, so without them only that diagnosis is licensed. Records are kept only for completely paired inputs: the base arm's zero-item set fixes the denominator, and a missing arm is a conservative bound, not a dropped denominator. The thresholds are frozen in </w:t>
+        <w:t xml:space="preserve"> w (not Proposition 4's ground-truth-weighted w); the two deviations need reference counts on the same scored subset, so without them only that diagnosis is licensed. Records are kept only for completely paired inputs: the base arm's zero set is the denominator for every arm, and a missing arm reads as an undecidable partial, not a dropped denominator (M.22). Released API summaries give the checks only; the per-call records and the driver that lets one rebuild them ship with the package (M.11.2, M.37). The thresholds are frozen in </w:t>
       </w:r>
       <w:r>
         <w:rPr>
@@ -15108,7 +14877,43 @@
           <w:i w:val="0"/>
           <w:sz w:val="20"/>
         </w:rPr>
-        <w:t xml:space="preserve"> fidelity beyond the native scale becomes harmful was not measured — a non-monotonicity existing work suggests may exist.</w:t>
+        <w:t xml:space="preserve"> fidelity beyond the native scale becomes harmful was not measured — a non-monotonicity existing work suggests may exist. </w:t>
+      </w:r>
+      <w:r>
+        <w:rPr>
+          <w:rFonts w:ascii="Times New Roman" w:hAnsi="Times New Roman"/>
+          <w:b/>
+          <w:i w:val="0"/>
+          <w:sz w:val="20"/>
+        </w:rPr>
+        <w:t>The attribution boundary is behavioural, not anthropomorphic.</w:t>
+      </w:r>
+      <w:r>
+        <w:rPr>
+          <w:rFonts w:ascii="Times New Roman" w:hAnsi="Times New Roman"/>
+          <w:b w:val="0"/>
+          <w:i w:val="0"/>
+          <w:sz w:val="20"/>
+        </w:rPr>
+        <w:t xml:space="preserve"> We read an answered zero as </w:t>
+      </w:r>
+      <w:r>
+        <w:rPr>
+          <w:rFonts w:ascii="Times New Roman" w:hAnsi="Times New Roman"/>
+          <w:b/>
+          <w:i w:val="0"/>
+          <w:sz w:val="20"/>
+        </w:rPr>
+        <w:t>mode collapse</w:t>
+      </w:r>
+      <w:r>
+        <w:rPr>
+          <w:rFonts w:ascii="Times New Roman" w:hAnsi="Times New Roman"/>
+          <w:b w:val="0"/>
+          <w:i w:val="0"/>
+          <w:sz w:val="20"/>
+        </w:rPr>
+        <w:t xml:space="preserve"> — output degenerating onto the mode or a prior integer — not as a human-like refusal, and claim nothing about intent; the operationalisation is stated so that it can be replaced.</w:t>
       </w:r>
     </w:p>
     <w:p>
@@ -15119,34 +14924,124 @@
           <w:i w:val="0"/>
           <w:sz w:val="20"/>
         </w:rPr>
-        <w:t>The attribution boundary is behavioural, not anthropomorphic.</w:t>
-      </w:r>
-      <w:r>
-        <w:rPr>
-          <w:rFonts w:ascii="Times New Roman" w:hAnsi="Times New Roman"/>
-          <w:b w:val="0"/>
-          <w:i w:val="0"/>
-          <w:sz w:val="20"/>
-        </w:rPr>
-        <w:t xml:space="preserve"> We read an answered zero as </w:t>
-      </w:r>
-      <w:r>
-        <w:rPr>
-          <w:rFonts w:ascii="Times New Roman" w:hAnsi="Times New Roman"/>
-          <w:b/>
-          <w:i w:val="0"/>
-          <w:sz w:val="20"/>
-        </w:rPr>
-        <w:t>mode collapse</w:t>
-      </w:r>
-      <w:r>
-        <w:rPr>
-          <w:rFonts w:ascii="Times New Roman" w:hAnsi="Times New Roman"/>
-          <w:b w:val="0"/>
-          <w:i w:val="0"/>
-          <w:sz w:val="20"/>
-        </w:rPr>
-        <w:t xml:space="preserve"> — output degenerating onto the mode or a prior integer — not as a human-like refusal, and claim nothing about intent; the operationalisation is stated so that it can be replaced.</w:t>
+        <w:t>The detector lineage is narrow</w:t>
+      </w:r>
+      <w:r>
+        <w:rPr>
+          <w:rFonts w:ascii="Times New Roman" w:hAnsi="Times New Roman"/>
+          <w:b w:val="0"/>
+          <w:i w:val="0"/>
+          <w:sz w:val="20"/>
+        </w:rPr>
+        <w:t xml:space="preserve">, resting on YOLO with RetinaNet and Faster R-CNN as secondary lineages; a broader sweep would establish whether §4.1's and §4.5's properties are family or architecture properties. The exemplar condition is measured on </w:t>
+      </w:r>
+      <w:r>
+        <w:rPr>
+          <w:rFonts w:ascii="Times New Roman" w:hAnsi="Times New Roman"/>
+          <w:b/>
+          <w:i w:val="0"/>
+          <w:sz w:val="20"/>
+        </w:rPr>
+        <w:t>one benchmark, three boxes and six families</w:t>
+      </w:r>
+      <w:r>
+        <w:rPr>
+          <w:rFonts w:ascii="Times New Roman" w:hAnsi="Times New Roman"/>
+          <w:b w:val="0"/>
+          <w:i w:val="0"/>
+          <w:sz w:val="20"/>
+        </w:rPr>
+        <w:t xml:space="preserve"> (§5.14), so it bounds the zero without mapping the few-shot counting family; its </w:t>
+      </w:r>
+      <w:r>
+        <w:rPr>
+          <w:rFonts w:ascii="Times New Roman" w:hAnsi="Times New Roman"/>
+          <w:b/>
+          <w:i w:val="0"/>
+          <w:sz w:val="20"/>
+        </w:rPr>
+        <w:t>384-px</w:t>
+      </w:r>
+      <w:r>
+        <w:rPr>
+          <w:rFonts w:ascii="Times New Roman" w:hAnsi="Times New Roman"/>
+          <w:b w:val="0"/>
+          <w:i w:val="0"/>
+          <w:sz w:val="20"/>
+        </w:rPr>
+        <w:t xml:space="preserve"> resolution is the release's own short-side constraint, and </w:t>
+      </w:r>
+      <w:r>
+        <w:rPr>
+          <w:rFonts w:ascii="Times New Roman" w:hAnsi="Times New Roman"/>
+          <w:b/>
+          <w:i w:val="0"/>
+          <w:sz w:val="20"/>
+        </w:rPr>
+        <w:t>M.41</w:t>
+      </w:r>
+      <w:r>
+        <w:rPr>
+          <w:rFonts w:ascii="Times New Roman" w:hAnsi="Times New Roman"/>
+          <w:b w:val="0"/>
+          <w:i w:val="0"/>
+          <w:sz w:val="20"/>
+        </w:rPr>
+        <w:t xml:space="preserve"> varies it (contract arms ≤ </w:t>
+      </w:r>
+      <w:r>
+        <w:rPr>
+          <w:rFonts w:ascii="Times New Roman" w:hAnsi="Times New Roman"/>
+          <w:b/>
+          <w:i w:val="0"/>
+          <w:sz w:val="20"/>
+        </w:rPr>
+        <w:t>2.0 pp</w:t>
+      </w:r>
+      <w:r>
+        <w:rPr>
+          <w:rFonts w:ascii="Times New Roman" w:hAnsi="Times New Roman"/>
+          <w:b w:val="0"/>
+          <w:i w:val="0"/>
+          <w:sz w:val="20"/>
+        </w:rPr>
+        <w:t xml:space="preserve">, exemplar abstention </w:t>
+      </w:r>
+      <w:r>
+        <w:rPr>
+          <w:rFonts w:ascii="Times New Roman" w:hAnsi="Times New Roman"/>
+          <w:b/>
+          <w:i w:val="0"/>
+          <w:sz w:val="20"/>
+        </w:rPr>
+        <w:t>10.7 pp</w:t>
+      </w:r>
+      <w:r>
+        <w:rPr>
+          <w:rFonts w:ascii="Times New Roman" w:hAnsi="Times New Roman"/>
+          <w:b w:val="0"/>
+          <w:i w:val="0"/>
+          <w:sz w:val="20"/>
+        </w:rPr>
+        <w:t xml:space="preserve"> across scales, </w:t>
+      </w:r>
+      <w:r>
+        <w:rPr>
+          <w:rFonts w:ascii="Times New Roman" w:hAnsi="Times New Roman"/>
+          <w:b/>
+          <w:i w:val="0"/>
+          <w:sz w:val="20"/>
+        </w:rPr>
+        <w:t>11.0 pp</w:t>
+      </w:r>
+      <w:r>
+        <w:rPr>
+          <w:rFonts w:ascii="Times New Roman" w:hAnsi="Times New Roman"/>
+          <w:b w:val="0"/>
+          <w:i w:val="0"/>
+          <w:sz w:val="20"/>
+        </w:rPr>
+        <w:t xml:space="preserve"> in one step). The three hosted endpoints are deployments we cannot pin to a build, so their numbers are dated, not frozen.</w:t>
       </w:r>
     </w:p>
     <w:p>
@@ -15157,162 +15052,52 @@
           <w:i w:val="0"/>
           <w:sz w:val="20"/>
         </w:rPr>
-        <w:t>The detector lineage is narrow</w:t>
-      </w:r>
-      <w:r>
-        <w:rPr>
-          <w:rFonts w:ascii="Times New Roman" w:hAnsi="Times New Roman"/>
-          <w:b w:val="0"/>
-          <w:i w:val="0"/>
-          <w:sz w:val="20"/>
-        </w:rPr>
-        <w:t xml:space="preserve">, resting on YOLO with RetinaNet and Faster R-CNN as secondary lineages; a broader sweep would establish whether §4.1's and §4.5's properties are family or architecture properties. The exemplar condition is measured on </w:t>
-      </w:r>
-      <w:r>
-        <w:rPr>
-          <w:rFonts w:ascii="Times New Roman" w:hAnsi="Times New Roman"/>
-          <w:b/>
-          <w:i w:val="0"/>
-          <w:sz w:val="20"/>
-        </w:rPr>
-        <w:t>one benchmark, three boxes and six families</w:t>
-      </w:r>
-      <w:r>
-        <w:rPr>
-          <w:rFonts w:ascii="Times New Roman" w:hAnsi="Times New Roman"/>
-          <w:b w:val="0"/>
-          <w:i w:val="0"/>
-          <w:sz w:val="20"/>
-        </w:rPr>
-        <w:t xml:space="preserve"> (§5.14), so it bounds the zero without mapping the few-shot counting family; its </w:t>
-      </w:r>
-      <w:r>
-        <w:rPr>
-          <w:rFonts w:ascii="Times New Roman" w:hAnsi="Times New Roman"/>
-          <w:b/>
-          <w:i w:val="0"/>
-          <w:sz w:val="20"/>
-        </w:rPr>
-        <w:t>384-px</w:t>
-      </w:r>
-      <w:r>
-        <w:rPr>
-          <w:rFonts w:ascii="Times New Roman" w:hAnsi="Times New Roman"/>
-          <w:b w:val="0"/>
-          <w:i w:val="0"/>
-          <w:sz w:val="20"/>
-        </w:rPr>
-        <w:t xml:space="preserve"> resolution is the release's own short-side constraint, and </w:t>
-      </w:r>
-      <w:r>
-        <w:rPr>
-          <w:rFonts w:ascii="Times New Roman" w:hAnsi="Times New Roman"/>
-          <w:b/>
-          <w:i w:val="0"/>
-          <w:sz w:val="20"/>
-        </w:rPr>
-        <w:t>M.41</w:t>
-      </w:r>
-      <w:r>
-        <w:rPr>
-          <w:rFonts w:ascii="Times New Roman" w:hAnsi="Times New Roman"/>
-          <w:b w:val="0"/>
-          <w:i w:val="0"/>
-          <w:sz w:val="20"/>
-        </w:rPr>
-        <w:t xml:space="preserve"> varies it (contract arms ≤ </w:t>
-      </w:r>
-      <w:r>
-        <w:rPr>
-          <w:rFonts w:ascii="Times New Roman" w:hAnsi="Times New Roman"/>
-          <w:b/>
-          <w:i w:val="0"/>
-          <w:sz w:val="20"/>
-        </w:rPr>
-        <w:t>2.0 pp</w:t>
-      </w:r>
-      <w:r>
-        <w:rPr>
-          <w:rFonts w:ascii="Times New Roman" w:hAnsi="Times New Roman"/>
-          <w:b w:val="0"/>
-          <w:i w:val="0"/>
-          <w:sz w:val="20"/>
-        </w:rPr>
-        <w:t xml:space="preserve">, exemplar abstention </w:t>
-      </w:r>
-      <w:r>
-        <w:rPr>
-          <w:rFonts w:ascii="Times New Roman" w:hAnsi="Times New Roman"/>
-          <w:b/>
-          <w:i w:val="0"/>
-          <w:sz w:val="20"/>
-        </w:rPr>
-        <w:t>10.7 pp</w:t>
-      </w:r>
-      <w:r>
-        <w:rPr>
-          <w:rFonts w:ascii="Times New Roman" w:hAnsi="Times New Roman"/>
-          <w:b w:val="0"/>
-          <w:i w:val="0"/>
-          <w:sz w:val="20"/>
-        </w:rPr>
-        <w:t xml:space="preserve"> across scales, </w:t>
-      </w:r>
-      <w:r>
-        <w:rPr>
-          <w:rFonts w:ascii="Times New Roman" w:hAnsi="Times New Roman"/>
-          <w:b/>
-          <w:i w:val="0"/>
-          <w:sz w:val="20"/>
-        </w:rPr>
-        <w:t>11.0 pp</w:t>
-      </w:r>
-      <w:r>
-        <w:rPr>
-          <w:rFonts w:ascii="Times New Roman" w:hAnsi="Times New Roman"/>
-          <w:b w:val="0"/>
-          <w:i w:val="0"/>
-          <w:sz w:val="20"/>
-        </w:rPr>
-        <w:t xml:space="preserve"> in one step). The three hosted endpoints are deployments we cannot pin to a build, so their numbers are dated, not frozen.</w:t>
-      </w:r>
-    </w:p>
-    <w:p>
-      <w:r>
-        <w:rPr>
-          <w:rFonts w:ascii="Times New Roman" w:hAnsi="Times New Roman"/>
-          <w:b/>
-          <w:i w:val="0"/>
-          <w:sz w:val="20"/>
-        </w:rPr>
-        <w:t>The abstention identification rests on a two-channel assumption.</w:t>
-      </w:r>
-      <w:r>
-        <w:rPr>
-          <w:rFonts w:ascii="Times New Roman" w:hAnsi="Times New Roman"/>
-          <w:b w:val="0"/>
-          <w:i w:val="0"/>
-          <w:sz w:val="20"/>
-        </w:rPr>
-        <w:t xml:space="preserve"> That assumption is </w:t>
-      </w:r>
-      <w:r>
-        <w:rPr>
-          <w:rFonts w:ascii="Times New Roman" w:hAnsi="Times New Roman"/>
-          <w:b/>
-          <w:i w:val="0"/>
-          <w:sz w:val="20"/>
-        </w:rPr>
-        <w:t>testable</w:t>
-      </w:r>
-      <w:r>
-        <w:rPr>
-          <w:rFonts w:ascii="Times New Roman" w:hAnsi="Times New Roman"/>
-          <w:b w:val="0"/>
-          <w:i w:val="0"/>
-          <w:sz w:val="20"/>
-        </w:rPr>
-        <w:t xml:space="preserve">, and is tested (§5.7). The census </w:t>
+        <w:t>The abstention interpretation rests on a two-channel assumption.</w:t>
+      </w:r>
+      <w:r>
+        <w:rPr>
+          <w:rFonts w:ascii="Times New Roman" w:hAnsi="Times New Roman"/>
+          <w:b w:val="0"/>
+          <w:i w:val="0"/>
+          <w:sz w:val="20"/>
+        </w:rPr>
+        <w:t xml:space="preserve"> It is </w:t>
+      </w:r>
+      <w:r>
+        <w:rPr>
+          <w:rFonts w:ascii="Times New Roman" w:hAnsi="Times New Roman"/>
+          <w:b/>
+          <w:i w:val="0"/>
+          <w:sz w:val="20"/>
+        </w:rPr>
+        <w:t>partly testable</w:t>
+      </w:r>
+      <w:r>
+        <w:rPr>
+          <w:rFonts w:ascii="Times New Roman" w:hAnsi="Times New Roman"/>
+          <w:b w:val="0"/>
+          <w:i w:val="0"/>
+          <w:sz w:val="20"/>
+        </w:rPr>
+        <w:t xml:space="preserve">, and its observable part is tested (§5.7): the controls measure the way the outlets are </w:t>
+      </w:r>
+      <w:r>
+        <w:rPr>
+          <w:rFonts w:ascii="Times New Roman" w:hAnsi="Times New Roman"/>
+          <w:b w:val="0"/>
+          <w:i/>
+          <w:sz w:val="20"/>
+        </w:rPr>
+        <w:t>used</w:t>
+      </w:r>
+      <w:r>
+        <w:rPr>
+          <w:rFonts w:ascii="Times New Roman" w:hAnsi="Times New Roman"/>
+          <w:b w:val="0"/>
+          <w:i w:val="0"/>
+          <w:sz w:val="20"/>
+        </w:rPr>
+        <w:t xml:space="preserve"> on the pools we state, not whether every answered zero is latent abstention. The census </w:t>
       </w:r>
       <w:r>
         <w:rPr>
@@ -15366,7 +15151,7 @@
           <w:i w:val="0"/>
           <w:sz w:val="20"/>
         </w:rPr>
-        <w:t xml:space="preserve"> closes that gap: on </w:t>
+        <w:t xml:space="preserve"> bears on that condition: on </w:t>
       </w:r>
       <w:r>
         <w:rPr>
@@ -16117,7 +15902,7 @@
           <w:i w:val="0"/>
           <w:sz w:val="20"/>
         </w:rPr>
-        <w:t xml:space="preserve"> of counting error measurable and found that, for one anchor build under Chinese prompts and GT weighting, the dominant dense-scene failure is not directional but abstention; the contributions are therefore </w:t>
+        <w:t xml:space="preserve"> of counting error measurable and found that, for one anchor build under Chinese prompts and GT weighting, the observed failure is an answered-zero output rather than a signed under-estimate; the contributions are therefore </w:t>
       </w:r>
       <w:r>
         <w:rPr>
@@ -16162,7 +15947,7 @@
           <w:i w:val="0"/>
           <w:sz w:val="20"/>
         </w:rPr>
-        <w:t>behavioural reading of the answered zero</w:t>
+        <w:t>observed contract-dependence of the answered zero</w:t>
       </w:r>
       <w:r>
         <w:rPr>
@@ -16279,10 +16064,8 @@
           <w:i w:val="0"/>
           <w:sz w:val="20"/>
         </w:rPr>
-        <w:t xml:space="preserve"> (§8.1). The weakest parts are stated as such in §8; the most consequential open question is whether the abstention channel can be given a statistical guarantee, not a measured rate (§7.7).</w:t>
-      </w:r>
-    </w:p>
-    <w:p>
+        <w:t xml:space="preserve"> (§8.1). The weakest parts are stated as such in §8; the most consequential open question is whether the abstention channel can be given a statistical guarantee, not a measured rate (§7.7). </w:t>
+      </w:r>
       <w:r>
         <w:rPr>
           <w:rFonts w:ascii="Times New Roman" w:hAnsi="Times New Roman"/>
@@ -16417,11 +16200,20 @@
       <w:r>
         <w:rPr>
           <w:rFonts w:ascii="Times New Roman" w:hAnsi="Times New Roman"/>
-          <w:b w:val="0"/>
-          <w:i w:val="0"/>
-          <w:sz w:val="20"/>
-        </w:rPr>
-        <w:t>Author contributions are declared by the corresponding author at submission, using the CRediT taxonomy.</w:t>
+          <w:b/>
+          <w:i w:val="0"/>
+          <w:sz w:val="20"/>
+        </w:rPr>
+        <w:t>Author contributions.</w:t>
+      </w:r>
+      <w:r>
+        <w:rPr>
+          <w:rFonts w:ascii="Times New Roman" w:hAnsi="Times New Roman"/>
+          <w:b w:val="0"/>
+          <w:i w:val="0"/>
+          <w:sz w:val="20"/>
+        </w:rPr>
+        <w:t xml:space="preserve"> Conceptualization, methodology, software, validation, formal analysis, investigation, resources, data curation, writing — original draft, writing — review and editing, visualization, supervision, project administration: the author.</w:t>
       </w:r>
     </w:p>
     <w:p>
@@ -16489,7 +16281,43 @@
           <w:i w:val="0"/>
           <w:sz w:val="20"/>
         </w:rPr>
-        <w:t>.</w:t>
+        <w:t xml:space="preserve">. </w:t>
+      </w:r>
+      <w:r>
+        <w:rPr>
+          <w:rFonts w:ascii="Times New Roman" w:hAnsi="Times New Roman"/>
+          <w:b w:val="0"/>
+          <w:i/>
+          <w:sz w:val="20"/>
+        </w:rPr>
+        <w:t>MANIFEST.csv</w:t>
+      </w:r>
+      <w:r>
+        <w:rPr>
+          <w:rFonts w:ascii="Times New Roman" w:hAnsi="Times New Roman"/>
+          <w:b w:val="0"/>
+          <w:i w:val="0"/>
+          <w:sz w:val="20"/>
+        </w:rPr>
+        <w:t xml:space="preserve"> lists the tree path by path with each file's byte count and MD5; an independent audit checked the bytes and the MD5s of a </w:t>
+      </w:r>
+      <w:r>
+        <w:rPr>
+          <w:rFonts w:ascii="Times New Roman" w:hAnsi="Times New Roman"/>
+          <w:b/>
+          <w:i w:val="0"/>
+          <w:sz w:val="20"/>
+        </w:rPr>
+        <w:t>selected subset</w:t>
+      </w:r>
+      <w:r>
+        <w:rPr>
+          <w:rFonts w:ascii="Times New Roman" w:hAnsi="Times New Roman"/>
+          <w:b w:val="0"/>
+          <w:i w:val="0"/>
+          <w:sz w:val="20"/>
+        </w:rPr>
+        <w:t xml:space="preserve"> of those records and not of every one, so listed-file coverage holds for that subset alone, and integrity says nothing about whether the analyses are correct.</w:t>
       </w:r>
     </w:p>
     <w:p>

</xml_diff>

<commit_message>
v0667: A5-1 target-word pairing written into the supplement as M.24.4 and its per-call records released (24 jsonl under neutral build names + criteria/reparse scripts + frozen target map + ARM_MAP); supplementary de-logging closed; r18 residual text items landed (A7-1/A8-1 pointer/A4-1/A0-3/A3-2/M-2/M-6/M-7/D1-4/D2-1/A8-3) or verified already landed; main text net 0 words (35 pp / 11,601 w); README derived counts refreshed
</commit_message>
<xml_diff>
--- a/manuscript/PaperB_manuscript_PR_layout.docx
+++ b/manuscript/PaperB_manuscript_PR_layout.docx
@@ -4277,7 +4277,7 @@
           <w:i w:val="0"/>
           <w:sz w:val="20"/>
         </w:rPr>
-        <w:t>Abstention is our leading indicator, so its operationalisation is stated item by item, not left as "the predicted total is zero". Three points matter here.</w:t>
+        <w:t>Abstention is our leading indicator, so its operationalisation is stated item by item, stated item by item. Three points matter here.</w:t>
       </w:r>
     </w:p>
     <w:p>
@@ -4477,7 +4477,7 @@
           <w:i w:val="0"/>
           <w:sz w:val="20"/>
         </w:rPr>
-        <w:t xml:space="preserve"> fields are given in Appendix B.1–B.2.</w:t>
+        <w:t xml:space="preserve"> fields are given in Appendix B.1–B.2, with a compact table of what each observable licenses.</w:t>
       </w:r>
     </w:p>
     <w:p>
@@ -4497,7 +4497,7 @@
           <w:i w:val="0"/>
           <w:sz w:val="20"/>
         </w:rPr>
-        <w:t xml:space="preserve"> We give an empirical criterion, not a stipulation: a lineage that abstained mainly in natural language would show a low ratio of answered-zero to textual refusal, approaching 0, and </w:t>
+        <w:t xml:space="preserve"> The criterion is empirical: a lineage that abstained mainly in natural language would show a low ratio of answered-zero to textual refusal, approaching 0, and </w:t>
       </w:r>
       <w:r>
         <w:rPr>
@@ -4515,7 +4515,7 @@
           <w:i w:val="0"/>
           <w:sz w:val="20"/>
         </w:rPr>
-        <w:t xml:space="preserve"> — the two statements point the same way. Over the whole corpus (892 result files, ~620k records):</w:t>
+        <w:t>. Over the whole corpus (892 result files, ~620k records):</w:t>
       </w:r>
     </w:p>
     <w:p>
@@ -5089,7 +5089,7 @@
           <w:i w:val="0"/>
           <w:sz w:val="20"/>
         </w:rPr>
-        <w:t xml:space="preserve"> (the three configurations: 0.18%, 0% and 0%). </w:t>
+        <w:t xml:space="preserve"> (three configurations: 0.18%, 0% and 0%). </w:t>
       </w:r>
       <w:r>
         <w:rPr>
@@ -5116,7 +5116,7 @@
           <w:i w:val="0"/>
           <w:sz w:val="20"/>
         </w:rPr>
-        <w:t>Cross-lineage comparisons of abstention rate must therefore define the channel per lineage.</w:t>
+        <w:t>Cross-lineage comparisons must define the channel per lineage.</w:t>
       </w:r>
       <w:r>
         <w:rPr>
@@ -5325,7 +5325,7 @@
           <w:i w:val="0"/>
           <w:sz w:val="20"/>
         </w:rPr>
-        <w:t xml:space="preserve"> and went on answering </w:t>
+        <w:t xml:space="preserve"> and answered </w:t>
       </w:r>
       <w:r>
         <w:rPr>
@@ -5496,16 +5496,16 @@
           <w:i w:val="0"/>
           <w:sz w:val="20"/>
         </w:rPr>
-        <w:t>The operative gate is therefore the availability of an abstention token, not the enumeration demand</w:t>
-      </w:r>
-      <w:r>
-        <w:rPr>
-          <w:rFonts w:ascii="Times New Roman" w:hAnsi="Times New Roman"/>
-          <w:b w:val="0"/>
-          <w:i w:val="0"/>
-          <w:sz w:val="20"/>
-        </w:rPr>
-        <w:t xml:space="preserve">. The legibility attribution consequently rests on the direct manipulations of §5.6–5.7, with one boundary the same census imposes: under an abstention contract the </w:t>
+        <w:t>The gate is therefore the availability of an abstention token, not the enumeration demand</w:t>
+      </w:r>
+      <w:r>
+        <w:rPr>
+          <w:rFonts w:ascii="Times New Roman" w:hAnsi="Times New Roman"/>
+          <w:b w:val="0"/>
+          <w:i w:val="0"/>
+          <w:sz w:val="20"/>
+        </w:rPr>
+        <w:t xml:space="preserve">. The legibility attribution rests on §5.6–5.7, with one boundary the census imposes: under an abstention contract the </w:t>
       </w:r>
       <w:r>
         <w:rPr>
@@ -5663,7 +5663,7 @@
           <w:i w:val="0"/>
           <w:sz w:val="20"/>
         </w:rPr>
-        <w:t xml:space="preserve"> — not empirical findings — so they are stated compactly here; full derivations and scope notes are in </w:t>
+        <w:t xml:space="preserve"> — not empirical findings — so they are stated compactly here; derivations and scope notes are in </w:t>
       </w:r>
       <w:r>
         <w:rPr>
@@ -5773,7 +5773,7 @@
           <w:i w:val="0"/>
           <w:sz w:val="20"/>
         </w:rPr>
-        <w:t xml:space="preserve"> for InternVL2.5-8B (κ = 2.3) — the arithmetic reason §3.6 reports the two lineages separately, not pooled.</w:t>
+        <w:t xml:space="preserve"> for InternVL2.5-8B (κ = 2.3) — the arithmetic reason §3.6 reports the two lineages separately.</w:t>
       </w:r>
     </w:p>
     <w:p>
@@ -5793,7 +5793,7 @@
           <w:i w:val="0"/>
           <w:sz w:val="20"/>
         </w:rPr>
-        <w:t xml:space="preserve"> ρ_pooled-ρ=Cov_g(g,r)/ g; abstention is itself GT-dependent, but that alone does not fix the covariance's sign or size: it is </w:t>
+        <w:t xml:space="preserve"> ρ_pooled-ρ=Cov_g(g,r)/ g; abstention is itself GT-dependent, but that alone fixes neither its sign nor its size: it is </w:t>
       </w:r>
       <w:r>
         <w:rPr>
@@ -5811,7 +5811,7 @@
           <w:i w:val="0"/>
           <w:sz w:val="20"/>
         </w:rPr>
-        <w:t>. §5.12 reports those values. Both conventions are therefore reported side by side, their divergence fixed by that covariance.</w:t>
+        <w:t>. §5.12 reports those values. Both conventions are therefore reported side by side.</w:t>
       </w:r>
     </w:p>
     <w:p>
@@ -5849,7 +5849,7 @@
           <w:i w:val="0"/>
           <w:sz w:val="20"/>
         </w:rPr>
-        <w:t xml:space="preserve"> (partial correlation exactly ± 1). That is why we withdraw our own candidate and claim </w:t>
+        <w:t xml:space="preserve"> (partial correlation exactly ± 1). We therefore withdraw our own candidate and claim </w:t>
       </w:r>
       <w:r>
         <w:rPr>
@@ -5885,7 +5885,7 @@
           <w:i w:val="0"/>
           <w:sz w:val="20"/>
         </w:rPr>
-        <w:t>: magnitude is not predicted by any quantity we have been able to construct.</w:t>
+        <w:t>: magnitude is not predicted by any quantity constructible here.</w:t>
       </w:r>
     </w:p>
     <w:p>
@@ -5905,7 +5905,25 @@
           <w:i w:val="0"/>
           <w:sz w:val="20"/>
         </w:rPr>
-        <w:t xml:space="preserve"> ρ_total=-(1-w)+w ρ_answered with w=G_N/G, and the abstention share of the under-count has the closed form S=(1-w)/[1-w(1+ρ_answered)], which is a share inside [0,1] only when the net deviation is an under-count; where it is not, the two pp terms of Table 3 are the reported quantities (§8.2). This is a reporting identity of the same form as the answer-propensity / conditional-composition decomposition we use elsewhere [46]; what is in question is where the movement goes on this corpus.</w:t>
+        <w:t xml:space="preserve"> ρ_total=-(1-w)+w ρ_answered with w=G_N/G, and the abstention share of the under-count has the closed form S=(1-w)/[1-w(1+ρ_answered)], a share inside [0,1] only under a net under-count; otherwise Table 3's two pp terms are reported (§8.2). This is a reporting identity of the same form as the answer-propensity / conditional-composition decomposition we use elsewhere [46]. Conditioning precision on prevalence is not a new identification result: it is the partial-identification problem of Manski (2021) and the quantification literature's unidentified-prevalence target (Gonzalez et al., 2017), both cited in full in </w:t>
+      </w:r>
+      <w:r>
+        <w:rPr>
+          <w:rFonts w:ascii="Times New Roman" w:hAnsi="Times New Roman"/>
+          <w:b/>
+          <w:i w:val="0"/>
+          <w:sz w:val="20"/>
+        </w:rPr>
+        <w:t>Appendix M.21</w:t>
+      </w:r>
+      <w:r>
+        <w:rPr>
+          <w:rFonts w:ascii="Times New Roman" w:hAnsi="Times New Roman"/>
+          <w:b w:val="0"/>
+          <w:i w:val="0"/>
+          <w:sz w:val="20"/>
+        </w:rPr>
+        <w:t>, so what is added here is the application to counted outputs; what is in question is where the movement goes on this corpus.</w:t>
       </w:r>
     </w:p>
     <w:p>
@@ -5945,7 +5963,7 @@
           <w:i w:val="0"/>
           <w:sz w:val="20"/>
         </w:rPr>
-        <w:t xml:space="preserve"> VisDrone and AI-TOD have the fewest targets (17–22) yet abstain as often as ShanghaiTech-A (433), which licenses stratifying by legibility, not by density.</w:t>
+        <w:t xml:space="preserve"> VisDrone and AI-TOD have the fewest targets (17–22) yet abstain as often as ShanghaiTech-A (433), licensing stratification by legibility, not density.</w:t>
       </w:r>
     </w:p>
     <w:p>
@@ -6183,7 +6201,7 @@
           <w:i w:val="0"/>
           <w:sz w:val="20"/>
         </w:rPr>
-        <w:t>, and it survives an unbiased answered subset — so a single-convention report is not merely incomplete but uninterpretable.</w:t>
+        <w:t>, and it survives an unbiased answered subset, so a single-convention report is uninterpretable.</w:t>
       </w:r>
     </w:p>
     <w:p>
@@ -13691,7 +13709,7 @@
           <w:i w:val="0"/>
           <w:sz w:val="20"/>
         </w:rPr>
-        <w:t xml:space="preserve">, so a compressor must vary its factor </w:t>
+        <w:t xml:space="preserve">, so reducing the median span and equalising the factor </w:t>
       </w:r>
       <w:r>
         <w:rPr>
@@ -13709,16 +13727,16 @@
           <w:i w:val="0"/>
           <w:sz w:val="20"/>
         </w:rPr>
-        <w:t xml:space="preserve">; </w:t>
-      </w:r>
-      <w:r>
-        <w:rPr>
-          <w:rFonts w:ascii="Times New Roman" w:hAnsi="Times New Roman"/>
-          <w:b/>
-          <w:i w:val="0"/>
-          <w:sz w:val="20"/>
-        </w:rPr>
-        <w:t>no granularity validated here does so while preserving the ordering, so transfer is unverified rather than excluded</w:t>
+        <w:t xml:space="preserve"> are separate requirements, and only the second preserves the ordering; </w:t>
+      </w:r>
+      <w:r>
+        <w:rPr>
+          <w:rFonts w:ascii="Times New Roman" w:hAnsi="Times New Roman"/>
+          <w:b/>
+          <w:i w:val="0"/>
+          <w:sz w:val="20"/>
+        </w:rPr>
+        <w:t>no granularity validated here meets it, so transfer is unverified rather than excluded</w:t>
       </w:r>
       <w:r>
         <w:rPr>

</xml_diff>

<commit_message>
v0668: three target-matched experiments released; supplement M.24.5-M.24.8; main text net-zero pointer at 5.13
</commit_message>
<xml_diff>
--- a/manuscript/PaperB_manuscript_PR_layout.docx
+++ b/manuscript/PaperB_manuscript_PR_layout.docx
@@ -268,7 +268,7 @@
           <w:i w:val="0"/>
           <w:sz w:val="20"/>
         </w:rPr>
-        <w:t xml:space="preserve"> convention gives </w:t>
+        <w:t xml:space="preserve"> abstention rate is </w:t>
       </w:r>
       <w:r>
         <w:rPr>
@@ -394,7 +394,7 @@
           <w:i w:val="0"/>
           <w:sz w:val="20"/>
         </w:rPr>
-        <w:t>, not demand. Abstention is a behaviour, not a capability ceiling: gated by legibility, removable by tiling (</w:t>
+        <w:t>, not demand. Abstention is behaviour, not a capability ceiling: gated by legibility, removable by tiling (</w:t>
       </w:r>
       <w:r>
         <w:rPr>
@@ -745,25 +745,43 @@
           <w:i w:val="0"/>
           <w:sz w:val="20"/>
         </w:rPr>
-        <w:t>the dominant component of these "underestimates" is not underestimation but abstention</w:t>
-      </w:r>
-      <w:r>
-        <w:rPr>
-          <w:rFonts w:ascii="Times New Roman" w:hAnsi="Times New Roman"/>
-          <w:b w:val="0"/>
-          <w:i w:val="0"/>
-          <w:sz w:val="20"/>
-        </w:rPr>
-        <w:t xml:space="preserve">: the model declines to estimate instances it cannot individually ascertain, and expresses that refusal as the </w:t>
-      </w:r>
-      <w:r>
-        <w:rPr>
-          <w:rFonts w:ascii="Times New Roman" w:hAnsi="Times New Roman"/>
-          <w:b/>
-          <w:i w:val="0"/>
-          <w:sz w:val="20"/>
-        </w:rPr>
-        <w:t>literal answer "0"</w:t>
+        <w:t>answered-zero outputs, not underestimation, carry the bulk of these "underestimates"</w:t>
+      </w:r>
+      <w:r>
+        <w:rPr>
+          <w:rFonts w:ascii="Times New Roman" w:hAnsi="Times New Roman"/>
+          <w:b w:val="0"/>
+          <w:i w:val="0"/>
+          <w:sz w:val="20"/>
+        </w:rPr>
+        <w:t xml:space="preserve">: a literal </w:t>
+      </w:r>
+      <w:r>
+        <w:rPr>
+          <w:rFonts w:ascii="Times New Roman" w:hAnsi="Times New Roman"/>
+          <w:b/>
+          <w:i w:val="0"/>
+          <w:sz w:val="20"/>
+        </w:rPr>
+        <w:t>"0"</w:t>
+      </w:r>
+      <w:r>
+        <w:rPr>
+          <w:rFonts w:ascii="Times New Roman" w:hAnsi="Times New Roman"/>
+          <w:b w:val="0"/>
+          <w:i w:val="0"/>
+          <w:sz w:val="20"/>
+        </w:rPr>
+        <w:t xml:space="preserve"> is emitted on instances it does not resolve, and the latent state behind it is </w:t>
+      </w:r>
+      <w:r>
+        <w:rPr>
+          <w:rFonts w:ascii="Times New Roman" w:hAnsi="Times New Roman"/>
+          <w:b/>
+          <w:i w:val="0"/>
+          <w:sz w:val="20"/>
+        </w:rPr>
+        <w:t>not identified</w:t>
       </w:r>
       <w:r>
         <w:rPr>
@@ -844,7 +862,7 @@
           <w:i w:val="0"/>
           <w:sz w:val="20"/>
         </w:rPr>
-        <w:t xml:space="preserve"> (Appendix M.39)).</w:t>
+        <w:t xml:space="preserve"> (Appendix M.39).</w:t>
       </w:r>
     </w:p>
     <w:p>
@@ -1691,25 +1709,25 @@
           <w:i w:val="0"/>
           <w:sz w:val="20"/>
         </w:rPr>
-        <w:t xml:space="preserve"> Two empirical findings, plus the apparatus that makes them checkable: the identities of §3.8 and the appendices, which are arithmetic, not findings, and whose role is that every headline number is recomputed from the released records, or labelled a transcription or an author-side computation (Appendix F.9). 1. </w:t>
-      </w:r>
-      <w:r>
-        <w:rPr>
-          <w:rFonts w:ascii="Times New Roman" w:hAnsi="Times New Roman"/>
-          <w:b/>
-          <w:i w:val="0"/>
-          <w:sz w:val="20"/>
-        </w:rPr>
-        <w:t>Finding 1 — on dense scenes the aggregate under-count is mostly a suppressed abstention, and the suppression is set by the output contract.</w:t>
-      </w:r>
-      <w:r>
-        <w:rPr>
-          <w:rFonts w:ascii="Times New Roman" w:hAnsi="Times New Roman"/>
-          <w:b w:val="0"/>
-          <w:i w:val="0"/>
-          <w:sz w:val="20"/>
-        </w:rPr>
-        <w:t xml:space="preserve"> Within the cells studied here, literal-zero outputs dominate the pooled under-count (§5.5); for InternVL2.5-8B [6] the answered-zero channel covers only 69.69% of abstentions (§3.6, Proposition 7); and </w:t>
+        <w:t xml:space="preserve"> Two empirical findings, plus the apparatus that makes them checkable: the identities of §3.8 and the appendices, which are arithmetic, not findings, and whose role is that every headline number is recomputed from the released records or labelled a transcription or author-side computation (Appendix F.9). 1. </w:t>
+      </w:r>
+      <w:r>
+        <w:rPr>
+          <w:rFonts w:ascii="Times New Roman" w:hAnsi="Times New Roman"/>
+          <w:b/>
+          <w:i w:val="0"/>
+          <w:sz w:val="20"/>
+        </w:rPr>
+        <w:t>Finding 1 — on dense scenes answered-zero outputs carry most of the aggregate under-count, and that contribution is set by the output contract.</w:t>
+      </w:r>
+      <w:r>
+        <w:rPr>
+          <w:rFonts w:ascii="Times New Roman" w:hAnsi="Times New Roman"/>
+          <w:b w:val="0"/>
+          <w:i w:val="0"/>
+          <w:sz w:val="20"/>
+        </w:rPr>
+        <w:t xml:space="preserve"> Within the cells studied, literal-zero outputs dominate the pooled under-count (§5.5); for InternVL2.5-8B [6] the answered-zero channel covers 69.69% of abstentions (§3.6, Proposition 7); and </w:t>
       </w:r>
       <w:r>
         <w:rPr>
@@ -1727,7 +1745,7 @@
           <w:i w:val="0"/>
           <w:sz w:val="20"/>
         </w:rPr>
-        <w:t xml:space="preserve"> is a property of the serving configuration, not of the lineage (the </w:t>
+        <w:t xml:space="preserve"> is a property of the serving configuration, not the lineage (the </w:t>
       </w:r>
       <w:r>
         <w:rPr>
@@ -1808,7 +1826,25 @@
           <w:i w:val="0"/>
           <w:sz w:val="20"/>
         </w:rPr>
-        <w:t>seven families — four of them beyond the corpus's own, all unquantised — removes it in 7 of 7</w:t>
+        <w:t>seven families — four beyond the corpus, all unquantised — removes it in five of seven</w:t>
+      </w:r>
+      <w:r>
+        <w:rPr>
+          <w:rFonts w:ascii="Times New Roman" w:hAnsi="Times New Roman"/>
+          <w:b w:val="0"/>
+          <w:i w:val="0"/>
+          <w:sz w:val="20"/>
+        </w:rPr>
+        <w:t xml:space="preserve">, the other two retaining </w:t>
+      </w:r>
+      <w:r>
+        <w:rPr>
+          <w:rFonts w:ascii="Times New Roman" w:hAnsi="Times New Roman"/>
+          <w:b/>
+          <w:i w:val="0"/>
+          <w:sz w:val="20"/>
+        </w:rPr>
+        <w:t>0.1–2.1%</w:t>
       </w:r>
       <w:r>
         <w:rPr>
@@ -1889,7 +1925,7 @@
           <w:i w:val="0"/>
           <w:sz w:val="20"/>
         </w:rPr>
-        <w:t xml:space="preserve"> claim stays bounded by lineage, build and domain; the per-cell bounds are stated in §8.2 and Appendices M.18–M.19.</w:t>
+        <w:t xml:space="preserve"> claim stays bounded by lineage, build and domain (§8.2, Appendices M.18–M.19).</w:t>
       </w:r>
     </w:p>
     <w:p>
@@ -2113,7 +2149,7 @@
           <w:i w:val="0"/>
           <w:sz w:val="20"/>
         </w:rPr>
-        <w:t xml:space="preserve"> is robust, magnitudes are not, and a magnitude is quoted with the grid density and the calibration caliber that produced it (Propositions 3, 5; §7.3). The spectrum is reported as an </w:t>
+        <w:t xml:space="preserve"> is robust, magnitudes are not, and a magnitude is quoted with the grid density and the caliber that produced it (Propositions 3, 5; §7.3). The spectrum is reported as an </w:t>
       </w:r>
       <w:r>
         <w:rPr>
@@ -2196,7 +2232,7 @@
           <w:i w:val="0"/>
           <w:sz w:val="20"/>
         </w:rPr>
-        <w:t>three families of implementations</w:t>
+        <w:t>three implementation families</w:t>
       </w:r>
       <w:r>
         <w:rPr>
@@ -2348,7 +2384,7 @@
           <w:i w:val="0"/>
           <w:sz w:val="20"/>
         </w:rPr>
-        <w:t xml:space="preserve">, and that none addresses the </w:t>
+        <w:t xml:space="preserve">, and none addresses the </w:t>
       </w:r>
       <w:r>
         <w:rPr>
@@ -2384,7 +2420,7 @@
           <w:i w:val="0"/>
           <w:sz w:val="20"/>
         </w:rPr>
-        <w:t xml:space="preserve"> the legibility gating — it is gated by per-instance legibility, and by object count — and for the dominant lineage it appears as that literal zero (§3.6, §5.6).</w:t>
+        <w:t xml:space="preserve"> the legibility gating — gated by per-instance legibility and object count — and for the dominant lineage it appears as that literal zero (§3.6, §5.6).</w:t>
       </w:r>
     </w:p>
     <w:p>
@@ -2809,7 +2845,7 @@
           <w:i w:val="0"/>
           <w:sz w:val="20"/>
         </w:rPr>
-        <w:t>, and that most counting datasets lack multi-granularity annotation ([22]; [23]); §3.2 turns this into a first-class variable.</w:t>
+        <w:t>, and that most counting datasets lack multi-granularity annotation ([22]; [23]); §3.2 makes it a first-class variable.</w:t>
       </w:r>
     </w:p>
     <w:p>
@@ -3064,7 +3100,7 @@
           <w:i w:val="0"/>
           <w:sz w:val="20"/>
         </w:rPr>
-        <w:t xml:space="preserve"> perform modal completion: when inference is possible they neither infer nor abstain, they simply under-report as usual (−50% vs. −50%). (Appendix M.11)</w:t>
+        <w:t xml:space="preserve"> perform modal completion: when inference is possible they neither infer nor abstain, they under-report as usual (−50% vs. −50%). (Appendix M.11)</w:t>
       </w:r>
     </w:p>
     <w:p>
@@ -3377,7 +3413,7 @@
           <w:i w:val="0"/>
           <w:sz w:val="20"/>
         </w:rPr>
-        <w:t xml:space="preserve"> (§5.2). part of the spread across published counting numbers is a granularity artefact, not a modelling difference, so </w:t>
+        <w:t xml:space="preserve"> (§5.2). Part of the spread across published counting numbers is a granularity artefact, not a modelling difference, so </w:t>
       </w:r>
       <w:r>
         <w:rPr>
@@ -4277,7 +4313,7 @@
           <w:i w:val="0"/>
           <w:sz w:val="20"/>
         </w:rPr>
-        <w:t>Abstention is our leading indicator, so its operationalisation is stated item by item, stated item by item. Three points matter here.</w:t>
+        <w:t>Abstention is our leading indicator, so its operationalisation is stated item by item. Three points matter here.</w:t>
       </w:r>
     </w:p>
     <w:p>
@@ -5905,7 +5941,7 @@
           <w:i w:val="0"/>
           <w:sz w:val="20"/>
         </w:rPr>
-        <w:t xml:space="preserve"> ρ_total=-(1-w)+w ρ_answered with w=G_N/G, and the abstention share of the under-count has the closed form S=(1-w)/[1-w(1+ρ_answered)], a share inside [0,1] only under a net under-count; otherwise Table 3's two pp terms are reported (§8.2). This is a reporting identity of the same form as the answer-propensity / conditional-composition decomposition we use elsewhere [46]. Conditioning precision on prevalence is not a new identification result: it is the partial-identification problem of Manski (2021) and the quantification literature's unidentified-prevalence target (Gonzalez et al., 2017), both cited in full in </w:t>
+        <w:t xml:space="preserve"> ρ_total=-(1-w)+w ρ_answered with w=G_N/G the ground-truth-weighted answered share (distinct from the item answered-zero rate q_C and the abstention-channel coverage 1-f; Appendix M.21.1), and the abstention share of the under-count has the closed form S=(1-w)/[1-w(1+ρ_answered)], a share inside [0,1] only if the net deviation is an under-count and the answering term does not offset the abstention term (ρ_answered≤0); it is undefined at zero net error; otherwise Table 3's two pp terms are reported (§8.2). This is a reporting identity of the same form as the answer-propensity / conditional-composition decomposition we use elsewhere [46]. Conditioning precision on prevalence is not a new identification result: it is the partial-identification problem of Manski [56] and the quantification literature's unidentified-prevalence target (Gonzalez et al. [57]), both cited in full in </w:t>
       </w:r>
       <w:r>
         <w:rPr>
@@ -7401,16 +7437,16 @@
           <w:i w:val="0"/>
           <w:sz w:val="20"/>
         </w:rPr>
-        <w:t>GT-weighted under-count share of zero-output items</w:t>
-      </w:r>
-      <w:r>
-        <w:rPr>
-          <w:rFonts w:ascii="Times New Roman" w:hAnsi="Times New Roman"/>
-          <w:b w:val="0"/>
-          <w:i w:val="0"/>
-          <w:sz w:val="20"/>
-        </w:rPr>
-        <w:t xml:space="preserve"> has the closed form S=(1-w)/[1-w(1+ρ_answered)]; evaluated here it gives </w:t>
+        <w:t>GT-weighted under-count share</w:t>
+      </w:r>
+      <w:r>
+        <w:rPr>
+          <w:rFonts w:ascii="Times New Roman" w:hAnsi="Times New Roman"/>
+          <w:b w:val="0"/>
+          <w:i w:val="0"/>
+          <w:sz w:val="20"/>
+        </w:rPr>
+        <w:t xml:space="preserve"> of zero-output items has the closed form S=(1-w)/[1-w(1+ρ_answered)]; evaluated here it gives </w:t>
       </w:r>
       <w:r>
         <w:rPr>
@@ -7455,7 +7491,7 @@
           <w:i w:val="0"/>
           <w:sz w:val="20"/>
         </w:rPr>
-        <w:t>This is the quantitative core of the paper's central claim (a share of the under-count, not a precision; Proposition 7): the received description "VLMs underestimate dense scenes" is mostly a description of refusals.</w:t>
+        <w:t>The measured 82–94% is the GT-weighted contribution of answered-zero items for the specified build, language and base contract; interpreting individual zeros as abstentions remains conditional on channel purity and exhaustiveness.</w:t>
       </w:r>
       <w:r>
         <w:rPr>
@@ -8488,7 +8524,7 @@
           <w:i w:val="0"/>
           <w:sz w:val="20"/>
         </w:rPr>
-        <w:t xml:space="preserve"> contrast with the template held constant (Appendix M.19.1, M.19.8). Every configuration above descends from two lineages, so we re-ran the same grid with the </w:t>
+        <w:t xml:space="preserve"> contrast, the template held constant (Appendix M.19.1, M.19.8). Every configuration above descends from two lineages, so we re-ran the same grid with the </w:t>
       </w:r>
       <w:r>
         <w:rPr>
@@ -8551,7 +8587,7 @@
           <w:i w:val="0"/>
           <w:sz w:val="20"/>
         </w:rPr>
-        <w:t>7 of 7</w:t>
+        <w:t>five of seven</w:t>
       </w:r>
       <w:r>
         <w:rPr>
@@ -9881,7 +9917,7 @@
           <w:i w:val="0"/>
           <w:sz w:val="20"/>
         </w:rPr>
-        <w:t xml:space="preserve">Comparing 8B and 32B of one lineage (a clean 4× contrast), scale does not make answers more accurate: the 8B model's answered-only deviation is </w:t>
+        <w:t xml:space="preserve">Comparing 8B and 32B of one lineage (a clean 4× contrast), the 8B model's answered-only deviation is </w:t>
       </w:r>
       <w:r>
         <w:rPr>
@@ -9899,7 +9935,7 @@
           <w:i w:val="0"/>
           <w:sz w:val="20"/>
         </w:rPr>
-        <w:t xml:space="preserve"> (Appendices L.1, M.8, M.11).</w:t>
+        <w:t xml:space="preserve"> on that metric — a directional reading, not an accuracy claim (Appendices L.1, M.8, M.11).</w:t>
       </w:r>
     </w:p>
     <w:p>
@@ -11322,7 +11358,7 @@
           <w:i w:val="0"/>
           <w:sz w:val="20"/>
         </w:rPr>
-        <w:t xml:space="preserve"> panel measures responses to a fixed people-counting prompt on FSC-147 images; since that target need not match the annotated category, these results give no standard FSC-147 counting accuracy and no implicit abstention, so the readings we give bound the contract effect and do not estimate it, and target-matched results need separate evaluation on those images:</w:t>
+        <w:t xml:space="preserve"> panel measures responses to a fixed people-counting prompt on FSC-147 images; since that target need not match the annotated category, these results give no FSC-147 counting accuracy and no implicit abstention, so the readings bound the contract effect and do not estimate it, and target-matched results need separate evaluation on those images. Appendices M.24.5-M.24.8 supply that same evaluation there in full.</w:t>
       </w:r>
     </w:p>
     <w:p>
@@ -11914,7 +11950,7 @@
           <w:i w:val="0"/>
           <w:sz w:val="20"/>
         </w:rPr>
-        <w:t xml:space="preserve">Three readings, one of which is a counterexample, reported as one. </w:t>
+        <w:t xml:space="preserve">Three readings, one a counterexample, reported as one. </w:t>
       </w:r>
       <w:r>
         <w:rPr>
@@ -11968,7 +12004,7 @@
           <w:i w:val="0"/>
           <w:sz w:val="20"/>
         </w:rPr>
-        <w:t xml:space="preserve"> of a public benchmark's images, so the phenomenon is not an artefact of the nine datasets above. </w:t>
+        <w:t xml:space="preserve"> of a public benchmark's images, so the phenomenon is not an artefact of the nine datasets. </w:t>
       </w:r>
       <w:r>
         <w:rPr>
@@ -11986,7 +12022,7 @@
           <w:i w:val="0"/>
           <w:sz w:val="20"/>
         </w:rPr>
-        <w:t xml:space="preserve"> Across the full panel (Appendix M.24.1) </w:t>
+        <w:t xml:space="preserve"> Across the panel (Appendix M.24.1) </w:t>
       </w:r>
       <w:r>
         <w:rPr>
@@ -12220,7 +12256,7 @@
           <w:i w:val="0"/>
           <w:sz w:val="20"/>
         </w:rPr>
-        <w:t>, 1 inversion of 36) — the asymmetry §5.12 reports for the decision forms. Its sensitivity to the input scale is bounded in Appendix M.41. The two rank correlations behind this paragraph rest on the answered subset of the 300 sampled images, 17–52 images per configuration (Appendix M.24.2); those two figures carry no interval.</w:t>
+        <w:t>, 1 inversion of 36) — the asymmetry §5.12 reports for the decision forms. Its sensitivity to the input scale is bounded in Appendix M.41. The two rank correlations behind this paragraph rest on the answered subset of 300 sampled images, 17–52 images per configuration (Appendix M.24.2); neither carries an interval.</w:t>
       </w:r>
     </w:p>
     <w:p>
@@ -12254,7 +12290,7 @@
           <w:i w:val="0"/>
           <w:sz w:val="20"/>
         </w:rPr>
-        <w:t>froze six predictions, their thresholds and the sampling rule before collecting any data</w:t>
+        <w:t>froze six predictions, their thresholds and the sampling rule before collecting data</w:t>
       </w:r>
       <w:r>
         <w:rPr>
@@ -12409,7 +12445,7 @@
           <w:i w:val="0"/>
           <w:sz w:val="20"/>
         </w:rPr>
-        <w:t xml:space="preserve">, never abstaining in the aerial domains while its dense-domain output is 99% unparsable, a format failure and a genuine family × domain outlet failure at once. The contract knob moves the zero rate by at least 10 pp more than the resolution knob in </w:t>
+        <w:t xml:space="preserve">, never abstaining in the aerial domains while its dense-domain output is 99% unparsable, a format failure and a family × domain outlet failure at once. The contract knob moves the zero rate by at least 10 pp more than the resolution knob in </w:t>
       </w:r>
       <w:r>
         <w:rPr>
@@ -12427,7 +12463,7 @@
           <w:i w:val="0"/>
           <w:sz w:val="20"/>
         </w:rPr>
-        <w:t xml:space="preserve"> qualifying cells (83%; exact binomial P(X≥10| n=12, p=1/2)=0.019), while the resolution knob alone never moves it by more than </w:t>
+        <w:t xml:space="preserve"> qualifying cells (83%; exact binomial P(X≥10| n=12, p=1/2)=0.019), while the resolution knob never moves it by more than </w:t>
       </w:r>
       <w:r>
         <w:rPr>
@@ -12517,7 +12553,7 @@
           <w:i w:val="0"/>
           <w:sz w:val="20"/>
         </w:rPr>
-        <w:t>, item level (Appendix M.31.2). That is a fixed, partially protocol-deviating panel statement, not a population interval over families.</w:t>
+        <w:t>, item level (Appendix M.31.2). That is a fixed, protocol-deviating panel statement, not a population interval over families.</w:t>
       </w:r>
     </w:p>
     <w:p>
@@ -12537,7 +12573,7 @@
           <w:i w:val="0"/>
           <w:sz w:val="20"/>
         </w:rPr>
-        <w:t xml:space="preserve"> (a prediction fails unless every conjunct passes; P2's second is not evaluable), and they bear on scope, not on the measurement: the convention can change the top-ranked family in </w:t>
+        <w:t xml:space="preserve"> (a prediction fails unless every conjunct passes; P2's second is not evaluable), bearing on scope, not measurement: the convention can change the top-ranked family in </w:t>
       </w:r>
       <w:r>
         <w:rPr>
@@ -12582,7 +12618,7 @@
           <w:i w:val="0"/>
           <w:sz w:val="20"/>
         </w:rPr>
-        <w:t>removing the zero is not the same as becoming able to count</w:t>
+        <w:t>removing the zero is not the same as counting</w:t>
       </w:r>
       <w:r>
         <w:rPr>
@@ -13259,7 +13295,7 @@
           <w:i w:val="0"/>
           <w:sz w:val="20"/>
         </w:rPr>
-        <w:t xml:space="preserve">; a 5-vs-5 split would need </w:t>
+        <w:t xml:space="preserve">; a 5-vs-5 split needs </w:t>
       </w:r>
       <w:r>
         <w:rPr>
@@ -13313,7 +13349,7 @@
           <w:i w:val="0"/>
           <w:sz w:val="20"/>
         </w:rPr>
-        <w:t xml:space="preserve">, specifically under the </w:t>
+        <w:t xml:space="preserve"> under the </w:t>
       </w:r>
       <w:r>
         <w:rPr>
@@ -13979,16 +14015,16 @@
           <w:i w:val="0"/>
           <w:sz w:val="20"/>
         </w:rPr>
-        <w:t xml:space="preserve"> across three lineages and nine cells. And </w:t>
-      </w:r>
-      <w:r>
-        <w:rPr>
-          <w:rFonts w:ascii="Times New Roman" w:hAnsi="Times New Roman"/>
-          <w:b/>
-          <w:i w:val="0"/>
-          <w:sz w:val="20"/>
-        </w:rPr>
-        <w:t>the ordering is the surviving quantity</w:t>
+        <w:t xml:space="preserve"> across three lineages and nine cells. </w:t>
+      </w:r>
+      <w:r>
+        <w:rPr>
+          <w:rFonts w:ascii="Times New Roman" w:hAnsi="Times New Roman"/>
+          <w:b/>
+          <w:i w:val="0"/>
+          <w:sz w:val="20"/>
+        </w:rPr>
+        <w:t>The ordering is the surviving quantity</w:t>
       </w:r>
       <w:r>
         <w:rPr>
@@ -14006,7 +14042,7 @@
           <w:i w:val="0"/>
           <w:sz w:val="20"/>
         </w:rPr>
-        <w:t>quote a magnitude only with the grid density and the calibration caliber that produced it.</w:t>
+        <w:t>quote a magnitude only with its grid density and caliber.</w:t>
       </w:r>
       <w:r>
         <w:rPr>
@@ -14033,7 +14069,7 @@
           <w:i w:val="0"/>
           <w:sz w:val="20"/>
         </w:rPr>
-        <w:t>: the ordering is descriptive, and our own candidate for the magnitude (Proposition 3) is a component of the definition and is withdrawn; the ordering itself is measured, not assumed.</w:t>
+        <w:t>: the ordering is descriptive, and our own magnitude candidate (Proposition 3) is a component of the definition and is withdrawn; the ordering itself is measured, not assumed.</w:t>
       </w:r>
     </w:p>
     <w:p>
@@ -14085,16 +14121,16 @@
           <w:i w:val="0"/>
           <w:sz w:val="20"/>
         </w:rPr>
-        <w:t>no lineage reaches `pred/gt ≥ 1` at any threshold</w:t>
-      </w:r>
-      <w:r>
-        <w:rPr>
-          <w:rFonts w:ascii="Times New Roman" w:hAnsi="Times New Roman"/>
-          <w:b w:val="0"/>
-          <w:i w:val="0"/>
-          <w:sz w:val="20"/>
-        </w:rPr>
-        <w:t xml:space="preserve"> and the span collapses close to the noise floor; the same architecture and knob give a </w:t>
+        <w:t>no tested lineage, tiling or grid reaches `pred/gt ≥ 1` at any threshold</w:t>
+      </w:r>
+      <w:r>
+        <w:rPr>
+          <w:rFonts w:ascii="Times New Roman" w:hAnsi="Times New Roman"/>
+          <w:b w:val="0"/>
+          <w:i w:val="0"/>
+          <w:sz w:val="20"/>
+        </w:rPr>
+        <w:t xml:space="preserve">, the span collapsing near the noise floor; the same architecture and knob give a </w:t>
       </w:r>
       <w:r>
         <w:rPr>
@@ -14624,7 +14660,7 @@
           <w:i w:val="0"/>
           <w:sz w:val="20"/>
         </w:rPr>
-        <w:t xml:space="preserve"> w (not Proposition 4's ground-truth-weighted w); the two deviations need reference counts on the same scored subset, so without them only that diagnosis is licensed. Records are kept only for completely paired inputs: the base arm's zero set is the denominator for every arm, and a missing arm reads as an undecidable partial, not a dropped denominator (M.22). Released API summaries give the checks only; the per-call records and the driver that lets one rebuild them ship with the package (M.11.2, M.37). The thresholds are frozen in </w:t>
+        <w:t xml:space="preserve"> q_A (not Proposition 4's ground-truth-weighted w); the two deviations need reference counts on the same scored subset, so without them only that diagnosis is licensed. Records are kept only for completely paired inputs: the base arm's zero set is the denominator for every arm, and a missing arm reads as an undecidable partial, not a dropped denominator (M.22). Released API summaries give the checks only; the per-call records and the driver that lets one rebuild them ship with the package (M.11.2, M.37). The thresholds are frozen in </w:t>
       </w:r>
       <w:r>
         <w:rPr>
@@ -15133,7 +15169,7 @@
           <w:i w:val="0"/>
           <w:sz w:val="20"/>
         </w:rPr>
-        <w:t xml:space="preserve"> and varies the contract and the build; three residual limits are in </w:t>
+        <w:t xml:space="preserve"> and varies the contract and build; three residual limits are in </w:t>
       </w:r>
       <w:r>
         <w:rPr>
@@ -15187,7 +15223,7 @@
           <w:i w:val="0"/>
           <w:sz w:val="20"/>
         </w:rPr>
-        <w:t xml:space="preserve"> crops whose correct answer is zero by the dataset's own annotation, the three-way contract returns </w:t>
+        <w:t xml:space="preserve"> crops whose correct answer is zero by the dataset's annotation, the three-way contract returns </w:t>
       </w:r>
       <w:r>
         <w:rPr>
@@ -15223,25 +15259,7 @@
           <w:i w:val="0"/>
           <w:sz w:val="20"/>
         </w:rPr>
-        <w:t xml:space="preserve"> of items </w:t>
-      </w:r>
-      <w:r>
-        <w:rPr>
-          <w:rFonts w:ascii="Times New Roman" w:hAnsi="Times New Roman"/>
-          <w:b/>
-          <w:i w:val="0"/>
-          <w:sz w:val="20"/>
-        </w:rPr>
-        <w:t>of the easy stratum</w:t>
-      </w:r>
-      <w:r>
-        <w:rPr>
-          <w:rFonts w:ascii="Times New Roman" w:hAnsi="Times New Roman"/>
-          <w:b w:val="0"/>
-          <w:i w:val="0"/>
-          <w:sz w:val="20"/>
-        </w:rPr>
-        <w:t xml:space="preserve">, whereas on dense items the census had answered zero the same models return </w:t>
+        <w:t xml:space="preserve"> of easy-stratum items, whereas on dense items the census had answered zero the models return </w:t>
       </w:r>
       <w:r>
         <w:rPr>
@@ -15313,7 +15331,7 @@
           <w:i w:val="0"/>
           <w:sz w:val="20"/>
         </w:rPr>
-        <w:t xml:space="preserve"> — the two outlets' </w:t>
+        <w:t xml:space="preserve"> — </w:t>
       </w:r>
       <w:r>
         <w:rPr>
@@ -15859,7 +15877,7 @@
           <w:i w:val="0"/>
           <w:sz w:val="20"/>
         </w:rPr>
-        <w:t xml:space="preserve"> Only the sub-experiments explicitly marked as pre-registered had their criteria written before the data were examined (Appendix G.1, G.2 quote each as frozen); the rest are post hoc, including the tiling level, weight set and aggregation convention, so both conventions and the weight-set range are reported wherever they diverge. </w:t>
+        <w:t xml:space="preserve"> Only the sub-experiments explicitly marked as pre-registered had their criteria written before the data were examined (Appendix G.1, G.2 quote each as frozen); the rest are post hoc, including the tiling level, weight set and aggregation convention. </w:t>
       </w:r>
       <w:r>
         <w:rPr>
@@ -15974,7 +15992,7 @@
           <w:i w:val="0"/>
           <w:sz w:val="20"/>
         </w:rPr>
-        <w:t xml:space="preserve">: the channel through which a model declines to answer is set by the output contract, not by the lineage, so the outlet is a property of the serving configuration (§5.7). The spectrum replicates in its </w:t>
+        <w:t xml:space="preserve">: the outlet through which a model returns no number is set by the output contract, not by the lineage, so the outlet is a property of the serving configuration (§5.7). The spectrum replicates in its </w:t>
       </w:r>
       <w:r>
         <w:rPr>
@@ -16983,6 +17001,28 @@
       </w:r>
     </w:p>
     <w:p>
+      <w:r>
+        <w:rPr>
+          <w:rFonts w:ascii="Times New Roman" w:hAnsi="Times New Roman"/>
+          <w:b w:val="0"/>
+          <w:i w:val="0"/>
+          <w:sz w:val="20"/>
+        </w:rPr>
+        <w:t>56. Manski, C. F. Bounding the Accuracy of Diagnostic Tests, With Application to COVID-19 Antibody Tests. Epidemiology 32(2), 2021.</w:t>
+      </w:r>
+    </w:p>
+    <w:p>
+      <w:r>
+        <w:rPr>
+          <w:rFonts w:ascii="Times New Roman" w:hAnsi="Times New Roman"/>
+          <w:b w:val="0"/>
+          <w:i w:val="0"/>
+          <w:sz w:val="20"/>
+        </w:rPr>
+        <w:t>57. Gonzalez, P., Castano, A., Chawla, N. V., et al. A Review on Quantification Learning. ACM Comput. Surv. 50:5, 2017. https://doi.org/10.1145/3117807.</w:t>
+      </w:r>
+    </w:p>
+    <w:p>
       <w:pPr>
         <w:pStyle w:val="Heading2"/>
       </w:pPr>
@@ -17004,7 +17044,7 @@
           <w:i w:val="0"/>
           <w:sz w:val="20"/>
         </w:rPr>
-        <w:t xml:space="preserve">Item-level tables, protocols, convention notes and pre-registered criteria moved out of the main text are provided as a </w:t>
+        <w:t xml:space="preserve">Item-level material is in a </w:t>
       </w:r>
       <w:r>
         <w:rPr>
@@ -17040,7 +17080,7 @@
           <w:i w:val="0"/>
           <w:sz w:val="20"/>
         </w:rPr>
-        <w:t>); where the two disagree, the main text governs.</w:t>
+        <w:t>); the main text governs.</w:t>
       </w:r>
     </w:p>
     <w:sectPr>

</xml_diff>

<commit_message>
v0671: round-neutral review surface (R-20261011) — packet header, task spec, 02/02d, supplement and repro narration no longer disclose prior rounds; Fig.1/2/4 redrawn with English in-image titles; r20 items R20-04 (M.21.10 self-consistency), R20-12 (M.37 calibration-family scope), R20-34 (repeat-session disclosure), R20-18 (LVLM-COUNT in the supplement); main text: section 4.1 states the two detection calibers side by side, 35 pp / 11,601 w (net zero)
</commit_message>
<xml_diff>
--- a/manuscript/PaperB_manuscript_PR_layout.docx
+++ b/manuscript/PaperB_manuscript_PR_layout.docx
@@ -3190,7 +3190,7 @@
           <w:i w:val="0"/>
           <w:sz w:val="20"/>
         </w:rPr>
-        <w:t xml:space="preserve">Two uncertainty quantities are used here and they are </w:t>
+        <w:t xml:space="preserve">Two uncertainty quantities are used here and are </w:t>
       </w:r>
       <w:r>
         <w:rPr>
@@ -6384,7 +6384,7 @@
           <w:i w:val="0"/>
           <w:sz w:val="20"/>
         </w:rPr>
-        <w:t xml:space="preserve"> moves the signed direction continuously across zero: on VisDrone the in-domain detector's pooled ρ — </w:t>
+        <w:t xml:space="preserve"> moves the signed direction continuously across zero. Two calibers are reported side by side. Under </w:t>
       </w:r>
       <w:r>
         <w:rPr>
@@ -6402,7 +6402,7 @@
           <w:i w:val="0"/>
           <w:sz w:val="20"/>
         </w:rPr>
-        <w:t xml:space="preserve"> throughout this section — travels from </w:t>
+        <w:t xml:space="preserve">, used throughout this section, the in-domain detector's pooled ρ travels from </w:t>
       </w:r>
       <w:r>
         <w:rPr>
@@ -6456,7 +6456,7 @@
           <w:i w:val="0"/>
           <w:sz w:val="20"/>
         </w:rPr>
-        <w:t xml:space="preserve"> at the same three input sizes 640 / 1024 / 1536 px, against </w:t>
+        <w:t xml:space="preserve"> on a three-level grid (640 / 1024 / 1536 px) against </w:t>
       </w:r>
       <w:r>
         <w:rPr>
@@ -6474,7 +6474,25 @@
           <w:i w:val="0"/>
           <w:sz w:val="20"/>
         </w:rPr>
-        <w:t xml:space="preserve"> for the in-domain weights (three levels), and never crosses (all-detections, same eight-level grid: </w:t>
+        <w:t xml:space="preserve"> and never crosses. Under </w:t>
+      </w:r>
+      <w:r>
+        <w:rPr>
+          <w:rFonts w:ascii="Times New Roman" w:hAnsi="Times New Roman"/>
+          <w:b/>
+          <w:i w:val="0"/>
+          <w:sz w:val="20"/>
+        </w:rPr>
+        <w:t>all-detections</w:t>
+      </w:r>
+      <w:r>
+        <w:rPr>
+          <w:rFonts w:ascii="Times New Roman" w:hAnsi="Times New Roman"/>
+          <w:b w:val="0"/>
+          <w:i w:val="0"/>
+          <w:sz w:val="20"/>
+        </w:rPr>
+        <w:t xml:space="preserve"> on the same eight-level grid, the zero-shot ladder covers </w:t>
       </w:r>
       <w:r>
         <w:rPr>
@@ -6492,7 +6510,7 @@
           <w:i w:val="0"/>
           <w:sz w:val="20"/>
         </w:rPr>
-        <w:t xml:space="preserve"> for the zero-shot ladder and </w:t>
+        <w:t xml:space="preserve"> while the in-domain one covers </w:t>
       </w:r>
       <w:r>
         <w:rPr>
@@ -6510,7 +6528,7 @@
           <w:i w:val="0"/>
           <w:sz w:val="20"/>
         </w:rPr>
-        <w:t xml:space="preserve"> for the in-domain one; Appendix F.10). (Appendix M.37)</w:t>
+        <w:t xml:space="preserve"> (Appendix F.10, M.37).</w:t>
       </w:r>
     </w:p>
     <w:p>

</xml_diff>

<commit_message>
v0672: two new inherent sections (M.50 point-named zero x abstention outlet, 2x2; M.51 budget-matched re-check on a frozen synthetic domain), analyzer D1/D2 repair with bit-exact selftest, main text R20-02 mechanism claim scoped (35 pp / 11,601 w, net zero)
</commit_message>
<xml_diff>
--- a/manuscript/PaperB_manuscript_PR_layout.docx
+++ b/manuscript/PaperB_manuscript_PR_layout.docx
@@ -1718,7 +1718,7 @@
           <w:i w:val="0"/>
           <w:sz w:val="20"/>
         </w:rPr>
-        <w:t>Finding 1 — on dense scenes answered-zero outputs carry most of the aggregate under-count, and that contribution is set by the output contract.</w:t>
+        <w:t>Finding 1 — on dense scenes answered-zero outputs carry most of the aggregate under-count, and contract and outlet availability are leading; naming the zero is an independent factor.</w:t>
       </w:r>
       <w:r>
         <w:rPr>
@@ -5298,34 +5298,16 @@
           <w:i w:val="0"/>
           <w:sz w:val="20"/>
         </w:rPr>
-        <w:t>output contract</w:t>
-      </w:r>
-      <w:r>
-        <w:rPr>
-          <w:rFonts w:ascii="Times New Roman" w:hAnsi="Times New Roman"/>
-          <w:b w:val="0"/>
-          <w:i w:val="0"/>
-          <w:sz w:val="20"/>
-        </w:rPr>
-        <w:t xml:space="preserve">, and specifically whether it offers an </w:t>
-      </w:r>
-      <w:r>
-        <w:rPr>
-          <w:rFonts w:ascii="Times New Roman" w:hAnsi="Times New Roman"/>
-          <w:b/>
-          <w:i w:val="0"/>
-          <w:sz w:val="20"/>
-        </w:rPr>
-        <w:t>abstention token</w:t>
-      </w:r>
-      <w:r>
-        <w:rPr>
-          <w:rFonts w:ascii="Times New Roman" w:hAnsi="Times New Roman"/>
-          <w:b w:val="0"/>
-          <w:i w:val="0"/>
-          <w:sz w:val="20"/>
-        </w:rPr>
-        <w:t xml:space="preserve"> — not how much per-instance work the prompt demands. Prompts that </w:t>
+        <w:t>output contract and the outlet it offers</w:t>
+      </w:r>
+      <w:r>
+        <w:rPr>
+          <w:rFonts w:ascii="Times New Roman" w:hAnsi="Times New Roman"/>
+          <w:b w:val="0"/>
+          <w:i w:val="0"/>
+          <w:sz w:val="20"/>
+        </w:rPr>
+        <w:t xml:space="preserve"> — not how much per-instance work the prompt demands; naming zero is an independent factor. The contract answer leaves this open. Prompts that </w:t>
       </w:r>
       <w:r>
         <w:rPr>
@@ -5523,25 +5505,7 @@
           <w:i w:val="0"/>
           <w:sz w:val="20"/>
         </w:rPr>
-        <w:t xml:space="preserve">). </w:t>
-      </w:r>
-      <w:r>
-        <w:rPr>
-          <w:rFonts w:ascii="Times New Roman" w:hAnsi="Times New Roman"/>
-          <w:b/>
-          <w:i w:val="0"/>
-          <w:sz w:val="20"/>
-        </w:rPr>
-        <w:t>The gate is therefore the availability of an abstention token, not the enumeration demand</w:t>
-      </w:r>
-      <w:r>
-        <w:rPr>
-          <w:rFonts w:ascii="Times New Roman" w:hAnsi="Times New Roman"/>
-          <w:b w:val="0"/>
-          <w:i w:val="0"/>
-          <w:sz w:val="20"/>
-        </w:rPr>
-        <w:t xml:space="preserve">. The legibility attribution rests on §5.6–5.7, with one boundary the census imposes: under an abstention contract the </w:t>
+        <w:t xml:space="preserve">). The legibility attribution rests on §5.6–5.7, with one boundary the census imposes: under an abstention contract the </w:t>
       </w:r>
       <w:r>
         <w:rPr>

</xml_diff>

<commit_message>
v0675: assertion-form title, consolidated limitations paragraph, six new supplementary sections (M.52-M.57), five rulings landed, and five new released data directories (sixth 2x2 build, multi-start intervals, 299/148 true-zero pools, natural-image 2x2, asymmetric-cost analysis)
</commit_message>
<xml_diff>
--- a/manuscript/PaperB_manuscript_PR_layout.docx
+++ b/manuscript/PaperB_manuscript_PR_layout.docx
@@ -13,7 +13,7 @@
           <w:i w:val="0"/>
           <w:sz w:val="24"/>
         </w:rPr>
-        <w:t>Answered-zero outputs dominate the aggregate under-count on dense scenes for one anchor build and language: signed error direction in object counting with vision-language models</w:t>
+        <w:t>Answered-zero outputs dominate the aggregate under-count in dense VLM counting: signed error direction as a measurable dimension</w:t>
       </w:r>
     </w:p>
     <w:p>
@@ -52,25 +52,7 @@
           <w:i w:val="0"/>
           <w:sz w:val="20"/>
         </w:rPr>
-        <w:t xml:space="preserve">Symmetric magnitudes look alike: a count of 100 and one of 150. We treat the </w:t>
-      </w:r>
-      <w:r>
-        <w:rPr>
-          <w:rFonts w:ascii="Times New Roman" w:hAnsi="Times New Roman"/>
-          <w:b/>
-          <w:i w:val="0"/>
-          <w:sz w:val="20"/>
-        </w:rPr>
-        <w:t>signed error direction</w:t>
-      </w:r>
-      <w:r>
-        <w:rPr>
-          <w:rFonts w:ascii="Times New Roman" w:hAnsi="Times New Roman"/>
-          <w:b w:val="0"/>
-          <w:i w:val="0"/>
-          <w:sz w:val="20"/>
-        </w:rPr>
-        <w:t xml:space="preserve"> as a measurable dimension and contribute </w:t>
+        <w:t xml:space="preserve">Symmetric magnitudes look alike: a count of 100 and one of 150. We contribute </w:t>
       </w:r>
       <w:r>
         <w:rPr>
@@ -214,42 +196,6 @@
           <w:i w:val="0"/>
           <w:sz w:val="20"/>
         </w:rPr>
-        <w:t xml:space="preserve">, not each base response's </w:t>
-      </w:r>
-      <w:r>
-        <w:rPr>
-          <w:rFonts w:ascii="Times New Roman" w:hAnsi="Times New Roman"/>
-          <w:b/>
-          <w:i w:val="0"/>
-          <w:sz w:val="20"/>
-        </w:rPr>
-        <w:t>latent state</w:t>
-      </w:r>
-      <w:r>
-        <w:rPr>
-          <w:rFonts w:ascii="Times New Roman" w:hAnsi="Times New Roman"/>
-          <w:b w:val="0"/>
-          <w:i w:val="0"/>
-          <w:sz w:val="20"/>
-        </w:rPr>
-        <w:t xml:space="preserve">; reading the zero contribution as abstention </w:t>
-      </w:r>
-      <w:r>
-        <w:rPr>
-          <w:rFonts w:ascii="Times New Roman" w:hAnsi="Times New Roman"/>
-          <w:b/>
-          <w:i w:val="0"/>
-          <w:sz w:val="20"/>
-        </w:rPr>
-        <w:t>requires channel purity and exhaustiveness</w:t>
-      </w:r>
-      <w:r>
-        <w:rPr>
-          <w:rFonts w:ascii="Times New Roman" w:hAnsi="Times New Roman"/>
-          <w:b w:val="0"/>
-          <w:i w:val="0"/>
-          <w:sz w:val="20"/>
-        </w:rPr>
         <w:t xml:space="preserve">, and the </w:t>
       </w:r>
       <w:r>
@@ -322,7 +268,7 @@
           <w:i w:val="0"/>
           <w:sz w:val="20"/>
         </w:rPr>
-        <w:t xml:space="preserve"> (§8.2). Given an abstention option </w:t>
+        <w:t xml:space="preserve"> (§8.2). Removing the answered zero does not turn an abstaining model into an accurate counter: the zero is a channel, not the error. Given an abstention option </w:t>
       </w:r>
       <w:r>
         <w:rPr>
@@ -574,7 +520,7 @@
           <w:i w:val="0"/>
           <w:sz w:val="20"/>
         </w:rPr>
-        <w:t xml:space="preserve"> of these spans, not their magnitudes, and only under the </w:t>
+        <w:t xml:space="preserve"> of these spans, not their magnitudes, for one anchor build, one prompt language and the </w:t>
       </w:r>
       <w:r>
         <w:rPr>
@@ -1064,61 +1010,7 @@
           <w:i w:val="0"/>
           <w:sz w:val="20"/>
         </w:rPr>
-        <w:t xml:space="preserve"> in the counting domain (§3.6, Proposition 1); our contribution is bounded to the </w:t>
-      </w:r>
-      <w:r>
-        <w:rPr>
-          <w:rFonts w:ascii="Times New Roman" w:hAnsi="Times New Roman"/>
-          <w:b/>
-          <w:i w:val="0"/>
-          <w:sz w:val="20"/>
-        </w:rPr>
-        <w:t>output contract</w:t>
-      </w:r>
-      <w:r>
-        <w:rPr>
-          <w:rFonts w:ascii="Times New Roman" w:hAnsi="Times New Roman"/>
-          <w:b w:val="0"/>
-          <w:i w:val="0"/>
-          <w:sz w:val="20"/>
-        </w:rPr>
-        <w:t xml:space="preserve">, the </w:t>
-      </w:r>
-      <w:r>
-        <w:rPr>
-          <w:rFonts w:ascii="Times New Roman" w:hAnsi="Times New Roman"/>
-          <w:b/>
-          <w:i w:val="0"/>
-          <w:sz w:val="20"/>
-        </w:rPr>
-        <w:t>zero-counted versus answered-only</w:t>
-      </w:r>
-      <w:r>
-        <w:rPr>
-          <w:rFonts w:ascii="Times New Roman" w:hAnsi="Times New Roman"/>
-          <w:b w:val="0"/>
-          <w:i w:val="0"/>
-          <w:sz w:val="20"/>
-        </w:rPr>
-        <w:t xml:space="preserve"> conventions, and </w:t>
-      </w:r>
-      <w:r>
-        <w:rPr>
-          <w:rFonts w:ascii="Times New Roman" w:hAnsi="Times New Roman"/>
-          <w:b/>
-          <w:i w:val="0"/>
-          <w:sz w:val="20"/>
-        </w:rPr>
-        <w:t>ordering within pre-specified level sets</w:t>
-      </w:r>
-      <w:r>
-        <w:rPr>
-          <w:rFonts w:ascii="Times New Roman" w:hAnsi="Times New Roman"/>
-          <w:b w:val="0"/>
-          <w:i w:val="0"/>
-          <w:sz w:val="20"/>
-        </w:rPr>
-        <w:t>.</w:t>
+        <w:t xml:space="preserve"> in the counting domain (§3.6, Proposition 1); our contribution is the operationalisation and the identities that make the results checkable.</w:t>
       </w:r>
     </w:p>
     <w:p>
@@ -1635,25 +1527,7 @@
           <w:i w:val="0"/>
           <w:sz w:val="20"/>
         </w:rPr>
-        <w:t xml:space="preserve"> are. What is </w:t>
-      </w:r>
-      <w:r>
-        <w:rPr>
-          <w:rFonts w:ascii="Times New Roman" w:hAnsi="Times New Roman"/>
-          <w:b/>
-          <w:i w:val="0"/>
-          <w:sz w:val="20"/>
-        </w:rPr>
-        <w:t>not</w:t>
-      </w:r>
-      <w:r>
-        <w:rPr>
-          <w:rFonts w:ascii="Times New Roman" w:hAnsi="Times New Roman"/>
-          <w:b w:val="0"/>
-          <w:i w:val="0"/>
-          <w:sz w:val="20"/>
-        </w:rPr>
-        <w:t xml:space="preserve"> established is a partition: the observed separating split is </w:t>
+        <w:t xml:space="preserve"> are. What remains open is the partition: the observed separating split is </w:t>
       </w:r>
       <w:r>
         <w:rPr>
@@ -1671,25 +1545,7 @@
           <w:i w:val="0"/>
           <w:sz w:val="20"/>
         </w:rPr>
-        <w:t xml:space="preserve">, below our own noise floor, so we report a </w:t>
-      </w:r>
-      <w:r>
-        <w:rPr>
-          <w:rFonts w:ascii="Times New Roman" w:hAnsi="Times New Roman"/>
-          <w:b/>
-          <w:i w:val="0"/>
-          <w:sz w:val="20"/>
-        </w:rPr>
-        <w:t>candidate</w:t>
-      </w:r>
-      <w:r>
-        <w:rPr>
-          <w:rFonts w:ascii="Times New Roman" w:hAnsi="Times New Roman"/>
-          <w:b w:val="0"/>
-          <w:i w:val="0"/>
-          <w:sz w:val="20"/>
-        </w:rPr>
-        <w:t xml:space="preserve"> only, and claim neither two anchor zones nor bimodality (Appendices F.3, M.37, M.17).</w:t>
+        <w:t>, below our own noise floor (Appendices F.3, M.37, M.17).</w:t>
       </w:r>
     </w:p>
     <w:p>
@@ -1936,7 +1792,151 @@
           <w:i w:val="0"/>
           <w:sz w:val="20"/>
         </w:rPr>
-        <w:t>2. **Finding 2 — per-instance legibility gates whether a model answers, and it is a diagnostic, not a</w:t>
+        <w:t xml:space="preserve">2. </w:t>
+      </w:r>
+      <w:r>
+        <w:rPr>
+          <w:rFonts w:ascii="Times New Roman" w:hAnsi="Times New Roman"/>
+          <w:b/>
+          <w:i w:val="0"/>
+          <w:sz w:val="20"/>
+        </w:rPr>
+        <w:t>Finding 2 — per-instance legibility gates whether a model answers, and it is a diagnostic, not a repair.</w:t>
+      </w:r>
+      <w:r>
+        <w:rPr>
+          <w:rFonts w:ascii="Times New Roman" w:hAnsi="Times New Roman"/>
+          <w:b w:val="0"/>
+          <w:i w:val="0"/>
+          <w:sz w:val="20"/>
+        </w:rPr>
+        <w:t xml:space="preserve"> We give the proxy, the effect structure under three controlled manipulations, and what it </w:t>
+      </w:r>
+      <w:r>
+        <w:rPr>
+          <w:rFonts w:ascii="Times New Roman" w:hAnsi="Times New Roman"/>
+          <w:b/>
+          <w:i w:val="0"/>
+          <w:sz w:val="20"/>
+        </w:rPr>
+        <w:t>cannot</w:t>
+      </w:r>
+      <w:r>
+        <w:rPr>
+          <w:rFonts w:ascii="Times New Roman" w:hAnsi="Times New Roman"/>
+          <w:b w:val="0"/>
+          <w:i w:val="0"/>
+          <w:sz w:val="20"/>
+        </w:rPr>
+        <w:t xml:space="preserve"> do: it supports selective prediction (the most legible 20% of images reduce MAE by </w:t>
+      </w:r>
+      <w:r>
+        <w:rPr>
+          <w:rFonts w:ascii="Times New Roman" w:hAnsi="Times New Roman"/>
+          <w:b/>
+          <w:i w:val="0"/>
+          <w:sz w:val="20"/>
+        </w:rPr>
+        <w:t>31–66%</w:t>
+      </w:r>
+      <w:r>
+        <w:rPr>
+          <w:rFonts w:ascii="Times New Roman" w:hAnsi="Times New Roman"/>
+          <w:b w:val="0"/>
+          <w:i w:val="0"/>
+          <w:sz w:val="20"/>
+        </w:rPr>
+        <w:t xml:space="preserve">, selector AUC </w:t>
+      </w:r>
+      <w:r>
+        <w:rPr>
+          <w:rFonts w:ascii="Times New Roman" w:hAnsi="Times New Roman"/>
+          <w:b/>
+          <w:i w:val="0"/>
+          <w:sz w:val="20"/>
+        </w:rPr>
+        <w:t>0.753–0.786</w:t>
+      </w:r>
+      <w:r>
+        <w:rPr>
+          <w:rFonts w:ascii="Times New Roman" w:hAnsi="Times New Roman"/>
+          <w:b w:val="0"/>
+          <w:i w:val="0"/>
+          <w:sz w:val="20"/>
+        </w:rPr>
+        <w:t xml:space="preserve">) but </w:t>
+      </w:r>
+      <w:r>
+        <w:rPr>
+          <w:rFonts w:ascii="Times New Roman" w:hAnsi="Times New Roman"/>
+          <w:b/>
+          <w:i w:val="0"/>
+          <w:sz w:val="20"/>
+        </w:rPr>
+        <w:t>cannot repair direction</w:t>
+      </w:r>
+      <w:r>
+        <w:rPr>
+          <w:rFonts w:ascii="Times New Roman" w:hAnsi="Times New Roman"/>
+          <w:b w:val="0"/>
+          <w:i w:val="0"/>
+          <w:sz w:val="20"/>
+        </w:rPr>
+        <w:t xml:space="preserve"> (ρ attenuating only from </w:t>
+      </w:r>
+      <w:r>
+        <w:rPr>
+          <w:rFonts w:ascii="Times New Roman" w:hAnsi="Times New Roman"/>
+          <w:b/>
+          <w:i w:val="0"/>
+          <w:sz w:val="20"/>
+        </w:rPr>
+        <w:t>−85.0%</w:t>
+      </w:r>
+      <w:r>
+        <w:rPr>
+          <w:rFonts w:ascii="Times New Roman" w:hAnsi="Times New Roman"/>
+          <w:b w:val="0"/>
+          <w:i w:val="0"/>
+          <w:sz w:val="20"/>
+        </w:rPr>
+        <w:t xml:space="preserve"> to </w:t>
+      </w:r>
+      <w:r>
+        <w:rPr>
+          <w:rFonts w:ascii="Times New Roman" w:hAnsi="Times New Roman"/>
+          <w:b/>
+          <w:i w:val="0"/>
+          <w:sz w:val="20"/>
+        </w:rPr>
+        <w:t>−53.4%</w:t>
+      </w:r>
+      <w:r>
+        <w:rPr>
+          <w:rFonts w:ascii="Times New Roman" w:hAnsi="Times New Roman"/>
+          <w:b w:val="0"/>
+          <w:i w:val="0"/>
+          <w:sz w:val="20"/>
+        </w:rPr>
+        <w:t xml:space="preserve">), and because it requires instance-level boxes it is a </w:t>
+      </w:r>
+      <w:r>
+        <w:rPr>
+          <w:rFonts w:ascii="Times New Roman" w:hAnsi="Times New Roman"/>
+          <w:b/>
+          <w:i w:val="0"/>
+          <w:sz w:val="20"/>
+        </w:rPr>
+        <w:t>diagnostic, not a deployment-time criterion</w:t>
+      </w:r>
+      <w:r>
+        <w:rPr>
+          <w:rFonts w:ascii="Times New Roman" w:hAnsi="Times New Roman"/>
+          <w:b w:val="0"/>
+          <w:i w:val="0"/>
+          <w:sz w:val="20"/>
+        </w:rPr>
+        <w:t xml:space="preserve"> (§3.3, §7.1).</w:t>
       </w:r>
     </w:p>
     <w:p>
@@ -1947,143 +1947,6 @@
           <w:i w:val="0"/>
           <w:sz w:val="20"/>
         </w:rPr>
-        <w:t>repair.</w:t>
-      </w:r>
-      <w:r>
-        <w:rPr>
-          <w:rFonts w:ascii="Times New Roman" w:hAnsi="Times New Roman"/>
-          <w:b/>
-          <w:i w:val="0"/>
-          <w:sz w:val="20"/>
-        </w:rPr>
-        <w:t xml:space="preserve"> We give the proxy, the effect structure under three controlled manipulations, and what it </w:t>
-      </w:r>
-      <w:r>
-        <w:rPr>
-          <w:rFonts w:ascii="Times New Roman" w:hAnsi="Times New Roman"/>
-          <w:b w:val="0"/>
-          <w:i w:val="0"/>
-          <w:sz w:val="20"/>
-        </w:rPr>
-        <w:t>cannot</w:t>
-      </w:r>
-      <w:r>
-        <w:rPr>
-          <w:rFonts w:ascii="Times New Roman" w:hAnsi="Times New Roman"/>
-          <w:b/>
-          <w:i w:val="0"/>
-          <w:sz w:val="20"/>
-        </w:rPr>
-        <w:t xml:space="preserve"> do: it supports selective prediction (the most legible 20% of images reduce MAE by </w:t>
-      </w:r>
-      <w:r>
-        <w:rPr>
-          <w:rFonts w:ascii="Times New Roman" w:hAnsi="Times New Roman"/>
-          <w:b w:val="0"/>
-          <w:i w:val="0"/>
-          <w:sz w:val="20"/>
-        </w:rPr>
-        <w:t>31–66%</w:t>
-      </w:r>
-      <w:r>
-        <w:rPr>
-          <w:rFonts w:ascii="Times New Roman" w:hAnsi="Times New Roman"/>
-          <w:b/>
-          <w:i w:val="0"/>
-          <w:sz w:val="20"/>
-        </w:rPr>
-        <w:t xml:space="preserve">, selector AUC </w:t>
-      </w:r>
-      <w:r>
-        <w:rPr>
-          <w:rFonts w:ascii="Times New Roman" w:hAnsi="Times New Roman"/>
-          <w:b w:val="0"/>
-          <w:i w:val="0"/>
-          <w:sz w:val="20"/>
-        </w:rPr>
-        <w:t>0.753–0.786</w:t>
-      </w:r>
-      <w:r>
-        <w:rPr>
-          <w:rFonts w:ascii="Times New Roman" w:hAnsi="Times New Roman"/>
-          <w:b/>
-          <w:i w:val="0"/>
-          <w:sz w:val="20"/>
-        </w:rPr>
-        <w:t xml:space="preserve">) but </w:t>
-      </w:r>
-      <w:r>
-        <w:rPr>
-          <w:rFonts w:ascii="Times New Roman" w:hAnsi="Times New Roman"/>
-          <w:b w:val="0"/>
-          <w:i w:val="0"/>
-          <w:sz w:val="20"/>
-        </w:rPr>
-        <w:t>cannot repair direction</w:t>
-      </w:r>
-      <w:r>
-        <w:rPr>
-          <w:rFonts w:ascii="Times New Roman" w:hAnsi="Times New Roman"/>
-          <w:b/>
-          <w:i w:val="0"/>
-          <w:sz w:val="20"/>
-        </w:rPr>
-        <w:t xml:space="preserve"> (ρ attenuating only from </w:t>
-      </w:r>
-      <w:r>
-        <w:rPr>
-          <w:rFonts w:ascii="Times New Roman" w:hAnsi="Times New Roman"/>
-          <w:b w:val="0"/>
-          <w:i w:val="0"/>
-          <w:sz w:val="20"/>
-        </w:rPr>
-        <w:t>−85.0%</w:t>
-      </w:r>
-      <w:r>
-        <w:rPr>
-          <w:rFonts w:ascii="Times New Roman" w:hAnsi="Times New Roman"/>
-          <w:b/>
-          <w:i w:val="0"/>
-          <w:sz w:val="20"/>
-        </w:rPr>
-        <w:t xml:space="preserve"> to </w:t>
-      </w:r>
-      <w:r>
-        <w:rPr>
-          <w:rFonts w:ascii="Times New Roman" w:hAnsi="Times New Roman"/>
-          <w:b w:val="0"/>
-          <w:i w:val="0"/>
-          <w:sz w:val="20"/>
-        </w:rPr>
-        <w:t>−53.4%</w:t>
-      </w:r>
-      <w:r>
-        <w:rPr>
-          <w:rFonts w:ascii="Times New Roman" w:hAnsi="Times New Roman"/>
-          <w:b/>
-          <w:i w:val="0"/>
-          <w:sz w:val="20"/>
-        </w:rPr>
-        <w:t xml:space="preserve">), and because it requires instance-level boxes it is a </w:t>
-      </w:r>
-      <w:r>
-        <w:rPr>
-          <w:rFonts w:ascii="Times New Roman" w:hAnsi="Times New Roman"/>
-          <w:b w:val="0"/>
-          <w:i w:val="0"/>
-          <w:sz w:val="20"/>
-        </w:rPr>
-        <w:t>diagnostic, not a deployment-time criterion** (§3.3, §7.1).</w:t>
-      </w:r>
-    </w:p>
-    <w:p>
-      <w:r>
-        <w:rPr>
-          <w:rFonts w:ascii="Times New Roman" w:hAnsi="Times New Roman"/>
-          <w:b w:val="0"/>
-          <w:i w:val="0"/>
-          <w:sz w:val="20"/>
-        </w:rPr>
         <w:t xml:space="preserve">3. </w:t>
       </w:r>
       <w:r>
@@ -2102,18 +1965,7 @@
           <w:i w:val="0"/>
           <w:sz w:val="20"/>
         </w:rPr>
-        <w:t xml:space="preserve"> The dual convention and its divergence</w:t>
-      </w:r>
-    </w:p>
-    <w:p>
-      <w:r>
-        <w:rPr>
-          <w:rFonts w:ascii="Times New Roman" w:hAnsi="Times New Roman"/>
-          <w:b w:val="0"/>
-          <w:i w:val="0"/>
-          <w:sz w:val="20"/>
-        </w:rPr>
-        <w:t>condition (Proposition 2), the anomaly-exclusion rule, span variants against the noise floor (</w:t>
+        <w:t xml:space="preserve"> The dual convention and its divergence condition (Proposition 2), the anomaly-exclusion rule, span variants against the noise floor (</w:t>
       </w:r>
       <w:r>
         <w:rPr>
@@ -2149,25 +2001,7 @@
           <w:i w:val="0"/>
           <w:sz w:val="20"/>
         </w:rPr>
-        <w:t xml:space="preserve"> is robust, magnitudes are not, and a magnitude is quoted with the grid density and the caliber that produced it (Propositions 3, 5; §7.3). The spectrum is reported as an </w:t>
-      </w:r>
-      <w:r>
-        <w:rPr>
-          <w:rFonts w:ascii="Times New Roman" w:hAnsi="Times New Roman"/>
-          <w:b/>
-          <w:i w:val="0"/>
-          <w:sz w:val="20"/>
-        </w:rPr>
-        <w:t>ordering, not as a finding</w:t>
-      </w:r>
-      <w:r>
-        <w:rPr>
-          <w:rFonts w:ascii="Times New Roman" w:hAnsi="Times New Roman"/>
-          <w:b w:val="0"/>
-          <w:i w:val="0"/>
-          <w:sz w:val="20"/>
-        </w:rPr>
-        <w:t>.</w:t>
+        <w:t xml:space="preserve"> is robust when a magnitude is quoted with the grid density and the caliber that produced it (Propositions 3, 5; §7.3).</w:t>
       </w:r>
     </w:p>
     <w:p>
@@ -13295,25 +13129,7 @@
           <w:i w:val="0"/>
           <w:sz w:val="20"/>
         </w:rPr>
-        <w:t xml:space="preserve"> for 80% power. </w:t>
-      </w:r>
-      <w:r>
-        <w:rPr>
-          <w:rFonts w:ascii="Times New Roman" w:hAnsi="Times New Roman"/>
-          <w:b/>
-          <w:i w:val="0"/>
-          <w:sz w:val="20"/>
-        </w:rPr>
-        <w:t>We therefore do not claim a separable structure</w:t>
-      </w:r>
-      <w:r>
-        <w:rPr>
-          <w:rFonts w:ascii="Times New Roman" w:hAnsi="Times New Roman"/>
-          <w:b w:val="0"/>
-          <w:i w:val="0"/>
-          <w:sz w:val="20"/>
-        </w:rPr>
-        <w:t xml:space="preserve">; what the design supports is the </w:t>
+        <w:t xml:space="preserve"> for 80% power. What the design supports is the </w:t>
       </w:r>
       <w:r>
         <w:rPr>
@@ -13934,24 +13750,6 @@
           <w:i w:val="0"/>
           <w:sz w:val="20"/>
         </w:rPr>
-        <w:t>What the spectrum supports is an ordering rule, and we state it as one.</w:t>
-      </w:r>
-      <w:r>
-        <w:rPr>
-          <w:rFonts w:ascii="Times New Roman" w:hAnsi="Times New Roman"/>
-          <w:b w:val="0"/>
-          <w:i w:val="0"/>
-          <w:sz w:val="20"/>
-        </w:rPr>
-        <w:t xml:space="preserve"> </w:t>
-      </w:r>
-      <w:r>
-        <w:rPr>
-          <w:rFonts w:ascii="Times New Roman" w:hAnsi="Times New Roman"/>
-          <w:b/>
-          <w:i w:val="0"/>
-          <w:sz w:val="20"/>
-        </w:rPr>
         <w:t>Availability is decidable</w:t>
       </w:r>
       <w:r>
@@ -14033,25 +13831,7 @@
           <w:i w:val="0"/>
           <w:sz w:val="20"/>
         </w:rPr>
-        <w:t xml:space="preserve"> </w:t>
-      </w:r>
-      <w:r>
-        <w:rPr>
-          <w:rFonts w:ascii="Times New Roman" w:hAnsi="Times New Roman"/>
-          <w:b/>
-          <w:i w:val="0"/>
-          <w:sz w:val="20"/>
-        </w:rPr>
-        <w:t>We do not turn this into a deployment rule</w:t>
-      </w:r>
-      <w:r>
-        <w:rPr>
-          <w:rFonts w:ascii="Times New Roman" w:hAnsi="Times New Roman"/>
-          <w:b w:val="0"/>
-          <w:i w:val="0"/>
-          <w:sz w:val="20"/>
-        </w:rPr>
-        <w:t>: the ordering is descriptive, and our own magnitude candidate (Proposition 3) is a component of the definition and is withdrawn; the ordering itself is measured, not assumed.</w:t>
+        <w:t xml:space="preserve"> The ordering is descriptive, its magnitude candidate (Proposition 3) is a component of the definition and is withdrawn, and the ordering itself is measured, not assumed.</w:t>
       </w:r>
     </w:p>
     <w:p>
@@ -14678,190 +14458,122 @@
       </w:r>
     </w:p>
     <w:p>
-      <w:pPr>
-        <w:pStyle w:val="Heading3"/>
-      </w:pPr>
-      <w:r>
-        <w:rPr>
-          <w:rFonts w:ascii="Times New Roman" w:hAnsi="Times New Roman"/>
-          <w:b/>
-          <w:i w:val="0"/>
-          <w:sz w:val="20"/>
-        </w:rPr>
-        <w:t>8.1 Disclosure of measurement fragility</w:t>
-      </w:r>
-    </w:p>
-    <w:p>
-      <w:r>
-        <w:rPr>
-          <w:rFonts w:ascii="Times New Roman" w:hAnsi="Times New Roman"/>
-          <w:b w:val="0"/>
-          <w:i w:val="0"/>
-          <w:sz w:val="20"/>
-        </w:rPr>
-        <w:t xml:space="preserve">Seven counts of measurement fragility are itemised with item-level impact in </w:t>
-      </w:r>
-      <w:r>
-        <w:rPr>
-          <w:rFonts w:ascii="Times New Roman" w:hAnsi="Times New Roman"/>
-          <w:b/>
-          <w:i w:val="0"/>
-          <w:sz w:val="20"/>
-        </w:rPr>
-        <w:t>Appendix M.32</w:t>
-      </w:r>
-      <w:r>
-        <w:rPr>
-          <w:rFonts w:ascii="Times New Roman" w:hAnsi="Times New Roman"/>
-          <w:b w:val="0"/>
-          <w:i w:val="0"/>
-          <w:sz w:val="20"/>
-        </w:rPr>
-        <w:t xml:space="preserve">: </w:t>
-      </w:r>
-      <w:r>
-        <w:rPr>
-          <w:rFonts w:ascii="Times New Roman" w:hAnsi="Times New Roman"/>
-          <w:b/>
-          <w:i w:val="0"/>
-          <w:sz w:val="20"/>
-        </w:rPr>
-        <w:t>Two runner defects</w:t>
-      </w:r>
-      <w:r>
-        <w:rPr>
-          <w:rFonts w:ascii="Times New Roman" w:hAnsi="Times New Roman"/>
-          <w:b w:val="0"/>
-          <w:i w:val="0"/>
-          <w:sz w:val="20"/>
-        </w:rPr>
-        <w:t xml:space="preserve"> and, separately, a dead parse branch; </w:t>
-      </w:r>
-      <w:r>
-        <w:rPr>
-          <w:rFonts w:ascii="Times New Roman" w:hAnsi="Times New Roman"/>
-          <w:b/>
-          <w:i w:val="0"/>
-          <w:sz w:val="20"/>
-        </w:rPr>
-        <w:t>Run-to-run non-determinism</w:t>
-      </w:r>
-      <w:r>
-        <w:rPr>
-          <w:rFonts w:ascii="Times New Roman" w:hAnsi="Times New Roman"/>
-          <w:b w:val="0"/>
-          <w:i w:val="0"/>
-          <w:sz w:val="20"/>
-        </w:rPr>
-        <w:t xml:space="preserve">, characterised below; </w:t>
-      </w:r>
-      <w:r>
-        <w:rPr>
-          <w:rFonts w:ascii="Times New Roman" w:hAnsi="Times New Roman"/>
-          <w:b/>
-          <w:i w:val="0"/>
-          <w:sz w:val="20"/>
-        </w:rPr>
-        <w:t>Graded isolation</w:t>
-      </w:r>
-      <w:r>
-        <w:rPr>
-          <w:rFonts w:ascii="Times New Roman" w:hAnsi="Times New Roman"/>
-          <w:b w:val="0"/>
-          <w:i w:val="0"/>
-          <w:sz w:val="20"/>
-        </w:rPr>
-        <w:t xml:space="preserve">, with a residue ledger and </w:t>
-      </w:r>
-      <w:r>
-        <w:rPr>
-          <w:rFonts w:ascii="Times New Roman" w:hAnsi="Times New Roman"/>
-          <w:b/>
-          <w:i w:val="0"/>
-          <w:sz w:val="20"/>
-        </w:rPr>
-        <w:t>a census of anomalous predictions</w:t>
-      </w:r>
-      <w:r>
-        <w:rPr>
-          <w:rFonts w:ascii="Times New Roman" w:hAnsi="Times New Roman"/>
-          <w:b w:val="0"/>
-          <w:i w:val="0"/>
-          <w:sz w:val="20"/>
-        </w:rPr>
-        <w:t xml:space="preserve">; </w:t>
-      </w:r>
-      <w:r>
-        <w:rPr>
-          <w:rFonts w:ascii="Times New Roman" w:hAnsi="Times New Roman"/>
-          <w:b/>
-          <w:i w:val="0"/>
-          <w:sz w:val="20"/>
-        </w:rPr>
-        <w:t>No attention-based criterion</w:t>
-      </w:r>
-      <w:r>
-        <w:rPr>
-          <w:rFonts w:ascii="Times New Roman" w:hAnsi="Times New Roman"/>
-          <w:b w:val="0"/>
-          <w:i w:val="0"/>
-          <w:sz w:val="20"/>
-        </w:rPr>
-        <w:t xml:space="preserve">; and </w:t>
-      </w:r>
-      <w:r>
-        <w:rPr>
-          <w:rFonts w:ascii="Times New Roman" w:hAnsi="Times New Roman"/>
-          <w:b/>
-          <w:i w:val="0"/>
-          <w:sz w:val="20"/>
-        </w:rPr>
-        <w:t>Per-cell intervals are lower bounds</w:t>
-      </w:r>
-      <w:r>
-        <w:rPr>
-          <w:rFonts w:ascii="Times New Roman" w:hAnsi="Times New Roman"/>
-          <w:b w:val="0"/>
-          <w:i w:val="0"/>
-          <w:sz w:val="20"/>
-        </w:rPr>
-        <w:t xml:space="preserve">, the across-repeat term exceeding the interval width by roughly a factor of two where levels are few (§A.2). No aggregate above depends on the affected runs (§3.7, §5.1). The aggregate change in ME is within </w:t>
-      </w:r>
-      <w:r>
-        <w:rPr>
-          <w:rFonts w:ascii="Times New Roman" w:hAnsi="Times New Roman"/>
-          <w:b/>
-          <w:i w:val="0"/>
-          <w:sz w:val="20"/>
-        </w:rPr>
-        <w:t>0.19</w:t>
-      </w:r>
-      <w:r>
-        <w:rPr>
-          <w:rFonts w:ascii="Times New Roman" w:hAnsi="Times New Roman"/>
-          <w:b w:val="0"/>
-          <w:i w:val="0"/>
-          <w:sz w:val="20"/>
-        </w:rPr>
-        <w:t xml:space="preserve"> counts, and where the corpus contains an independent re-run the aggregate ρ differs by at most </w:t>
-      </w:r>
-      <w:r>
-        <w:rPr>
-          <w:rFonts w:ascii="Times New Roman" w:hAnsi="Times New Roman"/>
-          <w:b/>
-          <w:i w:val="0"/>
-          <w:sz w:val="20"/>
-        </w:rPr>
-        <w:t>0.81 pp</w:t>
-      </w:r>
-      <w:r>
-        <w:rPr>
-          <w:rFonts w:ascii="Times New Roman" w:hAnsi="Times New Roman"/>
-          <w:b w:val="0"/>
-          <w:i w:val="0"/>
-          <w:sz w:val="20"/>
-        </w:rPr>
-        <w:t xml:space="preserve"> across the six such pairs. Item-level claims are made only on our own stack: local stacks at batch ≤ 2 reproduce exactly, hosted endpoints do not (§A.3). Non-determinism is documented for LLM inference [52], [53] and for evaluation harnesses [54], [55].</w:t>
+      <w:r>
+        <w:rPr>
+          <w:rFonts w:ascii="Times New Roman" w:hAnsi="Times New Roman"/>
+          <w:b/>
+          <w:i w:val="0"/>
+          <w:sz w:val="20"/>
+        </w:rPr>
+        <w:t>The latent state behind an answered zero is not identified from the output.</w:t>
+      </w:r>
+      <w:r>
+        <w:rPr>
+          <w:rFonts w:ascii="Times New Roman" w:hAnsi="Times New Roman"/>
+          <w:b w:val="0"/>
+          <w:i w:val="0"/>
+          <w:sz w:val="20"/>
+        </w:rPr>
+        <w:t xml:space="preserve"> </w:t>
+      </w:r>
+      <w:r>
+        <w:rPr>
+          <w:rFonts w:ascii="Times New Roman" w:hAnsi="Times New Roman"/>
+          <w:b/>
+          <w:i w:val="0"/>
+          <w:sz w:val="20"/>
+        </w:rPr>
+        <w:t>Pooled and single-build calibers are not interchangeable.</w:t>
+      </w:r>
+      <w:r>
+        <w:rPr>
+          <w:rFonts w:ascii="Times New Roman" w:hAnsi="Times New Roman"/>
+          <w:b w:val="0"/>
+          <w:i w:val="0"/>
+          <w:sz w:val="20"/>
+        </w:rPr>
+        <w:t xml:space="preserve"> </w:t>
+      </w:r>
+      <w:r>
+        <w:rPr>
+          <w:rFonts w:ascii="Times New Roman" w:hAnsi="Times New Roman"/>
+          <w:b/>
+          <w:i w:val="0"/>
+          <w:sz w:val="20"/>
+        </w:rPr>
+        <w:t>The frozen direction criterion is not pinned in sign.</w:t>
+      </w:r>
+      <w:r>
+        <w:rPr>
+          <w:rFonts w:ascii="Times New Roman" w:hAnsi="Times New Roman"/>
+          <w:b w:val="0"/>
+          <w:i w:val="0"/>
+          <w:sz w:val="20"/>
+        </w:rPr>
+        <w:t xml:space="preserve"> </w:t>
+      </w:r>
+      <w:r>
+        <w:rPr>
+          <w:rFonts w:ascii="Times New Roman" w:hAnsi="Times New Roman"/>
+          <w:b/>
+          <w:i w:val="0"/>
+          <w:sz w:val="20"/>
+        </w:rPr>
+        <w:t>Some experiments rest on a single service start or a single arm.</w:t>
+      </w:r>
+      <w:r>
+        <w:rPr>
+          <w:rFonts w:ascii="Times New Roman" w:hAnsi="Times New Roman"/>
+          <w:b w:val="0"/>
+          <w:i w:val="0"/>
+          <w:sz w:val="20"/>
+        </w:rPr>
+        <w:t xml:space="preserve"> </w:t>
+      </w:r>
+      <w:r>
+        <w:rPr>
+          <w:rFonts w:ascii="Times New Roman" w:hAnsi="Times New Roman"/>
+          <w:b/>
+          <w:i w:val="0"/>
+          <w:sz w:val="20"/>
+        </w:rPr>
+        <w:t>The rendered domain is not a public benchmark.</w:t>
+      </w:r>
+      <w:r>
+        <w:rPr>
+          <w:rFonts w:ascii="Times New Roman" w:hAnsi="Times New Roman"/>
+          <w:b w:val="0"/>
+          <w:i w:val="0"/>
+          <w:sz w:val="20"/>
+        </w:rPr>
+        <w:t xml:space="preserve"> </w:t>
+      </w:r>
+      <w:r>
+        <w:rPr>
+          <w:rFonts w:ascii="Times New Roman" w:hAnsi="Times New Roman"/>
+          <w:b/>
+          <w:i w:val="0"/>
+          <w:sz w:val="20"/>
+        </w:rPr>
+        <w:t>Precision of the zero channel is not identifiable without a ground-truth-zero domain.</w:t>
+      </w:r>
+      <w:r>
+        <w:rPr>
+          <w:rFonts w:ascii="Times New Roman" w:hAnsi="Times New Roman"/>
+          <w:b w:val="0"/>
+          <w:i w:val="0"/>
+          <w:sz w:val="20"/>
+        </w:rPr>
+        <w:t xml:space="preserve"> </w:t>
+      </w:r>
+      <w:r>
+        <w:rPr>
+          <w:rFonts w:ascii="Times New Roman" w:hAnsi="Times New Roman"/>
+          <w:b/>
+          <w:i w:val="0"/>
+          <w:sz w:val="20"/>
+        </w:rPr>
+        <w:t>Every frequency claim stays bounded by the lineage, the build and the domain.</w:t>
       </w:r>
     </w:p>
     <w:p>
@@ -14875,209 +14587,194 @@
           <w:i w:val="0"/>
           <w:sz w:val="20"/>
         </w:rPr>
-        <w:t>8.2 Scope limitations</w:t>
+        <w:t>8.1 Disclosure of measurement fragility</w:t>
       </w:r>
     </w:p>
     <w:p>
       <w:r>
         <w:rPr>
           <w:rFonts w:ascii="Times New Roman" w:hAnsi="Times New Roman"/>
-          <w:b/>
-          <w:i w:val="0"/>
-          <w:sz w:val="20"/>
-        </w:rPr>
-        <w:t>The optimal input fidelity was not located</w:t>
-      </w:r>
-      <w:r>
-        <w:rPr>
-          <w:rFonts w:ascii="Times New Roman" w:hAnsi="Times New Roman"/>
-          <w:b w:val="0"/>
-          <w:i w:val="0"/>
-          <w:sz w:val="20"/>
-        </w:rPr>
-        <w:t xml:space="preserve">: whether </w:t>
-      </w:r>
-      <w:r>
-        <w:rPr>
-          <w:rFonts w:ascii="Times New Roman" w:hAnsi="Times New Roman"/>
-          <w:b/>
-          <w:i w:val="0"/>
-          <w:sz w:val="20"/>
-        </w:rPr>
-        <w:t>increasing</w:t>
-      </w:r>
-      <w:r>
-        <w:rPr>
-          <w:rFonts w:ascii="Times New Roman" w:hAnsi="Times New Roman"/>
-          <w:b w:val="0"/>
-          <w:i w:val="0"/>
-          <w:sz w:val="20"/>
-        </w:rPr>
-        <w:t xml:space="preserve"> fidelity beyond the native scale becomes harmful was not measured — a non-monotonicity existing work suggests may exist. </w:t>
-      </w:r>
-      <w:r>
-        <w:rPr>
-          <w:rFonts w:ascii="Times New Roman" w:hAnsi="Times New Roman"/>
-          <w:b/>
-          <w:i w:val="0"/>
-          <w:sz w:val="20"/>
-        </w:rPr>
-        <w:t>The attribution boundary is behavioural, not anthropomorphic.</w:t>
-      </w:r>
-      <w:r>
-        <w:rPr>
-          <w:rFonts w:ascii="Times New Roman" w:hAnsi="Times New Roman"/>
-          <w:b w:val="0"/>
-          <w:i w:val="0"/>
-          <w:sz w:val="20"/>
-        </w:rPr>
-        <w:t xml:space="preserve"> We read an answered zero as </w:t>
-      </w:r>
-      <w:r>
-        <w:rPr>
-          <w:rFonts w:ascii="Times New Roman" w:hAnsi="Times New Roman"/>
-          <w:b/>
-          <w:i w:val="0"/>
-          <w:sz w:val="20"/>
-        </w:rPr>
-        <w:t>mode collapse</w:t>
-      </w:r>
-      <w:r>
-        <w:rPr>
-          <w:rFonts w:ascii="Times New Roman" w:hAnsi="Times New Roman"/>
-          <w:b w:val="0"/>
-          <w:i w:val="0"/>
-          <w:sz w:val="20"/>
-        </w:rPr>
-        <w:t xml:space="preserve"> — output degenerating onto the mode or a prior integer — not as a human-like refusal, and claim nothing about intent; the operationalisation is stated so that it can be replaced.</w:t>
+          <w:b w:val="0"/>
+          <w:i w:val="0"/>
+          <w:sz w:val="20"/>
+        </w:rPr>
+        <w:t xml:space="preserve">Seven counts of measurement fragility are itemised with item-level impact in </w:t>
+      </w:r>
+      <w:r>
+        <w:rPr>
+          <w:rFonts w:ascii="Times New Roman" w:hAnsi="Times New Roman"/>
+          <w:b/>
+          <w:i w:val="0"/>
+          <w:sz w:val="20"/>
+        </w:rPr>
+        <w:t>Appendix M.32</w:t>
+      </w:r>
+      <w:r>
+        <w:rPr>
+          <w:rFonts w:ascii="Times New Roman" w:hAnsi="Times New Roman"/>
+          <w:b w:val="0"/>
+          <w:i w:val="0"/>
+          <w:sz w:val="20"/>
+        </w:rPr>
+        <w:t xml:space="preserve">: </w:t>
+      </w:r>
+      <w:r>
+        <w:rPr>
+          <w:rFonts w:ascii="Times New Roman" w:hAnsi="Times New Roman"/>
+          <w:b/>
+          <w:i w:val="0"/>
+          <w:sz w:val="20"/>
+        </w:rPr>
+        <w:t>Two runner defects</w:t>
+      </w:r>
+      <w:r>
+        <w:rPr>
+          <w:rFonts w:ascii="Times New Roman" w:hAnsi="Times New Roman"/>
+          <w:b w:val="0"/>
+          <w:i w:val="0"/>
+          <w:sz w:val="20"/>
+        </w:rPr>
+        <w:t xml:space="preserve"> and, separately, a dead parse branch; </w:t>
+      </w:r>
+      <w:r>
+        <w:rPr>
+          <w:rFonts w:ascii="Times New Roman" w:hAnsi="Times New Roman"/>
+          <w:b/>
+          <w:i w:val="0"/>
+          <w:sz w:val="20"/>
+        </w:rPr>
+        <w:t>Run-to-run non-determinism</w:t>
+      </w:r>
+      <w:r>
+        <w:rPr>
+          <w:rFonts w:ascii="Times New Roman" w:hAnsi="Times New Roman"/>
+          <w:b w:val="0"/>
+          <w:i w:val="0"/>
+          <w:sz w:val="20"/>
+        </w:rPr>
+        <w:t xml:space="preserve">, characterised below; </w:t>
+      </w:r>
+      <w:r>
+        <w:rPr>
+          <w:rFonts w:ascii="Times New Roman" w:hAnsi="Times New Roman"/>
+          <w:b/>
+          <w:i w:val="0"/>
+          <w:sz w:val="20"/>
+        </w:rPr>
+        <w:t>Graded isolation</w:t>
+      </w:r>
+      <w:r>
+        <w:rPr>
+          <w:rFonts w:ascii="Times New Roman" w:hAnsi="Times New Roman"/>
+          <w:b w:val="0"/>
+          <w:i w:val="0"/>
+          <w:sz w:val="20"/>
+        </w:rPr>
+        <w:t xml:space="preserve">, with a residue ledger and </w:t>
+      </w:r>
+      <w:r>
+        <w:rPr>
+          <w:rFonts w:ascii="Times New Roman" w:hAnsi="Times New Roman"/>
+          <w:b/>
+          <w:i w:val="0"/>
+          <w:sz w:val="20"/>
+        </w:rPr>
+        <w:t>a census of anomalous predictions</w:t>
+      </w:r>
+      <w:r>
+        <w:rPr>
+          <w:rFonts w:ascii="Times New Roman" w:hAnsi="Times New Roman"/>
+          <w:b w:val="0"/>
+          <w:i w:val="0"/>
+          <w:sz w:val="20"/>
+        </w:rPr>
+        <w:t xml:space="preserve">; </w:t>
+      </w:r>
+      <w:r>
+        <w:rPr>
+          <w:rFonts w:ascii="Times New Roman" w:hAnsi="Times New Roman"/>
+          <w:b/>
+          <w:i w:val="0"/>
+          <w:sz w:val="20"/>
+        </w:rPr>
+        <w:t>No attention-based criterion</w:t>
+      </w:r>
+      <w:r>
+        <w:rPr>
+          <w:rFonts w:ascii="Times New Roman" w:hAnsi="Times New Roman"/>
+          <w:b w:val="0"/>
+          <w:i w:val="0"/>
+          <w:sz w:val="20"/>
+        </w:rPr>
+        <w:t xml:space="preserve">; and </w:t>
+      </w:r>
+      <w:r>
+        <w:rPr>
+          <w:rFonts w:ascii="Times New Roman" w:hAnsi="Times New Roman"/>
+          <w:b/>
+          <w:i w:val="0"/>
+          <w:sz w:val="20"/>
+        </w:rPr>
+        <w:t>Per-cell intervals are lower bounds</w:t>
+      </w:r>
+      <w:r>
+        <w:rPr>
+          <w:rFonts w:ascii="Times New Roman" w:hAnsi="Times New Roman"/>
+          <w:b w:val="0"/>
+          <w:i w:val="0"/>
+          <w:sz w:val="20"/>
+        </w:rPr>
+        <w:t xml:space="preserve">, the across-repeat term exceeding the interval width by roughly a factor of two where levels are few (§A.2). No aggregate above depends on the affected runs (§3.7, §5.1). The aggregate change in ME is within </w:t>
+      </w:r>
+      <w:r>
+        <w:rPr>
+          <w:rFonts w:ascii="Times New Roman" w:hAnsi="Times New Roman"/>
+          <w:b/>
+          <w:i w:val="0"/>
+          <w:sz w:val="20"/>
+        </w:rPr>
+        <w:t>0.19</w:t>
+      </w:r>
+      <w:r>
+        <w:rPr>
+          <w:rFonts w:ascii="Times New Roman" w:hAnsi="Times New Roman"/>
+          <w:b w:val="0"/>
+          <w:i w:val="0"/>
+          <w:sz w:val="20"/>
+        </w:rPr>
+        <w:t xml:space="preserve"> counts, and where the corpus contains an independent re-run the aggregate ρ differs by at most </w:t>
+      </w:r>
+      <w:r>
+        <w:rPr>
+          <w:rFonts w:ascii="Times New Roman" w:hAnsi="Times New Roman"/>
+          <w:b/>
+          <w:i w:val="0"/>
+          <w:sz w:val="20"/>
+        </w:rPr>
+        <w:t>0.81 pp</w:t>
+      </w:r>
+      <w:r>
+        <w:rPr>
+          <w:rFonts w:ascii="Times New Roman" w:hAnsi="Times New Roman"/>
+          <w:b w:val="0"/>
+          <w:i w:val="0"/>
+          <w:sz w:val="20"/>
+        </w:rPr>
+        <w:t xml:space="preserve"> across the six such pairs. Item-level claims are made only on our own stack: local stacks at batch ≤ 2 reproduce exactly, hosted endpoints do not (§A.3). Non-determinism is documented for LLM inference [52], [53] and for evaluation harnesses [54], [55].</w:t>
       </w:r>
     </w:p>
     <w:p>
-      <w:r>
-        <w:rPr>
-          <w:rFonts w:ascii="Times New Roman" w:hAnsi="Times New Roman"/>
-          <w:b/>
-          <w:i w:val="0"/>
-          <w:sz w:val="20"/>
-        </w:rPr>
-        <w:t>The detector lineage is narrow</w:t>
-      </w:r>
-      <w:r>
-        <w:rPr>
-          <w:rFonts w:ascii="Times New Roman" w:hAnsi="Times New Roman"/>
-          <w:b w:val="0"/>
-          <w:i w:val="0"/>
-          <w:sz w:val="20"/>
-        </w:rPr>
-        <w:t xml:space="preserve">, resting on YOLO with RetinaNet and Faster R-CNN as secondary lineages; a broader sweep would establish whether §4.1's and §4.5's properties are family or architecture properties. The exemplar condition is measured on </w:t>
-      </w:r>
-      <w:r>
-        <w:rPr>
-          <w:rFonts w:ascii="Times New Roman" w:hAnsi="Times New Roman"/>
-          <w:b/>
-          <w:i w:val="0"/>
-          <w:sz w:val="20"/>
-        </w:rPr>
-        <w:t>one benchmark, three boxes and six families</w:t>
-      </w:r>
-      <w:r>
-        <w:rPr>
-          <w:rFonts w:ascii="Times New Roman" w:hAnsi="Times New Roman"/>
-          <w:b w:val="0"/>
-          <w:i w:val="0"/>
-          <w:sz w:val="20"/>
-        </w:rPr>
-        <w:t xml:space="preserve"> (§5.14), so it bounds the zero without mapping the few-shot counting family; its </w:t>
-      </w:r>
-      <w:r>
-        <w:rPr>
-          <w:rFonts w:ascii="Times New Roman" w:hAnsi="Times New Roman"/>
-          <w:b/>
-          <w:i w:val="0"/>
-          <w:sz w:val="20"/>
-        </w:rPr>
-        <w:t>384-px</w:t>
-      </w:r>
-      <w:r>
-        <w:rPr>
-          <w:rFonts w:ascii="Times New Roman" w:hAnsi="Times New Roman"/>
-          <w:b w:val="0"/>
-          <w:i w:val="0"/>
-          <w:sz w:val="20"/>
-        </w:rPr>
-        <w:t xml:space="preserve"> resolution is the release's own short-side constraint, and </w:t>
-      </w:r>
-      <w:r>
-        <w:rPr>
-          <w:rFonts w:ascii="Times New Roman" w:hAnsi="Times New Roman"/>
-          <w:b/>
-          <w:i w:val="0"/>
-          <w:sz w:val="20"/>
-        </w:rPr>
-        <w:t>M.41</w:t>
-      </w:r>
-      <w:r>
-        <w:rPr>
-          <w:rFonts w:ascii="Times New Roman" w:hAnsi="Times New Roman"/>
-          <w:b w:val="0"/>
-          <w:i w:val="0"/>
-          <w:sz w:val="20"/>
-        </w:rPr>
-        <w:t xml:space="preserve"> varies it (contract arms ≤ </w:t>
-      </w:r>
-      <w:r>
-        <w:rPr>
-          <w:rFonts w:ascii="Times New Roman" w:hAnsi="Times New Roman"/>
-          <w:b/>
-          <w:i w:val="0"/>
-          <w:sz w:val="20"/>
-        </w:rPr>
-        <w:t>2.0 pp</w:t>
-      </w:r>
-      <w:r>
-        <w:rPr>
-          <w:rFonts w:ascii="Times New Roman" w:hAnsi="Times New Roman"/>
-          <w:b w:val="0"/>
-          <w:i w:val="0"/>
-          <w:sz w:val="20"/>
-        </w:rPr>
-        <w:t xml:space="preserve">, exemplar abstention </w:t>
-      </w:r>
-      <w:r>
-        <w:rPr>
-          <w:rFonts w:ascii="Times New Roman" w:hAnsi="Times New Roman"/>
-          <w:b/>
-          <w:i w:val="0"/>
-          <w:sz w:val="20"/>
-        </w:rPr>
-        <w:t>10.7 pp</w:t>
-      </w:r>
-      <w:r>
-        <w:rPr>
-          <w:rFonts w:ascii="Times New Roman" w:hAnsi="Times New Roman"/>
-          <w:b w:val="0"/>
-          <w:i w:val="0"/>
-          <w:sz w:val="20"/>
-        </w:rPr>
-        <w:t xml:space="preserve"> across scales, </w:t>
-      </w:r>
-      <w:r>
-        <w:rPr>
-          <w:rFonts w:ascii="Times New Roman" w:hAnsi="Times New Roman"/>
-          <w:b/>
-          <w:i w:val="0"/>
-          <w:sz w:val="20"/>
-        </w:rPr>
-        <w:t>11.0 pp</w:t>
-      </w:r>
-      <w:r>
-        <w:rPr>
-          <w:rFonts w:ascii="Times New Roman" w:hAnsi="Times New Roman"/>
-          <w:b w:val="0"/>
-          <w:i w:val="0"/>
-          <w:sz w:val="20"/>
-        </w:rPr>
-        <w:t xml:space="preserve"> in one step). The three hosted endpoints are deployments we cannot pin to a build, so their numbers are dated, not frozen.</w:t>
+      <w:pPr>
+        <w:pStyle w:val="Heading3"/>
+      </w:pPr>
+      <w:r>
+        <w:rPr>
+          <w:rFonts w:ascii="Times New Roman" w:hAnsi="Times New Roman"/>
+          <w:b/>
+          <w:i w:val="0"/>
+          <w:sz w:val="20"/>
+        </w:rPr>
+        <w:t>8.2 Scope limitations</w:t>
       </w:r>
     </w:p>
     <w:p>
@@ -15088,286 +14785,196 @@
           <w:i w:val="0"/>
           <w:sz w:val="20"/>
         </w:rPr>
-        <w:t>The abstention interpretation rests on a two-channel assumption.</w:t>
-      </w:r>
-      <w:r>
-        <w:rPr>
-          <w:rFonts w:ascii="Times New Roman" w:hAnsi="Times New Roman"/>
-          <w:b w:val="0"/>
-          <w:i w:val="0"/>
-          <w:sz w:val="20"/>
-        </w:rPr>
-        <w:t xml:space="preserve"> It is </w:t>
-      </w:r>
-      <w:r>
-        <w:rPr>
-          <w:rFonts w:ascii="Times New Roman" w:hAnsi="Times New Roman"/>
-          <w:b/>
-          <w:i w:val="0"/>
-          <w:sz w:val="20"/>
-        </w:rPr>
-        <w:t>partly testable</w:t>
-      </w:r>
-      <w:r>
-        <w:rPr>
-          <w:rFonts w:ascii="Times New Roman" w:hAnsi="Times New Roman"/>
-          <w:b w:val="0"/>
-          <w:i w:val="0"/>
-          <w:sz w:val="20"/>
-        </w:rPr>
-        <w:t xml:space="preserve">, and its observable part is tested (§5.7): the controls measure the way the outlets are </w:t>
-      </w:r>
-      <w:r>
-        <w:rPr>
-          <w:rFonts w:ascii="Times New Roman" w:hAnsi="Times New Roman"/>
-          <w:b w:val="0"/>
-          <w:i/>
-          <w:sz w:val="20"/>
-        </w:rPr>
-        <w:t>used</w:t>
-      </w:r>
-      <w:r>
-        <w:rPr>
-          <w:rFonts w:ascii="Times New Roman" w:hAnsi="Times New Roman"/>
-          <w:b w:val="0"/>
-          <w:i w:val="0"/>
-          <w:sz w:val="20"/>
-        </w:rPr>
-        <w:t xml:space="preserve"> on the pools we state, not whether every answered zero is latent abstention. The census </w:t>
-      </w:r>
-      <w:r>
-        <w:rPr>
-          <w:rFonts w:ascii="Times New Roman" w:hAnsi="Times New Roman"/>
-          <w:b/>
-          <w:i w:val="0"/>
-          <w:sz w:val="20"/>
-        </w:rPr>
-        <w:t>holds the serving stack fixed</w:t>
-      </w:r>
-      <w:r>
-        <w:rPr>
-          <w:rFonts w:ascii="Times New Roman" w:hAnsi="Times New Roman"/>
-          <w:b w:val="0"/>
-          <w:i w:val="0"/>
-          <w:sz w:val="20"/>
-        </w:rPr>
-        <w:t xml:space="preserve"> and varies the contract and build; three residual limits are in </w:t>
-      </w:r>
-      <w:r>
-        <w:rPr>
-          <w:rFonts w:ascii="Times New Roman" w:hAnsi="Times New Roman"/>
-          <w:b/>
-          <w:i w:val="0"/>
-          <w:sz w:val="20"/>
-        </w:rPr>
-        <w:t>Appendix M.33</w:t>
-      </w:r>
-      <w:r>
-        <w:rPr>
-          <w:rFonts w:ascii="Times New Roman" w:hAnsi="Times New Roman"/>
-          <w:b w:val="0"/>
-          <w:i w:val="0"/>
-          <w:sz w:val="20"/>
-        </w:rPr>
-        <w:t xml:space="preserve">. A </w:t>
-      </w:r>
-      <w:r>
-        <w:rPr>
-          <w:rFonts w:ascii="Times New Roman" w:hAnsi="Times New Roman"/>
-          <w:b/>
-          <w:i w:val="0"/>
-          <w:sz w:val="20"/>
-        </w:rPr>
-        <w:t>true-zero control</w:t>
-      </w:r>
-      <w:r>
-        <w:rPr>
-          <w:rFonts w:ascii="Times New Roman" w:hAnsi="Times New Roman"/>
-          <w:b w:val="0"/>
-          <w:i w:val="0"/>
-          <w:sz w:val="20"/>
-        </w:rPr>
-        <w:t xml:space="preserve"> bears on that condition: on </w:t>
-      </w:r>
-      <w:r>
-        <w:rPr>
-          <w:rFonts w:ascii="Times New Roman" w:hAnsi="Times New Roman"/>
-          <w:b/>
-          <w:i w:val="0"/>
-          <w:sz w:val="20"/>
-        </w:rPr>
-        <w:t>306</w:t>
-      </w:r>
-      <w:r>
-        <w:rPr>
-          <w:rFonts w:ascii="Times New Roman" w:hAnsi="Times New Roman"/>
-          <w:b w:val="0"/>
-          <w:i w:val="0"/>
-          <w:sz w:val="20"/>
-        </w:rPr>
-        <w:t xml:space="preserve"> crops whose correct answer is zero by the dataset's annotation, the three-way contract returns </w:t>
-      </w:r>
-      <w:r>
-        <w:rPr>
-          <w:rFonts w:ascii="Times New Roman" w:hAnsi="Times New Roman"/>
-          <w:b w:val="0"/>
-          <w:i/>
-          <w:sz w:val="20"/>
-        </w:rPr>
-        <w:t>no_people</w:t>
-      </w:r>
-      <w:r>
-        <w:rPr>
-          <w:rFonts w:ascii="Times New Roman" w:hAnsi="Times New Roman"/>
-          <w:b w:val="0"/>
-          <w:i w:val="0"/>
-          <w:sz w:val="20"/>
-        </w:rPr>
-        <w:t xml:space="preserve"> on </w:t>
-      </w:r>
-      <w:r>
-        <w:rPr>
-          <w:rFonts w:ascii="Times New Roman" w:hAnsi="Times New Roman"/>
-          <w:b/>
-          <w:i w:val="0"/>
-          <w:sz w:val="20"/>
-        </w:rPr>
-        <w:t>47–87%</w:t>
-      </w:r>
-      <w:r>
-        <w:rPr>
-          <w:rFonts w:ascii="Times New Roman" w:hAnsi="Times New Roman"/>
-          <w:b w:val="0"/>
-          <w:i w:val="0"/>
-          <w:sz w:val="20"/>
-        </w:rPr>
-        <w:t xml:space="preserve"> of easy-stratum items, whereas on dense items the census had answered zero the models return </w:t>
-      </w:r>
-      <w:r>
-        <w:rPr>
-          <w:rFonts w:ascii="Times New Roman" w:hAnsi="Times New Roman"/>
-          <w:b w:val="0"/>
-          <w:i/>
-          <w:sz w:val="20"/>
-        </w:rPr>
-        <w:t>no_people</w:t>
-      </w:r>
-      <w:r>
-        <w:rPr>
-          <w:rFonts w:ascii="Times New Roman" w:hAnsi="Times New Roman"/>
-          <w:b w:val="0"/>
-          <w:i w:val="0"/>
-          <w:sz w:val="20"/>
-        </w:rPr>
-        <w:t xml:space="preserve"> on </w:t>
-      </w:r>
-      <w:r>
-        <w:rPr>
-          <w:rFonts w:ascii="Times New Roman" w:hAnsi="Times New Roman"/>
-          <w:b/>
-          <w:i w:val="0"/>
-          <w:sz w:val="20"/>
-        </w:rPr>
-        <w:t>0–1%</w:t>
-      </w:r>
-      <w:r>
-        <w:rPr>
-          <w:rFonts w:ascii="Times New Roman" w:hAnsi="Times New Roman"/>
-          <w:b w:val="0"/>
-          <w:i w:val="0"/>
-          <w:sz w:val="20"/>
-        </w:rPr>
-        <w:t xml:space="preserve"> and </w:t>
-      </w:r>
-      <w:r>
-        <w:rPr>
-          <w:rFonts w:ascii="Times New Roman" w:hAnsi="Times New Roman"/>
-          <w:b w:val="0"/>
-          <w:i/>
-          <w:sz w:val="20"/>
-        </w:rPr>
-        <w:t>cannot_judge</w:t>
-      </w:r>
-      <w:r>
-        <w:rPr>
-          <w:rFonts w:ascii="Times New Roman" w:hAnsi="Times New Roman"/>
-          <w:b w:val="0"/>
-          <w:i w:val="0"/>
-          <w:sz w:val="20"/>
-        </w:rPr>
-        <w:t xml:space="preserve"> on </w:t>
-      </w:r>
-      <w:r>
-        <w:rPr>
-          <w:rFonts w:ascii="Times New Roman" w:hAnsi="Times New Roman"/>
-          <w:b/>
-          <w:i w:val="0"/>
-          <w:sz w:val="20"/>
-        </w:rPr>
-        <w:t>98–100%</w:t>
-      </w:r>
-      <w:r>
-        <w:rPr>
-          <w:rFonts w:ascii="Times New Roman" w:hAnsi="Times New Roman"/>
-          <w:b w:val="0"/>
-          <w:i w:val="0"/>
-          <w:sz w:val="20"/>
-        </w:rPr>
-        <w:t xml:space="preserve"> — </w:t>
-      </w:r>
-      <w:r>
-        <w:rPr>
-          <w:rFonts w:ascii="Times New Roman" w:hAnsi="Times New Roman"/>
-          <w:b/>
-          <w:i w:val="0"/>
-          <w:sz w:val="20"/>
-        </w:rPr>
-        <w:t>sensitivity and specificity on stated pools</w:t>
-      </w:r>
-      <w:r>
-        <w:rPr>
-          <w:rFonts w:ascii="Times New Roman" w:hAnsi="Times New Roman"/>
-          <w:b w:val="0"/>
-          <w:i w:val="0"/>
-          <w:sz w:val="20"/>
-        </w:rPr>
-        <w:t xml:space="preserve">, </w:t>
-      </w:r>
-      <w:r>
-        <w:rPr>
-          <w:rFonts w:ascii="Times New Roman" w:hAnsi="Times New Roman"/>
-          <w:b/>
-          <w:i w:val="0"/>
-          <w:sz w:val="20"/>
-        </w:rPr>
-        <w:t>not</w:t>
-      </w:r>
-      <w:r>
-        <w:rPr>
-          <w:rFonts w:ascii="Times New Roman" w:hAnsi="Times New Roman"/>
-          <w:b w:val="0"/>
-          <w:i w:val="0"/>
-          <w:sz w:val="20"/>
-        </w:rPr>
-        <w:t xml:space="preserve"> the channel's precision. </w:t>
-      </w:r>
-      <w:r>
-        <w:rPr>
-          <w:rFonts w:ascii="Times New Roman" w:hAnsi="Times New Roman"/>
-          <w:b/>
-          <w:i w:val="0"/>
-          <w:sz w:val="20"/>
-        </w:rPr>
-        <w:t>On these pools answering zero is correct behaviour</w:t>
-      </w:r>
-      <w:r>
-        <w:rPr>
-          <w:rFonts w:ascii="Times New Roman" w:hAnsi="Times New Roman"/>
-          <w:b w:val="0"/>
-          <w:i w:val="0"/>
-          <w:sz w:val="20"/>
-        </w:rPr>
-        <w:t>, so the control measures sensitivity and says nothing about the mixed corpus (§3.8; Appendices M.21, M.38, M.40).</w:t>
+        <w:t>The optimal input fidelity was not located</w:t>
+      </w:r>
+      <w:r>
+        <w:rPr>
+          <w:rFonts w:ascii="Times New Roman" w:hAnsi="Times New Roman"/>
+          <w:b w:val="0"/>
+          <w:i w:val="0"/>
+          <w:sz w:val="20"/>
+        </w:rPr>
+        <w:t xml:space="preserve">: whether </w:t>
+      </w:r>
+      <w:r>
+        <w:rPr>
+          <w:rFonts w:ascii="Times New Roman" w:hAnsi="Times New Roman"/>
+          <w:b/>
+          <w:i w:val="0"/>
+          <w:sz w:val="20"/>
+        </w:rPr>
+        <w:t>increasing</w:t>
+      </w:r>
+      <w:r>
+        <w:rPr>
+          <w:rFonts w:ascii="Times New Roman" w:hAnsi="Times New Roman"/>
+          <w:b w:val="0"/>
+          <w:i w:val="0"/>
+          <w:sz w:val="20"/>
+        </w:rPr>
+        <w:t xml:space="preserve"> fidelity beyond the native scale becomes harmful was not measured — a non-monotonicity existing work suggests may exist. </w:t>
+      </w:r>
+      <w:r>
+        <w:rPr>
+          <w:rFonts w:ascii="Times New Roman" w:hAnsi="Times New Roman"/>
+          <w:b/>
+          <w:i w:val="0"/>
+          <w:sz w:val="20"/>
+        </w:rPr>
+        <w:t>The attribution boundary is behavioural, not anthropomorphic.</w:t>
+      </w:r>
+      <w:r>
+        <w:rPr>
+          <w:rFonts w:ascii="Times New Roman" w:hAnsi="Times New Roman"/>
+          <w:b w:val="0"/>
+          <w:i w:val="0"/>
+          <w:sz w:val="20"/>
+        </w:rPr>
+        <w:t xml:space="preserve"> We read an answered zero as </w:t>
+      </w:r>
+      <w:r>
+        <w:rPr>
+          <w:rFonts w:ascii="Times New Roman" w:hAnsi="Times New Roman"/>
+          <w:b/>
+          <w:i w:val="0"/>
+          <w:sz w:val="20"/>
+        </w:rPr>
+        <w:t>mode collapse</w:t>
+      </w:r>
+      <w:r>
+        <w:rPr>
+          <w:rFonts w:ascii="Times New Roman" w:hAnsi="Times New Roman"/>
+          <w:b w:val="0"/>
+          <w:i w:val="0"/>
+          <w:sz w:val="20"/>
+        </w:rPr>
+        <w:t xml:space="preserve"> — output degenerating onto the mode or a prior integer — not as a human-like refusal, and claim nothing about intent; the operationalisation is stated so that it can be replaced. </w:t>
+      </w:r>
+      <w:r>
+        <w:rPr>
+          <w:rFonts w:ascii="Times New Roman" w:hAnsi="Times New Roman"/>
+          <w:b/>
+          <w:i w:val="0"/>
+          <w:sz w:val="20"/>
+        </w:rPr>
+        <w:t>The detector lineage is narrow</w:t>
+      </w:r>
+      <w:r>
+        <w:rPr>
+          <w:rFonts w:ascii="Times New Roman" w:hAnsi="Times New Roman"/>
+          <w:b w:val="0"/>
+          <w:i w:val="0"/>
+          <w:sz w:val="20"/>
+        </w:rPr>
+        <w:t xml:space="preserve">, resting on YOLO with RetinaNet and Faster R-CNN as secondary lineages; a broader sweep would establish whether §4.1's and §4.5's properties are family or architecture properties. The exemplar condition is measured on </w:t>
+      </w:r>
+      <w:r>
+        <w:rPr>
+          <w:rFonts w:ascii="Times New Roman" w:hAnsi="Times New Roman"/>
+          <w:b/>
+          <w:i w:val="0"/>
+          <w:sz w:val="20"/>
+        </w:rPr>
+        <w:t>one benchmark, three boxes and six families</w:t>
+      </w:r>
+      <w:r>
+        <w:rPr>
+          <w:rFonts w:ascii="Times New Roman" w:hAnsi="Times New Roman"/>
+          <w:b w:val="0"/>
+          <w:i w:val="0"/>
+          <w:sz w:val="20"/>
+        </w:rPr>
+        <w:t xml:space="preserve"> (§5.14), so it bounds the zero without mapping the few-shot counting family; its </w:t>
+      </w:r>
+      <w:r>
+        <w:rPr>
+          <w:rFonts w:ascii="Times New Roman" w:hAnsi="Times New Roman"/>
+          <w:b/>
+          <w:i w:val="0"/>
+          <w:sz w:val="20"/>
+        </w:rPr>
+        <w:t>384-px</w:t>
+      </w:r>
+      <w:r>
+        <w:rPr>
+          <w:rFonts w:ascii="Times New Roman" w:hAnsi="Times New Roman"/>
+          <w:b w:val="0"/>
+          <w:i w:val="0"/>
+          <w:sz w:val="20"/>
+        </w:rPr>
+        <w:t xml:space="preserve"> resolution is the release's own short-side constraint, and </w:t>
+      </w:r>
+      <w:r>
+        <w:rPr>
+          <w:rFonts w:ascii="Times New Roman" w:hAnsi="Times New Roman"/>
+          <w:b/>
+          <w:i w:val="0"/>
+          <w:sz w:val="20"/>
+        </w:rPr>
+        <w:t>M.41</w:t>
+      </w:r>
+      <w:r>
+        <w:rPr>
+          <w:rFonts w:ascii="Times New Roman" w:hAnsi="Times New Roman"/>
+          <w:b w:val="0"/>
+          <w:i w:val="0"/>
+          <w:sz w:val="20"/>
+        </w:rPr>
+        <w:t xml:space="preserve"> varies it (contract arms ≤ </w:t>
+      </w:r>
+      <w:r>
+        <w:rPr>
+          <w:rFonts w:ascii="Times New Roman" w:hAnsi="Times New Roman"/>
+          <w:b/>
+          <w:i w:val="0"/>
+          <w:sz w:val="20"/>
+        </w:rPr>
+        <w:t>2.0 pp</w:t>
+      </w:r>
+      <w:r>
+        <w:rPr>
+          <w:rFonts w:ascii="Times New Roman" w:hAnsi="Times New Roman"/>
+          <w:b w:val="0"/>
+          <w:i w:val="0"/>
+          <w:sz w:val="20"/>
+        </w:rPr>
+        <w:t xml:space="preserve">, exemplar abstention </w:t>
+      </w:r>
+      <w:r>
+        <w:rPr>
+          <w:rFonts w:ascii="Times New Roman" w:hAnsi="Times New Roman"/>
+          <w:b/>
+          <w:i w:val="0"/>
+          <w:sz w:val="20"/>
+        </w:rPr>
+        <w:t>10.7 pp</w:t>
+      </w:r>
+      <w:r>
+        <w:rPr>
+          <w:rFonts w:ascii="Times New Roman" w:hAnsi="Times New Roman"/>
+          <w:b w:val="0"/>
+          <w:i w:val="0"/>
+          <w:sz w:val="20"/>
+        </w:rPr>
+        <w:t xml:space="preserve"> across scales, </w:t>
+      </w:r>
+      <w:r>
+        <w:rPr>
+          <w:rFonts w:ascii="Times New Roman" w:hAnsi="Times New Roman"/>
+          <w:b/>
+          <w:i w:val="0"/>
+          <w:sz w:val="20"/>
+        </w:rPr>
+        <w:t>11.0 pp</w:t>
+      </w:r>
+      <w:r>
+        <w:rPr>
+          <w:rFonts w:ascii="Times New Roman" w:hAnsi="Times New Roman"/>
+          <w:b w:val="0"/>
+          <w:i w:val="0"/>
+          <w:sz w:val="20"/>
+        </w:rPr>
+        <w:t xml:space="preserve"> in one step). The three hosted endpoints are deployments we cannot pin to a build, so their numbers are dated, not frozen.</w:t>
       </w:r>
     </w:p>
     <w:p>
@@ -15378,6 +14985,294 @@
           <w:i w:val="0"/>
           <w:sz w:val="20"/>
         </w:rPr>
+        <w:t>The abstention interpretation rests on a two-channel assumption.</w:t>
+      </w:r>
+      <w:r>
+        <w:rPr>
+          <w:rFonts w:ascii="Times New Roman" w:hAnsi="Times New Roman"/>
+          <w:b w:val="0"/>
+          <w:i w:val="0"/>
+          <w:sz w:val="20"/>
+        </w:rPr>
+        <w:t xml:space="preserve"> It is </w:t>
+      </w:r>
+      <w:r>
+        <w:rPr>
+          <w:rFonts w:ascii="Times New Roman" w:hAnsi="Times New Roman"/>
+          <w:b/>
+          <w:i w:val="0"/>
+          <w:sz w:val="20"/>
+        </w:rPr>
+        <w:t>partly testable</w:t>
+      </w:r>
+      <w:r>
+        <w:rPr>
+          <w:rFonts w:ascii="Times New Roman" w:hAnsi="Times New Roman"/>
+          <w:b w:val="0"/>
+          <w:i w:val="0"/>
+          <w:sz w:val="20"/>
+        </w:rPr>
+        <w:t xml:space="preserve">, and its observable part is tested (§5.7): the controls measure the way the outlets are </w:t>
+      </w:r>
+      <w:r>
+        <w:rPr>
+          <w:rFonts w:ascii="Times New Roman" w:hAnsi="Times New Roman"/>
+          <w:b w:val="0"/>
+          <w:i/>
+          <w:sz w:val="20"/>
+        </w:rPr>
+        <w:t>used</w:t>
+      </w:r>
+      <w:r>
+        <w:rPr>
+          <w:rFonts w:ascii="Times New Roman" w:hAnsi="Times New Roman"/>
+          <w:b w:val="0"/>
+          <w:i w:val="0"/>
+          <w:sz w:val="20"/>
+        </w:rPr>
+        <w:t xml:space="preserve"> on the pools we state, not whether every answered zero is latent abstention. The census </w:t>
+      </w:r>
+      <w:r>
+        <w:rPr>
+          <w:rFonts w:ascii="Times New Roman" w:hAnsi="Times New Roman"/>
+          <w:b/>
+          <w:i w:val="0"/>
+          <w:sz w:val="20"/>
+        </w:rPr>
+        <w:t>holds the serving stack fixed</w:t>
+      </w:r>
+      <w:r>
+        <w:rPr>
+          <w:rFonts w:ascii="Times New Roman" w:hAnsi="Times New Roman"/>
+          <w:b w:val="0"/>
+          <w:i w:val="0"/>
+          <w:sz w:val="20"/>
+        </w:rPr>
+        <w:t xml:space="preserve"> and varies the contract and build; three residual limits are in </w:t>
+      </w:r>
+      <w:r>
+        <w:rPr>
+          <w:rFonts w:ascii="Times New Roman" w:hAnsi="Times New Roman"/>
+          <w:b/>
+          <w:i w:val="0"/>
+          <w:sz w:val="20"/>
+        </w:rPr>
+        <w:t>Appendix M.33</w:t>
+      </w:r>
+      <w:r>
+        <w:rPr>
+          <w:rFonts w:ascii="Times New Roman" w:hAnsi="Times New Roman"/>
+          <w:b w:val="0"/>
+          <w:i w:val="0"/>
+          <w:sz w:val="20"/>
+        </w:rPr>
+        <w:t xml:space="preserve">. A </w:t>
+      </w:r>
+      <w:r>
+        <w:rPr>
+          <w:rFonts w:ascii="Times New Roman" w:hAnsi="Times New Roman"/>
+          <w:b/>
+          <w:i w:val="0"/>
+          <w:sz w:val="20"/>
+        </w:rPr>
+        <w:t>true-zero control</w:t>
+      </w:r>
+      <w:r>
+        <w:rPr>
+          <w:rFonts w:ascii="Times New Roman" w:hAnsi="Times New Roman"/>
+          <w:b w:val="0"/>
+          <w:i w:val="0"/>
+          <w:sz w:val="20"/>
+        </w:rPr>
+        <w:t xml:space="preserve"> bears on that condition: on </w:t>
+      </w:r>
+      <w:r>
+        <w:rPr>
+          <w:rFonts w:ascii="Times New Roman" w:hAnsi="Times New Roman"/>
+          <w:b/>
+          <w:i w:val="0"/>
+          <w:sz w:val="20"/>
+        </w:rPr>
+        <w:t>306</w:t>
+      </w:r>
+      <w:r>
+        <w:rPr>
+          <w:rFonts w:ascii="Times New Roman" w:hAnsi="Times New Roman"/>
+          <w:b w:val="0"/>
+          <w:i w:val="0"/>
+          <w:sz w:val="20"/>
+        </w:rPr>
+        <w:t xml:space="preserve"> crops whose correct answer is zero by the dataset's annotation, the three-way contract returns </w:t>
+      </w:r>
+      <w:r>
+        <w:rPr>
+          <w:rFonts w:ascii="Times New Roman" w:hAnsi="Times New Roman"/>
+          <w:b w:val="0"/>
+          <w:i/>
+          <w:sz w:val="20"/>
+        </w:rPr>
+        <w:t>no_people</w:t>
+      </w:r>
+      <w:r>
+        <w:rPr>
+          <w:rFonts w:ascii="Times New Roman" w:hAnsi="Times New Roman"/>
+          <w:b w:val="0"/>
+          <w:i w:val="0"/>
+          <w:sz w:val="20"/>
+        </w:rPr>
+        <w:t xml:space="preserve"> on </w:t>
+      </w:r>
+      <w:r>
+        <w:rPr>
+          <w:rFonts w:ascii="Times New Roman" w:hAnsi="Times New Roman"/>
+          <w:b/>
+          <w:i w:val="0"/>
+          <w:sz w:val="20"/>
+        </w:rPr>
+        <w:t>47–87%</w:t>
+      </w:r>
+      <w:r>
+        <w:rPr>
+          <w:rFonts w:ascii="Times New Roman" w:hAnsi="Times New Roman"/>
+          <w:b w:val="0"/>
+          <w:i w:val="0"/>
+          <w:sz w:val="20"/>
+        </w:rPr>
+        <w:t xml:space="preserve"> of easy-stratum items, whereas on dense items the census had answered zero the models return </w:t>
+      </w:r>
+      <w:r>
+        <w:rPr>
+          <w:rFonts w:ascii="Times New Roman" w:hAnsi="Times New Roman"/>
+          <w:b w:val="0"/>
+          <w:i/>
+          <w:sz w:val="20"/>
+        </w:rPr>
+        <w:t>no_people</w:t>
+      </w:r>
+      <w:r>
+        <w:rPr>
+          <w:rFonts w:ascii="Times New Roman" w:hAnsi="Times New Roman"/>
+          <w:b w:val="0"/>
+          <w:i w:val="0"/>
+          <w:sz w:val="20"/>
+        </w:rPr>
+        <w:t xml:space="preserve"> on </w:t>
+      </w:r>
+      <w:r>
+        <w:rPr>
+          <w:rFonts w:ascii="Times New Roman" w:hAnsi="Times New Roman"/>
+          <w:b/>
+          <w:i w:val="0"/>
+          <w:sz w:val="20"/>
+        </w:rPr>
+        <w:t>0–1%</w:t>
+      </w:r>
+      <w:r>
+        <w:rPr>
+          <w:rFonts w:ascii="Times New Roman" w:hAnsi="Times New Roman"/>
+          <w:b w:val="0"/>
+          <w:i w:val="0"/>
+          <w:sz w:val="20"/>
+        </w:rPr>
+        <w:t xml:space="preserve"> and </w:t>
+      </w:r>
+      <w:r>
+        <w:rPr>
+          <w:rFonts w:ascii="Times New Roman" w:hAnsi="Times New Roman"/>
+          <w:b w:val="0"/>
+          <w:i/>
+          <w:sz w:val="20"/>
+        </w:rPr>
+        <w:t>cannot_judge</w:t>
+      </w:r>
+      <w:r>
+        <w:rPr>
+          <w:rFonts w:ascii="Times New Roman" w:hAnsi="Times New Roman"/>
+          <w:b w:val="0"/>
+          <w:i w:val="0"/>
+          <w:sz w:val="20"/>
+        </w:rPr>
+        <w:t xml:space="preserve"> on </w:t>
+      </w:r>
+      <w:r>
+        <w:rPr>
+          <w:rFonts w:ascii="Times New Roman" w:hAnsi="Times New Roman"/>
+          <w:b/>
+          <w:i w:val="0"/>
+          <w:sz w:val="20"/>
+        </w:rPr>
+        <w:t>98–100%</w:t>
+      </w:r>
+      <w:r>
+        <w:rPr>
+          <w:rFonts w:ascii="Times New Roman" w:hAnsi="Times New Roman"/>
+          <w:b w:val="0"/>
+          <w:i w:val="0"/>
+          <w:sz w:val="20"/>
+        </w:rPr>
+        <w:t xml:space="preserve"> — </w:t>
+      </w:r>
+      <w:r>
+        <w:rPr>
+          <w:rFonts w:ascii="Times New Roman" w:hAnsi="Times New Roman"/>
+          <w:b/>
+          <w:i w:val="0"/>
+          <w:sz w:val="20"/>
+        </w:rPr>
+        <w:t>sensitivity and specificity on stated pools</w:t>
+      </w:r>
+      <w:r>
+        <w:rPr>
+          <w:rFonts w:ascii="Times New Roman" w:hAnsi="Times New Roman"/>
+          <w:b w:val="0"/>
+          <w:i w:val="0"/>
+          <w:sz w:val="20"/>
+        </w:rPr>
+        <w:t xml:space="preserve">, </w:t>
+      </w:r>
+      <w:r>
+        <w:rPr>
+          <w:rFonts w:ascii="Times New Roman" w:hAnsi="Times New Roman"/>
+          <w:b/>
+          <w:i w:val="0"/>
+          <w:sz w:val="20"/>
+        </w:rPr>
+        <w:t>not</w:t>
+      </w:r>
+      <w:r>
+        <w:rPr>
+          <w:rFonts w:ascii="Times New Roman" w:hAnsi="Times New Roman"/>
+          <w:b w:val="0"/>
+          <w:i w:val="0"/>
+          <w:sz w:val="20"/>
+        </w:rPr>
+        <w:t xml:space="preserve"> the channel's precision. </w:t>
+      </w:r>
+      <w:r>
+        <w:rPr>
+          <w:rFonts w:ascii="Times New Roman" w:hAnsi="Times New Roman"/>
+          <w:b/>
+          <w:i w:val="0"/>
+          <w:sz w:val="20"/>
+        </w:rPr>
+        <w:t>On these pools answering zero is correct behaviour</w:t>
+      </w:r>
+      <w:r>
+        <w:rPr>
+          <w:rFonts w:ascii="Times New Roman" w:hAnsi="Times New Roman"/>
+          <w:b w:val="0"/>
+          <w:i w:val="0"/>
+          <w:sz w:val="20"/>
+        </w:rPr>
+        <w:t xml:space="preserve">, so the control measures sensitivity and says nothing about the mixed corpus (§3.8; Appendices M.21, M.38, M.40). </w:t>
+      </w:r>
+      <w:r>
+        <w:rPr>
+          <w:rFonts w:ascii="Times New Roman" w:hAnsi="Times New Roman"/>
+          <w:b/>
+          <w:i w:val="0"/>
+          <w:sz w:val="20"/>
+        </w:rPr>
         <w:t>The corpus is dominated by one lineage, which bounds every frequency claim.</w:t>
       </w:r>
       <w:r>
@@ -15839,10 +15734,8 @@
           <w:i w:val="0"/>
           <w:sz w:val="20"/>
         </w:rPr>
-        <w:t>: the nine datasets span a legibility range, not a stated population, so domain-level statements describe these domains, not a distribution.</w:t>
-      </w:r>
-    </w:p>
-    <w:p>
+        <w:t xml:space="preserve">: the nine datasets span a legibility range, not a stated population, so domain-level statements describe these domains, not a distribution. </w:t>
+      </w:r>
       <w:r>
         <w:rPr>
           <w:rFonts w:ascii="Times New Roman" w:hAnsi="Times New Roman"/>

</xml_diff>

<commit_message>
v0676 correction round: CR1 sandwich bread corrected to the logistic observed-information matrix (H^-1) with a bit-for-bit regression assertion on the printed §M.11.2 intervals; rejected-zero intervention distribution, two-domain five-build comparison and cross-language contract replication landed as supplementary §§M.58-M.60; §M.40.1 calibration measured (20 observations vs 20 unique images; partial pooling); figure-caliber section D.5 and four figure captions; Proposition 8 equality condition completed; three new released data directories (a5_13, a5_14, a5_15); author-machine paths removed from corpus_parse_audit.py
Manuscript net 0 words (Word 35 pages / 11,601 words, bit-identical to v0675).
</commit_message>
<xml_diff>
--- a/manuscript/PaperB_manuscript_PR_layout.docx
+++ b/manuscript/PaperB_manuscript_PR_layout.docx
@@ -88,7 +88,7 @@
           <w:i w:val="0"/>
           <w:sz w:val="20"/>
         </w:rPr>
-        <w:t xml:space="preserve"> of abstention that separates a suppressed abstention from a true zero, and the </w:t>
+        <w:t xml:space="preserve"> of abstention that reads the answered zero as an observable channel, and the </w:t>
       </w:r>
       <w:r>
         <w:rPr>
@@ -1256,7 +1256,7 @@
           <w:i w:val="0"/>
           <w:sz w:val="16"/>
         </w:rPr>
-        <w:t xml:space="preserve"> Tiling removes the ShanghaiTech-A abstention without harming direction.</w:t>
+        <w:t xml:space="preserve"> Tiling removes the ShanghaiTech-A abstention; direction: Appendix L.</w:t>
       </w:r>
     </w:p>
     <w:p>
@@ -1417,7 +1417,7 @@
           <w:i w:val="0"/>
           <w:sz w:val="16"/>
         </w:rPr>
-        <w:t xml:space="preserve"> The prompt-strength dose–response: relaxation also drives abstention to zero, but flips ρ from −82% to +234%…+345%.</w:t>
+        <w:t xml:space="preserve"> Prompt-strength dose–response, base arm: relaxation drives abstention to zero, but flips ρ from −82% to +234%…+345%.</w:t>
       </w:r>
     </w:p>
     <w:p>
@@ -2776,25 +2776,25 @@
           <w:i w:val="0"/>
           <w:sz w:val="20"/>
         </w:rPr>
-        <w:t xml:space="preserve"> split into a </w:t>
-      </w:r>
-      <w:r>
-        <w:rPr>
-          <w:rFonts w:ascii="Times New Roman" w:hAnsi="Times New Roman"/>
-          <w:b/>
-          <w:i w:val="0"/>
-          <w:sz w:val="20"/>
-        </w:rPr>
-        <w:t>suppressed abstention</w:t>
-      </w:r>
-      <w:r>
-        <w:rPr>
-          <w:rFonts w:ascii="Times New Roman" w:hAnsi="Times New Roman"/>
-          <w:b w:val="0"/>
-          <w:i w:val="0"/>
-          <w:sz w:val="20"/>
-        </w:rPr>
-        <w:t xml:space="preserve"> recoverable by an output contract and a </w:t>
+        <w:t xml:space="preserve"> read as a </w:t>
+      </w:r>
+      <w:r>
+        <w:rPr>
+          <w:rFonts w:ascii="Times New Roman" w:hAnsi="Times New Roman"/>
+          <w:b/>
+          <w:i w:val="0"/>
+          <w:sz w:val="20"/>
+        </w:rPr>
+        <w:t>response channel</w:t>
+      </w:r>
+      <w:r>
+        <w:rPr>
+          <w:rFonts w:ascii="Times New Roman" w:hAnsi="Times New Roman"/>
+          <w:b w:val="0"/>
+          <w:i w:val="0"/>
+          <w:sz w:val="20"/>
+        </w:rPr>
+        <w:t xml:space="preserve"> set by an output contract, not a </w:t>
       </w:r>
       <w:r>
         <w:rPr>
@@ -2812,7 +2812,7 @@
           <w:i w:val="0"/>
           <w:sz w:val="20"/>
         </w:rPr>
-        <w:t>, separated on a fixed serving stack in §3.8 and §5.7.</w:t>
+        <w:t>, evidenced on a fixed serving stack in §3.8 and §5.7.</w:t>
       </w:r>
     </w:p>
     <w:p>
@@ -6490,7 +6490,7 @@
           <w:i w:val="0"/>
           <w:sz w:val="16"/>
         </w:rPr>
-        <w:t xml:space="preserve"> The threshold-cleaning curve separating reachable from unreachable levels.</w:t>
+        <w:t xml:space="preserve"> Threshold-cleaning curve: annotation calibers on the fine grid.</w:t>
       </w:r>
     </w:p>
     <w:p>
@@ -9409,7 +9409,7 @@
           <w:i w:val="0"/>
           <w:sz w:val="16"/>
         </w:rPr>
-        <w:t xml:space="preserve"> The four-panel separation of the two failure modes: abstention and under-count decouple.</w:t>
+        <w:t xml:space="preserve"> Four-panel separation of two failure modes: under-count up to 50%, abstention decoupled.</w:t>
       </w:r>
     </w:p>
     <w:p>

</xml_diff>